<commit_message>
docs: drop 4-tier axis and numeric labels from P2 report
</commit_message>
<xml_diff>
--- a/archive/docx/p2-lifecycle-community-report.docx
+++ b/archive/docx/p2-lifecycle-community-report.docx
@@ -52,7 +52,7 @@
           <w:color w:val="000000"/>
           <w:sz w:val="23"/>
         </w:rPr>
-        <w:t>— 생애 6단계 · 6공동체 · 4계층으로 본 사회 재편의 원리 —</w:t>
+        <w:t>— 생애의 흐름과 공동체의 변화로 본 사회 재편의 원리 —</w:t>
       </w:r>
     </w:p>
     <w:p>
@@ -140,7 +140,7 @@
           <w:color w:val="000000"/>
           <w:sz w:val="21"/>
         </w:rPr>
-        <w:t>공동체가 개인을 빚는 것이 아니라, 개인의 생애주기적 필요가 공동체의 모양을 빚는다. 사람은 시대마다 다른 것을 필요로 했고, 그 필요가 가정에서 세계에 이르는 공동체의 형태와 역할을 바꿔 왔다. 이 글은 그 명제를 생애 6단계, 6공동체, 4계층의 세 축으로 풀어내고, 농업·산업화·디지털 세 시대에 걸쳐 공동체의 무게 중심이 어떻게 이동했는지를 따라간다. 농업 시대의 생존, 산업화 시대의 표준, 디지털 시대의 정체성 실현이라는 세 목표가 각각 다른 공동체를 빚어냈으며, 디지털 전환은 기술의 문제가 아니라 사람의 문제, 곧 생애주기의 문제임을 보인다. 브론펜브레너의 생태체계, 에릭슨의 발달단계, 센과 누스바움의 역량, 부르디외의 자본, 오스트롬의 다층 거버넌스, 퍼트넘의 사회자본, 기든스의 성찰적 자아, 에스핑안데르센의 복지국가, 폴라니의 대전환, 마이클 영의 능력주의 비판은 이 논의 곳곳에서 근거로 동원된다.</w:t>
+        <w:t>공동체가 개인을 빚는 것이 아니라, 개인의 생애주기적 필요가 공동체의 모양을 빚는다. 사람은 시대마다 다른 것을 필요로 했고, 그 필요가 가정에서 세계에 이르는 공동체의 형태와 역할을 바꿔 왔다. 이 글은 그 명제를 개인의 생애 흐름과 공동체의 변화라는 두 축으로 풀어내고, 농업·산업화·디지털 세 시대에 걸쳐 공동체의 무게 중심이 어떻게 이동했는지를 따라간다. 농업 시대의 생존, 산업화 시대의 표준, 디지털 시대의 정체성 실현이라는 세 목표가 각각 다른 공동체를 빚어냈으며, 디지털 전환은 기술의 문제가 아니라 사람의 문제, 곧 생애주기의 문제임을 보인다. 브론펜브레너의 생태체계, 에릭슨의 발달단계, 센과 누스바움의 역량, 부르디외의 자본, 오스트롬의 다층 거버넌스, 퍼트넘의 사회자본, 기든스의 성찰적 자아, 에스핑안데르센의 복지국가, 폴라니의 대전환, 마이클 영의 능력주의 비판은 이 논의 곳곳에서 근거로 동원된다.</w:t>
       </w:r>
     </w:p>
     <w:p>
@@ -166,7 +166,7 @@
           <w:color w:val="000000"/>
           <w:sz w:val="20"/>
         </w:rPr>
-        <w:t>생애주기, 공동체 전환, 정체성 실현, 4계층 격차, 디지털 전환, 역량과 자본</w:t>
+        <w:t>생애주기, 공동체 전환, 정체성 실현, 디지털 전환, 역량과 자본</w:t>
       </w:r>
     </w:p>
     <w:p>
@@ -249,7 +249,7 @@
           <w:color w:val="000000"/>
           <w:sz w:val="21"/>
         </w:rPr>
-        <w:t>이 글은 먼저 세 축(생애 6단계·6공동체·4계층)을 세우고, 세 시대에 걸친 공동체 역할의 이동을 비교한 뒤, 각 생애단계에서 기술이 만든 필요와 공동체의 응답, 그리고 계층 격차를 들여다보고, 디지털 전환이 공동체에 요구하는 재배치의 원리를 도출한다.</w:t>
+        <w:t>이 글은 먼저 두 축, 곧 개인의 생애 흐름과 공동체의 층위를 세우고, 세 시대에 걸친 공동체 역할의 이동을 비교한 뒤, 각 생애단계에서 기술이 만든 필요와 그에 대한 공동체의 응답을 들여다보고, 디지털 전환이 공동체에 요구하는 재배치의 원리를 도출한다.</w:t>
       </w:r>
     </w:p>
     <w:p>
@@ -268,7 +268,7 @@
           <w:color w:val="000000"/>
           <w:sz w:val="27"/>
         </w:rPr>
-        <w:t>2.  분석의 세 축 — 생애 6단계 · 6공동체 · 4계층</w:t>
+        <w:t>2.  두 축 — 개인의 생애 흐름과 공동체의 층위</w:t>
       </w:r>
     </w:p>
     <w:p>
@@ -284,7 +284,7 @@
           <w:color w:val="000000"/>
           <w:sz w:val="23"/>
         </w:rPr>
-        <w:t>2.1  생애 6단계 — 필요는 단계마다 달라진다</w:t>
+        <w:t>2.1  개인의 생애 — 필요는 단계마다 달라진다</w:t>
       </w:r>
     </w:p>
     <w:p>
@@ -348,7 +348,7 @@
           <w:color w:val="000000"/>
           <w:sz w:val="23"/>
         </w:rPr>
-        <w:t>2.2  6공동체 — 필요를 나누어 맡는 중첩의 층위</w:t>
+        <w:t>2.2  공동체의 층위 — 필요를 나누어 맡는 중첩 구조</w:t>
       </w:r>
     </w:p>
     <w:p>
@@ -401,22 +401,6 @@
     </w:p>
     <w:p>
       <w:pPr>
-        <w:keepNext/>
-        <w:spacing w:before="240" w:after="80"/>
-      </w:pPr>
-      <w:r>
-        <w:rPr>
-          <w:rFonts w:ascii="Noto Sans KR" w:hAnsi="Noto Sans KR" w:eastAsia="Noto Sans KR"/>
-          <w:b/>
-          <w:i w:val="0"/>
-          <w:color w:val="000000"/>
-          <w:sz w:val="23"/>
-        </w:rPr>
-        <w:t>2.3  4계층 — 같은 필요, 다른 충족</w:t>
-      </w:r>
-    </w:p>
-    <w:p>
-      <w:pPr>
         <w:spacing w:before="0" w:after="120" w:line="384" w:lineRule="auto"/>
         <w:jc w:val="both"/>
       </w:pPr>
@@ -428,39 +412,7 @@
           <w:color w:val="000000"/>
           <w:sz w:val="21"/>
         </w:rPr>
-        <w:t>같은 생애단계라도 사람마다 그 필요를 충족받는 정도는 다르다. 우리는 이 차이를 네 계층으로 포착한다. 리더는 자본과 조직과 기회를 먼저 쥐고 제도 안에서 우위를 누린다. 프로는 제도를 성실히 따르되 점수와 직무로 평가받는다. 아마는 자원이 부족해 통로가 자주 막힌다. 소외는 제도와 시장에서 아예 배제되어 기여할 길 자체가 닫힌다.</w:t>
-      </w:r>
-    </w:p>
-    <w:p>
-      <w:pPr>
-        <w:spacing w:before="0" w:after="120" w:line="384" w:lineRule="auto"/>
-        <w:jc w:val="both"/>
-      </w:pPr>
-      <w:r>
-        <w:rPr>
-          <w:rFonts w:ascii="Noto Serif KR" w:hAnsi="Noto Serif KR" w:eastAsia="Noto Serif KR"/>
-          <w:b w:val="0"/>
-          <w:i w:val="0"/>
-          <w:color w:val="000000"/>
-          <w:sz w:val="21"/>
-        </w:rPr>
-        <w:t>중요한 것은 소외 계층이 잠재력이 없는 사람이 아니라는 점이다. 누구나 모든 가능성을 지니고 태어난다고 명시한다. 소외는 능력의 부재가 아니라, 그 능력이 실제 기능으로 전환될 조건을 공동체가 제공하지 못한 결과다. 이 구분은 아마르티아 센과 마사 누스바움의 역량접근법으로 정확히 설명된다. 자원을 가졌느냐가 아니라 ‘할 수 있게 되었느냐’가 관건이며, 동일한 자원도 사람이 처한 조건에 따라 다른 기능으로 전환된다.</w:t>
-      </w:r>
-    </w:p>
-    <w:p>
-      <w:pPr>
-        <w:spacing w:before="0" w:after="120" w:line="384" w:lineRule="auto"/>
-        <w:jc w:val="both"/>
-      </w:pPr>
-      <w:r>
-        <w:rPr>
-          <w:rFonts w:ascii="Noto Serif KR" w:hAnsi="Noto Serif KR" w:eastAsia="Noto Serif KR"/>
-          <w:b w:val="0"/>
-          <w:i w:val="0"/>
-          <w:color w:val="000000"/>
-          <w:sz w:val="21"/>
-        </w:rPr>
-        <w:t>계층 격차가 생애 전체에 걸쳐 재생산되는 메커니즘은 피에르 부르디외의 자본이론이 밝혀준다. 리더 계층은 경제·문화·사회자본을 두루 갖추고, 소외 계층은 그 셋 모두의 결핍 속에서 가능성의 지평 자체가 좁게 설정된다. 유아기에 ‘발견을 도울 환경이 없던 아이’가 중장년에 이르러 ‘경력 단절이 곧 사회적 퇴출로 이어지는 사람’이 되는 경로는, 격차가 한 시점의 문제가 아니라 생애에 걸친 누적임을 보여준다.</w:t>
+        <w:t>두 축은 따로 놀지 않는다. 생애의 각 단계에서 생겨난 필요는 곧바로 ‘어느 공동체가 그 필요를 맡을 것인가’라는 물음으로 이어진다. 필요가 깊어지고 종류가 달라질수록, 그 필요를 받아내는 공동체의 무게 중심도 가정에서 마을로, 마을에서 도시로, 도시에서 국가와 세계로 이동한다. 이 글의 분석은 바로 이 두 축이 맞물리는 지점—생애 단계의 필요가 공동체의 형태를 호출하는 순간—을 따라간다.</w:t>
       </w:r>
     </w:p>
     <w:p>
@@ -706,7 +658,7 @@
           <w:color w:val="000000"/>
           <w:sz w:val="21"/>
         </w:rPr>
-        <w:t>디지털 기술은 이 단계에서 개인의 출발선을 바꾼다. 생체·행동 데이터를 읽는 기술이 등장하면서, 아이가 타고난 기질과 강점의 단서를 예전보다 훨씬 일찍 포착할 수 있게 되었다. 이 기술 변화가 새로운 필요를 만든다. 농업 시대에는 무사한 출산과 건강한 몸이면 충분했고, 산업화 시대에는 표준 발달표에 맞는 안정된 양육이 목표였다. 디지털 시대에는 타고난 단서를 일찍 읽어 기록하는 일이 필요가 된다. 그래서 공동체도 달라진다. 가정은 단순 양육의 자리에서 ‘단서를 가장 먼저 읽고 기록하는 생활 기반’으로 역할이 바뀐다. 그러나 리더 계층의 아이는 데이터로 단서가 풍부하게 읽히는 반면, 소외 계층의 아이는 데이터도 관찰도 닿지 않는 곳에 남는다. 제임스 헥만이 보였듯 생애 초기 투자는 이후 어느 시기보다 높은 수익을 낳으므로, 국가가 먼저 찾아가 기초 돌봄을 보장하는 역할을 새로 맡는다.</w:t>
+        <w:t>디지털 기술은 이 단계에서 개인의 출발선을 바꾼다. 생체·행동 데이터를 읽는 기술이 등장하면서, 아이가 타고난 기질과 강점의 단서를 예전보다 훨씬 일찍 포착할 수 있게 되었다. 이 기술 변화가 새로운 필요를 만든다. 농업 시대에는 무사한 출산과 건강한 몸이면 충분했고, 산업화 시대에는 표준 발달표에 맞는 안정된 양육이 목표였다. 디지털 시대에는 타고난 단서를 일찍 읽어 기록하는 일이 필요가 된다. 그래서 공동체도 달라진다. 가정은 단순 양육의 자리에서 ‘단서를 가장 먼저 읽고 기록하는 생활 기반’으로 역할이 바뀐다. 다만 이 기술은 누구에게나 똑같이 닿지 않는다. 데이터와 관찰이 풍부한 가정의 아이는 단서가 일찍 읽히지만, 그런 환경이 없는 아이는 출발선 바깥에 남는다. 제임스 헥만이 보였듯 생애 초기 투자는 이후 어느 시기보다 높은 수익을 낳으므로, 국가가 먼저 찾아가 기초 돌봄을 보장하는 역할을 새로 맡는다.</w:t>
       </w:r>
     </w:p>
     <w:p>
@@ -738,7 +690,7 @@
           <w:color w:val="000000"/>
           <w:sz w:val="21"/>
         </w:rPr>
-        <w:t>농업 시대의 아이는 집안일과 농사일을 익히며 자랐고, 산업화 시대의 아이는 취학 준비와 또래에 뒤지지 않는 기초 학력에 매였다. 디지털 시대의 목표는 다양한 체험으로 관심과 강점을 발견하고 실험하는 것이다. 산업화 시대에는 가정과 학교, 국가의 의무 교육만이 관여했지만, 디지털 시대에는 가정·이웃·마을·도시·국가가 함께 역할을 나눈다. 리더 계층은 폭넓은 체험으로 강점을 또렷이 하고, 아마 계층은 마을 공동 프로그램으로, 소외 계층은 국가와 마을이 먼저 채우는 체험과 돌봄으로 출발선에 선다. 이 분산 구조는 브론펜브레너가 말한 중간체계—가정·이웃·마을이 서로 맞물려 시너지를 내는 구조—를 제도로 구현한 것이다.</w:t>
+        <w:t>농업 시대의 아이는 집안일과 농사일을 익히며 자랐고, 산업화 시대의 아이는 취학 준비와 또래에 뒤지지 않는 기초 학력에 매였다. 디지털 시대의 목표는 다양한 체험으로 관심과 강점을 발견하고 실험하는 것이다. 산업화 시대에는 가정과 학교, 국가의 의무 교육만이 관여했지만, 디지털 시대에는 가정·이웃·마을·도시·국가가 함께 역할을 나눈다. 체험 자원이 풍부한 아이는 폭넓은 경험으로 강점을 또렷이 하지만, 그렇지 못한 아이를 위해 마을의 공동 프로그램과 국가의 돌봄이 발견의 기회를 먼저 채운다. 이 분산 구조는 브론펜브레너가 말한 중간체계—가정·이웃·마을이 서로 맞물려 시너지를 내는 구조—를 제도로 구현한 것이다.</w:t>
       </w:r>
     </w:p>
     <w:p>
@@ -770,7 +722,7 @@
           <w:color w:val="000000"/>
           <w:sz w:val="21"/>
         </w:rPr>
-        <w:t>이 단계는 정체성의 위기가 가장 첨예한 시기다. 산업화 시대의 청소년은 입시 경쟁에서 좋은 성적과 상급 학교 진학에 모든 것을 걸었다. 리더는 원하는 진로를 골랐지만, 프로는 점수에 진로를 빼앗기고, 아마는 성적에 밀려 다른 재능을 묻고, 소외는 진학 탈락으로 길이 막혔다. 마이클 영이 경고한 능력주의의 함정이 바로 이 장면이다. 시험이 삶을 재단하고, 실패는 구조가 아니라 개인의 능력 부족으로 귀속되어 소외 계층에게 이중의 고통을 안긴다. 디지털 시대는 연결 공동체를 도시의 입시 기관에서 마을의 멘토와 훈련 경로로 옮긴다. 강점이 점수 서열 바깥에서 길러질 수 있는 공간을 마을이 연다.</w:t>
+        <w:t>이 단계는 정체성의 위기가 가장 첨예한 시기다. 산업화 시대의 청소년은 입시 경쟁에서 좋은 성적과 상급 학교 진학에 모든 것을 걸었다. 성적이 좋은 소수는 원하는 진로를 골랐지만, 대다수는 점수에 진로를 빼앗기고 다른 재능을 묻어야 했으며, 진학에서 탈락한 이는 길 자체가 막혔다. 마이클 영이 경고한 능력주의의 함정이 바로 이 장면이다. 시험이 삶을 재단하고, 실패는 구조가 아니라 개인의 능력 부족으로 귀속되어 탈락한 이에게 이중의 고통을 안긴다. 디지털 시대는 연결 공동체를 도시의 입시 기관에서 마을의 멘토와 훈련 경로로 옮긴다. 강점이 점수 서열 바깥에서 길러질 수 있는 공간을 마을이 연다.</w:t>
       </w:r>
     </w:p>
     <w:p>
@@ -802,7 +754,7 @@
           <w:color w:val="000000"/>
           <w:sz w:val="21"/>
         </w:rPr>
-        <w:t>디지털 기술은 이 단계에서 개인이 일하는 방식을 가장 크게 바꾼다. AI·데이터·플랫폼이 기획·제작·유통의 비용을 낮추면서, 개인은 큰 조직에 들어가야만 생산자가 되던 제약에서 풀려난다. 이 변화가 새로운 필요를 만든다. 농업 시대에는 물려받을 토지와 혼인으로 가정을 이루는 것이, 산업화 시대에는 좋은 직장 취업과 정규직 정착이 청년의 목표였다. 디지털 시대에는 자기 정체성을 실제 기여로 발휘할 무대 자체가 필요가 된다. 그래서 공동체도 달라진다. 도시는 일자리를 배분하던 자리에서 정체성을 기여로 발휘하는 무대가 되고, 세계가 처음으로 연결 공동체로 등장한다. 국경을 넘는 협업 시장이 열리면서 국내 노동시장의 협소함을 우회할 길이 생기기 때문이다. 리더는 창업과 전문직으로 도시와 세계 무대에서 발휘하지만, 소외 계층에게는 진입 장벽을 낮춰 첫 기여를 잇는 지원이 필요하다. 이는 에스핑안데르센이 지식경제 복지국가에서 강조한 ‘사회적 투자’—역량이 기여로 발현되도록 미리 조건을 까는 일—와 맞닿는다.</w:t>
+        <w:t>디지털 기술은 이 단계에서 개인이 일하는 방식을 가장 크게 바꾼다. AI·데이터·플랫폼이 기획·제작·유통의 비용을 낮추면서, 개인은 큰 조직에 들어가야만 생산자가 되던 제약에서 풀려난다. 이 변화가 새로운 필요를 만든다. 농업 시대에는 물려받을 토지와 혼인으로 가정을 이루는 것이, 산업화 시대에는 좋은 직장 취업과 정규직 정착이 청년의 목표였다. 디지털 시대에는 자기 정체성을 실제 기여로 발휘할 무대 자체가 필요가 된다. 그래서 공동체도 달라진다. 도시는 일자리를 배분하던 자리에서 정체성을 기여로 발휘하는 무대가 되고, 세계가 처음으로 연결 공동체로 등장한다. 국경을 넘는 협업 시장이 열리면서 국내 노동시장의 협소함을 우회할 길이 생기기 때문이다. 다만 발휘의 무대에 먼저 올라서는 사람과 무대 바깥에 머무는 사람의 간격은 크다. 무대가 없던 이에게 진입 장벽을 낮춰 첫 기여를 잇는 지원이 필요한 까닭이다. 이는 에스핑안데르센이 지식경제 복지국가에서 강조한 ‘사회적 투자’—역량이 기여로 발현되도록 미리 조건을 까는 일—와 맞닿는다.</w:t>
       </w:r>
     </w:p>
     <w:p>
@@ -834,7 +786,7 @@
           <w:color w:val="000000"/>
           <w:sz w:val="21"/>
         </w:rPr>
-        <w:t>이 단계는 디지털 전환의 혜택과 위험이 가장 불균등하게 갈리는 시기다. 산업화 시대의 목표는 고용 유지와 가족 부양, 사회적 지위였다. 디지털 시대의 목표는 강점을 재설계하고 새 영역에 도전하는 것이다. 그러나 프로 계층은 재학습 없이 기술 변화 앞에 버티고, 아마 계층은 고용 불안에 경력 중단의 위험을 안으며, 소외 계층은 실직이 곧 사회적 퇴출로 이어져 회복이 어렵다. 부르디외의 관점에서 보면, 중장년기의 전환 실패는 생애에 걸쳐 쌓인 자본 격차가 임계점을 넘어 회복 불가능한 붕괴로 치닫는 국면이다. 이에 대해 우리는 마을의 재학습 접근과 국가·가정의 전환기 보호로 응답한다.</w:t>
+        <w:t>이 단계는 디지털 전환의 혜택과 위험이 가장 불균등하게 갈리는 시기다. 산업화 시대의 목표는 고용 유지와 가족 부양, 사회적 지위였다. 디지털 시대의 목표는 강점을 재설계하고 새 영역에 도전하는 것이다. 그러나 재학습의 기회를 얻은 사람은 변화의 물결에 올라타지만, 그렇지 못한 사람은 기술 변화 앞에서 버티다 고용 불안과 경력 중단의 위험을 안고, 한번 실직하면 회복이 어렵다. 부르디외의 자본이론이 보여주듯, 중장년기의 전환 실패는 생애에 걸쳐 쌓인 자본의 격차가 임계점을 넘어 회복하기 어려운 지점으로 치닫는 국면이다. 마을의 재학습 접근과 국가·가정의 전환기 보호가 필요한 까닭이다.</w:t>
       </w:r>
     </w:p>
     <w:p>
@@ -866,7 +818,7 @@
           <w:color w:val="000000"/>
           <w:sz w:val="21"/>
         </w:rPr>
-        <w:t>농업 시대의 노인은 권위와 봉양을 누렸고, 산업화 시대의 노인은 은퇴와 함께 부양의 대상으로 남았다. 디지털 시대의 노년기 재정의는 과감하다. 건강을 미리 예측하고 예방하며, 존엄과 판단의 주도권을 지키는 시기로 본다. 리더 계층은 멘토와 자문으로 후속 세대와 경험을 잇는 현역 전수자가 된다. 이 단계에는 가정의 예방·돌봄·존엄, 이웃의 관계 유지, 도시의 건강 예측·생활 의료, 국가의 소득·최소 권리선이 역할을 나눈다. 에스핑안데르센의 탈상품화 원리—노인이 시장에 의존하지 않고도 인간다운 삶을 유지해야 한다는—는 소외 노인을 고립에서 건져 돌봄과 역할로 다시 잇는 설계로 구현된다. 이는 에릭슨이 노년의 과업으로 본 ‘자아통합 대 절망’의 위기에 대한 사회적 응답이기도 하다.</w:t>
+        <w:t>농업 시대의 노인은 권위와 봉양을 누렸고, 산업화 시대의 노인은 은퇴와 함께 부양의 대상으로 남았다. 디지털 시대의 노년기 재정의는 과감하다. 건강을 미리 예측하고 예방하며, 존엄과 판단의 주도권을 지키는 시기로 본다. 경험을 쌓은 이는 멘토와 자문으로 후속 세대와 경험을 잇는 현역 전수자가 된다. 이 단계에는 가정의 예방·돌봄·존엄, 이웃의 관계 유지, 도시의 건강 예측·생활 의료, 국가의 소득·최소 권리선이 역할을 나눈다. 에스핑안데르센의 탈상품화 원리—노인이 시장에 의존하지 않고도 인간다운 삶을 유지해야 한다는—는 고립 위기의 노인을 돌봄과 역할로 다시 잇는 설계로 구현된다. 이는 에릭슨이 노년의 과업으로 본 ‘자아통합 대 절망’의 위기에 대한 사회적 응답이기도 하다.</w:t>
       </w:r>
     </w:p>
     <w:p>
@@ -917,7 +869,7 @@
           <w:color w:val="000000"/>
           <w:sz w:val="21"/>
         </w:rPr>
-        <w:t>디지털 시대의 생애주기는 한 방향으로 자라는 직선이 아니라, 앞 단계의 결과가 다음 단계의 조건이 되는 나선형 누적 구조다. 중장년의 재설계는 청소년기의 훈련이 성공했을 때 가능하고, 노년의 전수는 청년·중장년의 발휘가 쌓였을 때 의미를 갖는다. 그래서 초기 단계의 계층 격차는 단순한 기회 불평등이 아니라 생애 전체 사이클의 단절을 뜻한다. 초기에 역량이 기능으로 전환되지 못하면 이후 단계의 확장 자체가 막힌다. 헥만이 실증한 초기 투자의 복리 효과는 이 사이클 논리의 경제학적 표현이다.</w:t>
+        <w:t>디지털 시대의 생애주기는 한 방향으로 자라는 직선이 아니라, 앞 단계의 결과가 다음 단계의 조건이 되는 나선형 누적 구조다. 중장년의 재설계는 청소년기의 훈련이 성공했을 때 가능하고, 노년의 전수는 청년·중장년의 발휘가 쌓였을 때 의미를 갖는다. 그래서 초기 단계의 격차는 단순한 기회 불평등이 아니라 생애 전체 사이클의 단절을 뜻한다. 초기에 역량이 기능으로 전환되지 못하면 이후 단계의 확장 자체가 막힌다. 헥만이 실증한 초기 투자의 복리 효과는 이 사이클 논리의 경제학적 표현이다.</w:t>
       </w:r>
     </w:p>
     <w:p>
@@ -976,7 +928,7 @@
           <w:color w:val="000000"/>
           <w:sz w:val="21"/>
         </w:rPr>
-        <w:t xml:space="preserve">둘째, 소외 계층에게는 표준이 아니라 맞춤이 필요하다. </w:t>
+        <w:t xml:space="preserve">둘째, 제도의 손길이 닿지 않는 사람에게는 표준이 아니라 맞춤이 필요하다. </w:t>
       </w:r>
       <w:r>
         <w:rPr>
@@ -986,7 +938,7 @@
           <w:color w:val="000000"/>
           <w:sz w:val="21"/>
         </w:rPr>
-        <w:t>기다리는 제도가 아니라 ‘먼저 찾아가는’ 공동체의 능동성이 소외를 줄인다.</w:t>
+        <w:t>기다리는 제도가 아니라 ‘먼저 찾아가는’ 공동체의 능동성이 배제를 줄인다.</w:t>
       </w:r>
     </w:p>
     <w:p>
@@ -1150,7 +1102,7 @@
           <w:color w:val="000000"/>
           <w:sz w:val="21"/>
         </w:rPr>
-        <w:t xml:space="preserve">셋째, 소외 계층에게 선제적·능동적으로 다가간다. </w:t>
+        <w:t xml:space="preserve">셋째, 배제된 사람에게 선제적·능동적으로 다가간다. </w:t>
       </w:r>
       <w:r>
         <w:rPr>
@@ -1246,7 +1198,7 @@
           <w:color w:val="000000"/>
           <w:sz w:val="21"/>
         </w:rPr>
-        <w:t>이 분석에는 한계가 있다. 생애단계와 계층 구분은 이상형이어서 현실의 경계는 훨씬 유동적이며, 특히 청년기와 중장년기의 구분이 점점 흐려지고 있다. 여섯 공동체의 역할도 상호 배타적이지 않아 실제로는 여러 공동체가 같은 기능을 겹쳐 수행한다. 동원한 이론들은 주로 서구의 경험에서 나온 것이어서 한국 사회의 빠른 산업화와 교육열, 가족 구조의 급변을 온전히 담지 못할 수 있다. 무엇보다 디지털 시대의 공동체 모델은 아직 진행 중인 과정이며, 여기서 그린 그림은 실증이 아니라 규범적 지향에 가깝다.</w:t>
+        <w:t>이 분석에는 한계가 있다. 생애단계 구분은 이상형이어서 현실의 경계는 훨씬 유동적이며, 특히 청년기와 중장년기의 구분이 점점 흐려지고 있다. 여섯 공동체의 역할도 상호 배타적이지 않아 실제로는 여러 공동체가 같은 기능을 겹쳐 수행한다. 동원한 이론들은 주로 서구의 경험에서 나온 것이어서 한국 사회의 빠른 산업화와 교육열, 가족 구조의 급변을 온전히 담지 못할 수 있다. 무엇보다 디지털 시대의 공동체 모델은 아직 진행 중인 과정이며, 여기서 그린 그림은 실증이 아니라 규범적 지향에 가깝다.</w:t>
       </w:r>
     </w:p>
     <w:p>
@@ -1570,22 +1522,6 @@
           <w:sz w:val="19"/>
         </w:rPr>
         <w:t>Young, M. (1958). The Rise of the Meritocracy: 1870–2033. Thames and Hudson.</w:t>
-      </w:r>
-    </w:p>
-    <w:p>
-      <w:pPr>
-        <w:spacing w:after="60" w:line="324" w:lineRule="auto"/>
-        <w:ind w:left="454" w:hanging="454"/>
-      </w:pPr>
-      <w:r>
-        <w:rPr>
-          <w:rFonts w:ascii="Noto Serif KR" w:hAnsi="Noto Serif KR" w:eastAsia="Noto Serif KR"/>
-          <w:b w:val="0"/>
-          <w:i w:val="0"/>
-          <w:color w:val="000000"/>
-          <w:sz w:val="19"/>
-        </w:rPr>
-        <w:t>태재미래전략연구원. (2026). 마스터플랜 내부 데이터: 개인 생애주기·6공동체·4계층 데이터 [내부 자료].</w:t>
       </w:r>
     </w:p>
     <w:sectPr>

</xml_diff>

<commit_message>
docs: rewrite P2 report on rights-delegation contract frame
</commit_message>
<xml_diff>
--- a/archive/docx/p2-lifecycle-community-report.docx
+++ b/archive/docx/p2-lifecycle-community-report.docx
@@ -34,9 +34,9 @@
           <w:color w:val="000000"/>
           <w:sz w:val="44"/>
         </w:rPr>
-        <w:t>개인의 생애주기적 필요와</w:t>
+        <w:t>개인의 필요와 공동체</w:t>
         <w:br/>
-        <w:t>공동체의 구조적 전환</w:t>
+        <w:t>— 권리 위임의 계약으로 본 시대별 전환 —</w:t>
       </w:r>
     </w:p>
     <w:p>
@@ -52,7 +52,7 @@
           <w:color w:val="000000"/>
           <w:sz w:val="23"/>
         </w:rPr>
-        <w:t>— 생애의 흐름과 공동체의 변화로 본 사회 재편의 원리 —</w:t>
+        <w:t>생애의 흐름, 노동의 원리, 공동체의 형성·기능, 권리 위임과 회수의 구조</w:t>
       </w:r>
     </w:p>
     <w:p>
@@ -140,7 +140,7 @@
           <w:color w:val="000000"/>
           <w:sz w:val="21"/>
         </w:rPr>
-        <w:t>공동체가 개인을 빚는 것이 아니라, 개인의 생애주기적 필요가 공동체의 모양을 빚는다. 사람은 시대마다 다른 것을 필요로 했고, 그 필요가 가정에서 세계에 이르는 공동체의 형태와 역할을 바꿔 왔다. 이 글은 그 명제를 개인의 생애 흐름과 공동체의 변화라는 두 축으로 풀어내고, 농업·산업화·디지털 세 시대에 걸쳐 공동체의 무게 중심이 어떻게 이동했는지를 따라간다. 농업 시대의 생존, 산업화 시대의 표준, 디지털 시대의 정체성 실현이라는 세 목표가 각각 다른 공동체를 빚어냈으며, 디지털 전환은 기술의 문제가 아니라 사람의 문제, 곧 생애주기의 문제임을 보인다. 브론펜브레너의 생태체계, 에릭슨의 발달단계, 센과 누스바움의 역량, 부르디외의 자본, 오스트롬의 다층 거버넌스, 퍼트넘의 사회자본, 기든스의 성찰적 자아, 에스핑안데르센의 복지국가, 폴라니의 대전환, 마이클 영의 능력주의 비판은 이 논의 곳곳에서 근거로 동원된다.</w:t>
+        <w:t>공동체는 개인이 자신의 필요에 의해, 자신이 가진 권리의 일부를 위임하는 일종의 계약을 통해 구현되는 실체다. 개인이 먼저 있고, 그 개인이 생애의 단계마다 다른 필요를 마주하며, 그 필요를 감당하기 위해 시간·자원·결정권 등 자신의 권리 일부를 특정 공동체에 위임한다. 위임의 집합이 공동체라는 실체를 만들고, 더 이상 그 공동체를 필요로 하지 않을 때 개인은 위임한 권리를 거두어들일 수 있어야 한다. 이 연구는 그 '위임과 회수의 계약 논리'를 이론적 토대로 삼아, 농업·산업화·디지털 세 시대의 노동 원리, 생애주기별 개인의 필요, 그 필요에 응답하는 공동체의 형성과 역할을 정합적으로 연결한다. 산업화 시대에 국가라는 특정 공동체로 권리가 과도하게 집중·고착되면서 위임의 회수가 어려워졌고, 표준화·획일화·중앙집중의 폐해가 생겼다는 것이 이 연구의 비판적 초점이다. 디지털 시대는 그 집중된 권리를 가정·이웃·마을·도시·국가·세계 여러 층위로 다시 분산하는 전환으로 해석된다. 사회계약론(홉스·로크·루소), 오스트롬의 다층 거버넌스, 브론펜브레너의 생태체계, 에릭슨의 발달단계, 센·누스바움의 역량 이론, 폴라니의 재착근이 이론적 근거로 동원된다.</w:t>
       </w:r>
     </w:p>
     <w:p>
@@ -166,7 +166,7 @@
           <w:color w:val="000000"/>
           <w:sz w:val="20"/>
         </w:rPr>
-        <w:t>생애주기, 공동체 전환, 정체성 실현, 디지털 전환, 역량과 자본</w:t>
+        <w:t>권리 위임, 권리 회수, 계약으로서의 공동체, 생애주기, 노동 원리, 디지털 전환, 사회계약론</w:t>
       </w:r>
     </w:p>
     <w:p>
@@ -185,7 +185,7 @@
           <w:color w:val="000000"/>
           <w:sz w:val="27"/>
         </w:rPr>
-        <w:t>1.  서론 — 왜 ‘개인의 생애주기적 필요’가 출발점인가</w:t>
+        <w:t>1.  서론 — 공동체는 어떻게 생겨나는가</w:t>
       </w:r>
     </w:p>
     <w:p>
@@ -201,7 +201,7 @@
           <w:color w:val="000000"/>
           <w:sz w:val="21"/>
         </w:rPr>
-        <w:t>출발점은 통념을 뒤집는 데 있다. 사회과학은 오랫동안 공동체를 원인으로, 개인의 삶을 결과로 다루어 왔다. 국가가 제도를 설계하고, 시장이 인센티브를 부여하며, 가족이 규범을 전수한다는 하향식 그림이다. 이 글은 인과의 방향을 거꾸로 세운다. 먼저 개인이 있고, 그 개인이 생애 단계마다 다른 것을 필요로 하며, 그 필요의 총합이 공동체의 형태를 결정한다.</w:t>
+        <w:t>공동체란 무엇인가. 통념은 공동체를 개인에 앞서는 배경으로 다룬다. 국가가 제도를 설계하고 개인에게 부과하며, 가족이 규범을 전수하고 학교가 역할을 주입한다는 하향식 그림이다. 그러나 이 연구는 인과의 방향을 거꾸로 세운다. 개인이 먼저 있고, 그 개인이 살아가면서 마주치는 필요가 공동체를 불러낸다. 공동체는 개인이 자신의 필요에 의해 자신이 가진 권리의 일부를 위임하는 계약을 통해 구현되는 실체다. 개인의 권리 위임이 없으면 공동체는 존재하지 않으며, 위임이 철회되면 그 공동체는 근거를 잃는다.</w:t>
       </w:r>
     </w:p>
     <w:p>
@@ -217,7 +217,7 @@
           <w:color w:val="000000"/>
           <w:sz w:val="21"/>
         </w:rPr>
-        <w:t>농업 공동체의 씨족과 촌락은 대를 잇고 땅을 지켜야 하는 생존의 필요에서 생겨났다. 산업화 시대의 학교·공장·복지국가는 표준 노동력을 원하는 경제와 좋은 일자리를 원하는 개인이 맞물려 만들어졌다. 디지털 시대의 플랫폼과 프로젝트 공동체는 저마다의 정체성을 발휘하려는 개인의 필요가 밀어 올리고 있다. 세 전환 모두에서 공동체를 움직인 최초의 힘은 개인의 생애주기적 필요였다. 칼 폴라니가 『거대한 전환』에서 말한 재착근—시장과 제도가 결국 사회적 관계 속에 다시 뿌리내려야 한다는 통찰—은 이 시대 전환을 읽는 한 틀이 된다.</w:t>
+        <w:t>이 정의는 서구 근대 철학의 사회계약론과 직결된다. 17세기 영국의 철학자 토머스 홉스는 『리바이어던』(1651)에서, 인간이 '만인의 만인에 대한 전쟁' 상태를 벗어나기 위해 자신의 권리를 통치자에게 넘긴다는 계약을 상상했다. 그는 생존을 위한 권리 위임이 공동체(국가)를 만든다고 보았다. 그러나 홉스의 모델에서 위임은 사실상 회수 불가능하다. 한번 넘긴 권리는 절대 권력에 귀속되고, 개인은 다시 꺼내올 수 없다. 이것이 바로 권리 집중의 원형이다. 산업화 시대가 국가 중심으로 권리를 집중시킨 구조는 홉스적 설계의 현대적 구현이었다고 볼 수 있다.</w:t>
       </w:r>
     </w:p>
     <w:p>
@@ -233,7 +233,7 @@
           <w:color w:val="000000"/>
           <w:sz w:val="21"/>
         </w:rPr>
-        <w:t>이 글의 논리는 하나의 인과 사슬을 따른다. 디지털 기술이 개인이 할 수 있는 일과 맡는 역할을 바꾸고, 그 변화가 생애 단계마다 새로운 필요를 만들며, 그 필요에 응답하기 위해 공동체의 형태와 역할이 다시 짜인다. 기술이 개인을 바꾸고, 개인이 필요를 낳고, 필요가 공동체를 빚는다. 농업 시대에는 땅과 노동의 기술이 생존의 필요를 낳아 자급 공동체를 빚었고, 산업화 시대에는 대량생산과 표준화 기술이 좋은 일자리의 필요를 낳아 학교와 공장과 복지국가를 빚었다. 디지털 시대에는 AI·데이터·연결의 기술이 정체성을 발휘하려는 필요를 낳아 공동체를 다시 빚는다. 이 글은 그 마지막 전환을 농업·산업화 시대와 나란히 놓고 추적한다.</w:t>
+        <w:t>이에 맞서는 목소리는 같은 세기 말에 등장한다. 존 로크는 『통치론』(1689)에서 사람들이 통치자에게 권력을 맡기는 것은 어디까지나 '신탁(trust)', 곧 믿고 맡기는 것일 뿐이며, 통치자가 그 믿음을 저버리면 사람들은 맡긴 권력을 도로 거두어들일 권리가 있다고 보았다. 로크의 신탁과 저항권은 이 연구가 말하는 '위임은 회수 가능해야 한다'는 주장의 직접적인 이론적 뿌리다. 18세기 프랑스의 사상가 장자크 루소는 『사회계약론』(1762)에서 '일반의지'라는 개념을 통해 권리가 한 사람이나 한 기관에 집중되어서는 안 되고, 공동체 구성원 모두에게 골고루 돌아가야 한다고 보았다. 루소는 자치와 분산의 원리를 옹호한 사상가였다. 이 세 사람의 논의를 한 줄로 읽으면, 공동체는 개인이 권리를 위임함으로써 만들어지되(홉스), 그 위임은 언제든 회수할 수 있어야 하며(로크), 권리는 어느 한 곳에 집중되어서는 안 된다(루소)는 명제가 된다. 이것이 이 연구의 이론적 뼈대다.</w:t>
       </w:r>
     </w:p>
     <w:p>
@@ -249,7 +249,7 @@
           <w:color w:val="000000"/>
           <w:sz w:val="21"/>
         </w:rPr>
-        <w:t>이 글은 먼저 두 축, 곧 개인의 생애 흐름과 공동체의 층위를 세우고, 세 시대에 걸친 공동체 역할의 이동을 비교한 뒤, 각 생애단계에서 기술이 만든 필요와 그에 대한 공동체의 응답을 들여다보고, 디지털 전환이 공동체에 요구하는 재배치의 원리를 도출한다.</w:t>
+        <w:t>이 뼈대 위에 이 연구는 세 개의 물음을 던진다. 첫째, 시대마다 달랐던 노동의 원리는 어떻게 개인의 필요와 공동체의 형태를 규정했는가. 둘째, 생애주기의 단계마다 달라지는 개인의 필요에 어떤 공동체가 어떻게 응답해 왔는가. 셋째, 디지털 시대의 전환은 왜 권리의 재분산이라는 관점에서 읽혀야 하는가. 이 세 물음에 대한 답이 서로 정합적으로 이어질 때, 우리는 생애주기와 공동체에 관한 하나의 완결된 논리를 갖게 된다.</w:t>
       </w:r>
     </w:p>
     <w:p>
@@ -268,7 +268,7 @@
           <w:color w:val="000000"/>
           <w:sz w:val="27"/>
         </w:rPr>
-        <w:t>2.  두 축 — 개인의 생애 흐름과 공동체의 층위</w:t>
+        <w:t>2.  이론적 토대 — 권리 위임의 계약으로 본 공동체</w:t>
       </w:r>
     </w:p>
     <w:p>
@@ -284,7 +284,7 @@
           <w:color w:val="000000"/>
           <w:sz w:val="23"/>
         </w:rPr>
-        <w:t>2.1  개인의 생애 — 필요는 단계마다 달라진다</w:t>
+        <w:t>2.1  공동체 = 권리 위임의 계약적 실체</w:t>
       </w:r>
     </w:p>
     <w:p>
@@ -300,7 +300,7 @@
           <w:color w:val="000000"/>
           <w:sz w:val="21"/>
         </w:rPr>
-        <w:t>이 글은 인간의 생애를 여섯 단계로 나눈다. 태아·영아기는 가능성의 단서가 처음 드러나는 시기다. 유아·아동기는 그 단서를 체험으로 발견하고 실험하는 시기다. 청소년기는 강점을 골라 훈련하며 방향을 정하는 시기다. 청년기는 그 강점을 실제 기여로 발휘하는 시기다. 중장년기는 쌓은 역량을 재설계하고 새 영역으로 확장하는 시기다. 노년기는 경험을 다음 세대로 전수하고 세대를 연결하는 시기다.</w:t>
+        <w:t>공동체를 '권리 위임의 계약으로 구현된 실체'로 정의하는 것은 단순한 은유가 아니다. 개인이 가정에 시간과 돌봄을 바치는 것은 가정에 권리를 위임하는 행위다. 마을의 자치 조직에 결정권을 맡기는 것도, 국가에 세금을 내고 법을 따르는 것도 모두 자신의 권리 일부를 특정 공동체에 넘기는 계약 행위다. 이 관점에서 보면 공동체의 크기와 권한은 그 공동체에 얼마나 많은 권리가 위임되어 있느냐에 따라 결정된다. 위임이 많을수록 공동체는 강력해지고, 위임이 철회되면 공동체는 힘을 잃는다.</w:t>
       </w:r>
     </w:p>
     <w:p>
@@ -316,7 +316,7 @@
           <w:color w:val="000000"/>
           <w:sz w:val="21"/>
         </w:rPr>
-        <w:t>산업화 시대에 이 여섯 단계를 부르던 말은 달랐다. 취학 준비, 입시 경쟁, 취업과 정착, 고용 유지, 은퇴와 부양. 모두 외부 제도에 자신을 맞추는 적응의 언어다. 반면 디지털 시대의 단계어—발견, 훈련, 발휘, 재설계, 전수—는 내적 역량이 펼쳐지는 전개의 언어다. 같은 생애가 ‘제도에 맞추는 일’에서 ‘자기를 펼치는 일’로 의미가 바뀐다.</w:t>
+        <w:t>그렇다면 개인은 왜 권리를 위임하는가. 답은 단순하다. 필요 때문이다. 혼자서는 감당할 수 없는 필요가 생길 때, 개인은 그 필요를 충족할 수 있는 공동체에 권리를 위임한다. 아이를 낳고 기르는 필요는 가정이라는 공동체에 시간과 자원을 위임하게 한다. 안전의 필요는 마을과 국가에 결정권을 위임하게 한다. 노년의 의존 필요는 가정과 국가 모두에 돌봄과 소득의 권리를 위임하게 한다. 필요가 변하면 위임의 대상과 규모도 바뀐다.</w:t>
       </w:r>
     </w:p>
     <w:p>
@@ -332,7 +332,7 @@
           <w:color w:val="000000"/>
           <w:sz w:val="21"/>
         </w:rPr>
-        <w:t>이 단계 구분은 에릭 에릭슨의 심리사회적 발달론과 공명한다. 에릭슨이 청소년기에 배치한 ‘정체성 대 역할 혼미’의 위기는 이 글의 ‘훈련·방향 정함’ 단계와 정확히 겹치고, 중장년기의 ‘생산성 대 침체’ 위기는 ‘재설계·확장’ 단계와 맞물린다. 우리는 이 발달 위기를 개인의 심리 문제가 아니라 공동체가 응답해야 할 사회적 과제로 재정의한다.</w:t>
+        <w:t>인도의 경제학자 아마르티아 센은 개발을 자유의 확장으로 정의했다(『자유로서의 발전』, 1999). 센은 단순히 소득이 있다는 것이 아니라, 개인이 실제로 할 수 있는 일과 될 수 있는 존재의 폭이 넓어지는 것이 진정한 발전이라고 보았다. 철학자 마사 누스바움은 이를 '역량(capabilities)'이라는 개념으로 구체화했다 (『역량의 창조』, 2011). 역량이란 단지 이론적 가능성이 아니라 실제로 실행할 수 있는 능력을 가리킨다. 공동체가 개인에게 역량을 제공하는 한에서만 위임은 정당성을 갖는다. 역량을 빼앗는 공동체는 위임을 받을 근거가 없다.</w:t>
       </w:r>
     </w:p>
     <w:p>
@@ -348,7 +348,7 @@
           <w:color w:val="000000"/>
           <w:sz w:val="23"/>
         </w:rPr>
-        <w:t>2.2  공동체의 층위 — 필요를 나누어 맡는 중첩 구조</w:t>
+        <w:t>2.2  위임은 회수 가능해야 한다 — 산업화 시대 권리 집중의 문제</w:t>
       </w:r>
     </w:p>
     <w:p>
@@ -364,7 +364,7 @@
           <w:color w:val="000000"/>
           <w:sz w:val="21"/>
         </w:rPr>
-        <w:t>개인의 필요는 한 공동체가 다 떠맡을 수 없다. 이 글은 그 필요를 가정·이웃·마을·도시·국가·세계 여섯 층위가 나누어 맡는다고 본다. 가정은 개인이 매일 부대끼는 가장 가까운 자리다. 이웃과 마을은 그 가정들이 서로 연결되는 생활권이다. 도시는 일과 배움과 기회가 모이는 무대다. 국가는 규칙과 안전망을 세우는 층위이며, 세계는 국경을 넘는 위험을 함께 다루는 층위다.</w:t>
+        <w:t>로크의 신탁 이론이 핵심적으로 가리키는 것은, 위임은 조건부라는 점이다. 개인이 국가에 권리를 넘기는 것은 국가가 그 권리를 올바르게 사용하리라는 믿음을 전제로 한다. 그 믿음이 깨지면 권리는 다시 개인에게로 돌아와야 한다. 그런데 산업화 시대에는 이 회수의 회로가 막혔다. 국가는 표준화된 제도를 통해 교육, 고용, 복지, 의료를 모두 중앙에서 관리하기 시작했고, 개인은 어느 공동체에 얼마만큼 권리를 위임할지 스스로 결정하기 어렵게 되었다. 태어나면 국가 교육에 들어가고, 졸업하면 국가가 인증한 기업에 취직하며, 노년에는 국가 연금으로 생존하는 단선적 경로가 강제되었다.</w:t>
       </w:r>
     </w:p>
     <w:p>
@@ -380,7 +380,7 @@
           <w:color w:val="000000"/>
           <w:sz w:val="21"/>
         </w:rPr>
-        <w:t>핵심 원리는 두 가지다. 첫째, 공동체의 권한은 영구적이지 않다. 개인이 생애 단계와 위험에 따라 필요한 만큼 맡겼다가, 스스로 감당할 수 있게 되면 거둔다. 둘째, 공동체의 무게 중심은 시대에 따라 이동한다. 농업 시대에는 가족과 마을의 자급에, 산업화 시대에는 학교와 국가의 표준 관리에, 디지털 시대에는 도시의 발휘 무대와 국가의 조율로 무게가 옮겨간다.</w:t>
+        <w:t>이 과정에서 세 가지 공동체가 힘을 잃었다. 이웃은 산업화 시대에 표준 제도에 가려 공동 돌봄의 기능을 잃어버렸다. 마을은 생활공동체의 기능이 도시로 흡수되면서 해체되어 갔다. 가정은 양육과 부양을 맡되 교육마저 학교에 위임해야 했으며, 점점 더 좁은 기능만 남게 되었다. 반면 국가는 거의 모든 기능을 빨아들이며 비대해졌다. 권리가 집중된 공동체(국가)는 다양한 개인의 필요에 맞춤 대응할 수 없다. 표준화는 평균을 위해 설계되어 평균 바깥의 개인을 배제하며, 획일화는 다양성을 억압하고, 중앙집중은 현장의 맥락을 무시한다.</w:t>
       </w:r>
     </w:p>
     <w:p>
@@ -396,7 +396,23 @@
           <w:color w:val="000000"/>
           <w:sz w:val="21"/>
         </w:rPr>
-        <w:t>이 여섯 층위는 우리 브론펜브레너의 생태체계이론과 거의 그대로 포개진다. 그가 말한 미시체계는 가정에, 중간체계는 이웃과 마을에, 외체계는 도시에, 거시체계는 국가에, 시간체계는 시대를 가로지르는 세계의 변화에 대응한다. 브론펜브레너의 통찰—개인의 발달을 가장 크게 좌우하는 것은 가까운 환경과의 지속적 상호작용(근위 과정)이라는 점—은 디지털 시대에 가정·이웃·마을의 역할을 다시 키워야 한다는 처방으로 이어진다.</w:t>
+        <w:t>이 지점에서 경제학자 칼 폴라니의 통찰이 유효하다. 폴라니는 『거대한 전환』(1944)에서, 산업화 시대의 시장 경제가 노동과 토지와 화폐를 사회적 관계에서 뜯어내어 순수한 상품으로 만들었다고 분석했다. 폴라니에게 이것은 '탈착근(disembedding)'이었다. 사람들은 원래 살던 관계의 그물—가정, 이웃, 마을—에서 떨어져 나와 국가와 시장이라는 두 거대 기구에만 의존하게 되었다. 그의 통찰을 이 연구의 언어로 번역하면, 산업화 시대는 이웃·마을·가정에 분산되어 있던 권리 위임을 국가 하나로 집중시킨 시대였다. 디지털 시대의 과제는 그 집중을 원래의 여러 층위로 되돌리는 것, 즉 폴라니가 말한 '재착근(re-embedding)'이다.</w:t>
+      </w:r>
+    </w:p>
+    <w:p>
+      <w:pPr>
+        <w:keepNext/>
+        <w:spacing w:before="240" w:after="80"/>
+      </w:pPr>
+      <w:r>
+        <w:rPr>
+          <w:rFonts w:ascii="Noto Sans KR" w:hAnsi="Noto Sans KR" w:eastAsia="Noto Sans KR"/>
+          <w:b/>
+          <w:i w:val="0"/>
+          <w:color w:val="000000"/>
+          <w:sz w:val="23"/>
+        </w:rPr>
+        <w:t>2.3  다층 자치와 생태체계 — 권리 분산의 근거</w:t>
       </w:r>
     </w:p>
     <w:p>
@@ -412,7 +428,23 @@
           <w:color w:val="000000"/>
           <w:sz w:val="21"/>
         </w:rPr>
-        <w:t>두 축은 따로 놀지 않는다. 생애의 각 단계에서 생겨난 필요는 곧바로 ‘어느 공동체가 그 필요를 맡을 것인가’라는 물음으로 이어진다. 필요가 깊어지고 종류가 달라질수록, 그 필요를 받아내는 공동체의 무게 중심도 가정에서 마을로, 마을에서 도시로, 도시에서 국가와 세계로 이동한다. 이 글의 분석은 바로 이 두 축이 맞물리는 지점—생애 단계의 필요가 공동체의 형태를 호출하는 순간—을 따라간다.</w:t>
+        <w:t>노벨경제학상을 받은 엘리너 오스트롬은 공유 자원의 관리 문제를 연구하다가 중요한 발견을 했다. 사람들은 중앙 정부의 명령도, 사유화된 시장도 없이, 스스로 자치 규칙을 만들어 자원을 지속 가능하게 관리할 수 있다는 것이다(『공유의 비극을 넘어』, 1990). 그녀는 이를 '다층 거버넌스'라고 불렀다. 하나의 공동체가 모든 것을 독점하는 대신, 여러 층위의 공동체가 각자의 영역에서 자치적으로 문제를 나누어 맡는 구조다. 이것은 루소가 꿈꾼 자치의 현대적 실증이자, 이 연구가 디지털 시대 공동체 구조로 제안하는 모델과 정확히 일치한다. 권리는 가정·이웃·마을·도시·국가·세계가 층위에 따라 나누어 맡아야 하며, 어느 하나가 모든 권리를 독점하면 나머지 층위는 고사하고 개인은 선택지를 잃는다.</w:t>
+      </w:r>
+    </w:p>
+    <w:p>
+      <w:pPr>
+        <w:spacing w:before="0" w:after="120" w:line="384" w:lineRule="auto"/>
+        <w:jc w:val="both"/>
+      </w:pPr>
+      <w:r>
+        <w:rPr>
+          <w:rFonts w:ascii="Noto Serif KR" w:hAnsi="Noto Serif KR" w:eastAsia="Noto Serif KR"/>
+          <w:b w:val="0"/>
+          <w:i w:val="0"/>
+          <w:color w:val="000000"/>
+          <w:sz w:val="21"/>
+        </w:rPr>
+        <w:t>발달심리학자 우리 브론펜브레너는 개인의 발달을 여러 겹으로 중첩된 생태체계 안에서 이해했다(『인간 발달의 생태학』, 1979). 그에게 인간은 홀로 자라는 것이 아니라, 가정(미시체계), 이웃과 학교(중간체계), 부모가 일하는 직장(외체계), 사회의 가치 규범(거시체계)이 중첩되어 상호작용하는 환경 속에서 발달한다. 브론펜브레너의 핵심 통찰은, 개인에게 가장 깊은 영향을 미치는 것은 가까운 공동체와의 지속적이고 직접적인 상호작용—그가 '근위 과정'이라고 부른 것—이라는 점이다. 산업화 시대는 이 근위 과정이 일어나야 할 가정, 이웃, 마을을 약화시키고, 거시체계인 국가에 권리를 집중함으로써 개인의 발달을 가장 중요한 토대에서 분리시켰다.</w:t>
       </w:r>
     </w:p>
     <w:p>
@@ -431,7 +463,7 @@
           <w:color w:val="000000"/>
           <w:sz w:val="27"/>
         </w:rPr>
-        <w:t>3.  세 시대의 전환 — 생존에서 표준으로, 표준에서 정체성으로</w:t>
+        <w:t>3.  세 시대의 노동 원리 — 협동, 분업, 정체성 발휘</w:t>
       </w:r>
     </w:p>
     <w:p>
@@ -447,87 +479,7 @@
           <w:color w:val="000000"/>
           <w:sz w:val="23"/>
         </w:rPr>
-        <w:t>3.1  세 시대의 목표가 공동체를 다르게 빚었다</w:t>
-      </w:r>
-    </w:p>
-    <w:p>
-      <w:pPr>
-        <w:spacing w:before="0" w:after="120" w:line="384" w:lineRule="auto"/>
-        <w:jc w:val="both"/>
-      </w:pPr>
-      <w:r>
-        <w:rPr>
-          <w:rFonts w:ascii="Noto Serif KR" w:hAnsi="Noto Serif KR" w:eastAsia="Noto Serif KR"/>
-          <w:b/>
-          <w:i w:val="0"/>
-          <w:color w:val="000000"/>
-          <w:sz w:val="21"/>
-        </w:rPr>
-        <w:t xml:space="preserve">농업 시대의 목표는 생존이었다. </w:t>
-      </w:r>
-      <w:r>
-        <w:rPr>
-          <w:rFonts w:ascii="Noto Serif KR" w:hAnsi="Noto Serif KR" w:eastAsia="Noto Serif KR"/>
-          <w:b w:val="0"/>
-          <w:i w:val="0"/>
-          <w:color w:val="000000"/>
-          <w:sz w:val="21"/>
-        </w:rPr>
-        <w:t>대를 잇고 땅을 지키기 위해 가정은 노동과 양육을, 이웃은 품앗이를, 마을은 자치를, 국가는 신분 질서를 맡는 자급 공동체가 만들어졌다.</w:t>
-      </w:r>
-    </w:p>
-    <w:p>
-      <w:pPr>
-        <w:spacing w:before="0" w:after="120" w:line="384" w:lineRule="auto"/>
-        <w:ind w:firstLine="227"/>
-        <w:jc w:val="both"/>
-      </w:pPr>
-      <w:r>
-        <w:rPr>
-          <w:rFonts w:ascii="Noto Serif KR" w:hAnsi="Noto Serif KR" w:eastAsia="Noto Serif KR"/>
-          <w:b/>
-          <w:i w:val="0"/>
-          <w:color w:val="000000"/>
-          <w:sz w:val="21"/>
-        </w:rPr>
-        <w:t xml:space="preserve">산업화 시대의 목표는 표준이었다. </w:t>
-      </w:r>
-      <w:r>
-        <w:rPr>
-          <w:rFonts w:ascii="Noto Serif KR" w:hAnsi="Noto Serif KR" w:eastAsia="Noto Serif KR"/>
-          <w:b w:val="0"/>
-          <w:i w:val="0"/>
-          <w:color w:val="000000"/>
-          <w:sz w:val="21"/>
-        </w:rPr>
-        <w:t>좋은 일자리를 얻기 위해 가정은 양육을, 도시는 학교와 일자리를, 국가는 교육·고용·복지를 맡아 사람을 획일적으로 관리했다. 표준은 곧 줄세우기였다.</w:t>
-      </w:r>
-    </w:p>
-    <w:p>
-      <w:pPr>
-        <w:spacing w:before="0" w:after="120" w:line="384" w:lineRule="auto"/>
-        <w:ind w:firstLine="227"/>
-        <w:jc w:val="both"/>
-      </w:pPr>
-      <w:r>
-        <w:rPr>
-          <w:rFonts w:ascii="Noto Serif KR" w:hAnsi="Noto Serif KR" w:eastAsia="Noto Serif KR"/>
-          <w:b/>
-          <w:i w:val="0"/>
-          <w:color w:val="000000"/>
-          <w:sz w:val="21"/>
-        </w:rPr>
-        <w:t xml:space="preserve">디지털 시대의 목표는 정체성 실현이다. </w:t>
-      </w:r>
-      <w:r>
-        <w:rPr>
-          <w:rFonts w:ascii="Noto Serif KR" w:hAnsi="Noto Serif KR" w:eastAsia="Noto Serif KR"/>
-          <w:b w:val="0"/>
-          <w:i w:val="0"/>
-          <w:color w:val="000000"/>
-          <w:sz w:val="21"/>
-        </w:rPr>
-        <w:t>저마다 다른 정체성을 발휘하기 위해 가정은 단서를 발견하고, 이웃은 실험을 돕고, 마을은 훈련으로 잇고, 도시는 발휘 무대를 만들며, 국가는 도시 간 조율과 최소 권리선·위험 규칙을, 세계는 공동 위험 관리를 맡는다.</w:t>
+        <w:t>3.1  농업 시대의 노동 원리: 협동</w:t>
       </w:r>
     </w:p>
     <w:p>
@@ -543,7 +495,23 @@
           <w:color w:val="000000"/>
           <w:sz w:val="21"/>
         </w:rPr>
-        <w:t>칼 폴라니의 ‘거대한 전환’으로 보면, 농업 시대는 노동과 토지가 사회 관계에 단단히 묶여 있던 상태다. 산업화 시대는 노동이 상품으로 떨어져 나와 사회에서 탈각된 상태다. 디지털 시대는 개인의 정체성과 역량이 새로운 방식으로 다시 사회에 뿌리내려야 하는 ‘제2의 대전환’의 국면이다. 이 글이 그리는 공동체 재편은 바로 이 재착근의 설계도다.</w:t>
+        <w:t>농업 시대의 노동 원리는 협동이었다. 한 가족이나 한 마을이 혼자서는 감당할 수 없는 땅 갈기, 씨 뿌리기, 수확, 방어를 함께 해야만 생존할 수 있었다. 이 시대에 개인이 공동체에 위임한 것은 노동력과 결정권이었다. 가정에는 양육과 출산의 역할이 위임되었고, 이웃에는 품앗이와 두레의 노동이 위임되었으며, 마을에는 공동 경작지 관리와 자치 의사결정이 위임되었다. 국가는 신분 질서와 조세를 관장하는 먼 존재로, 개인의 일상에 직접적으로 깊이 개입하지는 않았다.</w:t>
+      </w:r>
+    </w:p>
+    <w:p>
+      <w:pPr>
+        <w:spacing w:before="0" w:after="120" w:line="384" w:lineRule="auto"/>
+        <w:jc w:val="both"/>
+      </w:pPr>
+      <w:r>
+        <w:rPr>
+          <w:rFonts w:ascii="Noto Serif KR" w:hAnsi="Noto Serif KR" w:eastAsia="Noto Serif KR"/>
+          <w:b w:val="0"/>
+          <w:i w:val="0"/>
+          <w:color w:val="000000"/>
+          <w:sz w:val="21"/>
+        </w:rPr>
+        <w:t>이 시대의 생애주기는 협동의 논리에 따라 구성되었다. 아이는 집안일과 농사일을 익히며 공동체의 노동에 참여하기 위한 준비를 했고, 청년기는 혼인과 토지 상속을 통해 가정이라는 공동체를 새로 구성하는 시기였으며, 중장년은 마을 자치에 참여하고 가문을 이끄는 중심이었고, 노년은 권위와 봉양의 대상으로서 공동체에 머물렀다. 필요와 위임의 관계는 비교적 단순하고 가시적이었다. 가정이 모든 것의 중심이었고, 이웃과 마을이 그를 보완했다.</w:t>
       </w:r>
     </w:p>
     <w:p>
@@ -559,7 +527,7 @@
           <w:color w:val="000000"/>
           <w:sz w:val="23"/>
         </w:rPr>
-        <w:t>3.2  공동체별로 무엇이 바뀌었나</w:t>
+        <w:t>3.2  산업화 시대의 노동 원리: 분업</w:t>
       </w:r>
     </w:p>
     <w:p>
@@ -575,7 +543,7 @@
           <w:color w:val="000000"/>
           <w:sz w:val="21"/>
         </w:rPr>
-        <w:t>여섯 공동체는 시대에 따라 역할이 크게 달라진다. 가정은 산업화 시대에 양육과 부양을 맡되 교육을 학교에 위임했지만, 디지털 시대에는 정체성의 단서를 가장 먼저 읽는 생활 기반이 된다. 이웃은 산업화 시대에 표준 제도에 가려 공동 돌봄이 소멸한 약한 관계망이었지만, 디지털 시대에는 정체성을 실험할 관계를 여는 일상망으로 되살아난다. 마을은 도시에 기능을 빼앗겨 해체되었다가, 발견된 방향을 훈련으로 잇는 생활권으로 복원된다.</w:t>
+        <w:t>산업화 시대의 노동 원리는 분업이었다. 공장과 관료제 조직은 복잡한 생산 과정을 잘게 나누어 각자에게 단순 반복 직무를 맡겼다. 한 사람이 전체를 이해할 필요는 없었다. 정해진 직무를 정확히 수행하는 표준화된 노동력이 필요했다. 이 원리가 개인의 필요를 규정했다. '좋은 일자리'를 얻기 위한 표준화된 교육, 그 교육을 통과하기 위한 입시 경쟁, 정규직 고용과 연금으로 이어지는 단선 경로가 삶의 목표가 되었다.</w:t>
       </w:r>
     </w:p>
     <w:p>
@@ -591,7 +559,7 @@
           <w:color w:val="000000"/>
           <w:sz w:val="21"/>
         </w:rPr>
-        <w:t>도시는 산업화 시대에 학교·회사·노동을 집적해 입시 경쟁과 정규 고용을 조직했지만, 디지털 시대에는 정체성을 실제 기여로 발휘하는 무대가 된다. 국가는 표준 제도를 중앙에서 관리하던 자리에서 물러나, 발휘의 조건을 보장하고 위험을 조정하는 안전망으로 전환된다. 세계는 산업화 시대에 개인에게 닿지 않던 제한적 국제질서였으나, 디지털 시대에는 기후·AI·감염병처럼 국경을 넘는 위험을 함께 관리하는 능동적 층위가 된다.</w:t>
+        <w:t>분업의 논리는 공동체에도 그대로 적용되었다. 국가는 교육, 고용, 복지, 의료를 중앙에서 일괄 관리하는 거대한 분업 기구가 되었다. 도시는 학교와 공장을 집적하여 표준 인재를 생산하고 배치하는 기관이 되었다. 이 과정에서 이웃과 마을은 기능을 잃었다. 생존을 위한 협동의 필요가 사라지자, 그 협동을 위해 위임되었던 권리들도 사실상 국가와 도시로 흡수되었다. 개인은 자기 권리를 여러 공동체에 분산해 위임하던 상태에서 국가와 도시 두 층위에만 의존하는 상태로 바뀌었다.</w:t>
       </w:r>
     </w:p>
     <w:p>
@@ -607,7 +575,55 @@
           <w:color w:val="000000"/>
           <w:sz w:val="21"/>
         </w:rPr>
-        <w:t>이 전환에서 세 가지 구조 변화가 두드러진다. 첫째, 산업화 시대에 약화되었던 이웃과 마을이 ‘실험 공간’과 ‘훈련 공간’으로 부활한다. 이는 로버트 퍼트넘이 진단한 사회자본의 붕괴—특히 이질적 사람들을 잇는 가교형 자본의 약화—에 대한 구조적 응답이다. 둘째, 국가가 ‘관리자’에서 ‘조율자·안전망’으로 바뀐다. 이는 엘리너 오스트롬의 다층 거버넌스 원리, 곧 어느 한 층위가 모든 것을 독점하지 않고 여러 자치 층위가 중첩적으로 문제를 나누어 맡는 방식과 일치한다. 셋째, 세계가 추상적 질서에서 생존에 직결된 거버넌스 층위로 능동화된다.</w:t>
+        <w:t>이것이 이 연구가 비판적으로 지적하는 지점이다. 분업 체제에서 개인은 국가가 설계한 경로를 따르지 않을 선택지가 거의 없었다. 위임한 권리를 회수하는 것은 제도 바깥으로 나가는 것을 의미했고, 그것은 대개 불이익과 배제를 뜻했다. 마이클 영이 『능력주의의 부상』(1958)에서 경고했듯, 시험 성적으로 모든 것이 줄 세워지는 사회에서 표준 경로에서 벗어난 사람은 '능력 부족'으로 낙인찍히는 이중의 고통을 받았다. 권리 집중이 낳은 가장 큰 폐해는 바로 이 다양성의 말살이었다.</w:t>
+      </w:r>
+    </w:p>
+    <w:p>
+      <w:pPr>
+        <w:keepNext/>
+        <w:spacing w:before="240" w:after="80"/>
+      </w:pPr>
+      <w:r>
+        <w:rPr>
+          <w:rFonts w:ascii="Noto Sans KR" w:hAnsi="Noto Sans KR" w:eastAsia="Noto Sans KR"/>
+          <w:b/>
+          <w:i w:val="0"/>
+          <w:color w:val="000000"/>
+          <w:sz w:val="23"/>
+        </w:rPr>
+        <w:t>3.3  디지털 시대의 노동 원리: 정체성 발휘</w:t>
+      </w:r>
+    </w:p>
+    <w:p>
+      <w:pPr>
+        <w:spacing w:before="0" w:after="120" w:line="384" w:lineRule="auto"/>
+        <w:jc w:val="both"/>
+      </w:pPr>
+      <w:r>
+        <w:rPr>
+          <w:rFonts w:ascii="Noto Serif KR" w:hAnsi="Noto Serif KR" w:eastAsia="Noto Serif KR"/>
+          <w:b w:val="0"/>
+          <w:i w:val="0"/>
+          <w:color w:val="000000"/>
+          <w:sz w:val="21"/>
+        </w:rPr>
+        <w:t>디지털 시대의 노동 원리는 정체성 발휘다. 인공지능과 자동화가 반복 직무를 대체하면서, 표준화된 분업 노동의 경제적 가치는 낮아지고 있다. 반면 데이터, 창의성, 고유한 판단력, 사람 사이의 신뢰처럼 각 개인만이 가진 독특한 역량의 가치는 높아진다. 플랫폼과 디지털 도구가 기획·제작·유통의 비용을 낮추면서 개인은 큰 조직에 들어가야만 생산자가 되는 제약에서 풀려나고 있다. 이 시대에 일한다는 것은 조직이 부여한 직무를 수행하는 것이 아니라, 자신의 고유한 정체성을 실제 기여로 발휘하는 것이다.</w:t>
+      </w:r>
+    </w:p>
+    <w:p>
+      <w:pPr>
+        <w:spacing w:before="0" w:after="120" w:line="384" w:lineRule="auto"/>
+        <w:jc w:val="both"/>
+      </w:pPr>
+      <w:r>
+        <w:rPr>
+          <w:rFonts w:ascii="Noto Serif KR" w:hAnsi="Noto Serif KR" w:eastAsia="Noto Serif KR"/>
+          <w:b w:val="0"/>
+          <w:i w:val="0"/>
+          <w:color w:val="000000"/>
+          <w:sz w:val="21"/>
+        </w:rPr>
+        <w:t>이 전환은 개인이 권리를 위임하는 방식도 바꾼다. 국가 하나에 집중되었던 권리가 다시 여러 공동체로 분산될 조건이 만들어진다. 가정은 정체성의 단서를 가장 먼저 읽는 공간으로 중요성이 되살아나고, 이웃과 마을은 정체성을 실험하고 훈련하는 관계망으로 기능이 복원된다. 도시는 그 정체성을 실제 기여로 발휘하는 무대가 되며, 국가는 모든 것을 관리하는 기관에서 여러 공동체가 잘 작동하도록 최소 조건을 보장하는 조율자로 역할이 바뀐다. 세계는 처음으로 개인의 발휘 무대로 직접 열린다. 국경을 넘는 협업이 가능해지면서, 국내 노동시장에서 자리를 얻지 못한 사람도 세계 무대에서 기여할 경로가 생긴다.</w:t>
       </w:r>
     </w:p>
     <w:p>
@@ -626,7 +642,7 @@
           <w:color w:val="000000"/>
           <w:sz w:val="27"/>
         </w:rPr>
-        <w:t>4.  생애단계별로 본 필요와 격차</w:t>
+        <w:t>4.  생애주기별 필요 — 어떤 공동체에 무엇을 위임하는가</w:t>
       </w:r>
     </w:p>
     <w:p>
@@ -658,7 +674,39 @@
           <w:color w:val="000000"/>
           <w:sz w:val="21"/>
         </w:rPr>
-        <w:t>디지털 기술은 이 단계에서 개인의 출발선을 바꾼다. 생체·행동 데이터를 읽는 기술이 등장하면서, 아이가 타고난 기질과 강점의 단서를 예전보다 훨씬 일찍 포착할 수 있게 되었다. 이 기술 변화가 새로운 필요를 만든다. 농업 시대에는 무사한 출산과 건강한 몸이면 충분했고, 산업화 시대에는 표준 발달표에 맞는 안정된 양육이 목표였다. 디지털 시대에는 타고난 단서를 일찍 읽어 기록하는 일이 필요가 된다. 그래서 공동체도 달라진다. 가정은 단순 양육의 자리에서 ‘단서를 가장 먼저 읽고 기록하는 생활 기반’으로 역할이 바뀐다. 다만 이 기술은 누구에게나 똑같이 닿지 않는다. 데이터와 관찰이 풍부한 가정의 아이는 단서가 일찍 읽히지만, 그런 환경이 없는 아이는 출발선 바깥에 남는다. 제임스 헥만이 보였듯 생애 초기 투자는 이후 어느 시기보다 높은 수익을 낳으므로, 국가가 먼저 찾아가 기초 돌봄을 보장하는 역할을 새로 맡는다.</w:t>
+        <w:t>모든 사람은 고유한 가능성을 지니고 태어난다. 태아·영아기는 그 가능성의 단서가 처음으로 드러나는 시기다. 농업 시대에 이 단계의 필요는 무사한 출산과 건강한 몸이었다. 생존 자체가 목표였고, 가정과 이웃, 마을이 공동으로 출산을 돕고 아이를 거두었다. 산업화 시대에는 안정된 양육과 표준 발달표에 맞는 보살핌이 필요로 규정되었다. 국가가 임신·출산·영유아 건강 관리를 담당하며 가정의 역할을 보완했다.</w:t>
+      </w:r>
+    </w:p>
+    <w:p>
+      <w:pPr>
+        <w:spacing w:before="0" w:after="120" w:line="384" w:lineRule="auto"/>
+        <w:jc w:val="both"/>
+      </w:pPr>
+      <w:r>
+        <w:rPr>
+          <w:rFonts w:ascii="Noto Serif KR" w:hAnsi="Noto Serif KR" w:eastAsia="Noto Serif KR"/>
+          <w:b w:val="0"/>
+          <w:i w:val="0"/>
+          <w:color w:val="000000"/>
+          <w:sz w:val="21"/>
+        </w:rPr>
+        <w:t>디지털 시대에는 타고난 기질과 강점의 단서를 일찍 발견하고 기록하는 것이 새로운 필요로 등장한다. 생체·행동 데이터를 읽는 기술이 등장하면서, 아이가 어떤 방식으로 환경에 반응하는지, 어디에 관심을 보이는지를 예전보다 훨씬 일찍 포착할 수 있게 되었다. 그에 따라 가정의 역할이 달라진다. 단순 양육의 자리에서, 정체성의 단서를 가장 먼저 읽고 기록하는 생활 기반으로 역할이 깊어진다. 가정은 이 단계에서 시간과 관심이라는 권리를 가장 크게 위임받는 공동체다.</w:t>
+      </w:r>
+    </w:p>
+    <w:p>
+      <w:pPr>
+        <w:spacing w:before="0" w:after="120" w:line="384" w:lineRule="auto"/>
+        <w:jc w:val="both"/>
+      </w:pPr>
+      <w:r>
+        <w:rPr>
+          <w:rFonts w:ascii="Noto Serif KR" w:hAnsi="Noto Serif KR" w:eastAsia="Noto Serif KR"/>
+          <w:b w:val="0"/>
+          <w:i w:val="0"/>
+          <w:color w:val="000000"/>
+          <w:sz w:val="21"/>
+        </w:rPr>
+        <w:t>그러나 이 기술은 누구에게나 동등하게 닿지 않는다. 관찰이 풍부한 가정의 아이는 단서가 일찍 읽히지만, 그런 환경이 없는 아이는 출발선 바깥에 남는다. 제임스 헥만이 실증했듯 생애 초기 투자는 이후 어느 시기보다 높은 복리 효과를 낳는다. 국가는 표준 관리자에서 '먼저 찾아가는 보장자'로 역할을 전환해야 한다. 이것은 위임의 구조가 달라지는 것이다. 국가에 위임된 권리가 표준 집행에서 선제적 돌봄으로 방향을 바꾼다.</w:t>
       </w:r>
     </w:p>
     <w:p>
@@ -690,7 +738,39 @@
           <w:color w:val="000000"/>
           <w:sz w:val="21"/>
         </w:rPr>
-        <w:t>농업 시대의 아이는 집안일과 농사일을 익히며 자랐고, 산업화 시대의 아이는 취학 준비와 또래에 뒤지지 않는 기초 학력에 매였다. 디지털 시대의 목표는 다양한 체험으로 관심과 강점을 발견하고 실험하는 것이다. 산업화 시대에는 가정과 학교, 국가의 의무 교육만이 관여했지만, 디지털 시대에는 가정·이웃·마을·도시·국가가 함께 역할을 나눈다. 체험 자원이 풍부한 아이는 폭넓은 경험으로 강점을 또렷이 하지만, 그렇지 못한 아이를 위해 마을의 공동 프로그램과 국가의 돌봄이 발견의 기회를 먼저 채운다. 이 분산 구조는 브론펜브레너가 말한 중간체계—가정·이웃·마을이 서로 맞물려 시너지를 내는 구조—를 제도로 구현한 것이다.</w:t>
+        <w:t>유아·아동기는 여러 강점의 단서를 체험으로 확인하는 시기다. 농업 시대에는 집안일과 농사일을 익히는 것이 이 단계의 과제였고, 산업화 시대에는 취학 준비와 기초 학력 습득이 목표였다. 두 시대 모두 아이의 필요는 외부 사회가 정의했다. 가정은 취학을 준비시키는 역할을 맡았고, 도시와 국가가 표준 교육 기관을 통해 나머지를 관장했다.</w:t>
+      </w:r>
+    </w:p>
+    <w:p>
+      <w:pPr>
+        <w:spacing w:before="0" w:after="120" w:line="384" w:lineRule="auto"/>
+        <w:jc w:val="both"/>
+      </w:pPr>
+      <w:r>
+        <w:rPr>
+          <w:rFonts w:ascii="Noto Serif KR" w:hAnsi="Noto Serif KR" w:eastAsia="Noto Serif KR"/>
+          <w:b w:val="0"/>
+          <w:i w:val="0"/>
+          <w:color w:val="000000"/>
+          <w:sz w:val="21"/>
+        </w:rPr>
+        <w:t>디지털 시대에는 다양한 체험으로 관심과 강점을 발견하고 실험하는 것이 이 단계의 과제가 된다. 아이는 여러 분야를 경험하면서 자신이 무엇에 끌리는지, 무엇을 할 때 생기가 도는지를 알아간다. 이를 위해 가정은 관심을 지지하고, 이웃은 다양한 체험 기회를 열며, 마을은 공동 발견 프로그램을 제공한다. 권리 위임의 관점에서 보면, 이 단계는 가정 하나가 교육을 독점하거나 국가 하나가 의무 교육을 독점하는 구조에서 벗어나, 가정·이웃·마을이 나누어 역할을 맡는 분산형 위임 구조로 이행하는 단계다.</w:t>
+      </w:r>
+    </w:p>
+    <w:p>
+      <w:pPr>
+        <w:spacing w:before="0" w:after="120" w:line="384" w:lineRule="auto"/>
+        <w:jc w:val="both"/>
+      </w:pPr>
+      <w:r>
+        <w:rPr>
+          <w:rFonts w:ascii="Noto Serif KR" w:hAnsi="Noto Serif KR" w:eastAsia="Noto Serif KR"/>
+          <w:b w:val="0"/>
+          <w:i w:val="0"/>
+          <w:color w:val="000000"/>
+          <w:sz w:val="21"/>
+        </w:rPr>
+        <w:t>브론펜브레너가 중간체계라고 부른 것, 즉 가정과 이웃과 마을이 서로 맞물려 상승 효과를 내는 구조가 이 단계에서 결정적으로 작동해야 한다. 체험이 풍부한 아이와 그렇지 못한 아이의 간격은 이미 이 단계에서 벌어지기 시작한다. 국가는 기회의 바닥을 보장하는 역할로 이 분산 구조를 뒤에서 떠받쳐야 한다.</w:t>
       </w:r>
     </w:p>
     <w:p>
@@ -722,7 +802,39 @@
           <w:color w:val="000000"/>
           <w:sz w:val="21"/>
         </w:rPr>
-        <w:t>이 단계는 정체성의 위기가 가장 첨예한 시기다. 산업화 시대의 청소년은 입시 경쟁에서 좋은 성적과 상급 학교 진학에 모든 것을 걸었다. 성적이 좋은 소수는 원하는 진로를 골랐지만, 대다수는 점수에 진로를 빼앗기고 다른 재능을 묻어야 했으며, 진학에서 탈락한 이는 길 자체가 막혔다. 마이클 영이 경고한 능력주의의 함정이 바로 이 장면이다. 시험이 삶을 재단하고, 실패는 구조가 아니라 개인의 능력 부족으로 귀속되어 탈락한 이에게 이중의 고통을 안긴다. 디지털 시대는 연결 공동체를 도시의 입시 기관에서 마을의 멘토와 훈련 경로로 옮긴다. 강점이 점수 서열 바깥에서 길러질 수 있는 공간을 마을이 연다.</w:t>
+        <w:t>청소년기는 정체성의 위기가 가장 첨예하게 나타나는 시기다. 에릭 에릭슨은 생애 발달을 여덟 단계로 나누고, 각 단계에서 개인이 해결해야 할 심리사회적 과제가 있다고 보았다(『아동기와 사회』, 1950). 에릭슨에게 청소년기의 핵심 과제는 '정체성 대 역할 혼미'였다. 나는 누구인가, 나는 무엇을 할 수 있는가를 탐색하고 방향을 정하는 것이 이 단계의 본질적 필요다.</w:t>
+      </w:r>
+    </w:p>
+    <w:p>
+      <w:pPr>
+        <w:spacing w:before="0" w:after="120" w:line="384" w:lineRule="auto"/>
+        <w:jc w:val="both"/>
+      </w:pPr>
+      <w:r>
+        <w:rPr>
+          <w:rFonts w:ascii="Noto Serif KR" w:hAnsi="Noto Serif KR" w:eastAsia="Noto Serif KR"/>
+          <w:b w:val="0"/>
+          <w:i w:val="0"/>
+          <w:color w:val="000000"/>
+          <w:sz w:val="21"/>
+        </w:rPr>
+        <w:t>농업 시대에 이 필요는 가업의 기술과 노동력을 습득하는 것으로 채워졌다. 산업화 시대에는 입시 경쟁에서 좋은 성적을 내고 상급 학교에 진학하는 것으로 대체되었다. 성적이 정체성을 규정했다. 이 구조에서 도시의 입시 학교와 국가의 대입 제도가 청소년의 권리 위임을 거의 독점했다. 아이가 무엇을 잘하고 무엇에 끌리는지는 중요하지 않았다. 점수가 진로를 결정했다.</w:t>
+      </w:r>
+    </w:p>
+    <w:p>
+      <w:pPr>
+        <w:spacing w:before="0" w:after="120" w:line="384" w:lineRule="auto"/>
+        <w:jc w:val="both"/>
+      </w:pPr>
+      <w:r>
+        <w:rPr>
+          <w:rFonts w:ascii="Noto Serif KR" w:hAnsi="Noto Serif KR" w:eastAsia="Noto Serif KR"/>
+          <w:b w:val="0"/>
+          <w:i w:val="0"/>
+          <w:color w:val="000000"/>
+          <w:sz w:val="21"/>
+        </w:rPr>
+        <w:t>이것이 권리 집중이 낳은 전형적인 폐해다. 국가와 도시에 집중된 교육 권리가 단일한 기준으로 모든 청소년을 줄 세웠다. 마이클 영이 경고했듯, 이 시스템은 탈락자에게 '네가 못난 것'이라는 낙인을 찍으며 구조적 배제를 개인의 실패로 위장했다. 디지털 시대의 청소년 공동체는 다르다. 마을이 멘토와 훈련 경로를 제공하고, 도시가 심화 경로와 재진입 통로를 마련하며, 각자의 강점이 점수 서열 바깥에서 길러질 수 있는 공간이 만들어진다. 청소년은 이 공동체들에 배움과 시간을 위임하되, 어느 경로가 자신에게 맞는지 스스로 선택하고 바꿀 수 있다.</w:t>
       </w:r>
     </w:p>
     <w:p>
@@ -754,7 +866,39 @@
           <w:color w:val="000000"/>
           <w:sz w:val="21"/>
         </w:rPr>
-        <w:t>디지털 기술은 이 단계에서 개인이 일하는 방식을 가장 크게 바꾼다. AI·데이터·플랫폼이 기획·제작·유통의 비용을 낮추면서, 개인은 큰 조직에 들어가야만 생산자가 되던 제약에서 풀려난다. 이 변화가 새로운 필요를 만든다. 농업 시대에는 물려받을 토지와 혼인으로 가정을 이루는 것이, 산업화 시대에는 좋은 직장 취업과 정규직 정착이 청년의 목표였다. 디지털 시대에는 자기 정체성을 실제 기여로 발휘할 무대 자체가 필요가 된다. 그래서 공동체도 달라진다. 도시는 일자리를 배분하던 자리에서 정체성을 기여로 발휘하는 무대가 되고, 세계가 처음으로 연결 공동체로 등장한다. 국경을 넘는 협업 시장이 열리면서 국내 노동시장의 협소함을 우회할 길이 생기기 때문이다. 다만 발휘의 무대에 먼저 올라서는 사람과 무대 바깥에 머무는 사람의 간격은 크다. 무대가 없던 이에게 진입 장벽을 낮춰 첫 기여를 잇는 지원이 필요한 까닭이다. 이는 에스핑안데르센이 지식경제 복지국가에서 강조한 ‘사회적 투자’—역량이 기여로 발현되도록 미리 조건을 까는 일—와 맞닿는다.</w:t>
+        <w:t>청년기는 훈련을 통해 다듬어진 강점을 실제 기여로 발휘하는 시기다. 농업 시대에는 토지와 혼인을 통해 새 가정을 구성하는 것이 이 단계의 과제였다. 산업화 시대에는 좋은 직장에 취업하고 정규직으로 정착하는 것이 목표였다. 두 경우 모두 필요는 외부가 규정했고, 공동체—국가와 도시—가 그 경로를 통제했다.</w:t>
+      </w:r>
+    </w:p>
+    <w:p>
+      <w:pPr>
+        <w:spacing w:before="0" w:after="120" w:line="384" w:lineRule="auto"/>
+        <w:jc w:val="both"/>
+      </w:pPr>
+      <w:r>
+        <w:rPr>
+          <w:rFonts w:ascii="Noto Serif KR" w:hAnsi="Noto Serif KR" w:eastAsia="Noto Serif KR"/>
+          <w:b w:val="0"/>
+          <w:i w:val="0"/>
+          <w:color w:val="000000"/>
+          <w:sz w:val="21"/>
+        </w:rPr>
+        <w:t>디지털 시대의 청년이 필요로 하는 것은 자기 정체성을 실제 기여로 발휘할 무대다. 인공지능과 플랫폼이 진입 비용을 낮추면서, 개인은 대기업에 고용되지 않고도 자신만의 방식으로 가치를 생산하고 시장에 내놓을 수 있게 되었다. 이 변화는 권리 위임의 구조를 바꾼다. 산업화 시대에 청년은 자신의 노동력과 결정권을 기업과 국가에 대규모로 위임하는 것이 거의 유일한 선택지였다. 디지털 시대에는 도시에 발휘의 기반을 위임하고, 세계와는 협업의 관계를 선택적으로 맺으며, 언제든 재편할 수 있는 유연한 위임 구조가 가능해진다.</w:t>
+      </w:r>
+    </w:p>
+    <w:p>
+      <w:pPr>
+        <w:spacing w:before="0" w:after="120" w:line="384" w:lineRule="auto"/>
+        <w:jc w:val="both"/>
+      </w:pPr>
+      <w:r>
+        <w:rPr>
+          <w:rFonts w:ascii="Noto Serif KR" w:hAnsi="Noto Serif KR" w:eastAsia="Noto Serif KR"/>
+          <w:b w:val="0"/>
+          <w:i w:val="0"/>
+          <w:color w:val="000000"/>
+          <w:sz w:val="21"/>
+        </w:rPr>
+        <w:t>그러나 이 변화는 모두에게 균등하게 열리지 않는다. 발휘의 무대에 먼저 올라서는 사람과 그 무대 바깥에 머무는 사람의 간격이 크다. 도시와 국가가 진입 장벽을 낮추고 첫 기여를 연결하는 역할을 맡는 것은, 모든 청년이 적어도 한 번은 위임의 회로에 들어올 수 있도록 하는 최소 보장이다. 에스핑안데르센이 지식경제 복지국가에서 강조한 사회적 투자는 바로 이 진입 조건을 미리 까는 일이다.</w:t>
       </w:r>
     </w:p>
     <w:p>
@@ -786,7 +930,39 @@
           <w:color w:val="000000"/>
           <w:sz w:val="21"/>
         </w:rPr>
-        <w:t>이 단계는 디지털 전환의 혜택과 위험이 가장 불균등하게 갈리는 시기다. 산업화 시대의 목표는 고용 유지와 가족 부양, 사회적 지위였다. 디지털 시대의 목표는 강점을 재설계하고 새 영역에 도전하는 것이다. 그러나 재학습의 기회를 얻은 사람은 변화의 물결에 올라타지만, 그렇지 못한 사람은 기술 변화 앞에서 버티다 고용 불안과 경력 중단의 위험을 안고, 한번 실직하면 회복이 어렵다. 부르디외의 자본이론이 보여주듯, 중장년기의 전환 실패는 생애에 걸쳐 쌓인 자본의 격차가 임계점을 넘어 회복하기 어려운 지점으로 치닫는 국면이다. 마을의 재학습 접근과 국가·가정의 전환기 보호가 필요한 까닭이다.</w:t>
+        <w:t>중장년기는 디지털 전환의 혜택과 위험이 가장 불균등하게 갈리는 시기다. 산업화 시대의 목표는 고용 유지와 가족 부양, 사회적 지위였다. 이 시기의 권리 위임은 주로 직장과 국가를 향해 있었다. 안정된 고용이라는 조건이 유지되는 한, 개인은 자신의 노동 시간과 역량을 기업에 위임하고 연금 권리는 국가에 맡겨두는 계약을 따랐다.</w:t>
+      </w:r>
+    </w:p>
+    <w:p>
+      <w:pPr>
+        <w:spacing w:before="0" w:after="120" w:line="384" w:lineRule="auto"/>
+        <w:jc w:val="both"/>
+      </w:pPr>
+      <w:r>
+        <w:rPr>
+          <w:rFonts w:ascii="Noto Serif KR" w:hAnsi="Noto Serif KR" w:eastAsia="Noto Serif KR"/>
+          <w:b w:val="0"/>
+          <w:i w:val="0"/>
+          <w:color w:val="000000"/>
+          <w:sz w:val="21"/>
+        </w:rPr>
+        <w:t>디지털 전환은 이 계약을 깨뜨리고 있다. 자동화와 인공지능이 기존 직무를 빠르게 대체하면서, 중장년에게 재학습과 강점의 재설계가 필요해졌다. 그러나 위임의 회수가 어려운 구조—국가가 표준 직업 훈련만 제공하고, 기업은 장기 고용 약속 없이 효율만 추구하는—에서 중장년은 재설계의 기회를 갖기 어렵다. 마을과 도시가 재학습의 접근로를 열고, 가정과 국가가 전환기 보호를 제공하는 것은, 빼앗겼던 선택권을 다시 분산해 돌려주는 과정이다.</w:t>
+      </w:r>
+    </w:p>
+    <w:p>
+      <w:pPr>
+        <w:spacing w:before="0" w:after="120" w:line="384" w:lineRule="auto"/>
+        <w:jc w:val="both"/>
+      </w:pPr>
+      <w:r>
+        <w:rPr>
+          <w:rFonts w:ascii="Noto Serif KR" w:hAnsi="Noto Serif KR" w:eastAsia="Noto Serif KR"/>
+          <w:b w:val="0"/>
+          <w:i w:val="0"/>
+          <w:color w:val="000000"/>
+          <w:sz w:val="21"/>
+        </w:rPr>
+        <w:t>에릭 에릭슨은 중장년기의 핵심 과제를 '생산성 대 침체'로 정의했다. 자신이 쌓은 것을 새 방향으로 확장하고 다음 세대를 위한 무언가를 만들어 내지 못하면, 개인은 정체와 고립으로 빠진다. 이 심리적 위기에 응답하는 것은 개인의 의지가 아니라 공동체의 구조다. 재학습의 기회를 만들고, 새 역할을 연결하며, 전환기의 불안을 함께 감당하는 공동체가 있어야 한다.</w:t>
       </w:r>
     </w:p>
     <w:p>
@@ -818,7 +994,39 @@
           <w:color w:val="000000"/>
           <w:sz w:val="21"/>
         </w:rPr>
-        <w:t>농업 시대의 노인은 권위와 봉양을 누렸고, 산업화 시대의 노인은 은퇴와 함께 부양의 대상으로 남았다. 디지털 시대의 노년기 재정의는 과감하다. 건강을 미리 예측하고 예방하며, 존엄과 판단의 주도권을 지키는 시기로 본다. 경험을 쌓은 이는 멘토와 자문으로 후속 세대와 경험을 잇는 현역 전수자가 된다. 이 단계에는 가정의 예방·돌봄·존엄, 이웃의 관계 유지, 도시의 건강 예측·생활 의료, 국가의 소득·최소 권리선이 역할을 나눈다. 에스핑안데르센의 탈상품화 원리—노인이 시장에 의존하지 않고도 인간다운 삶을 유지해야 한다는—는 고립 위기의 노인을 돌봄과 역할로 다시 잇는 설계로 구현된다. 이는 에릭슨이 노년의 과업으로 본 ‘자아통합 대 절망’의 위기에 대한 사회적 응답이기도 하다.</w:t>
+        <w:t>노년기는 농업 시대에는 권위와 봉양, 산업화 시대에는 은퇴와 부양의 시기였다. 두 시대 모두 노인을 '받는 존재'로 정의했다. 농업 시대에는 권위를 받고, 산업화 시대에는 연금과 부양을 받았다. 디지털 시대는 이 정의를 바꾼다. 건강을 미리 예측하고 예방하면서 존엄과 판단의 주도권을 지키고, 경험을 다음 세대에 전수하며 세대를 연결하는 '능동적 전수자'로서의 노년을 제안한다.</w:t>
+      </w:r>
+    </w:p>
+    <w:p>
+      <w:pPr>
+        <w:spacing w:before="0" w:after="120" w:line="384" w:lineRule="auto"/>
+        <w:jc w:val="both"/>
+      </w:pPr>
+      <w:r>
+        <w:rPr>
+          <w:rFonts w:ascii="Noto Serif KR" w:hAnsi="Noto Serif KR" w:eastAsia="Noto Serif KR"/>
+          <w:b w:val="0"/>
+          <w:i w:val="0"/>
+          <w:color w:val="000000"/>
+          <w:sz w:val="21"/>
+        </w:rPr>
+        <w:t>에릭슨은 노년기의 과제를 '자아통합 대 절망'으로 보았다. 자신의 삶이 의미 있었다는 통합감을 얻지 못하면 절망에 빠진다. 이 과제는 개인의 내면 문제가 아니라 사회적 과제다. 전수할 통로가 있고, 역할이 주어지며, 관계 안에 머물 수 있는 공동체 구조가 통합을 가능하게 한다. 가정은 돌봄과 존엄의 생활 공간을 제공하고, 이웃은 관계의 지속을 돕고, 마을과 도시는 멘토와 자문의 역할을 연결한다. 국가는 소득의 최소 기반과 고립 방지의 역할을 맡는다.</w:t>
+      </w:r>
+    </w:p>
+    <w:p>
+      <w:pPr>
+        <w:spacing w:before="0" w:after="120" w:line="384" w:lineRule="auto"/>
+        <w:jc w:val="both"/>
+      </w:pPr>
+      <w:r>
+        <w:rPr>
+          <w:rFonts w:ascii="Noto Serif KR" w:hAnsi="Noto Serif KR" w:eastAsia="Noto Serif KR"/>
+          <w:b w:val="0"/>
+          <w:i w:val="0"/>
+          <w:color w:val="000000"/>
+          <w:sz w:val="21"/>
+        </w:rPr>
+        <w:t>폴라니의 언어로 말하면, 노인이 시장과 국가 연금에만 의존하는 상태는 '탈착근'의 전형이다. 재착근은 노인이 관계와 역할의 그물 안으로 돌아오는 것이다. 그 그물을 유지하는 것은 각 공동체가 노인으로부터 위임받은 권리—관계, 시간, 경험—를 제대로 활용하고 돌려주는 것이다.</w:t>
       </w:r>
     </w:p>
     <w:p>
@@ -837,7 +1045,7 @@
           <w:color w:val="000000"/>
           <w:sz w:val="27"/>
         </w:rPr>
-        <w:t>5.  디지털 전환이 공동체에 요구하는 것</w:t>
+        <w:t>5.  공동체의 형성·역할·기능 — 층위별 권리 위임의 구조</w:t>
       </w:r>
     </w:p>
     <w:p>
@@ -853,7 +1061,7 @@
           <w:color w:val="000000"/>
           <w:sz w:val="23"/>
         </w:rPr>
-        <w:t>5.1  생애는 단선이 아니라 누적의 사이클이다</w:t>
+        <w:t>5.1  가정 — 정체성의 첫 번째 공동체</w:t>
       </w:r>
     </w:p>
     <w:p>
@@ -869,7 +1077,7 @@
           <w:color w:val="000000"/>
           <w:sz w:val="21"/>
         </w:rPr>
-        <w:t>디지털 시대의 생애주기는 한 방향으로 자라는 직선이 아니라, 앞 단계의 결과가 다음 단계의 조건이 되는 나선형 누적 구조다. 중장년의 재설계는 청소년기의 훈련이 성공했을 때 가능하고, 노년의 전수는 청년·중장년의 발휘가 쌓였을 때 의미를 갖는다. 그래서 초기 단계의 격차는 단순한 기회 불평등이 아니라 생애 전체 사이클의 단절을 뜻한다. 초기에 역량이 기능으로 전환되지 못하면 이후 단계의 확장 자체가 막힌다. 헥만이 실증한 초기 투자의 복리 효과는 이 사이클 논리의 경제학적 표현이다.</w:t>
+        <w:t>가정은 개인이 태어나는 순간부터 가장 먼저 권리를 위임받는 공동체다. 개인은 가정에 시간, 감정, 돌봄, 결정의 상당 부분을 위임한다. 농업 시대에 가정은 노동·양육·부양·교육을 모두 떠안는 전능한 공동체였다. 산업화 시대에는 교육을 학교에, 의료를 병원에 위임하면서 역할이 좁아졌다. 디지털 시대에 가정의 핵심 역할은 '정체성 단서를 가장 먼저 읽는 생활 기반'이다. 아이가 어디에 반응하는지, 무엇을 할 때 활기를 띠는지를 가장 가까이에서 관찰하고 기록하는 것이다. 또한 중장년의 전환기와 노년의 돌봄·존엄을 지지하는 역할도 함께 맡는다.</w:t>
       </w:r>
     </w:p>
     <w:p>
@@ -885,7 +1093,7 @@
           <w:color w:val="000000"/>
           <w:sz w:val="23"/>
         </w:rPr>
-        <w:t>5.2  공동체 재배치의 세 원리</w:t>
+        <w:t>5.2  이웃 — 실험의 공동체</w:t>
       </w:r>
     </w:p>
     <w:p>
@@ -896,76 +1104,12 @@
       <w:r>
         <w:rPr>
           <w:rFonts w:ascii="Noto Serif KR" w:hAnsi="Noto Serif KR" w:eastAsia="Noto Serif KR"/>
-          <w:b/>
-          <w:i w:val="0"/>
-          <w:color w:val="000000"/>
-          <w:sz w:val="21"/>
-        </w:rPr>
-        <w:t xml:space="preserve">첫째, 가까운 공동체를 다시 키워야 한다. </w:t>
-      </w:r>
-      <w:r>
-        <w:rPr>
-          <w:rFonts w:ascii="Noto Serif KR" w:hAnsi="Noto Serif KR" w:eastAsia="Noto Serif KR"/>
           <w:b w:val="0"/>
           <w:i w:val="0"/>
           <w:color w:val="000000"/>
           <w:sz w:val="21"/>
         </w:rPr>
-        <w:t>개인의 정체성 발현에 가장 큰 영향을 미치는 것은 가정·이웃·마을에서 일어나는 직접적이고 지속적인 상호작용이다. 산업화 시대에 약해진 이 층위를 회복하는 것이 디지털 전환의 핵심 과제다.</w:t>
-      </w:r>
-    </w:p>
-    <w:p>
-      <w:pPr>
-        <w:spacing w:before="0" w:after="120" w:line="384" w:lineRule="auto"/>
-        <w:ind w:firstLine="227"/>
-        <w:jc w:val="both"/>
-      </w:pPr>
-      <w:r>
-        <w:rPr>
-          <w:rFonts w:ascii="Noto Serif KR" w:hAnsi="Noto Serif KR" w:eastAsia="Noto Serif KR"/>
-          <w:b/>
-          <w:i w:val="0"/>
-          <w:color w:val="000000"/>
-          <w:sz w:val="21"/>
-        </w:rPr>
-        <w:t xml:space="preserve">둘째, 제도의 손길이 닿지 않는 사람에게는 표준이 아니라 맞춤이 필요하다. </w:t>
-      </w:r>
-      <w:r>
-        <w:rPr>
-          <w:rFonts w:ascii="Noto Serif KR" w:hAnsi="Noto Serif KR" w:eastAsia="Noto Serif KR"/>
-          <w:b w:val="0"/>
-          <w:i w:val="0"/>
-          <w:color w:val="000000"/>
-          <w:sz w:val="21"/>
-        </w:rPr>
-        <w:t>기다리는 제도가 아니라 ‘먼저 찾아가는’ 공동체의 능동성이 배제를 줄인다.</w:t>
-      </w:r>
-    </w:p>
-    <w:p>
-      <w:pPr>
-        <w:spacing w:before="0" w:after="120" w:line="384" w:lineRule="auto"/>
-        <w:ind w:firstLine="227"/>
-        <w:jc w:val="both"/>
-      </w:pPr>
-      <w:r>
-        <w:rPr>
-          <w:rFonts w:ascii="Noto Serif KR" w:hAnsi="Noto Serif KR" w:eastAsia="Noto Serif KR"/>
-          <w:b/>
-          <w:i w:val="0"/>
-          <w:color w:val="000000"/>
-          <w:sz w:val="21"/>
-        </w:rPr>
-        <w:t xml:space="preserve">셋째, 공동체 사이의 연결을 제도화해야 한다. </w:t>
-      </w:r>
-      <w:r>
-        <w:rPr>
-          <w:rFonts w:ascii="Noto Serif KR" w:hAnsi="Noto Serif KR" w:eastAsia="Noto Serif KR"/>
-          <w:b w:val="0"/>
-          <w:i w:val="0"/>
-          <w:color w:val="000000"/>
-          <w:sz w:val="21"/>
-        </w:rPr>
-        <w:t>이웃에서 발견한 흥미가 마을의 훈련으로, 마을의 훈련이 도시의 발휘로 이어지는 경로가 제도로 깔리지 않으면, 개별 공동체의 역할 강화는 단편에 그친다.</w:t>
+        <w:t>이웃은 산업화 시대에 가장 크게 위축된 공동체다. 표준 제도가 모든 것을 조직하면서 이웃 간 상호 돌봄과 협동의 기능은 사라졌다. 그러나 정체성을 발휘하려는 시대에 이웃은 다시 중요해진다. 이웃은 아이가 다양한 흥미를 실험하고 어른이 새 관계를 맺는 일상망이다. 관심 기반 모임, 생활 멘토, 상호 돌봄의 품앗이가 이웃에서 이루어질 때, 개인은 자신의 탐색 시간과 관계 자원을 이웃 공동체에 위임하며 발견의 기회를 얻는다. 단절된 사람이 다시 관계망으로 돌아오는 첫 번째 통로도 이웃이다.</w:t>
       </w:r>
     </w:p>
     <w:p>
@@ -981,7 +1125,7 @@
           <w:color w:val="000000"/>
           <w:sz w:val="23"/>
         </w:rPr>
-        <w:t>5.3  세계라는 층위의 의미가 달라진다</w:t>
+        <w:t>5.3  마을 — 훈련과 재학습의 공동체</w:t>
       </w:r>
     </w:p>
     <w:p>
@@ -997,7 +1141,87 @@
           <w:color w:val="000000"/>
           <w:sz w:val="21"/>
         </w:rPr>
-        <w:t>디지털 시대에 세계가 청년·중장년의 연결 공동체로 등장한다는 사실은 가볍지 않다. 국경을 넘는 협업이 가능해지면서 개인의 발휘 무대가 국내에 갇히지 않는다. 동시에 기후변화·AI 위험·감염병처럼 국가 단위를 넘어서는 공동 위험이 커지면서, 세계는 ‘개인에게 닿지 않던’ 추상적 질서에서 생활과 생존에 직결된 능동적 거버넌스 층위로 바뀐다. 앤서니 기든스가 말한 시간·공간의 압축이 제도의 차원에서 현실이 되는 셈이다.</w:t>
+        <w:t>마을은 생애주기의 여러 단계에서 훈련과 재학습을 담당하는 공동체다. 산업화 시대에 마을은 도시에 기능을 빼앗겨 행정 단위로 전락했다. 디지털 시대에 마을은 '발견된 방향을 훈련으로 잇는 생활권'으로 복원된다. 청소년에게는 마을 멘토단과 훈련 경로가, 중장년에게는 재학습 접근로가 마을을 통해 열린다. 마을은 중앙 정부가 직접 설계하기보다, 구성원이 자치적으로 훈련 경로를 만들고 국가가 최소 기준을 보장하는 방식으로 운영될 때 가장 잘 작동한다. 오스트롬이 말한 다층 자치 거버넌스의 가장 구체적인 현장이 바로 마을이다.</w:t>
+      </w:r>
+    </w:p>
+    <w:p>
+      <w:pPr>
+        <w:keepNext/>
+        <w:spacing w:before="240" w:after="80"/>
+      </w:pPr>
+      <w:r>
+        <w:rPr>
+          <w:rFonts w:ascii="Noto Sans KR" w:hAnsi="Noto Sans KR" w:eastAsia="Noto Sans KR"/>
+          <w:b/>
+          <w:i w:val="0"/>
+          <w:color w:val="000000"/>
+          <w:sz w:val="23"/>
+        </w:rPr>
+        <w:t>5.4  도시 — 발휘의 무대</w:t>
+      </w:r>
+    </w:p>
+    <w:p>
+      <w:pPr>
+        <w:spacing w:before="0" w:after="120" w:line="384" w:lineRule="auto"/>
+        <w:jc w:val="both"/>
+      </w:pPr>
+      <w:r>
+        <w:rPr>
+          <w:rFonts w:ascii="Noto Serif KR" w:hAnsi="Noto Serif KR" w:eastAsia="Noto Serif KR"/>
+          <w:b w:val="0"/>
+          <w:i w:val="0"/>
+          <w:color w:val="000000"/>
+          <w:sz w:val="21"/>
+        </w:rPr>
+        <w:t>도시는 산업화 시대에 학교와 공장을 집적하여 표준 인재를 생산·배치하는 기관이었다. 입시 경쟁과 정규 고용이 도시를 중심으로 조직되었고, 개인은 도시에 자신의 노동력과 삶의 결정권을 대규모로 위임했다. 디지털 시대에 도시는 정체성을 실제 기여로 발휘하는 무대이자 생활 기반으로 전환된다. 프로젝트 연결, 직무 전환, 생활 조정이 도시의 기능이 되며, 청년의 첫 기여와 중장년의 재설계가 도시를 통해 이루어진다. 도시에 위임되는 권리의 성격이 '표준 경로에 나를 맞추기'에서 '내 기여를 발휘할 무대 만들기'로 바뀐다.</w:t>
+      </w:r>
+    </w:p>
+    <w:p>
+      <w:pPr>
+        <w:keepNext/>
+        <w:spacing w:before="240" w:after="80"/>
+      </w:pPr>
+      <w:r>
+        <w:rPr>
+          <w:rFonts w:ascii="Noto Sans KR" w:hAnsi="Noto Sans KR" w:eastAsia="Noto Sans KR"/>
+          <w:b/>
+          <w:i w:val="0"/>
+          <w:color w:val="000000"/>
+          <w:sz w:val="23"/>
+        </w:rPr>
+        <w:t>5.5  국가와 세계 — 조율과 공동 위험 관리</w:t>
+      </w:r>
+    </w:p>
+    <w:p>
+      <w:pPr>
+        <w:spacing w:before="0" w:after="120" w:line="384" w:lineRule="auto"/>
+        <w:jc w:val="both"/>
+      </w:pPr>
+      <w:r>
+        <w:rPr>
+          <w:rFonts w:ascii="Noto Serif KR" w:hAnsi="Noto Serif KR" w:eastAsia="Noto Serif KR"/>
+          <w:b w:val="0"/>
+          <w:i w:val="0"/>
+          <w:color w:val="000000"/>
+          <w:sz w:val="21"/>
+        </w:rPr>
+        <w:t>국가는 산업화 시대에 권리 집중의 핵심 기구였다. 교육·고용·복지·의료를 중앙에서 일괄 관리했고, 개인이 어느 공동체에 권리를 위임할지 선택할 여지를 거의 남기지 않았다. 디지털 시대의 국가는 이 역할에서 물러나야 한다. 국가의 역할은 모든 것을 관리하는 데서, 가정·이웃·마을·도시가 각자의 역할을 잘 할 수 있도록 최소 조건을 보장하고 이들 사이를 조율하는 '메타 거버넌스'로 전환되어야 한다. 모든 사람에게 권리 위임의 기회가 열리도록 최소 권리선을 세우고, 어느 공동체가 과도한 권리를 독점하지 않도록 규칙을 만드는 것이 국가의 일이다.</w:t>
+      </w:r>
+    </w:p>
+    <w:p>
+      <w:pPr>
+        <w:spacing w:before="0" w:after="120" w:line="384" w:lineRule="auto"/>
+        <w:jc w:val="both"/>
+      </w:pPr>
+      <w:r>
+        <w:rPr>
+          <w:rFonts w:ascii="Noto Serif KR" w:hAnsi="Noto Serif KR" w:eastAsia="Noto Serif KR"/>
+          <w:b w:val="0"/>
+          <w:i w:val="0"/>
+          <w:color w:val="000000"/>
+          <w:sz w:val="21"/>
+        </w:rPr>
+        <w:t>세계는 산업화 시대에 국가 간 협정으로만 작동하던 추상적 층위였다. 개인에게는 닿지 않는 먼 곳이었다. 디지털 시대에 세계는 처음으로 개인의 권리 위임 상대로 등장한다. 국경을 넘는 협업이 가능해지면서 청년과 중장년이 세계 무대에서 기여를 발휘할 수 있다. 동시에 기후변화, 인공지능 위험, 감염병처럼 국가 단위를 넘어서는 공동 위험이 커지면서, 세계는 모든 생애단계의 안전과 직결된 능동적 거버넌스 층위가 된다.</w:t>
       </w:r>
     </w:p>
     <w:p>
@@ -1016,7 +1240,7 @@
           <w:color w:val="000000"/>
           <w:sz w:val="27"/>
         </w:rPr>
-        <w:t>6.  정책적 함의와 결론</w:t>
+        <w:t>6.  디지털 전환이 공동체에 요구하는 것 — 권리의 재분산</w:t>
       </w:r>
     </w:p>
     <w:p>
@@ -1032,7 +1256,7 @@
           <w:color w:val="000000"/>
           <w:sz w:val="23"/>
         </w:rPr>
-        <w:t>6.1  다섯 가지 정책 방향</w:t>
+        <w:t>6.1  권리 분산의 세 원리</w:t>
       </w:r>
     </w:p>
     <w:p>
@@ -1048,7 +1272,7 @@
           <w:color w:val="000000"/>
           <w:sz w:val="21"/>
         </w:rPr>
-        <w:t xml:space="preserve">첫째, 생애주기 단계별 공동체 역할을 제도로 명시한다. </w:t>
+        <w:t xml:space="preserve">첫째, 위임의 선택권을 개인에게 돌려주어야 한다. </w:t>
       </w:r>
       <w:r>
         <w:rPr>
@@ -1058,7 +1282,7 @@
           <w:color w:val="000000"/>
           <w:sz w:val="21"/>
         </w:rPr>
-        <w:t>현행 복지는 생애주기의 질적 차이를 충분히 담지 못한다. 위에서 본 여섯 단계와 단계별 역할 분담을 제도 설계의 단위로 삼아야 한다.</w:t>
+        <w:t>국가 하나가 모든 생애단계의 필요를 독점 관리하는 구조에서, 개인이 필요에 따라 가정·이웃·마을·도시에 권리를 나누어 위임하고 상황이 바뀌면 거두어들일 수 있는 구조로 전환해야 한다. 이것은 제도의 문제이기 이전에 철학의 문제다. 로크가 말했듯, 위임은 항상 회수 가능해야 한다.</w:t>
       </w:r>
     </w:p>
     <w:p>
@@ -1075,7 +1299,7 @@
           <w:color w:val="000000"/>
           <w:sz w:val="21"/>
         </w:rPr>
-        <w:t xml:space="preserve">둘째, 이웃·마을 공동체의 역량 회복에 장기 투자한다. </w:t>
+        <w:t xml:space="preserve">둘째, 가까운 공동체의 역량을 복원해야 한다. </w:t>
       </w:r>
       <w:r>
         <w:rPr>
@@ -1085,7 +1309,7 @@
           <w:color w:val="000000"/>
           <w:sz w:val="21"/>
         </w:rPr>
-        <w:t>사회자본은 한번 무너지면 쉽게 돌아오지 않는다. 인프라뿐 아니라 관계 형성을 돕는 꾸준한 커뮤니티 빌딩이 필요하다.</w:t>
+        <w:t>브론펜브레너가 지적했듯, 개인에게 가장 깊은 영향을 미치는 것은 가까운 환경에서의 직접적 상호작용이다. 산업화 시대에 약화된 이웃과 마을의 역할을 되살리는 것이 권리 재분산의 핵심이다. 이는 중앙 예산을 지방에 내려보내는 것이 아니라, 이웃과 마을이 스스로 역할을 정의하고 자치적으로 운영할 수 있는 조건을 만드는 것이다.</w:t>
       </w:r>
     </w:p>
     <w:p>
@@ -1102,7 +1326,7 @@
           <w:color w:val="000000"/>
           <w:sz w:val="21"/>
         </w:rPr>
-        <w:t xml:space="preserve">셋째, 배제된 사람에게 선제적·능동적으로 다가간다. </w:t>
+        <w:t xml:space="preserve">셋째, 생애주기 단계별 위임 구조를 제도로 명시해야 한다. </w:t>
       </w:r>
       <w:r>
         <w:rPr>
@@ -1112,61 +1336,7 @@
           <w:color w:val="000000"/>
           <w:sz w:val="21"/>
         </w:rPr>
-        <w:t>찾아가는 발달 지원, 방문형 돌봄, 중장년 경력 재설계 지원처럼 ‘먼저 찾아가는’ 공공 서비스를 제도화한다.</w:t>
-      </w:r>
-    </w:p>
-    <w:p>
-      <w:pPr>
-        <w:spacing w:before="0" w:after="120" w:line="384" w:lineRule="auto"/>
-        <w:ind w:firstLine="227"/>
-        <w:jc w:val="both"/>
-      </w:pPr>
-      <w:r>
-        <w:rPr>
-          <w:rFonts w:ascii="Noto Serif KR" w:hAnsi="Noto Serif KR" w:eastAsia="Noto Serif KR"/>
-          <w:b/>
-          <w:i w:val="0"/>
-          <w:color w:val="000000"/>
-          <w:sz w:val="21"/>
-        </w:rPr>
-        <w:t xml:space="preserve">넷째, 마을 단위 훈련·멘토 생태계를 구축한다. </w:t>
-      </w:r>
-      <w:r>
-        <w:rPr>
-          <w:rFonts w:ascii="Noto Serif KR" w:hAnsi="Noto Serif KR" w:eastAsia="Noto Serif KR"/>
-          <w:b w:val="0"/>
-          <w:i w:val="0"/>
-          <w:color w:val="000000"/>
-          <w:sz w:val="21"/>
-        </w:rPr>
-        <w:t>청소년과 중장년의 격차를 줄이는 핵심은 마을 단위의 훈련 경로와 멘토단이다. 중앙이 직접 운영하기보다 지역이 자율 설계하고 국가가 최소 기준을 보장한다.</w:t>
-      </w:r>
-    </w:p>
-    <w:p>
-      <w:pPr>
-        <w:spacing w:before="0" w:after="120" w:line="384" w:lineRule="auto"/>
-        <w:ind w:firstLine="227"/>
-        <w:jc w:val="both"/>
-      </w:pPr>
-      <w:r>
-        <w:rPr>
-          <w:rFonts w:ascii="Noto Serif KR" w:hAnsi="Noto Serif KR" w:eastAsia="Noto Serif KR"/>
-          <w:b/>
-          <w:i w:val="0"/>
-          <w:color w:val="000000"/>
-          <w:sz w:val="21"/>
-        </w:rPr>
-        <w:t xml:space="preserve">다섯째, 국가의 역할을 ‘관리’에서 ‘조율’로 바꾼다. </w:t>
-      </w:r>
-      <w:r>
-        <w:rPr>
-          <w:rFonts w:ascii="Noto Serif KR" w:hAnsi="Noto Serif KR" w:eastAsia="Noto Serif KR"/>
-          <w:b w:val="0"/>
-          <w:i w:val="0"/>
-          <w:color w:val="000000"/>
-          <w:sz w:val="21"/>
-        </w:rPr>
-        <w:t>중앙 관리형 국가는 다양한 정체성 실현 요구에 응답할 수 없다. 국가는 도시·마을의 실험을 조율하고 최소 권리선을 세우는 메타 거버넌스로 전환해야 한다.</w:t>
+        <w:t>각 생애단계에서 어떤 공동체가 어떤 역할을 맡는지, 개인이 어디에 권리를 위임하는지, 그 위임이 어떤 조건에서 회수될 수 있는지를 사회적 합의로 명시해야 한다. 현행 복지 제도는 생애주기의 질적 차이를 충분히 담지 못한다.</w:t>
       </w:r>
     </w:p>
     <w:p>
@@ -1182,7 +1352,7 @@
           <w:color w:val="000000"/>
           <w:sz w:val="23"/>
         </w:rPr>
-        <w:t>6.2  한계</w:t>
+        <w:t>6.2  생애는 누적의 사이클이다</w:t>
       </w:r>
     </w:p>
     <w:p>
@@ -1198,7 +1368,23 @@
           <w:color w:val="000000"/>
           <w:sz w:val="21"/>
         </w:rPr>
-        <w:t>이 분석에는 한계가 있다. 생애단계 구분은 이상형이어서 현실의 경계는 훨씬 유동적이며, 특히 청년기와 중장년기의 구분이 점점 흐려지고 있다. 여섯 공동체의 역할도 상호 배타적이지 않아 실제로는 여러 공동체가 같은 기능을 겹쳐 수행한다. 동원한 이론들은 주로 서구의 경험에서 나온 것이어서 한국 사회의 빠른 산업화와 교육열, 가족 구조의 급변을 온전히 담지 못할 수 있다. 무엇보다 디지털 시대의 공동체 모델은 아직 진행 중인 과정이며, 여기서 그린 그림은 실증이 아니라 규범적 지향에 가깝다.</w:t>
+        <w:t>디지털 시대의 생애주기는 직선이 아니라, 앞 단계의 결과가 다음 단계의 조건이 되는 나선형 누적 구조다. 중장년의 재설계는 청소년기의 훈련이 성공했을 때 가능하고, 노년의 전수는 청년·중장년의 발휘가 쌓였을 때 의미를 갖는다. 그래서 초기 단계의 권리 위임 격차—어떤 아이는 가정·이웃·마을의 풍부한 지지 속에서 단서를 발견하고, 어떤 아이는 그 공동체들이 모두 약한 환경에서 태어나는—는 단순한 기회 불평등이 아니라 생애 전체 사이클의 단절을 의미한다.</w:t>
+      </w:r>
+    </w:p>
+    <w:p>
+      <w:pPr>
+        <w:spacing w:before="0" w:after="120" w:line="384" w:lineRule="auto"/>
+        <w:jc w:val="both"/>
+      </w:pPr>
+      <w:r>
+        <w:rPr>
+          <w:rFonts w:ascii="Noto Serif KR" w:hAnsi="Noto Serif KR" w:eastAsia="Noto Serif KR"/>
+          <w:b w:val="0"/>
+          <w:i w:val="0"/>
+          <w:color w:val="000000"/>
+          <w:sz w:val="21"/>
+        </w:rPr>
+        <w:t>센과 누스바움이 역량의 관점에서 강조했듯, 형식적 권리보다 중요한 것은 실질적 역량이다. 모든 사람이 투표권을 갖는다고 해서 모든 사람이 정치적 역량을 갖는 것이 아니듯, 모든 아이에게 학교가 있다고 해서 모든 아이가 발견과 훈련의 역량을 갖는 것은 아니다. 공동체는 그 역량이 실제로 작동하도록 조건을 만들어야 한다. 위임의 구조가 역량의 실현을 뒷받침할 때, 비로소 계약은 정당성을 갖는다.</w:t>
       </w:r>
     </w:p>
     <w:p>
@@ -1230,7 +1416,7 @@
           <w:color w:val="000000"/>
           <w:sz w:val="21"/>
         </w:rPr>
-        <w:t>이 글의 핵심 주장은 셋으로 요약된다. 첫째, 공동체의 변화는 기술이 바깥에서 결정하는 것이 아니라 개인의 생애주기적 필요가 안에서 밀어 올리는 과정이다. 둘째, 산업화 시대의 표준화 공동체는 정체성을 발휘하려는 개인의 필요에 응답하지 못하는 구조적 한계를 안고 있다. 셋째, 디지털 시대의 공동체 재편은 이웃·마을의 부활, 도시의 무대화, 국가의 조율자 전환, 세계의 능동화를 통해 각 생애단계의 필요에 맞춰 응답하는 분산형 구조를 지향한다.</w:t>
+        <w:t>이 연구의 핵심 주장은 세 줄로 요약된다. 첫째, 공동체는 개인이 자신의 필요에 의해 권리를 위임하는 계약을 통해 구현되는 실체이며, 위임은 언제든 회수 가능해야 한다. 둘째, 산업화 시대는 이 위임이 국가 하나로 집중·고착되면서 표준화·획일화·배제의 폐해를 낳았고, 이것이 이 연구의 비판적 초점이다. 셋째, 디지털 시대의 전환은 기술의 문제가 아니라, 집중된 권리를 가정·이웃·마을·도시·국가·세계의 여러 층위로 다시 분산하고 개인에게 위임의 선택권을 돌려주는 재편의 과제다.</w:t>
       </w:r>
     </w:p>
     <w:p>
@@ -1246,7 +1432,7 @@
           <w:color w:val="000000"/>
           <w:sz w:val="21"/>
         </w:rPr>
-        <w:t>디지털 전환은 기술의 문제가 아니라 사람의 문제다. 그리고 사람의 문제는 언제나 생애주기의 문제다. 우리가 내놓는 것은 기술 로드맵이 아니라 인간 발달의 생태학이며, 그 생태학 안에서 공동체는 개인의 필요에 응답함으로써만 존재의 이유를 증명한다.</w:t>
+        <w:t>루소가 꿈꾼 자치, 로크가 요구한 신탁의 회수 가능성, 오스트롬이 실증한 다층 자치 거버넌스, 브론펜브레너가 밝힌 근위 과정의 중요성, 폴라니가 진단한 재착근의 필요—이 모든 논의는 같은 방향을 가리킨다. 개인은 자신의 필요에 맞는 공동체를 스스로 구성하고, 그 공동체에 권리를 위임하며, 상황이 바뀌면 권리를 거두어들일 수 있어야 한다. 그 순환이 작동하는 사회가 디지털 시대 마스터플랜이 지향하는 공동체의 모습이다.</w:t>
       </w:r>
     </w:p>
     <w:p>
@@ -1281,39 +1467,7 @@
           <w:color w:val="000000"/>
           <w:sz w:val="19"/>
         </w:rPr>
-        <w:t>Bourdieu, P. (1986). The forms of capital. In J. G. Richardson (Ed.), Handbook of Theory and Research for the Sociology of Education (pp. 241–258). Greenwood Press.</w:t>
-      </w:r>
-    </w:p>
-    <w:p>
-      <w:pPr>
-        <w:spacing w:after="60" w:line="324" w:lineRule="auto"/>
-        <w:ind w:left="454" w:hanging="454"/>
-      </w:pPr>
-      <w:r>
-        <w:rPr>
-          <w:rFonts w:ascii="Noto Serif KR" w:hAnsi="Noto Serif KR" w:eastAsia="Noto Serif KR"/>
-          <w:b w:val="0"/>
-          <w:i w:val="0"/>
-          <w:color w:val="000000"/>
-          <w:sz w:val="19"/>
-        </w:rPr>
         <w:t>Bronfenbrenner, U. (1979). The Ecology of Human Development. Harvard University Press.</w:t>
-      </w:r>
-    </w:p>
-    <w:p>
-      <w:pPr>
-        <w:spacing w:after="60" w:line="324" w:lineRule="auto"/>
-        <w:ind w:left="454" w:hanging="454"/>
-      </w:pPr>
-      <w:r>
-        <w:rPr>
-          <w:rFonts w:ascii="Noto Serif KR" w:hAnsi="Noto Serif KR" w:eastAsia="Noto Serif KR"/>
-          <w:b w:val="0"/>
-          <w:i w:val="0"/>
-          <w:color w:val="000000"/>
-          <w:sz w:val="19"/>
-        </w:rPr>
-        <w:t>Chetty, R., Hendren, N., Kline, P., &amp; Saez, E. (2014). Where is the land of opportunity? Quarterly Journal of Economics, 129(4), 1553–1623.</w:t>
       </w:r>
     </w:p>
     <w:p>
@@ -1361,22 +1515,6 @@
           <w:color w:val="000000"/>
           <w:sz w:val="19"/>
         </w:rPr>
-        <w:t>Esping-Andersen, G. (1990). The Three Worlds of Welfare Capitalism. Princeton University Press.</w:t>
-      </w:r>
-    </w:p>
-    <w:p>
-      <w:pPr>
-        <w:spacing w:after="60" w:line="324" w:lineRule="auto"/>
-        <w:ind w:left="454" w:hanging="454"/>
-      </w:pPr>
-      <w:r>
-        <w:rPr>
-          <w:rFonts w:ascii="Noto Serif KR" w:hAnsi="Noto Serif KR" w:eastAsia="Noto Serif KR"/>
-          <w:b w:val="0"/>
-          <w:i w:val="0"/>
-          <w:color w:val="000000"/>
-          <w:sz w:val="19"/>
-        </w:rPr>
         <w:t>Esping-Andersen, G. (1999). Social Foundations of Postindustrial Economies. Oxford University Press.</w:t>
       </w:r>
     </w:p>
@@ -1393,7 +1531,7 @@
           <w:color w:val="000000"/>
           <w:sz w:val="19"/>
         </w:rPr>
-        <w:t>Giddens, A. (1991). Modernity and Self-Identity. Stanford University Press.</w:t>
+        <w:t>Heckman, J. J. (2006). Skill formation and the economics of investing in disadvantaged children. Science, 312(5782), 1900–1902.</w:t>
       </w:r>
     </w:p>
     <w:p>
@@ -1409,7 +1547,23 @@
           <w:color w:val="000000"/>
           <w:sz w:val="19"/>
         </w:rPr>
-        <w:t>Heckman, J. J. (2006). Skill formation and the economics of investing in disadvantaged children. Science, 312(5782), 1900–1902.</w:t>
+        <w:t>Hobbes, T. (1651). Leviathan. Andrew Crooke.</w:t>
+      </w:r>
+    </w:p>
+    <w:p>
+      <w:pPr>
+        <w:spacing w:after="60" w:line="324" w:lineRule="auto"/>
+        <w:ind w:left="454" w:hanging="454"/>
+      </w:pPr>
+      <w:r>
+        <w:rPr>
+          <w:rFonts w:ascii="Noto Serif KR" w:hAnsi="Noto Serif KR" w:eastAsia="Noto Serif KR"/>
+          <w:b w:val="0"/>
+          <w:i w:val="0"/>
+          <w:color w:val="000000"/>
+          <w:sz w:val="19"/>
+        </w:rPr>
+        <w:t>Locke, J. (1689). Two Treatises of Government. Awnsham Churchill.</w:t>
       </w:r>
     </w:p>
     <w:p>
@@ -1489,7 +1643,7 @@
           <w:color w:val="000000"/>
           <w:sz w:val="19"/>
         </w:rPr>
-        <w:t>Putnam, R. D. (2000). Bowling Alone. Simon &amp; Schuster.</w:t>
+        <w:t>Rousseau, J.-J. (1762). Du Contrat Social. Marc-Michel Rey.</w:t>
       </w:r>
     </w:p>
     <w:p>

</xml_diff>

<commit_message>
docs: format references in APA 7th, drop uncited Putnam
</commit_message>
<xml_diff>
--- a/archive/docx/p2-lifecycle-community-report.docx
+++ b/archive/docx/p2-lifecycle-community-report.docx
@@ -1456,7 +1456,7 @@
     </w:p>
     <w:p>
       <w:pPr>
-        <w:spacing w:after="60" w:line="324" w:lineRule="auto"/>
+        <w:spacing w:after="60" w:line="336" w:lineRule="auto"/>
         <w:ind w:left="454" w:hanging="454"/>
       </w:pPr>
       <w:r>
@@ -1467,12 +1467,32 @@
           <w:color w:val="000000"/>
           <w:sz w:val="19"/>
         </w:rPr>
-        <w:t>Bronfenbrenner, U. (1979). The Ecology of Human Development. Harvard University Press.</w:t>
+        <w:t xml:space="preserve">Bronfenbrenner, U. (1979). </w:t>
+      </w:r>
+      <w:r>
+        <w:rPr>
+          <w:rFonts w:ascii="Noto Serif KR" w:hAnsi="Noto Serif KR" w:eastAsia="Noto Serif KR"/>
+          <w:b w:val="0"/>
+          <w:i/>
+          <w:color w:val="000000"/>
+          <w:sz w:val="19"/>
+        </w:rPr>
+        <w:t>The ecology of human development: Experiments by nature and design</w:t>
+      </w:r>
+      <w:r>
+        <w:rPr>
+          <w:rFonts w:ascii="Noto Serif KR" w:hAnsi="Noto Serif KR" w:eastAsia="Noto Serif KR"/>
+          <w:b w:val="0"/>
+          <w:i w:val="0"/>
+          <w:color w:val="000000"/>
+          <w:sz w:val="19"/>
+        </w:rPr>
+        <w:t>. Harvard University Press.</w:t>
       </w:r>
     </w:p>
     <w:p>
       <w:pPr>
-        <w:spacing w:after="60" w:line="324" w:lineRule="auto"/>
+        <w:spacing w:after="60" w:line="336" w:lineRule="auto"/>
         <w:ind w:left="454" w:hanging="454"/>
       </w:pPr>
       <w:r>
@@ -1483,12 +1503,32 @@
           <w:color w:val="000000"/>
           <w:sz w:val="19"/>
         </w:rPr>
-        <w:t>Erikson, E. H. (1950). Childhood and Society. W. W. Norton.</w:t>
+        <w:t xml:space="preserve">Erikson, E. H. (1950). </w:t>
+      </w:r>
+      <w:r>
+        <w:rPr>
+          <w:rFonts w:ascii="Noto Serif KR" w:hAnsi="Noto Serif KR" w:eastAsia="Noto Serif KR"/>
+          <w:b w:val="0"/>
+          <w:i/>
+          <w:color w:val="000000"/>
+          <w:sz w:val="19"/>
+        </w:rPr>
+        <w:t>Childhood and society</w:t>
+      </w:r>
+      <w:r>
+        <w:rPr>
+          <w:rFonts w:ascii="Noto Serif KR" w:hAnsi="Noto Serif KR" w:eastAsia="Noto Serif KR"/>
+          <w:b w:val="0"/>
+          <w:i w:val="0"/>
+          <w:color w:val="000000"/>
+          <w:sz w:val="19"/>
+        </w:rPr>
+        <w:t>. W. W. Norton.</w:t>
       </w:r>
     </w:p>
     <w:p>
       <w:pPr>
-        <w:spacing w:after="60" w:line="324" w:lineRule="auto"/>
+        <w:spacing w:after="60" w:line="336" w:lineRule="auto"/>
         <w:ind w:left="454" w:hanging="454"/>
       </w:pPr>
       <w:r>
@@ -1499,12 +1539,32 @@
           <w:color w:val="000000"/>
           <w:sz w:val="19"/>
         </w:rPr>
-        <w:t>Erikson, E. H. (1968). Identity: Youth and Crisis. W. W. Norton.</w:t>
+        <w:t xml:space="preserve">Erikson, E. H. (1968). </w:t>
+      </w:r>
+      <w:r>
+        <w:rPr>
+          <w:rFonts w:ascii="Noto Serif KR" w:hAnsi="Noto Serif KR" w:eastAsia="Noto Serif KR"/>
+          <w:b w:val="0"/>
+          <w:i/>
+          <w:color w:val="000000"/>
+          <w:sz w:val="19"/>
+        </w:rPr>
+        <w:t>Identity: Youth and crisis</w:t>
+      </w:r>
+      <w:r>
+        <w:rPr>
+          <w:rFonts w:ascii="Noto Serif KR" w:hAnsi="Noto Serif KR" w:eastAsia="Noto Serif KR"/>
+          <w:b w:val="0"/>
+          <w:i w:val="0"/>
+          <w:color w:val="000000"/>
+          <w:sz w:val="19"/>
+        </w:rPr>
+        <w:t>. W. W. Norton.</w:t>
       </w:r>
     </w:p>
     <w:p>
       <w:pPr>
-        <w:spacing w:after="60" w:line="324" w:lineRule="auto"/>
+        <w:spacing w:after="60" w:line="336" w:lineRule="auto"/>
         <w:ind w:left="454" w:hanging="454"/>
       </w:pPr>
       <w:r>
@@ -1515,12 +1575,32 @@
           <w:color w:val="000000"/>
           <w:sz w:val="19"/>
         </w:rPr>
-        <w:t>Esping-Andersen, G. (1999). Social Foundations of Postindustrial Economies. Oxford University Press.</w:t>
+        <w:t xml:space="preserve">Esping-Andersen, G. (1999). </w:t>
+      </w:r>
+      <w:r>
+        <w:rPr>
+          <w:rFonts w:ascii="Noto Serif KR" w:hAnsi="Noto Serif KR" w:eastAsia="Noto Serif KR"/>
+          <w:b w:val="0"/>
+          <w:i/>
+          <w:color w:val="000000"/>
+          <w:sz w:val="19"/>
+        </w:rPr>
+        <w:t>Social foundations of postindustrial economies</w:t>
+      </w:r>
+      <w:r>
+        <w:rPr>
+          <w:rFonts w:ascii="Noto Serif KR" w:hAnsi="Noto Serif KR" w:eastAsia="Noto Serif KR"/>
+          <w:b w:val="0"/>
+          <w:i w:val="0"/>
+          <w:color w:val="000000"/>
+          <w:sz w:val="19"/>
+        </w:rPr>
+        <w:t>. Oxford University Press.</w:t>
       </w:r>
     </w:p>
     <w:p>
       <w:pPr>
-        <w:spacing w:after="60" w:line="324" w:lineRule="auto"/>
+        <w:spacing w:after="60" w:line="336" w:lineRule="auto"/>
         <w:ind w:left="454" w:hanging="454"/>
       </w:pPr>
       <w:r>
@@ -1531,12 +1611,32 @@
           <w:color w:val="000000"/>
           <w:sz w:val="19"/>
         </w:rPr>
-        <w:t>Heckman, J. J. (2006). Skill formation and the economics of investing in disadvantaged children. Science, 312(5782), 1900–1902.</w:t>
+        <w:t xml:space="preserve">Heckman, J. J. (2006). Skill formation and the economics of investing in disadvantaged children. </w:t>
+      </w:r>
+      <w:r>
+        <w:rPr>
+          <w:rFonts w:ascii="Noto Serif KR" w:hAnsi="Noto Serif KR" w:eastAsia="Noto Serif KR"/>
+          <w:b w:val="0"/>
+          <w:i/>
+          <w:color w:val="000000"/>
+          <w:sz w:val="19"/>
+        </w:rPr>
+        <w:t>Science, 312</w:t>
+      </w:r>
+      <w:r>
+        <w:rPr>
+          <w:rFonts w:ascii="Noto Serif KR" w:hAnsi="Noto Serif KR" w:eastAsia="Noto Serif KR"/>
+          <w:b w:val="0"/>
+          <w:i w:val="0"/>
+          <w:color w:val="000000"/>
+          <w:sz w:val="19"/>
+        </w:rPr>
+        <w:t>(5782), 1900–1902. https://doi.org/10.1126/science.1128898</w:t>
       </w:r>
     </w:p>
     <w:p>
       <w:pPr>
-        <w:spacing w:after="60" w:line="324" w:lineRule="auto"/>
+        <w:spacing w:after="60" w:line="336" w:lineRule="auto"/>
         <w:ind w:left="454" w:hanging="454"/>
       </w:pPr>
       <w:r>
@@ -1547,12 +1647,32 @@
           <w:color w:val="000000"/>
           <w:sz w:val="19"/>
         </w:rPr>
-        <w:t>Hobbes, T. (1651). Leviathan. Andrew Crooke.</w:t>
+        <w:t xml:space="preserve">Hobbes, T. (1996). </w:t>
+      </w:r>
+      <w:r>
+        <w:rPr>
+          <w:rFonts w:ascii="Noto Serif KR" w:hAnsi="Noto Serif KR" w:eastAsia="Noto Serif KR"/>
+          <w:b w:val="0"/>
+          <w:i/>
+          <w:color w:val="000000"/>
+          <w:sz w:val="19"/>
+        </w:rPr>
+        <w:t>Leviathan</w:t>
+      </w:r>
+      <w:r>
+        <w:rPr>
+          <w:rFonts w:ascii="Noto Serif KR" w:hAnsi="Noto Serif KR" w:eastAsia="Noto Serif KR"/>
+          <w:b w:val="0"/>
+          <w:i w:val="0"/>
+          <w:color w:val="000000"/>
+          <w:sz w:val="19"/>
+        </w:rPr>
+        <w:t xml:space="preserve"> (R. Tuck, Ed.). Cambridge University Press. (Original work published 1651)</w:t>
       </w:r>
     </w:p>
     <w:p>
       <w:pPr>
-        <w:spacing w:after="60" w:line="324" w:lineRule="auto"/>
+        <w:spacing w:after="60" w:line="336" w:lineRule="auto"/>
         <w:ind w:left="454" w:hanging="454"/>
       </w:pPr>
       <w:r>
@@ -1563,12 +1683,32 @@
           <w:color w:val="000000"/>
           <w:sz w:val="19"/>
         </w:rPr>
-        <w:t>Locke, J. (1689). Two Treatises of Government. Awnsham Churchill.</w:t>
+        <w:t xml:space="preserve">Locke, J. (1988). </w:t>
+      </w:r>
+      <w:r>
+        <w:rPr>
+          <w:rFonts w:ascii="Noto Serif KR" w:hAnsi="Noto Serif KR" w:eastAsia="Noto Serif KR"/>
+          <w:b w:val="0"/>
+          <w:i/>
+          <w:color w:val="000000"/>
+          <w:sz w:val="19"/>
+        </w:rPr>
+        <w:t>Two treatises of government</w:t>
+      </w:r>
+      <w:r>
+        <w:rPr>
+          <w:rFonts w:ascii="Noto Serif KR" w:hAnsi="Noto Serif KR" w:eastAsia="Noto Serif KR"/>
+          <w:b w:val="0"/>
+          <w:i w:val="0"/>
+          <w:color w:val="000000"/>
+          <w:sz w:val="19"/>
+        </w:rPr>
+        <w:t xml:space="preserve"> (P. Laslett, Ed.). Cambridge University Press. (Original work published 1689)</w:t>
       </w:r>
     </w:p>
     <w:p>
       <w:pPr>
-        <w:spacing w:after="60" w:line="324" w:lineRule="auto"/>
+        <w:spacing w:after="60" w:line="336" w:lineRule="auto"/>
         <w:ind w:left="454" w:hanging="454"/>
       </w:pPr>
       <w:r>
@@ -1579,12 +1719,32 @@
           <w:color w:val="000000"/>
           <w:sz w:val="19"/>
         </w:rPr>
-        <w:t>Nussbaum, M. C. (2011). Creating Capabilities: The Human Development Approach. Harvard University Press.</w:t>
+        <w:t xml:space="preserve">Nussbaum, M. C. (2011). </w:t>
+      </w:r>
+      <w:r>
+        <w:rPr>
+          <w:rFonts w:ascii="Noto Serif KR" w:hAnsi="Noto Serif KR" w:eastAsia="Noto Serif KR"/>
+          <w:b w:val="0"/>
+          <w:i/>
+          <w:color w:val="000000"/>
+          <w:sz w:val="19"/>
+        </w:rPr>
+        <w:t>Creating capabilities: The human development approach</w:t>
+      </w:r>
+      <w:r>
+        <w:rPr>
+          <w:rFonts w:ascii="Noto Serif KR" w:hAnsi="Noto Serif KR" w:eastAsia="Noto Serif KR"/>
+          <w:b w:val="0"/>
+          <w:i w:val="0"/>
+          <w:color w:val="000000"/>
+          <w:sz w:val="19"/>
+        </w:rPr>
+        <w:t>. Harvard University Press.</w:t>
       </w:r>
     </w:p>
     <w:p>
       <w:pPr>
-        <w:spacing w:after="60" w:line="324" w:lineRule="auto"/>
+        <w:spacing w:after="60" w:line="336" w:lineRule="auto"/>
         <w:ind w:left="454" w:hanging="454"/>
       </w:pPr>
       <w:r>
@@ -1595,12 +1755,32 @@
           <w:color w:val="000000"/>
           <w:sz w:val="19"/>
         </w:rPr>
-        <w:t>Ostrom, E. (1990). Governing the Commons. Cambridge University Press.</w:t>
+        <w:t xml:space="preserve">Ostrom, E. (1990). </w:t>
+      </w:r>
+      <w:r>
+        <w:rPr>
+          <w:rFonts w:ascii="Noto Serif KR" w:hAnsi="Noto Serif KR" w:eastAsia="Noto Serif KR"/>
+          <w:b w:val="0"/>
+          <w:i/>
+          <w:color w:val="000000"/>
+          <w:sz w:val="19"/>
+        </w:rPr>
+        <w:t>Governing the commons: The evolution of institutions for collective action</w:t>
+      </w:r>
+      <w:r>
+        <w:rPr>
+          <w:rFonts w:ascii="Noto Serif KR" w:hAnsi="Noto Serif KR" w:eastAsia="Noto Serif KR"/>
+          <w:b w:val="0"/>
+          <w:i w:val="0"/>
+          <w:color w:val="000000"/>
+          <w:sz w:val="19"/>
+        </w:rPr>
+        <w:t>. Cambridge University Press.</w:t>
       </w:r>
     </w:p>
     <w:p>
       <w:pPr>
-        <w:spacing w:after="60" w:line="324" w:lineRule="auto"/>
+        <w:spacing w:after="60" w:line="336" w:lineRule="auto"/>
         <w:ind w:left="454" w:hanging="454"/>
       </w:pPr>
       <w:r>
@@ -1611,12 +1791,32 @@
           <w:color w:val="000000"/>
           <w:sz w:val="19"/>
         </w:rPr>
-        <w:t>Ostrom, E. (2009). A polycentric approach for coping with climate change. World Bank Policy Research Working Paper, No. 5095.</w:t>
+        <w:t xml:space="preserve">Ostrom, E. (2009). </w:t>
+      </w:r>
+      <w:r>
+        <w:rPr>
+          <w:rFonts w:ascii="Noto Serif KR" w:hAnsi="Noto Serif KR" w:eastAsia="Noto Serif KR"/>
+          <w:b w:val="0"/>
+          <w:i/>
+          <w:color w:val="000000"/>
+          <w:sz w:val="19"/>
+        </w:rPr>
+        <w:t>A polycentric approach for coping with climate change</w:t>
+      </w:r>
+      <w:r>
+        <w:rPr>
+          <w:rFonts w:ascii="Noto Serif KR" w:hAnsi="Noto Serif KR" w:eastAsia="Noto Serif KR"/>
+          <w:b w:val="0"/>
+          <w:i w:val="0"/>
+          <w:color w:val="000000"/>
+          <w:sz w:val="19"/>
+        </w:rPr>
+        <w:t xml:space="preserve"> (Policy Research Working Paper No. 5095). World Bank.</w:t>
       </w:r>
     </w:p>
     <w:p>
       <w:pPr>
-        <w:spacing w:after="60" w:line="324" w:lineRule="auto"/>
+        <w:spacing w:after="60" w:line="336" w:lineRule="auto"/>
         <w:ind w:left="454" w:hanging="454"/>
       </w:pPr>
       <w:r>
@@ -1627,12 +1827,32 @@
           <w:color w:val="000000"/>
           <w:sz w:val="19"/>
         </w:rPr>
-        <w:t>Polanyi, K. (1944). The Great Transformation. Farrar &amp; Rinehart.</w:t>
+        <w:t xml:space="preserve">Polanyi, K. (1944). </w:t>
+      </w:r>
+      <w:r>
+        <w:rPr>
+          <w:rFonts w:ascii="Noto Serif KR" w:hAnsi="Noto Serif KR" w:eastAsia="Noto Serif KR"/>
+          <w:b w:val="0"/>
+          <w:i/>
+          <w:color w:val="000000"/>
+          <w:sz w:val="19"/>
+        </w:rPr>
+        <w:t>The great transformation: The political and economic origins of our time</w:t>
+      </w:r>
+      <w:r>
+        <w:rPr>
+          <w:rFonts w:ascii="Noto Serif KR" w:hAnsi="Noto Serif KR" w:eastAsia="Noto Serif KR"/>
+          <w:b w:val="0"/>
+          <w:i w:val="0"/>
+          <w:color w:val="000000"/>
+          <w:sz w:val="19"/>
+        </w:rPr>
+        <w:t>. Farrar &amp; Rinehart.</w:t>
       </w:r>
     </w:p>
     <w:p>
       <w:pPr>
-        <w:spacing w:after="60" w:line="324" w:lineRule="auto"/>
+        <w:spacing w:after="60" w:line="336" w:lineRule="auto"/>
         <w:ind w:left="454" w:hanging="454"/>
       </w:pPr>
       <w:r>
@@ -1643,12 +1863,32 @@
           <w:color w:val="000000"/>
           <w:sz w:val="19"/>
         </w:rPr>
-        <w:t>Rousseau, J.-J. (1762). Du Contrat Social. Marc-Michel Rey.</w:t>
+        <w:t xml:space="preserve">Rousseau, J.-J. (1997). </w:t>
+      </w:r>
+      <w:r>
+        <w:rPr>
+          <w:rFonts w:ascii="Noto Serif KR" w:hAnsi="Noto Serif KR" w:eastAsia="Noto Serif KR"/>
+          <w:b w:val="0"/>
+          <w:i/>
+          <w:color w:val="000000"/>
+          <w:sz w:val="19"/>
+        </w:rPr>
+        <w:t>The social contract and other later political writings</w:t>
+      </w:r>
+      <w:r>
+        <w:rPr>
+          <w:rFonts w:ascii="Noto Serif KR" w:hAnsi="Noto Serif KR" w:eastAsia="Noto Serif KR"/>
+          <w:b w:val="0"/>
+          <w:i w:val="0"/>
+          <w:color w:val="000000"/>
+          <w:sz w:val="19"/>
+        </w:rPr>
+        <w:t xml:space="preserve"> (V. Gourevitch, Ed. &amp; Trans.). Cambridge University Press. (Original work published 1762)</w:t>
       </w:r>
     </w:p>
     <w:p>
       <w:pPr>
-        <w:spacing w:after="60" w:line="324" w:lineRule="auto"/>
+        <w:spacing w:after="60" w:line="336" w:lineRule="auto"/>
         <w:ind w:left="454" w:hanging="454"/>
       </w:pPr>
       <w:r>
@@ -1659,12 +1899,32 @@
           <w:color w:val="000000"/>
           <w:sz w:val="19"/>
         </w:rPr>
-        <w:t>Sen, A. (1999). Development as Freedom. Anchor Books.</w:t>
+        <w:t xml:space="preserve">Sen, A. (1999). </w:t>
+      </w:r>
+      <w:r>
+        <w:rPr>
+          <w:rFonts w:ascii="Noto Serif KR" w:hAnsi="Noto Serif KR" w:eastAsia="Noto Serif KR"/>
+          <w:b w:val="0"/>
+          <w:i/>
+          <w:color w:val="000000"/>
+          <w:sz w:val="19"/>
+        </w:rPr>
+        <w:t>Development as freedom</w:t>
+      </w:r>
+      <w:r>
+        <w:rPr>
+          <w:rFonts w:ascii="Noto Serif KR" w:hAnsi="Noto Serif KR" w:eastAsia="Noto Serif KR"/>
+          <w:b w:val="0"/>
+          <w:i w:val="0"/>
+          <w:color w:val="000000"/>
+          <w:sz w:val="19"/>
+        </w:rPr>
+        <w:t>. Oxford University Press.</w:t>
       </w:r>
     </w:p>
     <w:p>
       <w:pPr>
-        <w:spacing w:after="60" w:line="324" w:lineRule="auto"/>
+        <w:spacing w:after="60" w:line="336" w:lineRule="auto"/>
         <w:ind w:left="454" w:hanging="454"/>
       </w:pPr>
       <w:r>
@@ -1675,7 +1935,27 @@
           <w:color w:val="000000"/>
           <w:sz w:val="19"/>
         </w:rPr>
-        <w:t>Young, M. (1958). The Rise of the Meritocracy: 1870–2033. Thames and Hudson.</w:t>
+        <w:t xml:space="preserve">Young, M. (1958). </w:t>
+      </w:r>
+      <w:r>
+        <w:rPr>
+          <w:rFonts w:ascii="Noto Serif KR" w:hAnsi="Noto Serif KR" w:eastAsia="Noto Serif KR"/>
+          <w:b w:val="0"/>
+          <w:i/>
+          <w:color w:val="000000"/>
+          <w:sz w:val="19"/>
+        </w:rPr>
+        <w:t>The rise of the meritocracy, 1870–2033</w:t>
+      </w:r>
+      <w:r>
+        <w:rPr>
+          <w:rFonts w:ascii="Noto Serif KR" w:hAnsi="Noto Serif KR" w:eastAsia="Noto Serif KR"/>
+          <w:b w:val="0"/>
+          <w:i w:val="0"/>
+          <w:color w:val="000000"/>
+          <w:sz w:val="19"/>
+        </w:rPr>
+        <w:t>. Thames and Hudson.</w:t>
       </w:r>
     </w:p>
     <w:sectPr>

</xml_diff>

<commit_message>
docs: argue for federated small-cities in 5.4
</commit_message>
<xml_diff>
--- a/archive/docx/p2-lifecycle-community-report.docx
+++ b/archive/docx/p2-lifecycle-community-report.docx
@@ -1178,6 +1178,38 @@
     </w:p>
     <w:p>
       <w:pPr>
+        <w:spacing w:before="0" w:after="120" w:line="384" w:lineRule="auto"/>
+        <w:jc w:val="both"/>
+      </w:pPr>
+      <w:r>
+        <w:rPr>
+          <w:rFonts w:ascii="Noto Serif KR" w:hAnsi="Noto Serif KR" w:eastAsia="Noto Serif KR"/>
+          <w:b w:val="0"/>
+          <w:i w:val="0"/>
+          <w:color w:val="000000"/>
+          <w:sz w:val="21"/>
+        </w:rPr>
+        <w:t>이 전환은 도시의 형태 자체를 다시 묻게 한다. 산업화 시대의 대도시는 학교·기업·행정을 한 점에 모아 규모의 효율을 끌어낸 집적 장치였다. 그러나 모든 기능이 한 도시에 집중되면, 개인이 위임한 권리도 그 거대한 행정 단위 하나에 묶여 회수하기 어려워진다. 이것은 국가로의 권리 집중과 같은 문제를 도시 규모에서 되풀이하는 것이다. 정체성을 발휘하는 무대로서의 도시는 다른 원리를 요구한다. 사람은 자신이 어디에 무엇을 맡겼는지 보이고, 필요하면 거두어들일 수 있는 규모 안에서만 권리를 능동적으로 위임한다.</w:t>
+      </w:r>
+    </w:p>
+    <w:p>
+      <w:pPr>
+        <w:spacing w:before="0" w:after="120" w:line="384" w:lineRule="auto"/>
+        <w:jc w:val="both"/>
+      </w:pPr>
+      <w:r>
+        <w:rPr>
+          <w:rFonts w:ascii="Noto Serif KR" w:hAnsi="Noto Serif KR" w:eastAsia="Noto Serif KR"/>
+          <w:b w:val="0"/>
+          <w:i w:val="0"/>
+          <w:color w:val="000000"/>
+          <w:sz w:val="21"/>
+        </w:rPr>
+        <w:t>그래서 디지털 시대의 도시는 거대한 단일 대도시가 아니라, 사람이 체감할 수 있는 규모의 강소도시들이 연합하는 형태로 재편되어야 한다. 강소도시는 한 사람의 강점을 알아보고 기여의 기회를 연결할 만큼 작고 구체적인 생활권이다. 이 규모에서는 위임이 익명의 거대 행정에 흡수되지 않고, 내가 맡긴 결정권이 어떻게 쓰이는지 들여다보고 조정할 수 있다. 동시에 작은 도시 하나만으로는 정체성을 발휘할 시장과 데이터, 기회의 폭이 부족하다. 그래서 강소도시들은 데이터·인공지능·행정·산업의 기반을 서로 연결해 하나의 연합된 생활권을 이룬다. 발휘의 폭은 연합 전체에서 얻되, 권리의 위임과 회수는 내가 속한 작은 도시 단위에서 이루어지는 구조다. 규모의 효율은 연합으로 확보하고 권리의 통제권은 개인 가까이 남기는 것, 이것이 대도시를 강소도시의 연합으로 다시 짜야 하는 이유다.</w:t>
+      </w:r>
+    </w:p>
+    <w:p>
+      <w:pPr>
         <w:keepNext/>
         <w:spacing w:before="240" w:after="80"/>
       </w:pPr>

</xml_diff>

<commit_message>
docs: add page numbers, replace mobilized-theory phrasing
</commit_message>
<xml_diff>
--- a/archive/docx/p2-lifecycle-community-report.docx
+++ b/archive/docx/p2-lifecycle-community-report.docx
@@ -140,7 +140,7 @@
           <w:color w:val="000000"/>
           <w:sz w:val="21"/>
         </w:rPr>
-        <w:t>공동체는 개인이 자신의 필요에 의해, 자신이 가진 권리의 일부를 위임하는 일종의 계약을 통해 구현되는 실체다. 개인이 먼저 있고, 그 개인이 생애의 단계마다 다른 필요를 마주하며, 그 필요를 감당하기 위해 시간·자원·결정권 등 자신의 권리 일부를 특정 공동체에 위임한다. 위임의 집합이 공동체라는 실체를 만들고, 더 이상 그 공동체를 필요로 하지 않을 때 개인은 위임한 권리를 거두어들일 수 있어야 한다. 이 연구는 그 '위임과 회수의 계약 논리'를 이론적 토대로 삼아, 농업·산업화·디지털 세 시대의 노동 원리, 생애주기별 개인의 필요, 그 필요에 응답하는 공동체의 형성과 역할을 정합적으로 연결한다. 산업화 시대에 국가라는 특정 공동체로 권리가 과도하게 집중·고착되면서 위임의 회수가 어려워졌고, 표준화·획일화·중앙집중의 폐해가 생겼다는 것이 이 연구의 비판적 초점이다. 디지털 시대는 그 집중된 권리를 가정·이웃·마을·도시·국가·세계 여러 층위로 다시 분산하는 전환으로 해석된다. 사회계약론(홉스·로크·루소), 오스트롬의 다층 거버넌스, 브론펜브레너의 생태체계, 에릭슨의 발달단계, 센·누스바움의 역량 이론, 폴라니의 재착근이 이론적 근거로 동원된다.</w:t>
+        <w:t>공동체는 개인이 자신의 필요에 의해, 자신이 가진 권리의 일부를 위임하는 일종의 계약을 통해 구현되는 실체다. 개인이 먼저 있고, 그 개인이 생애의 단계마다 다른 필요를 마주하며, 그 필요를 감당하기 위해 시간·자원·결정권 등 자신의 권리 일부를 특정 공동체에 위임한다. 위임의 집합이 공동체라는 실체를 만들고, 더 이상 그 공동체를 필요로 하지 않을 때 개인은 위임한 권리를 거두어들일 수 있어야 한다. 이 연구는 그 '위임과 회수의 계약 논리'를 이론적 토대로 삼아, 농업·산업화·디지털 세 시대의 노동 원리, 생애주기별 개인의 필요, 그 필요에 응답하는 공동체의 형성과 역할을 정합적으로 연결한다. 산업화 시대에 국가라는 특정 공동체로 권리가 과도하게 집중·고착되면서 위임의 회수가 어려워졌고, 표준화·획일화·중앙집중의 폐해가 생겼다는 것이 이 연구의 비판적 초점이다. 디지털 시대는 그 집중된 권리를 가정·이웃·마을·도시·국가·세계 여러 층위로 다시 분산하는 전환으로 해석된다. 공동체를 권리 위임의 계약으로 보는 시각은 홉스·로크·루소의 사회계약론에 뿌리를 두며, 권리가 한곳에 쏠리지 않고 여러 층위로 나뉘어야 한다는 주장은 오스트롬의 다층 거버넌스 연구와 맞닿는다. 개인의 생애 흐름은 에릭슨의 발달 연구로, 공동체의 층위 구조는 브론펜브레너의 생태체계 연구로, 위임이 실제로 개인의 삶을 넓히는지를 가늠하는 잣대는 센과 누스바움의 역량 이론으로 설명한다.</w:t>
       </w:r>
     </w:p>
     <w:p>
@@ -1991,6 +1991,7 @@
       </w:r>
     </w:p>
     <w:sectPr>
+      <w:footerReference w:type="default" r:id="rId9"/>
       <w:pgSz w:w="11906" w:h="16838"/>
       <w:pgMar w:top="1587" w:right="1701" w:bottom="1417" w:left="1701" w:header="720" w:footer="720" w:gutter="0"/>
       <w:cols w:space="720"/>
@@ -1998,6 +1999,46 @@
     </w:sectPr>
   </w:body>
 </w:document>
+</file>
+
+<file path=word/footer1.xml><?xml version="1.0" encoding="utf-8"?>
+<w:ftr xmlns:m="http://schemas.openxmlformats.org/officeDocument/2006/math" xmlns:mc="http://schemas.openxmlformats.org/markup-compatibility/2006" xmlns:mo="http://schemas.microsoft.com/office/mac/office/2008/main" xmlns:mv="urn:schemas-microsoft-com:mac:vml" xmlns:o="urn:schemas-microsoft-com:office:office" xmlns:r="http://schemas.openxmlformats.org/officeDocument/2006/relationships" xmlns:v="urn:schemas-microsoft-com:vml" xmlns:w10="urn:schemas-microsoft-com:office:word" xmlns:w14="http://schemas.microsoft.com/office/word/2010/wordml" xmlns:w="http://schemas.openxmlformats.org/wordprocessingml/2006/main" xmlns:wne="http://schemas.microsoft.com/office/word/2006/wordml" xmlns:wp14="http://schemas.microsoft.com/office/word/2010/wordprocessingDrawing" xmlns:wp="http://schemas.openxmlformats.org/drawingml/2006/wordprocessingDrawing" xmlns:wpc="http://schemas.microsoft.com/office/word/2010/wordprocessingCanvas" xmlns:wpg="http://schemas.microsoft.com/office/word/2010/wordprocessingGroup" xmlns:wpi="http://schemas.microsoft.com/office/word/2010/wordprocessingInk" xmlns:wps="http://schemas.microsoft.com/office/word/2010/wordprocessingShape" mc:Ignorable="w14 wp14">
+  <w:p>
+    <w:pPr>
+      <w:pStyle w:val="Footer"/>
+      <w:jc w:val="center"/>
+    </w:pPr>
+    <w:r/>
+    <w:r>
+      <w:rPr>
+        <w:rFonts w:ascii="Noto Sans KR" w:hAnsi="Noto Sans KR"/>
+        <w:color w:val="000000"/>
+        <w:sz w:val="18"/>
+      </w:rPr>
+      <w:fldChar w:fldCharType="begin"/>
+      <w:instrText xml:space="preserve">PAGE</w:instrText>
+      <w:fldChar w:fldCharType="end"/>
+    </w:r>
+    <w:r>
+      <w:rPr>
+        <w:rFonts w:ascii="Noto Sans KR" w:hAnsi="Noto Sans KR"/>
+        <w:color w:val="000000"/>
+        <w:sz w:val="18"/>
+      </w:rPr>
+      <w:t xml:space="preserve"> / </w:t>
+    </w:r>
+    <w:r>
+      <w:rPr>
+        <w:rFonts w:ascii="Noto Sans KR" w:hAnsi="Noto Sans KR"/>
+        <w:color w:val="000000"/>
+        <w:sz w:val="18"/>
+      </w:rPr>
+      <w:fldChar w:fldCharType="begin"/>
+      <w:instrText xml:space="preserve">NUMPAGES</w:instrText>
+      <w:fldChar w:fldCharType="end"/>
+    </w:r>
+  </w:p>
+</w:ftr>
 </file>
 
 <file path=word/numbering.xml><?xml version="1.0" encoding="utf-8"?>

</xml_diff>

<commit_message>
docs: add scholar intros and plain-language glosses
</commit_message>
<xml_diff>
--- a/archive/docx/p2-lifecycle-community-report.docx
+++ b/archive/docx/p2-lifecycle-community-report.docx
@@ -201,7 +201,7 @@
           <w:color w:val="000000"/>
           <w:sz w:val="21"/>
         </w:rPr>
-        <w:t>이 연구는 공동체를 개인이 자신의 필요에 의해 자신이 가진 권리의 일부를 위임하는 계약을 통해 구현되는 실체로 본다. 개인이 먼저 있고, 그 개인이 살아가면서 마주치는 필요가 공동체를 불러낸다. 개인의 권리 위임이 없으면 공동체는 존재하지 않으며, 위임이 철회되면 그 공동체는 근거를 잃는다.</w:t>
+        <w:t>이 연구는 공동체를 개인이 자신의 필요에 의해 자신이 가진 권리의 일부를 위임하는 계약을 통해 구현되는 실체로 본다. 개인이 먼저 있고, 그 개인이 살아가면서 마주치는 필요가 공동체를 불러낸다. 개인의 권리 위임이 없으면 공동체는 존재하지 않으며, 위임이 철회되면 그 공동체는 근거를 잃는다. 예를 들어 어떤 부모가 아이를 위해 마을의 돌봄 협동조합에 시간과 결정권 일부를 맡기는 것이 곧 위임이다. 그 부모가 이사를 떠나거나 조합이 역할을 다하지 못한다고 판단하면 위임을 거두어들일 수 있어야 한다는 것이 이 연구의 출발점이다.</w:t>
       </w:r>
     </w:p>
     <w:p>
@@ -217,7 +217,7 @@
           <w:color w:val="000000"/>
           <w:sz w:val="21"/>
         </w:rPr>
-        <w:t>이 정의는 서구 근대 철학의 사회계약론과 직결된다. 17세기 영국의 철학자 토머스 홉스는 『리바이어던』(1651)에서, 인간이 '만인의 만인에 대한 전쟁' 상태를 벗어나기 위해 자신의 권리를 통치자에게 넘긴다는 계약을 상상했다. 그는 생존을 위한 권리 위임이 공동체(국가)를 만든다고 보았다. 그러나 홉스의 모델에서 위임은 사실상 회수 불가능하다. 한번 넘긴 권리는 절대 권력에 귀속되고, 개인은 다시 꺼내올 수 없다. 이것이 바로 권리 집중의 원형이다. 산업화 시대가 국가 중심으로 권리를 집중시킨 구조는 홉스적 설계의 현대적 구현이었다고 볼 수 있다.</w:t>
+        <w:t>이 정의는 서구 근대 철학의 사회계약론(사회 구성원들이 서로 계약을 맺어 공동체를 만든다는 이론)과 직결된다. 17세기 영국의 정치철학자 토머스 홉스(Thomas Hobbes, 1588–1679)는 대표작 『리바이어던』(1651)에서, 인간이 '만인의 만인에 대한 전쟁' 상태—모두가 모두와 싸우는 혼돈—를 벗어나기 위해 자신의 권리를 통치자에게 넘긴다는 계약을 상상했다. 그는 생존을 위한 권리 위임이 공동체(국가)를 만든다고 보았다. 그러나 홉스의 모델에서 위임은 사실상 회수 불가능하다. 한번 넘긴 권리는 절대 권력에 귀속되고, 개인은 다시 꺼내올 수 없다. 이것이 바로 권리 집중의 원형이다. 산업화 시대가 국가 중심으로 권리를 집중시킨 구조는 홉스적 설계의 현대적 구현이었다고 볼 수 있다.</w:t>
       </w:r>
     </w:p>
     <w:p>
@@ -233,7 +233,7 @@
           <w:color w:val="000000"/>
           <w:sz w:val="21"/>
         </w:rPr>
-        <w:t>이에 맞서는 목소리는 같은 세기 말에 등장한다. 존 로크는 『통치론』(1689)에서 사람들이 통치자에게 권력을 맡기는 것은 어디까지나 '신탁(trust)', 곧 믿고 맡기는 것일 뿐이며, 통치자가 그 믿음을 저버리면 사람들은 맡긴 권력을 도로 거두어들일 권리가 있다고 보았다. 로크의 신탁과 저항권은 이 연구가 말하는 '위임은 회수 가능해야 한다'는 주장의 직접적인 이론적 뿌리다. 18세기 프랑스의 사상가 장자크 루소는 『사회계약론』(1762)에서 '일반의지'라는 개념을 통해 권리가 한 사람이나 한 기관에 집중되어서는 안 되고, 공동체 구성원 모두에게 골고루 돌아가야 한다고 보았다. 루소는 자치와 분산의 원리를 옹호한 사상가였다. 이 세 사람의 논의를 한 줄로 읽으면, 공동체는 개인이 권리를 위임함으로써 만들어지되(홉스), 그 위임은 언제든 회수할 수 있어야 하며(로크), 권리는 어느 한 곳에 집중되어서는 안 된다(루소)는 명제가 된다. 이것이 이 연구의 이론적 뼈대다.</w:t>
+        <w:t>이에 맞서는 목소리는 같은 세기 말에 등장한다. 17세기 영국의 철학자 존 로크(John Locke, 1632–1704)는 『통치론』(1689)에서 사람들이 통치자에게 권력을 맡기는 것은 어디까지나 '신탁(trust)', 곧 믿고 맡기는 것일 뿐이며, 통치자가 그 믿음을 저버리면 사람들은 맡긴 권력을 도로 거두어들일 권리가 있다고 보았다. 로크의 신탁과 저항권은 이 연구가 말하는 '위임은 회수 가능해야 한다'는 주장의 직접적인 이론적 뿌리다. 18세기 프랑스의 정치철학자 장자크 루소(Jean-Jacques Rousseau, 1712–1778)는 『사회계약론』(1762)에서 '일반의지(volonté générale)'라는 개념을 통해—일반의지란 구성원 전체의 공동 이익을 향한 의지를 뜻한다—권리가 한 사람이나 한 기관에 집중되어서는 안 되고, 공동체 구성원 모두에게 골고루 돌아가야 한다고 보았다. 루소는 자치와 분산의 원리를 옹호한 사상가였다. 이 세 사람의 논의를 한 줄로 읽으면, 공동체는 개인이 권리를 위임함으로써 만들어지되(홉스), 그 위임은 언제든 회수할 수 있어야 하며(로크), 권리는 어느 한 곳에 집중되어서는 안 된다(루소)는 명제가 된다. 이것이 이 연구의 이론적 뼈대다.</w:t>
       </w:r>
     </w:p>
     <w:p>
@@ -300,7 +300,7 @@
           <w:color w:val="000000"/>
           <w:sz w:val="21"/>
         </w:rPr>
-        <w:t>공동체를 권리 위임의 계약으로 구현된 실체로 보면, 일상의 행위들이 모두 위임으로 읽힌다. 개인이 가정에 시간과 돌봄을 바치는 것은 가정에 권리를 위임하는 행위다. 마을의 자치 조직에 결정권을 맡기는 것도, 국가에 세금을 내고 법을 따르는 것도 모두 자신의 권리 일부를 특정 공동체에 넘기는 계약 행위다. 이 관점에서 보면 공동체의 크기와 권한은 그 공동체에 얼마나 많은 권리가 위임되어 있느냐에 따라 결정된다. 위임이 많을수록 공동체는 강력해지고, 위임이 철회되면 공동체는 힘을 잃는다.</w:t>
+        <w:t>공동체를 권리 위임의 계약으로 구현된 실체로 보면, 일상의 행위들이 모두 위임으로 읽힌다. 개인이 가정에 시간과 돌봄을 바치는 것은 가정에 권리를 위임하는 행위다. 마을의 자치 조직에 결정권을 맡기는 것도, 국가에 세금을 내고 법을 따르는 것도 모두 자신의 권리 일부를 특정 공동체에 넘기는 계약 행위다. 이 관점에서 보면 공동체의 크기와 권한은 그 공동체에 얼마나 많은 권리가 위임되어 있느냐에 따라 결정된다. 위임이 많을수록 공동체는 강력해지고, 위임이 철회되면 공동체는 힘을 잃는다. 마치 주주들이 투자금을 거두어들이면 회사가 힘을 잃는 것처럼, 구성원들이 권리를 철회하면 공동체는 근거를 잃는다.</w:t>
       </w:r>
     </w:p>
     <w:p>
@@ -316,7 +316,7 @@
           <w:color w:val="000000"/>
           <w:sz w:val="21"/>
         </w:rPr>
-        <w:t>그렇다면 개인은 왜 권리를 위임하는가. 답은 단순하다. 필요 때문이다. 혼자서는 감당할 수 없는 필요가 생길 때, 개인은 그 필요를 충족할 수 있는 공동체에 권리를 위임한다. 아이를 낳고 기르는 필요는 가정이라는 공동체에 시간과 자원을 위임하게 한다. 안전의 필요는 마을과 국가에 결정권을 위임하게 한다. 노년의 의존 필요는 가정과 국가 모두에 돌봄과 소득의 권리를 위임하게 한다. 필요가 변하면 위임의 대상과 규모도 바뀐다.</w:t>
+        <w:t>그렇다면 개인은 왜 권리를 위임하는가. 답은 단순하다. 필요 때문이다. 혼자서는 감당할 수 없는 필요가 생길 때, 개인은 그 필요를 충족할 수 있는 공동체에 권리를 위임한다. 아이를 낳고 기르는 필요는 가정이라는 공동체에 시간과 자원을 위임하게 한다. 안전의 필요는 마을과 국가에 결정권을 위임하게 한다. 노년의 의존 필요는 가정과 국가 모두에 돌봄과 소득의 권리를 위임하게 한다. 필요가 변하면 위임의 대상과 규모도 바뀐다. 청년기에는 경력을 쌓기 위해 도시에 많은 권리를 위임하지만, 중장년기에는 가정과 이웃으로 위임의 무게중심이 옮겨가는 것이 그 예다.</w:t>
       </w:r>
     </w:p>
     <w:p>
@@ -332,7 +332,7 @@
           <w:color w:val="000000"/>
           <w:sz w:val="21"/>
         </w:rPr>
-        <w:t>인도의 경제학자 아마르티아 센은 개발을 자유의 확장으로 정의했다(『자유로서의 발전』, 1999). 센은 단순히 소득이 있다는 것이 아니라, 개인이 실제로 할 수 있는 일과 될 수 있는 존재의 폭이 넓어지는 것이 진정한 발전이라고 보았다. 철학자 마사 누스바움은 이를 '역량(capabilities)'이라는 개념으로 구체화했다 (『역량의 창조』, 2011). 역량이란 단지 이론적 가능성이 아니라 실제로 실행할 수 있는 능력을 가리킨다. 공동체가 개인에게 역량을 제공하는 한에서만 위임은 정당성을 갖는다. 역량을 빼앗는 공동체는 위임을 받을 근거가 없다.</w:t>
+        <w:t>노벨 경제학상을 받은 인도 출신 경제학자 아마르티아 센(Amartya Sen, 1933– )은 개발을 자유의 확장으로 정의했다(『자유로서의 발전』, 1999). 센은 단순히 소득이 있다는 것이 아니라, 개인이 실제로 할 수 있는 일과 될 수 있는 존재의 폭이 넓어지는 것이 진정한 발전이라고 보았다. 가령 같은 소득을 가진 두 사람이라도 한 사람은 교육의 기회가 있고 다른 사람은 없다면, 두 사람의 '발전' 수준은 다르다. 미국의 철학자 마사 누스바움(Martha Nussbaum, 1947– )은 이를 '역량(capabilities, 단순한 이론적 가능성이 아니라 실제로 실행할 수 있는 능력)'이라는 개념으로 구체화했다 (『역량의 창조』, 2011). 공동체가 개인에게 역량을 제공하는 한에서만 위임은 정당성을 갖는다. 역량을 빼앗는 공동체는 위임을 받을 근거가 없다.</w:t>
       </w:r>
     </w:p>
     <w:p>
@@ -364,7 +364,7 @@
           <w:color w:val="000000"/>
           <w:sz w:val="21"/>
         </w:rPr>
-        <w:t>로크의 신탁 이론이 핵심적으로 가리키는 것은, 위임은 조건부라는 점이다. 개인이 국가에 권리를 넘기는 것은 국가가 그 권리를 올바르게 사용하리라는 믿음을 전제로 한다. 그 믿음이 깨지면 권리는 다시 개인에게로 돌아와야 한다. 그런데 산업화 시대에는 이 회수의 회로가 막혔다. 국가는 표준화된 제도를 통해 교육, 고용, 복지, 의료를 모두 중앙에서 관리하기 시작했고, 개인은 어느 공동체에 얼마만큼 권리를 위임할지 스스로 결정하기 어렵게 되었다. 태어나면 국가 교육에 들어가고, 졸업하면 국가가 인증한 기업에 취직하며, 노년에는 국가 연금으로 생존하는 단선적 경로가 강제되었다.</w:t>
+        <w:t>로크의 신탁 이론이 핵심적으로 가리키는 것은, 위임은 조건부라는 점이다. 개인이 국가에 권리를 넘기는 것은 국가가 그 권리를 올바르게 사용하리라는 믿음을 전제로 한다. 그 믿음이 깨지면 권리는 다시 개인에게로 돌아와야 한다. 그런데 산업화 시대에는 이 회수의 회로가 막혔다. 국가는 표준화된 제도를 통해 교육, 고용, 복지, 의료를 모두 중앙에서 관리하기 시작했고, 개인은 어느 공동체에 얼마만큼 권리를 위임할지 스스로 결정하기 어렵게 되었다. 태어나면 국가 교육에 들어가고, 졸업하면 국가가 인증한 기업에 취직하며, 노년에는 국가 연금으로 생존하는 단선적 경로가 강제되었다. 이 경로 바깥에 서는 것은 곧 사회적 낙오를 의미했다.</w:t>
       </w:r>
     </w:p>
     <w:p>
@@ -380,7 +380,7 @@
           <w:color w:val="000000"/>
           <w:sz w:val="21"/>
         </w:rPr>
-        <w:t>이 과정에서 세 가지 공동체가 힘을 잃었다. 이웃은 산업화 시대에 표준 제도에 가려 공동 돌봄의 기능을 잃어버렸다. 마을은 생활공동체의 기능이 도시로 흡수되면서 해체되어 갔다. 가정은 양육과 부양을 맡되 교육마저 학교에 위임해야 했으며, 점점 더 좁은 기능만 남게 되었다. 반면 국가는 거의 모든 기능을 빨아들이며 비대해졌다. 권리가 집중된 공동체(국가)는 다양한 개인의 필요에 맞춤 대응할 수 없다. 표준화는 평균을 위해 설계되어 평균 바깥의 개인을 배제하며, 획일화는 다양성을 억압하고, 중앙집중은 현장의 맥락을 무시한다.</w:t>
+        <w:t>이 과정에서 세 가지 공동체가 힘을 잃었다. 이웃은 산업화 시대에 표준 제도에 가려 공동 돌봄의 기능을 잃어버렸다. 마을은 생활공동체의 기능이 도시로 흡수되면서 해체되어 갔다. 가정은 양육과 부양을 맡되 교육마저 학교에 위임해야 했으며, 점점 더 좁은 기능만 남게 되었다. 반면 국가는 거의 모든 기능을 빨아들이며 비대해졌다. 권리가 집중된 공동체(국가)는 다양한 개인의 필요에 맞춤 대응할 수 없다. 표준화는 평균을 위해 설계되어 평균 바깥의 개인을 배제하며, 획일화는 다양성을 억압하고, 중앙집중은 현장의 맥락을 무시한다. 장애인이나 소수 언어 화자처럼 표준 경로가 맞지 않는 사람은 제도 안에서 보이지 않는 사람이 되고 만다.</w:t>
       </w:r>
     </w:p>
     <w:p>
@@ -396,7 +396,7 @@
           <w:color w:val="000000"/>
           <w:sz w:val="21"/>
         </w:rPr>
-        <w:t>이 지점에서 경제학자 칼 폴라니의 통찰이 유효하다. 폴라니는 『거대한 전환』(1944)에서, 산업화 시대의 시장 경제가 노동과 토지와 화폐를 사회적 관계에서 뜯어내어 순수한 상품으로 만들었다고 분석했다. 폴라니에게 이것은 '탈착근(disembedding)'이었다. 사람들은 원래 살던 관계의 그물—가정, 이웃, 마을—에서 떨어져 나와 국가와 시장이라는 두 거대 기구에만 의존하게 되었다. 그의 통찰을 이 연구의 언어로 번역하면, 산업화 시대는 이웃·마을·가정에 분산되어 있던 권리 위임을 국가 하나로 집중시킨 시대였다. 디지털 시대의 과제는 그 집중을 원래의 여러 층위로 되돌리는 것, 즉 폴라니가 말한 '재착근(re-embedding)'이다.</w:t>
+        <w:t>이 지점에서 헝가리 출신 경제사학자 칼 폴라니(Karl Polanyi, 1886–1964)의 통찰이 유효하다. 폴라니는 대표작 『거대한 전환』(1944)에서, 산업화 시대의 시장 경제가 노동과 토지와 화폐를 사회적 관계에서 뜯어내어 순수한 상품으로 만들었다고 분석했다. 폴라니에게 이것은 '탈착근(disembedding, 사람들이 원래 속해 있던 관계의 그물에서 떨어져 나오는 것)'이었다. 사람들은 원래 살던 관계의 그물—가정, 이웃, 마을—에서 떨어져 나와 국가와 시장이라는 두 거대 기구에만 의존하게 되었다. 그의 통찰을 이 연구의 언어로 번역하면, 산업화 시대는 이웃·마을·가정에 분산되어 있던 권리 위임을 국가 하나로 집중시킨 시대였다. 디지털 시대의 과제는 그 집중을 원래의 여러 층위로 되돌리는 것, 즉 폴라니가 말한 '재착근(re-embedding, 사람들이 다시 관계의 그물 안으로 돌아오는 것)'이다.</w:t>
       </w:r>
     </w:p>
     <w:p>
@@ -428,7 +428,7 @@
           <w:color w:val="000000"/>
           <w:sz w:val="21"/>
         </w:rPr>
-        <w:t>노벨경제학상을 받은 엘리너 오스트롬은 공유 자원의 관리 문제를 연구하다가 중요한 발견을 했다. 사람들은 중앙 정부의 명령도, 사유화된 시장도 없이, 스스로 자치 규칙을 만들어 자원을 지속 가능하게 관리할 수 있다는 것이다(『공유의 비극을 넘어』, 1990). 그녀는 이를 '다층 거버넌스'라고 불렀다. 하나의 공동체가 모든 것을 독점하는 대신, 여러 층위의 공동체가 각자의 영역에서 자치적으로 문제를 나누어 맡는 구조다. 이것은 루소가 꿈꾼 자치의 현대적 실증이자, 이 연구가 디지털 시대 공동체 구조로 제안하는 모델과 정확히 일치한다. 권리는 가정·이웃·마을·도시·국가·세계가 층위에 따라 나누어 맡아야 하며, 어느 하나가 모든 권리를 독점하면 나머지 층위는 고사하고 개인은 선택지를 잃는다.</w:t>
+        <w:t>1990년에 여성 최초로 노벨 경제학상을 받은 미국의 정치경제학자 엘리너 오스트롬(Elinor Ostrom, 1933–2012)은 공유 자원의 관리 문제를 연구하다가 중요한 발견을 했다. 공유 자원이란 숲, 어장, 지하수처럼 여럿이 함께 쓰는 자원인데, 학계에서는 오랫동안 이런 자원을 사람들이 남용하고 고갈시킬 수밖에 없다고 여겼다. 그러나 오스트롬은 전 세계의 사례를 조사하며, 사람들은 중앙 정부의 명령도, 사유화된 시장도 없이, 스스로 자치 규칙을 만들어 자원을 지속 가능하게 관리할 수 있다는 것을 실증했다(『공유의 비극을 넘어』, 1990). 그녀는 이를 '다층 거버넌스(polycentric governance, 여러 층위의 공동체가 각자의 영역에서 자치적으로 문제를 나누어 맡는 구조)'라고 불렀다. 이것은 루소가 꿈꾼 자치의 현대적 실증이자, 이 연구가 디지털 시대 공동체 구조로 제안하는 모델과 정확히 일치한다. 권리는 가정·이웃·마을·도시·국가·세계가 층위에 따라 나누어 맡아야 하며, 어느 하나가 모든 권리를 독점하면 나머지 층위는 고사하고 개인은 선택지를 잃는다.</w:t>
       </w:r>
     </w:p>
     <w:p>
@@ -444,7 +444,7 @@
           <w:color w:val="000000"/>
           <w:sz w:val="21"/>
         </w:rPr>
-        <w:t>발달심리학자 우리 브론펜브레너는 개인의 발달을 여러 겹으로 중첩된 생태체계 안에서 이해했다(『인간 발달의 생태학』, 1979). 그에게 인간은 홀로 자라는 것이 아니라, 가정(미시체계), 이웃과 학교(중간체계), 부모가 일하는 직장(외체계), 사회의 가치 규범(거시체계)이 중첩되어 상호작용하는 환경 속에서 발달한다. 브론펜브레너의 핵심 통찰은, 개인에게 가장 깊은 영향을 미치는 것은 가까운 공동체와의 지속적이고 직접적인 상호작용—그가 '근위 과정'이라고 부른 것—이라는 점이다. 산업화 시대는 이 근위 과정이 일어나야 할 가정, 이웃, 마을을 약화시키고, 거시체계인 국가에 권리를 집중함으로써 개인의 발달을 가장 중요한 토대에서 분리시켰다.</w:t>
+        <w:t>미국의 발달심리학자 유리 브론펜브레너(Urie Bronfenbrenner, 1917–2005)는 개인의 발달을 여러 겹으로 중첩된 생태체계 안에서 이해했다(『인간 발달의 생태학』, 1979). 그에게 인간은 홀로 자라는 것이 아니라, 가정(미시체계), 이웃과 학교(중간체계), 부모가 일하는 직장(외체계), 사회의 가치 규범(거시체계)이 중첩되어 상호작용하는 환경 속에서 발달한다. 마치 양파 껍질처럼 여러 겹의 환경이 한 사람을 에워싸고 있는 구조다. 브론펜브레너의 핵심 통찰은, 개인에게 가장 깊은 영향을 미치는 것은 가까운 공동체와의 지속적이고 직접적인 상호작용—그가 '근위 과정(proximal process)'이라고 부른 것—이라는 점이다. 산업화 시대는 이 근위 과정이 일어나야 할 가정, 이웃, 마을을 약화시키고, 거시체계인 국가에 권리를 집중함으로써 개인의 발달을 가장 중요한 토대에서 분리시켰다.</w:t>
       </w:r>
     </w:p>
     <w:p>
@@ -495,7 +495,7 @@
           <w:color w:val="000000"/>
           <w:sz w:val="21"/>
         </w:rPr>
-        <w:t>농업 시대의 노동 원리는 협동이었다. 한 가족이나 한 마을이 혼자서는 감당할 수 없는 땅 갈기, 씨 뿌리기, 수확, 방어를 함께 해야만 생존할 수 있었다. 이 시대에 개인이 공동체에 위임한 것은 노동력과 결정권이었다. 가정에는 양육과 출산의 역할이 위임되었고, 이웃에는 품앗이와 두레의 노동이 위임되었으며, 마을에는 공동 경작지 관리와 자치 의사결정이 위임되었다. 국가는 신분 질서와 조세를 관장하는 먼 존재로, 개인의 일상에 직접적으로 깊이 개입하지는 않았다.</w:t>
+        <w:t>농업 시대의 노동 원리는 협동이었다. 한 가족이나 한 마을이 혼자서는 감당할 수 없는 땅 갈기, 씨 뿌리기, 수확, 방어를 함께 해야만 생존할 수 있었다. 이 시대에 개인이 공동체에 위임한 것은 노동력과 결정권이었다. 가정에는 양육과 출산의 역할이 위임되었고, 이웃에는 품앗이와 두레의 노동이 위임되었으며, 마을에는 공동 경작지 관리와 자치 의사결정이 위임되었다. 국가는 신분 질서와 조세를 관장하는 먼 존재로, 개인의 일상에 직접적으로 깊이 개입하지는 않았다. 한국의 품앗이가 이를 잘 보여준다. 이웃집 모내기를 함께 해주고, 추수 때 다시 도움을 받는 방식이었다. 이것은 비공식적이지만 매우 정교한 권리 위임과 회수의 순환이었다.</w:t>
       </w:r>
     </w:p>
     <w:p>
@@ -543,7 +543,7 @@
           <w:color w:val="000000"/>
           <w:sz w:val="21"/>
         </w:rPr>
-        <w:t>산업화 시대의 노동 원리는 분업이었다. 공장과 관료제 조직은 복잡한 생산 과정을 잘게 나누어 각자에게 단순 반복 직무를 맡겼다. 한 사람이 전체를 이해할 필요는 없었다. 정해진 직무를 정확히 수행하는 표준화된 노동력이 필요했다. 이 원리가 개인의 필요를 규정했다. '좋은 일자리'를 얻기 위한 표준화된 교육, 그 교육을 통과하기 위한 입시 경쟁, 정규직 고용과 연금으로 이어지는 단선 경로가 삶의 목표가 되었다.</w:t>
+        <w:t>산업화 시대의 노동 원리는 분업이었다. 분업이란 복잡한 생산 과정을 잘게 쪼개어 각자에게 특정 단계를 반복 담당하게 하는 방식이다. 공장과 관료제 조직은 이 원리로 생산성을 획기적으로 높였다. 한 사람이 전체를 이해할 필요는 없었다. 정해진 직무를 정확히 수행하는 표준화된 노동력이 필요했다. 이 원리가 개인의 필요를 규정했다. '좋은 일자리'를 얻기 위한 표준화된 교육, 그 교육을 통과하기 위한 입시 경쟁, 정규직 고용과 연금으로 이어지는 단선 경로가 삶의 목표가 되었다.</w:t>
       </w:r>
     </w:p>
     <w:p>
@@ -575,7 +575,7 @@
           <w:color w:val="000000"/>
           <w:sz w:val="21"/>
         </w:rPr>
-        <w:t>이것이 이 연구가 비판적으로 지적하는 지점이다. 분업 체제에서 개인은 국가가 설계한 경로를 따르지 않을 선택지가 거의 없었다. 위임한 권리를 회수하는 것은 제도 바깥으로 나가는 것을 의미했고, 그것은 대개 불이익과 배제를 뜻했다. 마이클 영이 『능력주의의 부상』(1958)에서 경고했듯, 시험 성적으로 모든 것이 줄 세워지는 사회에서 표준 경로에서 벗어난 사람은 '능력 부족'으로 낙인찍히는 이중의 고통을 받았다. 권리 집중이 낳은 가장 큰 폐해는 바로 이 다양성의 말살이었다.</w:t>
+        <w:t>이것이 이 연구가 비판적으로 지적하는 지점이다. 분업 체제에서 개인은 국가가 설계한 경로를 따르지 않을 선택지가 거의 없었다. 위임한 권리를 회수하는 것은 제도 바깥으로 나가는 것을 의미했고, 그것은 대개 불이익과 배제를 뜻했다. 영국의 사회학자 마이클 영(Michael Young, 1915–2002)은 『능력주의의 부상』(1958)에서—능력주의(meritocracy)란 시험 성적과 측정 가능한 능력으로 사람을 서열화하고 그 서열에 따라 지위를 배분하는 체제를 뜻한다—이런 시스템은 탈락자에게 '네가 못난 것'이라는 낙인을 찍으며 구조적 배제를 개인의 실패로 위장한다고 경고했다. 권리 집중이 낳은 가장 큰 폐해는 바로 이 다양성의 말살이었다.</w:t>
       </w:r>
     </w:p>
     <w:p>
@@ -607,7 +607,7 @@
           <w:color w:val="000000"/>
           <w:sz w:val="21"/>
         </w:rPr>
-        <w:t>디지털 시대의 노동 원리는 정체성 발휘다. 인공지능과 자동화가 반복 직무를 대체하면서, 표준화된 분업 노동의 경제적 가치는 낮아지고 있다. 반면 데이터, 창의성, 고유한 판단력, 사람 사이의 신뢰처럼 각 개인만이 가진 독특한 역량의 가치는 높아진다. 플랫폼과 디지털 도구가 기획·제작·유통의 비용을 낮추면서 개인은 큰 조직에 들어가야만 생산자가 되는 제약에서 풀려나고 있다. 이 시대에 일한다는 것은 조직이 부여한 직무를 수행하는 것이 아니라, 자신의 고유한 정체성을 실제 기여로 발휘하는 것이다.</w:t>
+        <w:t>디지털 시대의 노동 원리는 정체성 발휘다. 인공지능과 자동화가 반복 직무를 대체하면서, 표준화된 분업 노동의 경제적 가치는 낮아지고 있다. 반면 데이터, 창의성, 고유한 판단력, 사람 사이의 신뢰처럼 각 개인만이 가진 독특한 역량의 가치는 높아진다. 예를 들어 세금 계산서 처리는 자동화로 대체되지만, 복잡한 세무 분쟁을 풀어내는 맥락 이해력은 오히려 더 귀해진다. 플랫폼과 디지털 도구가 기획·제작·유통의 비용을 낮추면서 개인은 큰 조직에 들어가야만 생산자가 되는 제약에서 풀려나고 있다. 이 시대에 일한다는 것은 조직이 부여한 직무를 수행하는 것이 아니라, 자신의 고유한 정체성을 실제 기여로 발휘하는 것이다.</w:t>
       </w:r>
     </w:p>
     <w:p>
@@ -674,7 +674,7 @@
           <w:color w:val="000000"/>
           <w:sz w:val="21"/>
         </w:rPr>
-        <w:t>모든 사람은 고유한 가능성을 지니고 태어난다. 태아·영아기는 그 가능성의 단서가 처음으로 드러나는 시기다. 농업 시대에 이 단계의 필요는 무사한 출산과 건강한 몸이었다. 생존 자체가 목표였고, 가정과 이웃, 마을이 공동으로 출산을 돕고 아이를 거두었다. 산업화 시대에는 안정된 양육과 표준 발달표에 맞는 보살핌이 필요로 규정되었다. 국가가 임신·출산·영유아 건강 관리를 담당하며 가정의 역할을 보완했다.</w:t>
+        <w:t>모든 사람은 고유한 가능성을 지니고 태어난다. 태아·영아기는 그 가능성의 단서가 처음으로 드러나는 시기다. 농업 시대에 이 단계의 필요는 무사한 출산과 건강한 몸이었다. 생존 자체가 목표였고, 가정과 이웃, 마을이 공동으로 출산을 돕고 아이를 거두었다. 산업화 시대에는 안정된 양육과 표준 발달표에 맞는 보살핌이 필요로 규정되었다. 표준 발달표란 월령별로 몸무게, 신장, 언어 발달이 어느 수준이어야 한다는 평균치를 가리킨다. 국가가 임신·출산·영유아 건강 관리를 담당하며 가정의 역할을 보완했다.</w:t>
       </w:r>
     </w:p>
     <w:p>
@@ -706,7 +706,7 @@
           <w:color w:val="000000"/>
           <w:sz w:val="21"/>
         </w:rPr>
-        <w:t>그러나 이 기술은 누구에게나 동등하게 닿지 않는다. 관찰이 풍부한 가정의 아이는 단서가 일찍 읽히지만, 그런 환경이 없는 아이는 출발선 바깥에 남는다. 제임스 헥만이 실증했듯 생애 초기 투자는 이후 어느 시기보다 높은 복리 효과를 낳는다. 국가는 표준 관리자에서 '먼저 찾아가는 보장자'로 역할을 전환해야 한다. 이것은 위임의 구조가 달라지는 것이다. 국가에 위임된 권리가 표준 집행에서 선제적 돌봄으로 방향을 바꾼다.</w:t>
+        <w:t>그러나 이 기술은 누구에게나 동등하게 닿지 않는다. 관찰이 풍부한 가정의 아이는 단서가 일찍 읽히지만, 그런 환경이 없는 아이는 출발선 바깥에 남는다. 미국의 경제학자이자 노벨 경제학상 수상자인 제임스 헥만(James Heckman, 1944– )은 미국 저소득층 아동을 대상으로 한 장기 추적 연구에서, 생애 초기에 이루어지는 양육과 교육 환경에 대한 투자는 이후 어느 시기보다 높은 복리 효과를 낳는다는 것을 실증했다. 돌봄의 질을 높이는 데 1달러를 쓰면 성인이 된 후 범죄 예방, 소득 향상, 복지 지출 감소 등으로 수배의 사회적 수익이 돌아온다는 계산이다. 국가는 표준 관리자에서 '먼저 찾아가는 보장자'로 역할을 전환해야 한다. 이것은 위임의 구조가 달라지는 것이다. 국가에 위임된 권리가 표준 집행에서 선제적 돌봄으로 방향을 바꾼다.</w:t>
       </w:r>
     </w:p>
     <w:p>
@@ -754,7 +754,7 @@
           <w:color w:val="000000"/>
           <w:sz w:val="21"/>
         </w:rPr>
-        <w:t>디지털 시대에는 다양한 체험으로 관심과 강점을 발견하고 실험하는 것이 이 단계의 과제가 된다. 아이는 여러 분야를 경험하면서 자신이 무엇에 끌리는지, 무엇을 할 때 생기가 도는지를 알아간다. 이를 위해 가정은 관심을 지지하고, 이웃은 다양한 체험 기회를 열며, 마을은 공동 발견 프로그램을 제공한다. 권리 위임의 관점에서 보면, 이 단계는 가정 하나가 교육을 독점하거나 국가 하나가 의무 교육을 독점하는 구조에서 벗어나, 가정·이웃·마을이 나누어 역할을 맡는 분산형 위임 구조로 이행하는 단계다.</w:t>
+        <w:t>디지털 시대에는 다양한 체험으로 관심과 강점을 발견하고 실험하는 것이 이 단계의 과제가 된다. 아이는 여러 분야를 경험하면서 자신이 무엇에 끌리는지, 무엇을 할 때 생기가 도는지를 알아간다. 한 아이는 블록 쌓기에서 공간 감각의 단서를 보이고, 다른 아이는 친구의 감정을 금방 읽는 공감 능력을 드러낸다. 이를 위해 가정은 관심을 지지하고, 이웃은 다양한 체험 기회를 열며, 마을은 공동 발견 프로그램을 제공한다. 권리 위임의 관점에서 보면, 이 단계는 가정 하나가 교육을 독점하거나 국가 하나가 의무 교육을 독점하는 구조에서 벗어나, 가정·이웃·마을이 나누어 역할을 맡는 분산형 위임 구조로 이행하는 단계다.</w:t>
       </w:r>
     </w:p>
     <w:p>
@@ -770,7 +770,7 @@
           <w:color w:val="000000"/>
           <w:sz w:val="21"/>
         </w:rPr>
-        <w:t>브론펜브레너가 중간체계라고 부른 것, 즉 가정과 이웃과 마을이 서로 맞물려 상승 효과를 내는 구조가 이 단계에서 결정적으로 작동해야 한다. 체험이 풍부한 아이와 그렇지 못한 아이의 간격은 이미 이 단계에서 벌어지기 시작한다. 국가는 기회의 바닥을 보장하는 역할로 이 분산 구조를 뒤에서 떠받쳐야 한다.</w:t>
+        <w:t>브론펜브레너가 중간체계(mesosystem, 가정과 이웃과 마을이 서로 맞물려 상호 강화하는 영역)라고 부른 구조가 이 단계에서 결정적으로 작동해야 한다. 체험이 풍부한 아이와 그렇지 못한 아이의 간격은 이미 이 단계에서 벌어지기 시작한다. 국가는 기회의 바닥을 보장하는 역할로 이 분산 구조를 뒤에서 떠받쳐야 한다.</w:t>
       </w:r>
     </w:p>
     <w:p>
@@ -802,7 +802,7 @@
           <w:color w:val="000000"/>
           <w:sz w:val="21"/>
         </w:rPr>
-        <w:t>청소년기는 정체성의 위기가 가장 첨예하게 나타나는 시기다. 에릭 에릭슨은 생애 발달을 여덟 단계로 나누고, 각 단계에서 개인이 해결해야 할 심리사회적 과제가 있다고 보았다(『아동기와 사회』, 1950). 에릭슨에게 청소년기의 핵심 과제는 '정체성 대 역할 혼미'였다. 나는 누구인가, 나는 무엇을 할 수 있는가를 탐색하고 방향을 정하는 것이 이 단계의 본질적 필요다.</w:t>
+        <w:t>청소년기는 정체성의 위기가 가장 첨예하게 나타나는 시기다. 독일 태생의 미국 발달심리학자이자 정신분석가 에릭 에릭슨(Erik H. Erikson, 1902–1994)은 생애 발달을 여덟 단계로 나누고, 각 단계에서 개인이 해결해야 할 심리사회적 과제가 있다고 보았다(『아동기와 사회』, 1950). 심리사회적 과제란 내면의 심리와 바깥 사회적 관계가 맞닿아 만들어내는 긴장이자 도전을 가리킨다. 에릭슨에게 청소년기의 핵심 과제는 '정체성 대 역할 혼미'였다. 나는 누구인가, 나는 무엇을 할 수 있는가를 탐색하고 방향을 정하는 것이 이 단계의 본질적 필요다.</w:t>
       </w:r>
     </w:p>
     <w:p>
@@ -898,7 +898,7 @@
           <w:color w:val="000000"/>
           <w:sz w:val="21"/>
         </w:rPr>
-        <w:t>그러나 이 변화는 모두에게 균등하게 열리지 않는다. 발휘의 무대에 먼저 올라서는 사람과 그 무대 바깥에 머무는 사람의 간격이 크다. 도시와 국가가 진입 장벽을 낮추고 첫 기여를 연결하는 역할을 맡는 것은, 모든 청년이 적어도 한 번은 위임의 회로에 들어올 수 있도록 하는 최소 보장이다. 에스핑안데르센이 지식경제 복지국가에서 강조한 사회적 투자는 바로 이 진입 조건을 미리 까는 일이다.</w:t>
+        <w:t>그러나 이 변화는 모두에게 균등하게 열리지 않는다. 발휘의 무대에 먼저 올라서는 사람과 그 무대 바깥에 머무는 사람의 간격이 크다. 도시와 국가가 진입 장벽을 낮추고 첫 기여를 연결하는 역할을 맡는 것은, 모든 청년이 적어도 한 번은 위임의 회로에 들어올 수 있도록 하는 최소 보장이다. 덴마크 출신의 사회정책학자 예스타 에스핑안데르센(Gøsta Esping-Andersen, 1947– )은 북유럽 복지국가 연구로 잘 알려진 학자인데, 지식경제 시대에는 복지를 소득 보전에만 쓰지 말고 교육·보육·재훈련 같은 사람에 대한 사전 투자—그가 말하는 '사회적 투자(social investment)'—로 전환해야 한다고 강조했다. 청년이 발휘의 무대에 오르기 위해 필요한 진입 조건을 미리 까는 일이 바로 그것이다.</w:t>
       </w:r>
     </w:p>
     <w:p>
@@ -946,7 +946,7 @@
           <w:color w:val="000000"/>
           <w:sz w:val="21"/>
         </w:rPr>
-        <w:t>디지털 전환은 이 계약을 깨뜨리고 있다. 자동화와 인공지능이 기존 직무를 빠르게 대체하면서, 중장년에게 재학습과 강점의 재설계가 필요해졌다. 그러나 위임의 회수가 어려운 구조—국가가 표준 직업 훈련만 제공하고, 기업은 장기 고용 약속 없이 효율만 추구하는—에서 중장년은 재설계의 기회를 갖기 어렵다. 마을과 도시가 재학습의 접근로를 열고, 가정과 국가가 전환기 보호를 제공하는 것은, 빼앗겼던 선택권을 다시 분산해 돌려주는 과정이다.</w:t>
+        <w:t>디지털 전환은 이 계약을 깨뜨리고 있다. 자동화와 인공지능이 기존 직무를 빠르게 대체하면서, 중장년에게 재학습과 강점의 재설계가 필요해졌다. 그러나 위임의 회수가 어려운 구조—국가가 표준 직업 훈련만 제공하고, 기업은 장기 고용 약속 없이 효율만 추구하는—에서 중장년은 재설계의 기회를 갖기 어렵다. 마을과 도시가 재학습의 접근로를 열고, 가정과 국가가 전환기 보호를 제공하는 것은, 빼앗겼던 선택권을 다시 분산해 돌려주는 과정이다. 예를 들어 직업 전환을 원하는 중장년이 마을 단위 재교육 센터에서 새 기술을 배우고, 국가는 그 기간 동안 소득을 일부 보전해주는 구조가 이에 해당한다.</w:t>
       </w:r>
     </w:p>
     <w:p>
@@ -962,7 +962,7 @@
           <w:color w:val="000000"/>
           <w:sz w:val="21"/>
         </w:rPr>
-        <w:t>에릭 에릭슨은 중장년기의 핵심 과제를 '생산성 대 침체'로 정의했다. 자신이 쌓은 것을 새 방향으로 확장하고 다음 세대를 위한 무언가를 만들어 내지 못하면, 개인은 정체와 고립으로 빠진다. 이 심리적 위기에 응답하는 것은 개인의 의지가 아니라 공동체의 구조다. 재학습의 기회를 만들고, 새 역할을 연결하며, 전환기의 불안을 함께 감당하는 공동체가 있어야 한다.</w:t>
+        <w:t>에릭 에릭슨은 중장년기의 핵심 과제를 '생산성 대 침체(generativity vs. stagnation)'로 정의했다. 생산성이란 자신이 쌓은 것을 다음 세대에 전달하거나 사회에 기여하는 방향으로 확장하는 힘을 가리킨다. 자신이 쌓은 것을 새 방향으로 확장하고 다음 세대를 위한 무언가를 만들어 내지 못하면, 개인은 정체와 고립으로 빠진다. 이 심리적 위기에 응답하는 것은 개인의 의지가 아니라 공동체의 구조다. 재학습의 기회를 만들고, 새 역할을 연결하며, 전환기의 불안을 함께 감당하는 공동체가 있어야 한다.</w:t>
       </w:r>
     </w:p>
     <w:p>
@@ -1010,7 +1010,7 @@
           <w:color w:val="000000"/>
           <w:sz w:val="21"/>
         </w:rPr>
-        <w:t>에릭슨은 노년기의 과제를 '자아통합 대 절망'으로 보았다. 자신의 삶이 의미 있었다는 통합감을 얻지 못하면 절망에 빠진다. 이 과제는 개인의 내면 문제가 아니라 사회적 과제다. 전수할 통로가 있고, 역할이 주어지며, 관계 안에 머물 수 있는 공동체 구조가 통합을 가능하게 한다. 가정은 돌봄과 존엄의 생활 공간을 제공하고, 이웃은 관계의 지속을 돕고, 마을과 도시는 멘토와 자문의 역할을 연결한다. 국가는 소득의 최소 기반과 고립 방지의 역할을 맡는다.</w:t>
+        <w:t>에릭슨은 노년기의 과제를 '자아통합 대 절망(ego integrity vs. despair)'으로 보았다. 자아통합이란 자신의 삶 전체를 돌아보며 '그래도 이 삶은 의미가 있었다'는 느낌을 갖는 것이다. 자신의 삶이 의미 있었다는 통합감을 얻지 못하면 절망에 빠진다. 이 과제는 개인의 내면 문제가 아니라 사회적 과제다. 전수할 통로가 있고, 역할이 주어지며, 관계 안에 머물 수 있는 공동체 구조가 통합을 가능하게 한다. 가정은 돌봄과 존엄의 생활 공간을 제공하고, 이웃은 관계의 지속을 돕고, 마을과 도시는 멘토와 자문의 역할을 연결한다. 국가는 소득의 최소 기반과 고립 방지의 역할을 맡는다.</w:t>
       </w:r>
     </w:p>
     <w:p>
@@ -1026,7 +1026,7 @@
           <w:color w:val="000000"/>
           <w:sz w:val="21"/>
         </w:rPr>
-        <w:t>폴라니의 언어로 말하면, 노인이 시장과 국가 연금에만 의존하는 상태는 '탈착근'의 전형이다. 재착근은 노인이 관계와 역할의 그물 안으로 돌아오는 것이다. 그 그물을 유지하는 것은 각 공동체가 노인으로부터 위임받은 권리—관계, 시간, 경험—를 제대로 활용하고 돌려주는 것이다.</w:t>
+        <w:t>폴라니의 언어로 말하면, 노인이 시장과 국가 연금에만 의존하는 상태는 '탈착근'의 전형이다. 오랜 시간 가꿔온 인간관계와 역할에서 떨어져 나와 돈으로만 생존을 유지하는 것이다. 재착근은 노인이 관계와 역할의 그물 안으로 돌아오는 것이다. 그 그물을 유지하는 것은 각 공동체가 노인으로부터 위임받은 권리—관계, 시간, 경험—를 제대로 활용하고 돌려주는 것이다.</w:t>
       </w:r>
     </w:p>
     <w:p>
@@ -1077,7 +1077,7 @@
           <w:color w:val="000000"/>
           <w:sz w:val="21"/>
         </w:rPr>
-        <w:t>가정은 개인이 태어나는 순간부터 가장 먼저 권리를 위임받는 공동체다. 개인은 가정에 시간, 감정, 돌봄, 결정의 상당 부분을 위임한다. 농업 시대에 가정은 노동·양육·부양·교육을 모두 떠안는 전능한 공동체였다. 산업화 시대에는 교육을 학교에, 의료를 병원에 위임하면서 역할이 좁아졌다. 디지털 시대에 가정의 핵심 역할은 '정체성 단서를 가장 먼저 읽는 생활 기반'이다. 아이가 어디에 반응하는지, 무엇을 할 때 활기를 띠는지를 가장 가까이에서 관찰하고 기록하는 것이다. 또한 중장년의 전환기와 노년의 돌봄·존엄을 지지하는 역할도 함께 맡는다.</w:t>
+        <w:t>가정은 개인이 태어나는 순간부터 가장 먼저 권리를 위임받는 공동체다. 개인은 가정에 시간, 감정, 돌봄, 결정의 상당 부분을 위임한다. 농업 시대에 가정은 노동·양육·부양·교육을 모두 떠안는 전능한 공동체였다. 산업화 시대에는 교육을 학교에, 의료를 병원에 위임하면서 역할이 좁아졌다. 디지털 시대에 가정의 핵심 역할은 '정체성 단서를 가장 먼저 읽는 생활 기반'이다. 아이가 어디에 반응하는지, 무엇을 할 때 활기를 띠는지를 가장 가까이에서 관찰하고 기록하는 것이다. 또한 중장년의 전환기와 노년의 돌봄·존엄을 지지하는 역할도 함께 맡는다. 브론펜브레너가 말한 미시체계(microsystem)—개인이 직접 몸담는 가장 가까운 환경—가 바로 가정이며, 이 층위가 건강해야 다른 모든 공동체에서의 위임도 의미를 가질 수 있다.</w:t>
       </w:r>
     </w:p>
     <w:p>
@@ -1109,7 +1109,7 @@
           <w:color w:val="000000"/>
           <w:sz w:val="21"/>
         </w:rPr>
-        <w:t>이웃은 산업화 시대에 가장 크게 위축된 공동체다. 표준 제도가 모든 것을 조직하면서 이웃 간 상호 돌봄과 협동의 기능은 사라졌다. 그러나 정체성을 발휘하려는 시대에 이웃은 다시 중요해진다. 이웃은 아이가 다양한 흥미를 실험하고 어른이 새 관계를 맺는 일상망이다. 관심 기반 모임, 생활 멘토, 상호 돌봄의 품앗이가 이웃에서 이루어질 때, 개인은 자신의 탐색 시간과 관계 자원을 이웃 공동체에 위임하며 발견의 기회를 얻는다. 단절된 사람이 다시 관계망으로 돌아오는 첫 번째 통로도 이웃이다.</w:t>
+        <w:t>이웃은 산업화 시대에 가장 크게 위축된 공동체다. 표준 제도가 모든 것을 조직하면서 이웃 간 상호 돌봄과 협동의 기능은 사라졌다. 그러나 정체성을 발휘하려는 시대에 이웃은 다시 중요해진다. 이웃은 아이가 다양한 흥미를 실험하고 어른이 새 관계를 맺는 일상망이다. 관심 기반 모임, 생활 멘토, 상호 돌봄의 품앗이가 이웃에서 이루어질 때, 개인은 자신의 탐색 시간과 관계 자원을 이웃 공동체에 위임하며 발견의 기회를 얻는다. 단절된 사람이 다시 관계망으로 돌아오는 첫 번째 통로도 이웃이다. 오스트롬이 연구한 공동 관리의 사례들—스위스 알프스의 목초지 공동 관리, 일본 어촌의 어장 자치—은 이웃 규모의 자치가 얼마나 정교하게 작동할 수 있는지를 보여준다.</w:t>
       </w:r>
     </w:p>
     <w:p>
@@ -1141,7 +1141,7 @@
           <w:color w:val="000000"/>
           <w:sz w:val="21"/>
         </w:rPr>
-        <w:t>마을은 생애주기의 여러 단계에서 훈련과 재학습을 담당하는 공동체다. 산업화 시대에 마을은 도시에 기능을 빼앗겨 행정 단위로 전락했다. 디지털 시대에 마을은 '발견된 방향을 훈련으로 잇는 생활권'으로 복원된다. 청소년에게는 마을 멘토단과 훈련 경로가, 중장년에게는 재학습 접근로가 마을을 통해 열린다. 마을은 중앙 정부가 직접 설계하기보다, 구성원이 자치적으로 훈련 경로를 만들고 국가가 최소 기준을 보장하는 방식으로 운영될 때 가장 잘 작동한다. 오스트롬이 말한 다층 자치 거버넌스의 가장 구체적인 현장이 바로 마을이다.</w:t>
+        <w:t>마을은 생애주기의 여러 단계에서 훈련과 재학습을 담당하는 공동체다. 산업화 시대에 마을은 도시에 기능을 빼앗겨 행정 단위로 전락했다. 디지털 시대에 마을은 '발견된 방향을 훈련으로 잇는 생활권'으로 복원된다. 청소년에게는 마을 멘토단과 훈련 경로가, 중장년에게는 재학습 접근로가 마을을 통해 열린다. 마을은 중앙 정부가 직접 설계하기보다, 구성원이 자치적으로 훈련 경로를 만들고 국가가 최소 기준을 보장하는 방식으로 운영될 때 가장 잘 작동한다. 오스트롬이 말한 다층 자치 거버넌스의 가장 구체적인 현장이 바로 마을이다. 아마르티아 센과 마사 누스바움이 강조한 역량—실제로 무언가를 할 수 있는 힘—은 마을 단위의 훈련 환경이 갖춰질 때 비로소 구체적으로 자라날 수 있다.</w:t>
       </w:r>
     </w:p>
     <w:p>
@@ -1237,7 +1237,7 @@
           <w:color w:val="000000"/>
           <w:sz w:val="21"/>
         </w:rPr>
-        <w:t>국가는 산업화 시대에 권리 집중의 핵심 기구였다. 교육·고용·복지·의료를 중앙에서 일괄 관리했고, 개인이 어느 공동체에 권리를 위임할지 선택할 여지를 거의 남기지 않았다. 디지털 시대의 국가는 이 역할에서 물러나야 한다. 국가의 역할은 모든 것을 관리하는 데서, 가정·이웃·마을·도시가 각자의 역할을 잘 할 수 있도록 최소 조건을 보장하고 이들 사이를 조율하는 '메타 거버넌스'로 전환되어야 한다. 모든 사람에게 권리 위임의 기회가 열리도록 최소 권리선을 세우고, 어느 공동체가 과도한 권리를 독점하지 않도록 규칙을 만드는 것이 국가의 일이다.</w:t>
+        <w:t>국가는 산업화 시대에 권리 집중의 핵심 기구였다. 교육·고용·복지·의료를 중앙에서 일괄 관리했고, 개인이 어느 공동체에 권리를 위임할지 선택할 여지를 거의 남기지 않았다. 디지털 시대의 국가는 이 역할에서 물러나야 한다. 국가의 역할은 모든 것을 관리하는 데서, 가정·이웃·마을·도시가 각자의 역할을 잘 할 수 있도록 최소 조건을 보장하고 이들 사이를 조율하는 '메타 거버넌스(meta-governance, 다른 공동체들이 잘 작동하도록 환경을 만드는 상위 조율 기능)'로 전환되어야 한다. 모든 사람에게 권리 위임의 기회가 열리도록 최소 권리선을 세우고, 어느 공동체가 과도한 권리를 독점하지 않도록 규칙을 만드는 것이 국가의 일이다. 에스핑안데르센이 말한 사회적 투자 국가—소득 보전에서 역량 형성으로—는 이 전환의 구체적인 형태다.</w:t>
       </w:r>
     </w:p>
     <w:p>
@@ -1253,7 +1253,7 @@
           <w:color w:val="000000"/>
           <w:sz w:val="21"/>
         </w:rPr>
-        <w:t>세계는 산업화 시대에 국가 간 협정으로만 작동하던 추상적 층위였다. 개인에게는 닿지 않는 먼 곳이었다. 디지털 시대에 세계는 처음으로 개인의 권리 위임 상대로 등장한다. 국경을 넘는 협업이 가능해지면서 청년과 중장년이 세계 무대에서 기여를 발휘할 수 있다. 동시에 기후변화, 인공지능 위험, 감염병처럼 국가 단위를 넘어서는 공동 위험이 커지면서, 세계는 모든 생애단계의 안전과 직결된 능동적 거버넌스 층위가 된다.</w:t>
+        <w:t>세계는 산업화 시대에 국가 간 협정으로만 작동하던 추상적 층위였다. 개인에게는 닿지 않는 먼 곳이었다. 디지털 시대에 세계는 처음으로 개인의 권리 위임 상대로 등장한다. 국경을 넘는 협업이 가능해지면서 청년과 중장년이 세계 무대에서 기여를 발휘할 수 있다. 동시에 기후변화, 인공지능 위험, 감염병처럼 국가 단위를 넘어서는 공동 위험이 커지면서, 세계는 모든 생애단계의 안전과 직결된 능동적 거버넌스 층위가 된다. 오스트롬이 만년에 연구한 기후변화 대응 거버넌스가 보여주듯, 거버넌스 층위가 더 많고 더 분산될수록 공동 위험에 대한 적응력도 높아진다.</w:t>
       </w:r>
     </w:p>
     <w:p>
@@ -1314,7 +1314,7 @@
           <w:color w:val="000000"/>
           <w:sz w:val="21"/>
         </w:rPr>
-        <w:t>국가 하나가 모든 생애단계의 필요를 독점 관리하는 구조에서, 개인이 필요에 따라 가정·이웃·마을·도시에 권리를 나누어 위임하고 상황이 바뀌면 거두어들일 수 있는 구조로 전환해야 한다. 이것은 제도의 문제이기 이전에 철학의 문제다. 로크가 말했듯, 위임은 항상 회수 가능해야 한다.</w:t>
+        <w:t>국가 하나가 모든 생애단계의 필요를 독점 관리하는 구조에서, 개인이 필요에 따라 가정·이웃·마을·도시에 권리를 나누어 위임하고 상황이 바뀌면 거두어들일 수 있는 구조로 전환해야 한다. 이것은 제도의 문제이기 이전에 철학의 문제다. 로크가 말했듯, 위임은 항상 회수 가능해야 한다. 탈상품화(시장에 기대지 않고도 살아갈 수 있게 해주는 사회 보장)만으로는 부족하며, 위임의 대상을 스스로 선택하고 바꿀 수 있는 구조가 함께 필요하다.</w:t>
       </w:r>
     </w:p>
     <w:p>
@@ -1341,7 +1341,7 @@
           <w:color w:val="000000"/>
           <w:sz w:val="21"/>
         </w:rPr>
-        <w:t>브론펜브레너가 지적했듯, 개인에게 가장 깊은 영향을 미치는 것은 가까운 환경에서의 직접적 상호작용이다. 산업화 시대에 약화된 이웃과 마을의 역할을 되살리는 것이 권리 재분산의 핵심이다. 이는 중앙 예산을 지방에 내려보내는 것이 아니라, 이웃과 마을이 스스로 역할을 정의하고 자치적으로 운영할 수 있는 조건을 만드는 것이다.</w:t>
+        <w:t>브론펜브레너가 지적했듯, 개인에게 가장 깊은 영향을 미치는 것은 가까운 환경에서의 직접적 상호작용이다. 산업화 시대에 약화된 이웃과 마을의 역할을 되살리는 것이 권리 재분산의 핵심이다. 이는 중앙 예산을 지방에 내려보내는 것이 아니라, 이웃과 마을이 스스로 역할을 정의하고 자치적으로 운영할 수 있는 조건을 만드는 것이다. 오스트롬이 보여주었듯, 자치는 주어지는 것이 아니라 구성원들이 스스로 규칙을 만들 때 비로소 작동한다.</w:t>
       </w:r>
     </w:p>
     <w:p>
@@ -1368,7 +1368,7 @@
           <w:color w:val="000000"/>
           <w:sz w:val="21"/>
         </w:rPr>
-        <w:t>각 생애단계에서 어떤 공동체가 어떤 역할을 맡는지, 개인이 어디에 권리를 위임하는지, 그 위임이 어떤 조건에서 회수될 수 있는지를 사회적 합의로 명시해야 한다. 현행 복지 제도는 생애주기의 질적 차이를 충분히 담지 못한다.</w:t>
+        <w:t>각 생애단계에서 어떤 공동체가 어떤 역할을 맡는지, 개인이 어디에 권리를 위임하는지, 그 위임이 어떤 조건에서 회수될 수 있는지를 사회적 합의로 명시해야 한다. 현행 복지 제도는 생애주기의 질적 차이를 충분히 담지 못한다. 헥만이 실증한 생애 초기 투자의 복리 효과를 감안하면, 영아기에서 청소년기까지의 공동체 지원은 단순한 복지 지출이 아니라 사회 전체의 역량에 대한 선제적 투자로 재정의되어야 한다.</w:t>
       </w:r>
     </w:p>
     <w:p>
@@ -1400,7 +1400,7 @@
           <w:color w:val="000000"/>
           <w:sz w:val="21"/>
         </w:rPr>
-        <w:t>디지털 시대의 생애주기는 직선이 아니라, 앞 단계의 결과가 다음 단계의 조건이 되는 나선형 누적 구조다. 중장년의 재설계는 청소년기의 훈련이 성공했을 때 가능하고, 노년의 전수는 청년·중장년의 발휘가 쌓였을 때 의미를 갖는다. 그래서 초기 단계의 권리 위임 격차—어떤 아이는 가정·이웃·마을의 풍부한 지지 속에서 단서를 발견하고, 어떤 아이는 그 공동체들이 모두 약한 환경에서 태어나는—는 단순한 기회 불평등이 아니라 생애 전체 사이클의 단절을 의미한다.</w:t>
+        <w:t>디지털 시대의 생애주기는 직선이 아니라, 앞 단계의 결과가 다음 단계의 조건이 되는 나선형 누적 구조다. 중장년의 재설계는 청소년기의 훈련이 성공했을 때 가능하고, 노년의 전수는 청년·중장년의 발휘가 쌓였을 때 의미를 갖는다. 그래서 초기 단계의 권리 위임 격차—어떤 아이는 가정·이웃·마을의 풍부한 지지 속에서 단서를 발견하고, 어떤 아이는 그 공동체들이 모두 약한 환경에서 태어나는—는 단순한 기회 불평등이 아니라 생애 전체 사이클의 단절을 의미한다. 헥만의 연구는 이 불평등이 경제학적으로도 가장 비효율적인 낭비임을 보여준다. 일찍 메꾸지 않은 결핍은 나중에 훨씬 큰 비용을 치르게 만든다.</w:t>
       </w:r>
     </w:p>
     <w:p>

</xml_diff>

<commit_message>
docs: standard KR terms, drop industrial-critique frame and closing cliche
</commit_message>
<xml_diff>
--- a/archive/docx/p2-lifecycle-community-report.docx
+++ b/archive/docx/p2-lifecycle-community-report.docx
@@ -140,7 +140,7 @@
           <w:color w:val="000000"/>
           <w:sz w:val="21"/>
         </w:rPr>
-        <w:t>공동체는 개인이 자신의 필요에 의해, 자신이 가진 권리의 일부를 위임하는 일종의 계약을 통해 구현되는 실체다. 개인이 먼저 있고, 그 개인이 생애의 단계마다 다른 필요를 마주하며, 그 필요를 감당하기 위해 시간·자원·결정권 등 자신의 권리 일부를 특정 공동체에 위임한다. 위임의 집합이 공동체라는 실체를 만들고, 더 이상 그 공동체를 필요로 하지 않을 때 개인은 위임한 권리를 거두어들일 수 있어야 한다. 이 연구는 그 '위임과 회수의 계약 논리'를 이론적 토대로 삼아, 농업·산업화·디지털 세 시대의 노동 원리, 생애주기별 개인의 필요, 그 필요에 응답하는 공동체의 형성과 역할을 정합적으로 연결한다. 산업화 시대에 국가라는 특정 공동체로 권리가 과도하게 집중·고착되면서 위임의 회수가 어려워졌고, 표준화·획일화·중앙집중의 폐해가 생겼다는 것이 이 연구의 비판적 초점이다. 디지털 시대는 그 집중된 권리를 가정·이웃·마을·도시·국가·세계 여러 층위로 다시 분산하는 전환으로 해석된다. 공동체를 권리 위임의 계약으로 보는 시각은 홉스·로크·루소의 사회계약론에 뿌리를 두며, 권리가 한곳에 쏠리지 않고 여러 층위로 나뉘어야 한다는 주장은 오스트롬의 다층 거버넌스 연구와 맞닿는다. 개인의 생애 흐름은 에릭슨의 발달 연구로, 공동체의 층위 구조는 브론펜브레너의 생태체계 연구로, 위임이 실제로 개인의 삶을 넓히는지를 가늠하는 잣대는 센과 누스바움의 역량 이론으로 설명한다.</w:t>
+        <w:t>공동체는 개인이 자신의 필요에 의해 권리의 일부를 위임하는 계약을 통해 구현되는 실체다. 개인이 먼저 있고, 생애의 단계마다 달라지는 필요가 공동체를 불러낸다. 위임의 집합이 공동체를 만들고, 더 이상 그 공동체를 필요로 하지 않을 때 개인은 위임한 권리를 거두어들일 수 있어야 한다. 이 연구는 그 '위임과 회수의 계약 논리'를 이론적 토대로 삼아, 농업·산업화·디지털 세 시대의 노동 원리, 생애주기별 필요, 그 필요에 응답하는 공동체의 형성과 역할을 정합적으로 연결한다. 산업화 시대에는 표준 교육과 안정된 일자리라는 그 시대 개인의 필요에 맞추어 권리가 국가로 모였다. 그 집중은 당대의 필요에는 부합했으나, 정체성의 발휘를 원하는 디지털 시대 개인의 필요에는 더 이상 맞지 않는다. 디지털 시대는 그 모인 권리를 가정·이웃·마을·도시·국가·세계 여러 층위로 다시 분산하는 전환으로 해석된다. 이 논의는 홉스·로크·루소의 사회계약론에 뿌리를 두며, 에릭슨의 생애 발달 연구, 브론펜브레너의 생태체계 연구, 오스트롬의 다중심 거버넌스, 센과 누스바움의 역량 이론으로 보완된다. 또한 폴라니의 탈배태·재배태 개념, 마이클 영의 능력주의 비판, 에스핑안데르센의 사회적 투자론, 헥만의 생애 초기 투자 연구가 각 생애단계 논의를 뒷받침한다.</w:t>
       </w:r>
     </w:p>
     <w:p>
@@ -201,7 +201,7 @@
           <w:color w:val="000000"/>
           <w:sz w:val="21"/>
         </w:rPr>
-        <w:t>이 연구는 공동체를 개인이 자신의 필요에 의해 자신이 가진 권리의 일부를 위임하는 계약을 통해 구현되는 실체로 본다. 개인이 먼저 있고, 그 개인이 살아가면서 마주치는 필요가 공동체를 불러낸다. 개인의 권리 위임이 없으면 공동체는 존재하지 않으며, 위임이 철회되면 그 공동체는 근거를 잃는다. 예를 들어 어떤 부모가 아이를 위해 마을의 돌봄 협동조합에 시간과 결정권 일부를 맡기는 것이 곧 위임이다. 그 부모가 이사를 떠나거나 조합이 역할을 다하지 못한다고 판단하면 위임을 거두어들일 수 있어야 한다는 것이 이 연구의 출발점이다.</w:t>
+        <w:t>이 연구는 공동체를 개인이 자신의 필요에 의해 권리의 일부를 위임하는 계약으로 구현된 실체로 본다. 개인이 먼저 있고, 살아가면서 마주치는 필요가 공동체를 불러낸다. 위임이 철회되면 공동체는 근거를 잃는다. 어떤 부모가 아이를 위해 마을 돌봄 협동조합에 시간과 결정권 일부를 맡기는 것이 곧 위임이며, 이사를 떠나거나 역할을 다하지 못한다고 판단하면 그 위임을 거두어들일 수 있어야 한다는 것이 이 연구의 출발점이다. 이 관점은 공동체를 개인보다 앞서 존재하는 유기체나 자연 질서가 아닌, 개인의 선택과 위임으로 구성·유지·해소되는 계약적 실체로 본다는 점에서 기존의 공동체론과 결을 달리한다.</w:t>
       </w:r>
     </w:p>
     <w:p>
@@ -217,7 +217,7 @@
           <w:color w:val="000000"/>
           <w:sz w:val="21"/>
         </w:rPr>
-        <w:t>이 정의는 서구 근대 철학의 사회계약론(사회 구성원들이 서로 계약을 맺어 공동체를 만든다는 이론)과 직결된다. 17세기 영국의 정치철학자 토머스 홉스(Thomas Hobbes, 1588–1679)는 대표작 『리바이어던』(1651)에서, 인간이 '만인의 만인에 대한 전쟁' 상태—모두가 모두와 싸우는 혼돈—를 벗어나기 위해 자신의 권리를 통치자에게 넘긴다는 계약을 상상했다. 그는 생존을 위한 권리 위임이 공동체(국가)를 만든다고 보았다. 그러나 홉스의 모델에서 위임은 사실상 회수 불가능하다. 한번 넘긴 권리는 절대 권력에 귀속되고, 개인은 다시 꺼내올 수 없다. 이것이 바로 권리 집중의 원형이다. 산업화 시대가 국가 중심으로 권리를 집중시킨 구조는 홉스적 설계의 현대적 구현이었다고 볼 수 있다.</w:t>
+        <w:t>17세기 영국의 정치철학자 토머스 홉스(Thomas Hobbes, 1588–1679)는 『리바이어던』(1651)에서 '만인의 만인에 대한 투쟁' 상태를 벗어나기 위해 개인이 권리를 통치자에게 넘긴다는 계약을 상상했다. 그러나 홉스의 모델에서 위임은 사실상 회수 불가능하다. 한번 넘긴 권리는 절대 권력에 귀속된다. 이에 맞서 17세기 영국의 철학자 존 로크(John Locke, 1632–1704)는 『통치론』(1689)에서 통치자에게 권력을 맡기는 것은 '신탁(trust)'일 뿐이며, 그 믿음이 깨지면 권리를 도로 거두어들일 수 있다고 보았다. 로크의 신탁과 저항권은 이 연구가 말하는 '위임은 회수 가능해야 한다'는 주장의 직접적인 이론적 뿌리다. 18세기 프랑스의 정치철학자 장자크 루소(Jean-Jacques Rousseau, 1712–1778)는 『사회계약론』(1762)에서 '일반의지(volonté générale)'를 통해 권리가 한 사람이나 한 기관에 집중되어서는 안 된다고 주장했다. 루소는 자치와 분산의 원리를 옹호한 사상가였다. 세 논의를 한 줄로 읽으면 이렇다. 공동체는 개인이 권리를 위임함으로써 만들어지되(홉스), 그 위임은 언제든 회수할 수 있어야 하며(로크), 권리는 어느 한 곳에 집중되어서는 안 된다(루소). 이것이 이 연구의 이론적 뼈대다.</w:t>
       </w:r>
     </w:p>
     <w:p>
@@ -233,23 +233,7 @@
           <w:color w:val="000000"/>
           <w:sz w:val="21"/>
         </w:rPr>
-        <w:t>이에 맞서는 목소리는 같은 세기 말에 등장한다. 17세기 영국의 철학자 존 로크(John Locke, 1632–1704)는 『통치론』(1689)에서 사람들이 통치자에게 권력을 맡기는 것은 어디까지나 '신탁(trust)', 곧 믿고 맡기는 것일 뿐이며, 통치자가 그 믿음을 저버리면 사람들은 맡긴 권력을 도로 거두어들일 권리가 있다고 보았다. 로크의 신탁과 저항권은 이 연구가 말하는 '위임은 회수 가능해야 한다'는 주장의 직접적인 이론적 뿌리다. 18세기 프랑스의 정치철학자 장자크 루소(Jean-Jacques Rousseau, 1712–1778)는 『사회계약론』(1762)에서 '일반의지(volonté générale)'라는 개념을 통해—일반의지란 구성원 전체의 공동 이익을 향한 의지를 뜻한다—권리가 한 사람이나 한 기관에 집중되어서는 안 되고, 공동체 구성원 모두에게 골고루 돌아가야 한다고 보았다. 루소는 자치와 분산의 원리를 옹호한 사상가였다. 이 세 사람의 논의를 한 줄로 읽으면, 공동체는 개인이 권리를 위임함으로써 만들어지되(홉스), 그 위임은 언제든 회수할 수 있어야 하며(로크), 권리는 어느 한 곳에 집중되어서는 안 된다(루소)는 명제가 된다. 이것이 이 연구의 이론적 뼈대다.</w:t>
-      </w:r>
-    </w:p>
-    <w:p>
-      <w:pPr>
-        <w:spacing w:before="0" w:after="120" w:line="384" w:lineRule="auto"/>
-        <w:jc w:val="both"/>
-      </w:pPr>
-      <w:r>
-        <w:rPr>
-          <w:rFonts w:ascii="Noto Serif KR" w:hAnsi="Noto Serif KR" w:eastAsia="Noto Serif KR"/>
-          <w:b w:val="0"/>
-          <w:i w:val="0"/>
-          <w:color w:val="000000"/>
-          <w:sz w:val="21"/>
-        </w:rPr>
-        <w:t>이 뼈대 위에 이 연구는 세 개의 물음을 던진다. 첫째, 시대마다 달랐던 노동의 원리는 어떻게 개인의 필요와 공동체의 형태를 규정했는가. 둘째, 생애주기의 단계마다 달라지는 개인의 필요에 어떤 공동체가 어떻게 응답해 왔는가. 셋째, 디지털 시대의 전환은 왜 권리의 재분산이라는 관점에서 읽혀야 하는가. 이 세 물음에 대한 답이 서로 정합적으로 이어질 때, 우리는 생애주기와 공동체에 관한 하나의 완결된 논리를 갖게 된다.</w:t>
+        <w:t>이 뼈대 위에 세 가지 물음을 던진다. 시대마다 달랐던 노동의 원리는 어떻게 개인의 필요와 공동체의 형태를 규정했는가. 생애주기의 단계마다 달라지는 필요에 어떤 공동체가 응답해 왔는가. 디지털 시대의 전환은 왜 권리의 재분산이라는 관점에서 읽혀야 하는가. 이 세 물음에 대한 답이 서로 정합적으로 이어질 때, 우리는 생애주기와 공동체에 관한 하나의 완결된 논리를 갖게 된다.</w:t>
       </w:r>
     </w:p>
     <w:p>
@@ -300,7 +284,7 @@
           <w:color w:val="000000"/>
           <w:sz w:val="21"/>
         </w:rPr>
-        <w:t>공동체를 권리 위임의 계약으로 구현된 실체로 보면, 일상의 행위들이 모두 위임으로 읽힌다. 개인이 가정에 시간과 돌봄을 바치는 것은 가정에 권리를 위임하는 행위다. 마을의 자치 조직에 결정권을 맡기는 것도, 국가에 세금을 내고 법을 따르는 것도 모두 자신의 권리 일부를 특정 공동체에 넘기는 계약 행위다. 이 관점에서 보면 공동체의 크기와 권한은 그 공동체에 얼마나 많은 권리가 위임되어 있느냐에 따라 결정된다. 위임이 많을수록 공동체는 강력해지고, 위임이 철회되면 공동체는 힘을 잃는다. 마치 주주들이 투자금을 거두어들이면 회사가 힘을 잃는 것처럼, 구성원들이 권리를 철회하면 공동체는 근거를 잃는다.</w:t>
+        <w:t>공동체를 권리 위임의 계약으로 보면 일상의 행위들이 모두 위임으로 읽힌다. 개인이 가정에 시간과 돌봄을 바치는 것, 마을 자치 조직에 결정권을 맡기는 것, 국가에 세금을 내고 법을 따르는 것이 모두 권리 위임이다. 공동체의 크기와 권한은 그 공동체에 얼마나 많은 권리가 위임되어 있느냐에 달려 있다. 개인은 혼자서 감당할 수 없는 필요가 생길 때 그 필요를 충족할 공동체에 권리를 위임한다. 필요가 변하면 위임의 대상과 규모도 바뀐다. 청년기에는 경력을 쌓기 위해 도시와 직장에 많은 권리를 위임하지만, 중장년기에는 가정과 이웃으로 위임의 무게중심이 옮겨가고, 노년기에는 돌봄과 존엄을 위한 공동체에 의존이 깊어진다. 이처럼 위임은 생애 전체에 걸쳐 끊임없이 재구성되는 동적 관계다.</w:t>
       </w:r>
     </w:p>
     <w:p>
@@ -316,23 +300,7 @@
           <w:color w:val="000000"/>
           <w:sz w:val="21"/>
         </w:rPr>
-        <w:t>그렇다면 개인은 왜 권리를 위임하는가. 답은 단순하다. 필요 때문이다. 혼자서는 감당할 수 없는 필요가 생길 때, 개인은 그 필요를 충족할 수 있는 공동체에 권리를 위임한다. 아이를 낳고 기르는 필요는 가정이라는 공동체에 시간과 자원을 위임하게 한다. 안전의 필요는 마을과 국가에 결정권을 위임하게 한다. 노년의 의존 필요는 가정과 국가 모두에 돌봄과 소득의 권리를 위임하게 한다. 필요가 변하면 위임의 대상과 규모도 바뀐다. 청년기에는 경력을 쌓기 위해 도시에 많은 권리를 위임하지만, 중장년기에는 가정과 이웃으로 위임의 무게중심이 옮겨가는 것이 그 예다.</w:t>
-      </w:r>
-    </w:p>
-    <w:p>
-      <w:pPr>
-        <w:spacing w:before="0" w:after="120" w:line="384" w:lineRule="auto"/>
-        <w:jc w:val="both"/>
-      </w:pPr>
-      <w:r>
-        <w:rPr>
-          <w:rFonts w:ascii="Noto Serif KR" w:hAnsi="Noto Serif KR" w:eastAsia="Noto Serif KR"/>
-          <w:b w:val="0"/>
-          <w:i w:val="0"/>
-          <w:color w:val="000000"/>
-          <w:sz w:val="21"/>
-        </w:rPr>
-        <w:t>노벨 경제학상을 받은 인도 출신 경제학자 아마르티아 센(Amartya Sen, 1933– )은 개발을 자유의 확장으로 정의했다(『자유로서의 발전』, 1999). 센은 단순히 소득이 있다는 것이 아니라, 개인이 실제로 할 수 있는 일과 될 수 있는 존재의 폭이 넓어지는 것이 진정한 발전이라고 보았다. 가령 같은 소득을 가진 두 사람이라도 한 사람은 교육의 기회가 있고 다른 사람은 없다면, 두 사람의 '발전' 수준은 다르다. 미국의 철학자 마사 누스바움(Martha Nussbaum, 1947– )은 이를 '역량(capabilities, 단순한 이론적 가능성이 아니라 실제로 실행할 수 있는 능력)'이라는 개념으로 구체화했다 (『역량의 창조』, 2011). 공동체가 개인에게 역량을 제공하는 한에서만 위임은 정당성을 갖는다. 역량을 빼앗는 공동체는 위임을 받을 근거가 없다.</w:t>
+        <w:t>노벨 경제학상을 받은 인도 출신 경제학자 아마르티아 센(Amartya Sen, 1933– )은 발전을 자유의 확장으로 정의했다(『자유로서의 발전』, 1999). 단순한 소득 증가가 아니라 개인이 실제로 할 수 있는 일과 될 수 있는 존재의 폭이 넓어지는 것이 진정한 발전이다. 미국의 철학자 마사 누스바움(Martha Nussbaum, 1947– )은 이를 '역량(capabilities)'—실제로 실행할 수 있는 능력—으로 구체화했다(『역량의 창조』, 2011). 공동체가 개인에게 역량을 제공하는 한에서만 위임은 정당성을 갖는다.</w:t>
       </w:r>
     </w:p>
     <w:p>
@@ -364,7 +332,7 @@
           <w:color w:val="000000"/>
           <w:sz w:val="21"/>
         </w:rPr>
-        <w:t>로크의 신탁 이론이 핵심적으로 가리키는 것은, 위임은 조건부라는 점이다. 개인이 국가에 권리를 넘기는 것은 국가가 그 권리를 올바르게 사용하리라는 믿음을 전제로 한다. 그 믿음이 깨지면 권리는 다시 개인에게로 돌아와야 한다. 그런데 산업화 시대에는 이 회수의 회로가 막혔다. 국가는 표준화된 제도를 통해 교육, 고용, 복지, 의료를 모두 중앙에서 관리하기 시작했고, 개인은 어느 공동체에 얼마만큼 권리를 위임할지 스스로 결정하기 어렵게 되었다. 태어나면 국가 교육에 들어가고, 졸업하면 국가가 인증한 기업에 취직하며, 노년에는 국가 연금으로 생존하는 단선적 경로가 강제되었다. 이 경로 바깥에 서는 것은 곧 사회적 낙오를 의미했다.</w:t>
+        <w:t>로크의 신탁 이론이 가리키는 것은 위임이 조건부라는 점이다. 국가가 그 권리를 올바르게 사용하리라는 믿음이 깨지면 권리는 다시 개인에게로 돌아와야 한다. 그러나 산업화 시대에는 이 회수의 회로가 막혔다. 국가는 교육·고용·복지·의료를 중앙에서 관리하기 시작했고, 개인은 태어나면 국가 교육에 들어가고 졸업하면 국가가 인증한 기업에 취직하며 노년에는 국가 연금으로 생존하는 단선적 경로에 묶였다. 이 경로 바깥에 서는 것은 곧 사회적 낙오를 의미했다. 장애인이나 소수 언어 화자처럼 표준 경로가 맞지 않는 사람은 제도 안에서 보이지 않는 사람이 되고 만다.</w:t>
       </w:r>
     </w:p>
     <w:p>
@@ -380,7 +348,7 @@
           <w:color w:val="000000"/>
           <w:sz w:val="21"/>
         </w:rPr>
-        <w:t>이 과정에서 세 가지 공동체가 힘을 잃었다. 이웃은 산업화 시대에 표준 제도에 가려 공동 돌봄의 기능을 잃어버렸다. 마을은 생활공동체의 기능이 도시로 흡수되면서 해체되어 갔다. 가정은 양육과 부양을 맡되 교육마저 학교에 위임해야 했으며, 점점 더 좁은 기능만 남게 되었다. 반면 국가는 거의 모든 기능을 빨아들이며 비대해졌다. 권리가 집중된 공동체(국가)는 다양한 개인의 필요에 맞춤 대응할 수 없다. 표준화는 평균을 위해 설계되어 평균 바깥의 개인을 배제하며, 획일화는 다양성을 억압하고, 중앙집중은 현장의 맥락을 무시한다. 장애인이나 소수 언어 화자처럼 표준 경로가 맞지 않는 사람은 제도 안에서 보이지 않는 사람이 되고 만다.</w:t>
+        <w:t>이 과정에서 이웃과 마을은 공동 돌봄의 기능을 잃고 해체되었으며, 가정은 점점 좁은 역할만 남게 되었다. 반면 국가는 거의 모든 기능을 빨아들이며 비대해졌다. 권리가 집중된 공동체는 다양한 개인의 필요에 맞춤 대응할 수 없다. 표준화는 평균 바깥의 개인을 배제하고, 획일화는 다양성을 억압한다.</w:t>
       </w:r>
     </w:p>
     <w:p>
@@ -396,7 +364,7 @@
           <w:color w:val="000000"/>
           <w:sz w:val="21"/>
         </w:rPr>
-        <w:t>이 지점에서 헝가리 출신 경제사학자 칼 폴라니(Karl Polanyi, 1886–1964)의 통찰이 유효하다. 폴라니는 대표작 『거대한 전환』(1944)에서, 산업화 시대의 시장 경제가 노동과 토지와 화폐를 사회적 관계에서 뜯어내어 순수한 상품으로 만들었다고 분석했다. 폴라니에게 이것은 '탈착근(disembedding, 사람들이 원래 속해 있던 관계의 그물에서 떨어져 나오는 것)'이었다. 사람들은 원래 살던 관계의 그물—가정, 이웃, 마을—에서 떨어져 나와 국가와 시장이라는 두 거대 기구에만 의존하게 되었다. 그의 통찰을 이 연구의 언어로 번역하면, 산업화 시대는 이웃·마을·가정에 분산되어 있던 권리 위임을 국가 하나로 집중시킨 시대였다. 디지털 시대의 과제는 그 집중을 원래의 여러 층위로 되돌리는 것, 즉 폴라니가 말한 '재착근(re-embedding, 사람들이 다시 관계의 그물 안으로 돌아오는 것)'이다.</w:t>
+        <w:t>헝가리 출신 경제사학자 칼 폴라니(Karl Polanyi, 1886–1964)는 『거대한 전환』(1944)에서 산업화 시대의 시장 경제가 노동·토지·화폐를 사회적 관계에서 뜯어내어 상품으로 만들었다고 분석했다. 폴라니는 이를 '탈배태(disembedding)'—사람들이 원래 속해 있던 관계의 그물에서 떨어져 나오는 것—으로 불렀다. 산업화 시대는 이웃·마을·가정에 분산되어 있던 권리 위임을 국가 하나로 집중시킨 시대였다. 디지털 시대의 과제는 그 집중을 여러 층위로 되돌리는 것, 곧 폴라니가 말한 '재배태(re-embedding)'이다.</w:t>
       </w:r>
     </w:p>
     <w:p>
@@ -428,7 +396,7 @@
           <w:color w:val="000000"/>
           <w:sz w:val="21"/>
         </w:rPr>
-        <w:t>1990년에 여성 최초로 노벨 경제학상을 받은 미국의 정치경제학자 엘리너 오스트롬(Elinor Ostrom, 1933–2012)은 공유 자원의 관리 문제를 연구하다가 중요한 발견을 했다. 공유 자원이란 숲, 어장, 지하수처럼 여럿이 함께 쓰는 자원인데, 학계에서는 오랫동안 이런 자원을 사람들이 남용하고 고갈시킬 수밖에 없다고 여겼다. 그러나 오스트롬은 전 세계의 사례를 조사하며, 사람들은 중앙 정부의 명령도, 사유화된 시장도 없이, 스스로 자치 규칙을 만들어 자원을 지속 가능하게 관리할 수 있다는 것을 실증했다(『공유의 비극을 넘어』, 1990). 그녀는 이를 '다층 거버넌스(polycentric governance, 여러 층위의 공동체가 각자의 영역에서 자치적으로 문제를 나누어 맡는 구조)'라고 불렀다. 이것은 루소가 꿈꾼 자치의 현대적 실증이자, 이 연구가 디지털 시대 공동체 구조로 제안하는 모델과 정확히 일치한다. 권리는 가정·이웃·마을·도시·국가·세계가 층위에 따라 나누어 맡아야 하며, 어느 하나가 모든 권리를 독점하면 나머지 층위는 고사하고 개인은 선택지를 잃는다.</w:t>
+        <w:t>여성 최초로 노벨 경제학상을 받은 미국의 정치경제학자 엘리너 오스트롬(Elinor Ostrom, 1933–2012)은 전 세계 사례를 조사하며 사람들이 중앙 정부나 사유화된 시장 없이도 스스로 자치 규칙을 만들어 공유 자원을 지속 가능하게 관리할 수 있다는 것을 실증했다(『공유의 비극을 넘어』, 1990). 그녀는 이를 '다중심 거버넌스(polycentric governance)'—여러 층위의 공동체가 각자의 영역에서 자치적으로 문제를 나누어 맡는 구조—라고 불렀다. 권리는 가정·이웃·마을·도시·국가·세계가 층위에 따라 나누어 맡아야 하며, 어느 하나가 모든 권리를 독점하면 나머지 층위는 고사하고 개인은 선택지를 잃는다.</w:t>
       </w:r>
     </w:p>
     <w:p>
@@ -444,7 +412,7 @@
           <w:color w:val="000000"/>
           <w:sz w:val="21"/>
         </w:rPr>
-        <w:t>미국의 발달심리학자 유리 브론펜브레너(Urie Bronfenbrenner, 1917–2005)는 개인의 발달을 여러 겹으로 중첩된 생태체계 안에서 이해했다(『인간 발달의 생태학』, 1979). 그에게 인간은 홀로 자라는 것이 아니라, 가정(미시체계), 이웃과 학교(중간체계), 부모가 일하는 직장(외체계), 사회의 가치 규범(거시체계)이 중첩되어 상호작용하는 환경 속에서 발달한다. 마치 양파 껍질처럼 여러 겹의 환경이 한 사람을 에워싸고 있는 구조다. 브론펜브레너의 핵심 통찰은, 개인에게 가장 깊은 영향을 미치는 것은 가까운 공동체와의 지속적이고 직접적인 상호작용—그가 '근위 과정(proximal process)'이라고 부른 것—이라는 점이다. 산업화 시대는 이 근위 과정이 일어나야 할 가정, 이웃, 마을을 약화시키고, 거시체계인 국가에 권리를 집중함으로써 개인의 발달을 가장 중요한 토대에서 분리시켰다.</w:t>
+        <w:t>미국의 발달심리학자 유리 브론펜브레너(Urie Bronfenbrenner, 1917–2005)는 개인의 발달을 여러 겹으로 중첩된 생태체계 안에서 이해했다(『인간 발달의 생태학』, 1979). 가정(미시체계), 이웃과 학교(중간체계), 부모의 직장(외체계), 사회의 가치 규범(거시체계)이 중첩되어 상호작용하는 구조다. 그의 핵심 통찰은 개인에게 가장 깊은 영향을 미치는 것이 가까운 공동체와의 직접적 상호작용—'근위 과정(proximal process)'—이라는 점이다. 산업화 시대는 이 근위 과정이 일어나야 할 가정·이웃·마을을 약화시키고 거시체계인 국가에 권리를 집중함으로써 개인의 발달을 가장 중요한 토대에서 분리시켰다.</w:t>
       </w:r>
     </w:p>
     <w:p>
@@ -495,23 +463,7 @@
           <w:color w:val="000000"/>
           <w:sz w:val="21"/>
         </w:rPr>
-        <w:t>농업 시대의 노동 원리는 협동이었다. 한 가족이나 한 마을이 혼자서는 감당할 수 없는 땅 갈기, 씨 뿌리기, 수확, 방어를 함께 해야만 생존할 수 있었다. 이 시대에 개인이 공동체에 위임한 것은 노동력과 결정권이었다. 가정에는 양육과 출산의 역할이 위임되었고, 이웃에는 품앗이와 두레의 노동이 위임되었으며, 마을에는 공동 경작지 관리와 자치 의사결정이 위임되었다. 국가는 신분 질서와 조세를 관장하는 먼 존재로, 개인의 일상에 직접적으로 깊이 개입하지는 않았다. 한국의 품앗이가 이를 잘 보여준다. 이웃집 모내기를 함께 해주고, 추수 때 다시 도움을 받는 방식이었다. 이것은 비공식적이지만 매우 정교한 권리 위임과 회수의 순환이었다.</w:t>
-      </w:r>
-    </w:p>
-    <w:p>
-      <w:pPr>
-        <w:spacing w:before="0" w:after="120" w:line="384" w:lineRule="auto"/>
-        <w:jc w:val="both"/>
-      </w:pPr>
-      <w:r>
-        <w:rPr>
-          <w:rFonts w:ascii="Noto Serif KR" w:hAnsi="Noto Serif KR" w:eastAsia="Noto Serif KR"/>
-          <w:b w:val="0"/>
-          <w:i w:val="0"/>
-          <w:color w:val="000000"/>
-          <w:sz w:val="21"/>
-        </w:rPr>
-        <w:t>이 시대의 생애주기는 협동의 논리에 따라 구성되었다. 아이는 집안일과 농사일을 익히며 공동체의 노동에 참여하기 위한 준비를 했고, 청년기는 혼인과 토지 상속을 통해 가정이라는 공동체를 새로 구성하는 시기였으며, 중장년은 마을 자치에 참여하고 가문을 이끄는 중심이었고, 노년은 권위와 봉양의 대상으로서 공동체에 머물렀다. 필요와 위임의 관계는 비교적 단순하고 가시적이었다. 가정이 모든 것의 중심이었고, 이웃과 마을이 그를 보완했다.</w:t>
+        <w:t>농업 시대의 노동 원리는 협동이었다. 혼자서는 감당할 수 없는 땅 갈기·씨 뿌리기·수확·방어를 함께 해야 생존할 수 있었다. 가정에는 양육과 출산의 역할이, 이웃에는 품앗이와 두레의 노동이, 마을에는 공동 경작지 관리와 자치 의사결정이 위임되었다. 국가는 신분 질서와 조세를 관장하는 먼 존재로 개인의 일상에 깊이 개입하지 않았다. 한국의 품앗이—이웃집 모내기를 함께 해주고 추수 때 다시 도움을 받는 방식—는 비공식적이지만 정교한 권리 위임과 회수의 순환을 보여주는 사례다. 생애주기도 협동의 논리를 따랐다. 아이는 공동체 노동에 참여하기 위한 준비를 했고, 청년기는 혼인과 토지 상속으로 새 가정을 구성하는 시기였으며, 중장년은 마을 자치의 중심이었고, 노년은 권위와 봉양의 대상으로 공동체에 머물렀다.</w:t>
       </w:r>
     </w:p>
     <w:p>
@@ -543,7 +495,7 @@
           <w:color w:val="000000"/>
           <w:sz w:val="21"/>
         </w:rPr>
-        <w:t>산업화 시대의 노동 원리는 분업이었다. 분업이란 복잡한 생산 과정을 잘게 쪼개어 각자에게 특정 단계를 반복 담당하게 하는 방식이다. 공장과 관료제 조직은 이 원리로 생산성을 획기적으로 높였다. 한 사람이 전체를 이해할 필요는 없었다. 정해진 직무를 정확히 수행하는 표준화된 노동력이 필요했다. 이 원리가 개인의 필요를 규정했다. '좋은 일자리'를 얻기 위한 표준화된 교육, 그 교육을 통과하기 위한 입시 경쟁, 정규직 고용과 연금으로 이어지는 단선 경로가 삶의 목표가 되었다.</w:t>
+        <w:t>산업화 시대의 노동 원리는 분업이었다. 복잡한 생산 과정을 잘게 쪼개어 각자에게 반복 담당하게 하는 방식으로 공장과 관료제 조직은 생산성을 획기적으로 높였다. 한 사람이 전체를 이해할 필요 없이 정해진 직무를 정확히 수행하는 표준화된 노동력이 필요했다. '좋은 일자리'를 위한 표준화된 교육, 입시 경쟁, 정규직 고용과 연금으로 이어지는 단선 경로가 삶의 목표가 되었다.</w:t>
       </w:r>
     </w:p>
     <w:p>
@@ -559,23 +511,7 @@
           <w:color w:val="000000"/>
           <w:sz w:val="21"/>
         </w:rPr>
-        <w:t>분업의 논리는 공동체에도 그대로 적용되었다. 국가는 교육, 고용, 복지, 의료를 중앙에서 일괄 관리하는 거대한 분업 기구가 되었다. 도시는 학교와 공장을 집적하여 표준 인재를 생산하고 배치하는 기관이 되었다. 이 과정에서 이웃과 마을은 기능을 잃었다. 생존을 위한 협동의 필요가 사라지자, 그 협동을 위해 위임되었던 권리들도 사실상 국가와 도시로 흡수되었다. 개인은 자기 권리를 여러 공동체에 분산해 위임하던 상태에서 국가와 도시 두 층위에만 의존하는 상태로 바뀌었다.</w:t>
-      </w:r>
-    </w:p>
-    <w:p>
-      <w:pPr>
-        <w:spacing w:before="0" w:after="120" w:line="384" w:lineRule="auto"/>
-        <w:jc w:val="both"/>
-      </w:pPr>
-      <w:r>
-        <w:rPr>
-          <w:rFonts w:ascii="Noto Serif KR" w:hAnsi="Noto Serif KR" w:eastAsia="Noto Serif KR"/>
-          <w:b w:val="0"/>
-          <w:i w:val="0"/>
-          <w:color w:val="000000"/>
-          <w:sz w:val="21"/>
-        </w:rPr>
-        <w:t>이것이 이 연구가 비판적으로 지적하는 지점이다. 분업 체제에서 개인은 국가가 설계한 경로를 따르지 않을 선택지가 거의 없었다. 위임한 권리를 회수하는 것은 제도 바깥으로 나가는 것을 의미했고, 그것은 대개 불이익과 배제를 뜻했다. 영국의 사회학자 마이클 영(Michael Young, 1915–2002)은 『능력주의의 부상』(1958)에서—능력주의(meritocracy)란 시험 성적과 측정 가능한 능력으로 사람을 서열화하고 그 서열에 따라 지위를 배분하는 체제를 뜻한다—이런 시스템은 탈락자에게 '네가 못난 것'이라는 낙인을 찍으며 구조적 배제를 개인의 실패로 위장한다고 경고했다. 권리 집중이 낳은 가장 큰 폐해는 바로 이 다양성의 말살이었다.</w:t>
+        <w:t>분업의 논리는 공동체에도 적용되었다. 국가는 교육·고용·복지·의료를 일괄 관리하는 거대한 분업 기구가 되었고, 이웃과 마을은 기능을 잃었다. 개인은 여러 공동체에 권리를 분산해 위임하던 상태에서 국가와 도시 두 층위에만 의존하는 상태로 바뀌었다. 영국의 사회학자 마이클 영(Michael Young, 1915–2002)은 『능력주의의 부상』(1958)에서 이런 시스템이 탈락자에게 '네가 못난 것'이라는 낙인을 찍으며 구조적 배제를 개인의 실패로 위장한다고 경고했다.</w:t>
       </w:r>
     </w:p>
     <w:p>
@@ -607,7 +543,7 @@
           <w:color w:val="000000"/>
           <w:sz w:val="21"/>
         </w:rPr>
-        <w:t>디지털 시대의 노동 원리는 정체성 발휘다. 인공지능과 자동화가 반복 직무를 대체하면서, 표준화된 분업 노동의 경제적 가치는 낮아지고 있다. 반면 데이터, 창의성, 고유한 판단력, 사람 사이의 신뢰처럼 각 개인만이 가진 독특한 역량의 가치는 높아진다. 예를 들어 세금 계산서 처리는 자동화로 대체되지만, 복잡한 세무 분쟁을 풀어내는 맥락 이해력은 오히려 더 귀해진다. 플랫폼과 디지털 도구가 기획·제작·유통의 비용을 낮추면서 개인은 큰 조직에 들어가야만 생산자가 되는 제약에서 풀려나고 있다. 이 시대에 일한다는 것은 조직이 부여한 직무를 수행하는 것이 아니라, 자신의 고유한 정체성을 실제 기여로 발휘하는 것이다.</w:t>
+        <w:t>디지털 시대의 노동 원리는 정체성 발휘다. 인공지능과 자동화가 반복 직무를 대체하면서 표준화된 분업 노동의 경제적 가치는 낮아지고, 각 개인만이 가진 고유한 역량의 가치는 높아진다. 예를 들어 세금 계산서 처리는 자동화로 대체되지만, 복잡한 세무 분쟁을 풀어내는 맥락 이해력은 오히려 더 귀해진다. 플랫폼과 디지털 도구가 기획·제작·유통의 비용을 낮추면서 개인은 큰 조직에 들어가야만 생산자가 되는 제약에서 풀려나고 있다. 일한다는 것은 조직이 부여한 직무를 수행하는 것이 아니라 자신의 고유한 정체성을 실제 기여로 발휘하는 것이다.</w:t>
       </w:r>
     </w:p>
     <w:p>
@@ -623,7 +559,7 @@
           <w:color w:val="000000"/>
           <w:sz w:val="21"/>
         </w:rPr>
-        <w:t>이 전환은 개인이 권리를 위임하는 방식도 바꾼다. 국가 하나에 집중되었던 권리가 다시 여러 공동체로 분산될 조건이 만들어진다. 가정은 정체성의 단서를 가장 먼저 읽는 공간으로 중요성이 되살아나고, 이웃과 마을은 정체성을 실험하고 훈련하는 관계망으로 기능이 복원된다. 도시는 그 정체성을 실제 기여로 발휘하는 무대가 되며, 국가는 모든 것을 관리하는 기관에서 여러 공동체가 잘 작동하도록 최소 조건을 보장하는 조율자로 역할이 바뀐다. 세계는 처음으로 개인의 발휘 무대로 직접 열린다. 국경을 넘는 협업이 가능해지면서, 국내 노동시장에서 자리를 얻지 못한 사람도 세계 무대에서 기여할 경로가 생긴다.</w:t>
+        <w:t>이 전환은 권리 위임의 방식도 바꾼다. 국가 하나에 집중되었던 권리가 다시 여러 공동체로 분산될 조건이 만들어진다. 가정은 정체성의 단서를 가장 먼저 읽는 공간으로 중요성이 되살아나고, 이웃과 마을은 정체성을 실험하고 훈련하는 관계망으로 복원된다. 도시는 그 정체성을 실제 기여로 발휘하는 무대가 되며, 국가는 모든 것을 관리하는 기관에서 여러 공동체가 잘 작동하도록 최소 조건을 보장하는 조율자로 역할이 바뀐다. 세계는 처음으로 개인의 발휘 무대로 직접 열린다. 국경을 넘는 협업이 가능해지면서, 국내 노동시장에서 자리를 얻지 못한 사람도 세계 무대에서 기여할 경로가 생긴다.</w:t>
       </w:r>
     </w:p>
     <w:p>
@@ -674,39 +610,7 @@
           <w:color w:val="000000"/>
           <w:sz w:val="21"/>
         </w:rPr>
-        <w:t>모든 사람은 고유한 가능성을 지니고 태어난다. 태아·영아기는 그 가능성의 단서가 처음으로 드러나는 시기다. 농업 시대에 이 단계의 필요는 무사한 출산과 건강한 몸이었다. 생존 자체가 목표였고, 가정과 이웃, 마을이 공동으로 출산을 돕고 아이를 거두었다. 산업화 시대에는 안정된 양육과 표준 발달표에 맞는 보살핌이 필요로 규정되었다. 표준 발달표란 월령별로 몸무게, 신장, 언어 발달이 어느 수준이어야 한다는 평균치를 가리킨다. 국가가 임신·출산·영유아 건강 관리를 담당하며 가정의 역할을 보완했다.</w:t>
-      </w:r>
-    </w:p>
-    <w:p>
-      <w:pPr>
-        <w:spacing w:before="0" w:after="120" w:line="384" w:lineRule="auto"/>
-        <w:jc w:val="both"/>
-      </w:pPr>
-      <w:r>
-        <w:rPr>
-          <w:rFonts w:ascii="Noto Serif KR" w:hAnsi="Noto Serif KR" w:eastAsia="Noto Serif KR"/>
-          <w:b w:val="0"/>
-          <w:i w:val="0"/>
-          <w:color w:val="000000"/>
-          <w:sz w:val="21"/>
-        </w:rPr>
-        <w:t>디지털 시대에는 타고난 기질과 강점의 단서를 일찍 발견하고 기록하는 것이 새로운 필요로 등장한다. 생체·행동 데이터를 읽는 기술이 등장하면서, 아이가 어떤 방식으로 환경에 반응하는지, 어디에 관심을 보이는지를 예전보다 훨씬 일찍 포착할 수 있게 되었다. 그에 따라 가정의 역할이 달라진다. 단순 양육의 자리에서, 정체성의 단서를 가장 먼저 읽고 기록하는 생활 기반으로 역할이 깊어진다. 가정은 이 단계에서 시간과 관심이라는 권리를 가장 크게 위임받는 공동체다.</w:t>
-      </w:r>
-    </w:p>
-    <w:p>
-      <w:pPr>
-        <w:spacing w:before="0" w:after="120" w:line="384" w:lineRule="auto"/>
-        <w:jc w:val="both"/>
-      </w:pPr>
-      <w:r>
-        <w:rPr>
-          <w:rFonts w:ascii="Noto Serif KR" w:hAnsi="Noto Serif KR" w:eastAsia="Noto Serif KR"/>
-          <w:b w:val="0"/>
-          <w:i w:val="0"/>
-          <w:color w:val="000000"/>
-          <w:sz w:val="21"/>
-        </w:rPr>
-        <w:t>그러나 이 기술은 누구에게나 동등하게 닿지 않는다. 관찰이 풍부한 가정의 아이는 단서가 일찍 읽히지만, 그런 환경이 없는 아이는 출발선 바깥에 남는다. 미국의 경제학자이자 노벨 경제학상 수상자인 제임스 헥만(James Heckman, 1944– )은 미국 저소득층 아동을 대상으로 한 장기 추적 연구에서, 생애 초기에 이루어지는 양육과 교육 환경에 대한 투자는 이후 어느 시기보다 높은 복리 효과를 낳는다는 것을 실증했다. 돌봄의 질을 높이는 데 1달러를 쓰면 성인이 된 후 범죄 예방, 소득 향상, 복지 지출 감소 등으로 수배의 사회적 수익이 돌아온다는 계산이다. 국가는 표준 관리자에서 '먼저 찾아가는 보장자'로 역할을 전환해야 한다. 이것은 위임의 구조가 달라지는 것이다. 국가에 위임된 권리가 표준 집행에서 선제적 돌봄으로 방향을 바꾼다.</w:t>
+        <w:t>태아·영아기는 고유한 가능성의 단서가 처음 드러나는 시기다. 농업 시대의 필요는 무사한 출산과 건강한 몸이었고, 가정·이웃·마을이 공동으로 출산을 돕고 아이를 거두었다. 산업화 시대에는 표준 발달표에 맞는 보살핌이 필요로 규정되었고, 국가가 임신·출산·영유아 건강 관리를 담당하며 가정을 보완했다. 디지털 시대에는 타고난 기질과 강점의 단서를 일찍 발견하고 기록하는 것이 새로운 필요로 등장한다. 생체·행동 데이터를 읽는 기술이 등장하면서, 아이가 어떤 방식으로 환경에 반응하는지를 예전보다 훨씬 일찍 포착할 수 있게 되었다. 가정의 역할은 단순 양육에서 정체성의 단서를 가장 먼저 읽고 기록하는 생활 기반으로 깊어진다. 미국의 경제학자 제임스 헥만(James Heckman, 1944– )은 장기 추적 연구에서 생애 초기 양육·교육 환경에 대한 투자가 이후 어느 시기보다 높은 복리 효과를 낳는다는 것을 실증했다. 돌봄의 질을 높이는 데 1달러를 쓰면 성인이 된 후 범죄 예방·소득 향상·복지 지출 감소로 수배의 사회적 수익이 돌아온다. 국가는 표준 관리자에서 '먼저 찾아가는 보장자'로 역할을 전환해야 한다.</w:t>
       </w:r>
     </w:p>
     <w:p>
@@ -738,39 +642,7 @@
           <w:color w:val="000000"/>
           <w:sz w:val="21"/>
         </w:rPr>
-        <w:t>유아·아동기는 여러 강점의 단서를 체험으로 확인하는 시기다. 농업 시대에는 집안일과 농사일을 익히는 것이 이 단계의 과제였고, 산업화 시대에는 취학 준비와 기초 학력 습득이 목표였다. 두 시대 모두 아이의 필요는 외부 사회가 정의했다. 가정은 취학을 준비시키는 역할을 맡았고, 도시와 국가가 표준 교육 기관을 통해 나머지를 관장했다.</w:t>
-      </w:r>
-    </w:p>
-    <w:p>
-      <w:pPr>
-        <w:spacing w:before="0" w:after="120" w:line="384" w:lineRule="auto"/>
-        <w:jc w:val="both"/>
-      </w:pPr>
-      <w:r>
-        <w:rPr>
-          <w:rFonts w:ascii="Noto Serif KR" w:hAnsi="Noto Serif KR" w:eastAsia="Noto Serif KR"/>
-          <w:b w:val="0"/>
-          <w:i w:val="0"/>
-          <w:color w:val="000000"/>
-          <w:sz w:val="21"/>
-        </w:rPr>
-        <w:t>디지털 시대에는 다양한 체험으로 관심과 강점을 발견하고 실험하는 것이 이 단계의 과제가 된다. 아이는 여러 분야를 경험하면서 자신이 무엇에 끌리는지, 무엇을 할 때 생기가 도는지를 알아간다. 한 아이는 블록 쌓기에서 공간 감각의 단서를 보이고, 다른 아이는 친구의 감정을 금방 읽는 공감 능력을 드러낸다. 이를 위해 가정은 관심을 지지하고, 이웃은 다양한 체험 기회를 열며, 마을은 공동 발견 프로그램을 제공한다. 권리 위임의 관점에서 보면, 이 단계는 가정 하나가 교육을 독점하거나 국가 하나가 의무 교육을 독점하는 구조에서 벗어나, 가정·이웃·마을이 나누어 역할을 맡는 분산형 위임 구조로 이행하는 단계다.</w:t>
-      </w:r>
-    </w:p>
-    <w:p>
-      <w:pPr>
-        <w:spacing w:before="0" w:after="120" w:line="384" w:lineRule="auto"/>
-        <w:jc w:val="both"/>
-      </w:pPr>
-      <w:r>
-        <w:rPr>
-          <w:rFonts w:ascii="Noto Serif KR" w:hAnsi="Noto Serif KR" w:eastAsia="Noto Serif KR"/>
-          <w:b w:val="0"/>
-          <w:i w:val="0"/>
-          <w:color w:val="000000"/>
-          <w:sz w:val="21"/>
-        </w:rPr>
-        <w:t>브론펜브레너가 중간체계(mesosystem, 가정과 이웃과 마을이 서로 맞물려 상호 강화하는 영역)라고 부른 구조가 이 단계에서 결정적으로 작동해야 한다. 체험이 풍부한 아이와 그렇지 못한 아이의 간격은 이미 이 단계에서 벌어지기 시작한다. 국가는 기회의 바닥을 보장하는 역할로 이 분산 구조를 뒤에서 떠받쳐야 한다.</w:t>
+        <w:t>유아·아동기는 여러 강점의 단서를 체험으로 확인하는 시기다. 농업 시대에는 집안일과 농사일을 익히는 것이, 산업화 시대에는 취학 준비와 기초 학력 습득이 과제였다. 두 시대 모두 아이의 필요는 외부 사회가 정의했다. 디지털 시대에는 다양한 체험으로 관심과 강점을 발견하고 실험하는 것이 이 단계의 과제가 된다. 한 아이는 블록 쌓기에서 공간 감각의 단서를 보이고, 다른 아이는 친구의 감정을 빠르게 읽는 공감 능력을 드러낸다. 이를 위해 가정은 관심을 지지하고, 이웃은 다양한 체험 기회를 열며, 마을은 공동 발견 프로그램을 제공한다. 가정 하나 혹은 국가 하나가 교육을 독점하는 구조에서 벗어나 가정·이웃·마을이 나누어 역할을 맡는 분산형 위임 구조로 이행하는 것이 이 단계의 핵심이다. 브론펜브레너가 중간체계(mesosystem)라고 부른 가정·이웃·마을의 상호 강화 구조가 이 단계에서 결정적으로 작동해야 한다. 체험이 풍부한 아이와 그렇지 못한 아이의 간격은 이미 이 단계에서 벌어지기 시작하므로, 국가는 기회의 바닥을 보장하는 역할로 이 분산 구조를 뒤에서 떠받쳐야 한다.</w:t>
       </w:r>
     </w:p>
     <w:p>
@@ -802,7 +674,7 @@
           <w:color w:val="000000"/>
           <w:sz w:val="21"/>
         </w:rPr>
-        <w:t>청소년기는 정체성의 위기가 가장 첨예하게 나타나는 시기다. 독일 태생의 미국 발달심리학자이자 정신분석가 에릭 에릭슨(Erik H. Erikson, 1902–1994)은 생애 발달을 여덟 단계로 나누고, 각 단계에서 개인이 해결해야 할 심리사회적 과제가 있다고 보았다(『아동기와 사회』, 1950). 심리사회적 과제란 내면의 심리와 바깥 사회적 관계가 맞닿아 만들어내는 긴장이자 도전을 가리킨다. 에릭슨에게 청소년기의 핵심 과제는 '정체성 대 역할 혼미'였다. 나는 누구인가, 나는 무엇을 할 수 있는가를 탐색하고 방향을 정하는 것이 이 단계의 본질적 필요다.</w:t>
+        <w:t>청소년기는 정체성의 위기가 가장 첨예하게 나타나는 시기다. 독일 태생의 미국 발달심리학자 에릭 에릭슨(Erik H. Erikson, 1902–1994)은 생애 발달을 여덟 단계로 나누어 각 단계의 심리사회적 과제를 제시했다(『아동기와 사회』, 1950). 청소년기의 핵심 과제는 '정체성 대 역할 혼미'였다. 나는 누구인가, 무엇을 할 수 있는가를 탐색하고 방향을 정하는 것이 이 단계의 본질적 필요다.</w:t>
       </w:r>
     </w:p>
     <w:p>
@@ -818,23 +690,7 @@
           <w:color w:val="000000"/>
           <w:sz w:val="21"/>
         </w:rPr>
-        <w:t>농업 시대에 이 필요는 가업의 기술과 노동력을 습득하는 것으로 채워졌다. 산업화 시대에는 입시 경쟁에서 좋은 성적을 내고 상급 학교에 진학하는 것으로 대체되었다. 성적이 정체성을 규정했다. 이 구조에서 도시의 입시 학교와 국가의 대입 제도가 청소년의 권리 위임을 거의 독점했다. 아이가 무엇을 잘하고 무엇에 끌리는지는 중요하지 않았다. 점수가 진로를 결정했다.</w:t>
-      </w:r>
-    </w:p>
-    <w:p>
-      <w:pPr>
-        <w:spacing w:before="0" w:after="120" w:line="384" w:lineRule="auto"/>
-        <w:jc w:val="both"/>
-      </w:pPr>
-      <w:r>
-        <w:rPr>
-          <w:rFonts w:ascii="Noto Serif KR" w:hAnsi="Noto Serif KR" w:eastAsia="Noto Serif KR"/>
-          <w:b w:val="0"/>
-          <w:i w:val="0"/>
-          <w:color w:val="000000"/>
-          <w:sz w:val="21"/>
-        </w:rPr>
-        <w:t>이것이 권리 집중이 낳은 전형적인 폐해다. 국가와 도시에 집중된 교육 권리가 단일한 기준으로 모든 청소년을 줄 세웠다. 마이클 영이 경고했듯, 이 시스템은 탈락자에게 '네가 못난 것'이라는 낙인을 찍으며 구조적 배제를 개인의 실패로 위장했다. 디지털 시대의 청소년 공동체는 다르다. 마을이 멘토와 훈련 경로를 제공하고, 도시가 심화 경로와 재진입 통로를 마련하며, 각자의 강점이 점수 서열 바깥에서 길러질 수 있는 공간이 만들어진다. 청소년은 이 공동체들에 배움과 시간을 위임하되, 어느 경로가 자신에게 맞는지 스스로 선택하고 바꿀 수 있다.</w:t>
+        <w:t>농업 시대에는 가업 기술 습득이, 산업화 시대에는 입시 경쟁과 상급 학교 진학이 이 필요를 채웠다. 성적이 정체성을 규정했고, 도시의 입시 학교와 국가의 대입 제도가 청소년의 권리 위임을 거의 독점했다. 마이클 영이 경고했듯 이 구조는 탈락자에게 구조적 배제를 개인의 실패로 위장했다. 디지털 시대에는 마을이 멘토와 훈련 경로를 제공하고, 도시가 심화 경로와 재진입 통로를 마련하여 각자의 강점이 점수 서열 바깥에서 길러질 수 있는 공간이 만들어진다.</w:t>
       </w:r>
     </w:p>
     <w:p>
@@ -866,7 +722,7 @@
           <w:color w:val="000000"/>
           <w:sz w:val="21"/>
         </w:rPr>
-        <w:t>청년기는 훈련을 통해 다듬어진 강점을 실제 기여로 발휘하는 시기다. 농업 시대에는 토지와 혼인을 통해 새 가정을 구성하는 것이 이 단계의 과제였다. 산업화 시대에는 좋은 직장에 취업하고 정규직으로 정착하는 것이 목표였다. 두 경우 모두 필요는 외부가 규정했고, 공동체—국가와 도시—가 그 경로를 통제했다.</w:t>
+        <w:t>청년기는 훈련을 통해 다듬어진 강점을 실제 기여로 발휘하는 시기다. 농업 시대에는 토지와 혼인을 통해 새 가정을 구성하는 것이, 산업화 시대에는 좋은 직장에 취업하고 정착하는 것이 목표였다. 두 경우 모두 필요는 외부가 규정했고 국가와 도시가 그 경로를 통제했다.</w:t>
       </w:r>
     </w:p>
     <w:p>
@@ -882,23 +738,7 @@
           <w:color w:val="000000"/>
           <w:sz w:val="21"/>
         </w:rPr>
-        <w:t>디지털 시대의 청년이 필요로 하는 것은 자기 정체성을 실제 기여로 발휘할 무대다. 인공지능과 플랫폼이 진입 비용을 낮추면서, 개인은 대기업에 고용되지 않고도 자신만의 방식으로 가치를 생산하고 시장에 내놓을 수 있게 되었다. 이 변화는 권리 위임의 구조를 바꾼다. 산업화 시대에 청년은 자신의 노동력과 결정권을 기업과 국가에 대규모로 위임하는 것이 거의 유일한 선택지였다. 디지털 시대에는 도시에 발휘의 기반을 위임하고, 세계와는 협업의 관계를 선택적으로 맺으며, 언제든 재편할 수 있는 유연한 위임 구조가 가능해진다.</w:t>
-      </w:r>
-    </w:p>
-    <w:p>
-      <w:pPr>
-        <w:spacing w:before="0" w:after="120" w:line="384" w:lineRule="auto"/>
-        <w:jc w:val="both"/>
-      </w:pPr>
-      <w:r>
-        <w:rPr>
-          <w:rFonts w:ascii="Noto Serif KR" w:hAnsi="Noto Serif KR" w:eastAsia="Noto Serif KR"/>
-          <w:b w:val="0"/>
-          <w:i w:val="0"/>
-          <w:color w:val="000000"/>
-          <w:sz w:val="21"/>
-        </w:rPr>
-        <w:t>그러나 이 변화는 모두에게 균등하게 열리지 않는다. 발휘의 무대에 먼저 올라서는 사람과 그 무대 바깥에 머무는 사람의 간격이 크다. 도시와 국가가 진입 장벽을 낮추고 첫 기여를 연결하는 역할을 맡는 것은, 모든 청년이 적어도 한 번은 위임의 회로에 들어올 수 있도록 하는 최소 보장이다. 덴마크 출신의 사회정책학자 예스타 에스핑안데르센(Gøsta Esping-Andersen, 1947– )은 북유럽 복지국가 연구로 잘 알려진 학자인데, 지식경제 시대에는 복지를 소득 보전에만 쓰지 말고 교육·보육·재훈련 같은 사람에 대한 사전 투자—그가 말하는 '사회적 투자(social investment)'—로 전환해야 한다고 강조했다. 청년이 발휘의 무대에 오르기 위해 필요한 진입 조건을 미리 까는 일이 바로 그것이다.</w:t>
+        <w:t>디지털 시대의 청년이 필요로 하는 것은 자기 정체성을 실제 기여로 발휘할 무대다. 인공지능과 플랫폼이 진입 비용을 낮추면서 개인은 대기업에 고용되지 않고도 가치를 생산할 수 있게 되었다. 산업화 시대에 청년은 노동력과 결정권을 기업과 국가에 대규모로 위임하는 것이 거의 유일한 선택지였다면, 디지털 시대에는 도시에 발휘의 기반을 위임하고 세계와 선택적으로 협업하며 언제든 재편할 수 있는 유연한 위임 구조가 가능해진다. 덴마크 출신의 사회정책학자 예스타 에스핑안데르센(Gøsta Esping-Andersen, 1947– )은 지식경제 시대에는 복지를 소득 보전에만 쓰지 말고 교육·보육·재훈련 같은 사람에 대한 사전 투자—'사회적 투자(social investment)'—로 전환해야 한다고 강조했다.</w:t>
       </w:r>
     </w:p>
     <w:p>
@@ -930,7 +770,7 @@
           <w:color w:val="000000"/>
           <w:sz w:val="21"/>
         </w:rPr>
-        <w:t>중장년기는 디지털 전환의 혜택과 위험이 가장 불균등하게 갈리는 시기다. 산업화 시대의 목표는 고용 유지와 가족 부양, 사회적 지위였다. 이 시기의 권리 위임은 주로 직장과 국가를 향해 있었다. 안정된 고용이라는 조건이 유지되는 한, 개인은 자신의 노동 시간과 역량을 기업에 위임하고 연금 권리는 국가에 맡겨두는 계약을 따랐다.</w:t>
+        <w:t>중장년기는 디지털 전환의 혜택과 위험이 가장 불균등하게 갈리는 시기다. 산업화 시대의 목표는 고용 유지와 가족 부양이었고, 권리 위임은 주로 직장과 국가를 향해 있었다. 안정된 고용이 유지되는 한 개인은 자신의 노동 시간과 역량을 기업에 위임하고 연금 권리는 국가에 맡겨두는 계약을 따랐다. 디지털 전환은 자동화와 인공지능이 기존 직무를 대체하면서 재학습과 강점의 재설계를 요구한다. 마을과 도시가 재학습의 접근로를 열고 가정과 국가가 전환기 보호를 제공하는 것은, 빼앗겼던 선택권을 다시 분산해 돌려주는 과정이다. 직업 전환을 원하는 중장년이 마을 단위 재교육 센터에서 새 기술을 배우고 국가는 그 기간 동안 소득을 일부 보전해주는 구조가 이에 해당한다.</w:t>
       </w:r>
     </w:p>
     <w:p>
@@ -946,23 +786,7 @@
           <w:color w:val="000000"/>
           <w:sz w:val="21"/>
         </w:rPr>
-        <w:t>디지털 전환은 이 계약을 깨뜨리고 있다. 자동화와 인공지능이 기존 직무를 빠르게 대체하면서, 중장년에게 재학습과 강점의 재설계가 필요해졌다. 그러나 위임의 회수가 어려운 구조—국가가 표준 직업 훈련만 제공하고, 기업은 장기 고용 약속 없이 효율만 추구하는—에서 중장년은 재설계의 기회를 갖기 어렵다. 마을과 도시가 재학습의 접근로를 열고, 가정과 국가가 전환기 보호를 제공하는 것은, 빼앗겼던 선택권을 다시 분산해 돌려주는 과정이다. 예를 들어 직업 전환을 원하는 중장년이 마을 단위 재교육 센터에서 새 기술을 배우고, 국가는 그 기간 동안 소득을 일부 보전해주는 구조가 이에 해당한다.</w:t>
-      </w:r>
-    </w:p>
-    <w:p>
-      <w:pPr>
-        <w:spacing w:before="0" w:after="120" w:line="384" w:lineRule="auto"/>
-        <w:jc w:val="both"/>
-      </w:pPr>
-      <w:r>
-        <w:rPr>
-          <w:rFonts w:ascii="Noto Serif KR" w:hAnsi="Noto Serif KR" w:eastAsia="Noto Serif KR"/>
-          <w:b w:val="0"/>
-          <w:i w:val="0"/>
-          <w:color w:val="000000"/>
-          <w:sz w:val="21"/>
-        </w:rPr>
-        <w:t>에릭 에릭슨은 중장년기의 핵심 과제를 '생산성 대 침체(generativity vs. stagnation)'로 정의했다. 생산성이란 자신이 쌓은 것을 다음 세대에 전달하거나 사회에 기여하는 방향으로 확장하는 힘을 가리킨다. 자신이 쌓은 것을 새 방향으로 확장하고 다음 세대를 위한 무언가를 만들어 내지 못하면, 개인은 정체와 고립으로 빠진다. 이 심리적 위기에 응답하는 것은 개인의 의지가 아니라 공동체의 구조다. 재학습의 기회를 만들고, 새 역할을 연결하며, 전환기의 불안을 함께 감당하는 공동체가 있어야 한다.</w:t>
+        <w:t>에릭슨은 중장년기의 핵심 과제를 '생산성 대 침체(generativity vs. stagnation)'로 정의했다. 자신이 쌓은 것을 새 방향으로 확장하고 다음 세대를 위한 무언가를 만들어내지 못하면 정체와 고립으로 빠진다. 이 심리적 위기에 응답하는 것은 개인의 의지가 아니라 공동체의 구조다. 재학습의 기회를 만들고 새 역할을 연결하며 전환기의 불안을 함께 감당하는 공동체가 있어야 한다.</w:t>
       </w:r>
     </w:p>
     <w:p>
@@ -994,7 +818,7 @@
           <w:color w:val="000000"/>
           <w:sz w:val="21"/>
         </w:rPr>
-        <w:t>노년기는 농업 시대에는 권위와 봉양, 산업화 시대에는 은퇴와 부양의 시기였다. 두 시대 모두 노인을 '받는 존재'로 정의했다. 농업 시대에는 권위를 받고, 산업화 시대에는 연금과 부양을 받았다. 디지털 시대는 이 정의를 바꾼다. 건강을 미리 예측하고 예방하면서 존엄과 판단의 주도권을 지키고, 경험을 다음 세대에 전수하며 세대를 연결하는 '능동적 전수자'로서의 노년을 제안한다.</w:t>
+        <w:t>농업 시대의 노년은 권위와 봉양, 산업화 시대의 노년은 은퇴와 부양의 시기였다. 두 시대 모두 노인을 '받는 존재'로 정의했다. 디지털 시대는 건강을 미리 예측·예방하면서 존엄과 판단의 주도권을 지키고, 경험을 다음 세대에 전수하며 세대를 연결하는 '능동적 전수자'로서의 노년을 제안한다.</w:t>
       </w:r>
     </w:p>
     <w:p>
@@ -1010,23 +834,7 @@
           <w:color w:val="000000"/>
           <w:sz w:val="21"/>
         </w:rPr>
-        <w:t>에릭슨은 노년기의 과제를 '자아통합 대 절망(ego integrity vs. despair)'으로 보았다. 자아통합이란 자신의 삶 전체를 돌아보며 '그래도 이 삶은 의미가 있었다'는 느낌을 갖는 것이다. 자신의 삶이 의미 있었다는 통합감을 얻지 못하면 절망에 빠진다. 이 과제는 개인의 내면 문제가 아니라 사회적 과제다. 전수할 통로가 있고, 역할이 주어지며, 관계 안에 머물 수 있는 공동체 구조가 통합을 가능하게 한다. 가정은 돌봄과 존엄의 생활 공간을 제공하고, 이웃은 관계의 지속을 돕고, 마을과 도시는 멘토와 자문의 역할을 연결한다. 국가는 소득의 최소 기반과 고립 방지의 역할을 맡는다.</w:t>
-      </w:r>
-    </w:p>
-    <w:p>
-      <w:pPr>
-        <w:spacing w:before="0" w:after="120" w:line="384" w:lineRule="auto"/>
-        <w:jc w:val="both"/>
-      </w:pPr>
-      <w:r>
-        <w:rPr>
-          <w:rFonts w:ascii="Noto Serif KR" w:hAnsi="Noto Serif KR" w:eastAsia="Noto Serif KR"/>
-          <w:b w:val="0"/>
-          <w:i w:val="0"/>
-          <w:color w:val="000000"/>
-          <w:sz w:val="21"/>
-        </w:rPr>
-        <w:t>폴라니의 언어로 말하면, 노인이 시장과 국가 연금에만 의존하는 상태는 '탈착근'의 전형이다. 오랜 시간 가꿔온 인간관계와 역할에서 떨어져 나와 돈으로만 생존을 유지하는 것이다. 재착근은 노인이 관계와 역할의 그물 안으로 돌아오는 것이다. 그 그물을 유지하는 것은 각 공동체가 노인으로부터 위임받은 권리—관계, 시간, 경험—를 제대로 활용하고 돌려주는 것이다.</w:t>
+        <w:t>에릭슨은 노년기의 과제를 '자아통합 대 절망(ego integrity vs. despair)'으로 보았다. 자신의 삶 전체를 돌아보며 '그래도 이 삶은 의미가 있었다'는 통합감을 얻지 못하면 절망에 빠진다. 전수할 통로가 있고 역할이 주어지며 관계 안에 머물 수 있는 공동체 구조가 통합을 가능하게 한다. 가정은 돌봄과 존엄의 생활 공간을, 이웃은 관계의 지속을, 마을과 도시는 멘토와 자문의 역할을 연결하고, 국가는 소득의 최소 기반과 고립 방지의 역할을 맡는다. 폴라니의 언어로 말하면, 노인이 시장과 국가 연금에만 의존하는 상태는 탈배태의 전형이다. 재배태은 노인이 관계와 역할의 그물 안으로 돌아오는 것이며, 그 그물을 유지하는 것은 각 공동체가 노인으로부터 위임받은 관계·시간·경험을 제대로 활용하고 돌려주는 것이다.</w:t>
       </w:r>
     </w:p>
     <w:p>
@@ -1077,7 +885,7 @@
           <w:color w:val="000000"/>
           <w:sz w:val="21"/>
         </w:rPr>
-        <w:t>가정은 개인이 태어나는 순간부터 가장 먼저 권리를 위임받는 공동체다. 개인은 가정에 시간, 감정, 돌봄, 결정의 상당 부분을 위임한다. 농업 시대에 가정은 노동·양육·부양·교육을 모두 떠안는 전능한 공동체였다. 산업화 시대에는 교육을 학교에, 의료를 병원에 위임하면서 역할이 좁아졌다. 디지털 시대에 가정의 핵심 역할은 '정체성 단서를 가장 먼저 읽는 생활 기반'이다. 아이가 어디에 반응하는지, 무엇을 할 때 활기를 띠는지를 가장 가까이에서 관찰하고 기록하는 것이다. 또한 중장년의 전환기와 노년의 돌봄·존엄을 지지하는 역할도 함께 맡는다. 브론펜브레너가 말한 미시체계(microsystem)—개인이 직접 몸담는 가장 가까운 환경—가 바로 가정이며, 이 층위가 건강해야 다른 모든 공동체에서의 위임도 의미를 가질 수 있다.</w:t>
+        <w:t>가정은 개인이 태어나는 순간부터 가장 먼저 권리를 위임받는 공동체다. 농업 시대에 가정은 노동·양육·부양·교육을 모두 떠안는 전능한 공동체였고, 산업화 시대에는 교육을 학교에, 의료를 병원에 위임하면서 역할이 좁아졌다. 디지털 시대에 가정의 핵심 역할은 정체성의 단서를 가장 먼저 읽는 생활 기반이다. 아이가 어디에 반응하는지, 무엇을 할 때 활기를 띠는지를 가장 가까이에서 관찰하고 기록하는 것이다. 또한 중장년의 전환기와 노년의 돌봄·존엄을 지지하는 역할도 함께 맡는다. 브론펜브레너가 말한 미시체계(microsystem)—개인이 직접 몸담는 가장 가까운 환경—가 바로 가정이며, 이 층위가 건강해야 다른 모든 공동체에서의 위임도 의미를 가질 수 있다.</w:t>
       </w:r>
     </w:p>
     <w:p>
@@ -1109,7 +917,7 @@
           <w:color w:val="000000"/>
           <w:sz w:val="21"/>
         </w:rPr>
-        <w:t>이웃은 산업화 시대에 가장 크게 위축된 공동체다. 표준 제도가 모든 것을 조직하면서 이웃 간 상호 돌봄과 협동의 기능은 사라졌다. 그러나 정체성을 발휘하려는 시대에 이웃은 다시 중요해진다. 이웃은 아이가 다양한 흥미를 실험하고 어른이 새 관계를 맺는 일상망이다. 관심 기반 모임, 생활 멘토, 상호 돌봄의 품앗이가 이웃에서 이루어질 때, 개인은 자신의 탐색 시간과 관계 자원을 이웃 공동체에 위임하며 발견의 기회를 얻는다. 단절된 사람이 다시 관계망으로 돌아오는 첫 번째 통로도 이웃이다. 오스트롬이 연구한 공동 관리의 사례들—스위스 알프스의 목초지 공동 관리, 일본 어촌의 어장 자치—은 이웃 규모의 자치가 얼마나 정교하게 작동할 수 있는지를 보여준다.</w:t>
+        <w:t>이웃은 산업화 시대에 가장 크게 위축된 공동체다. 표준 제도가 모든 것을 조직하면서 이웃 간 상호 돌봄과 협동의 기능은 사라졌다. 정체성을 발휘하는 시대에 이웃은 다시 중요해진다. 아이가 흥미를 실험하고 어른이 새 관계를 맺는 일상망이다. 관심 기반 모임, 생활 멘토, 상호 돌봄의 품앗이가 이웃에서 이루어질 때 개인은 발견의 기회를 얻는다. 단절된 사람이 다시 관계망으로 돌아오는 첫 번째 통로도 이웃이다. 오스트롬이 연구한 스위스 알프스의 목초지 공동 관리, 일본 어촌의 어장 자치는 이웃 규모의 자치가 얼마나 정교하게 작동할 수 있는지를 보여준다.</w:t>
       </w:r>
     </w:p>
     <w:p>
@@ -1141,7 +949,7 @@
           <w:color w:val="000000"/>
           <w:sz w:val="21"/>
         </w:rPr>
-        <w:t>마을은 생애주기의 여러 단계에서 훈련과 재학습을 담당하는 공동체다. 산업화 시대에 마을은 도시에 기능을 빼앗겨 행정 단위로 전락했다. 디지털 시대에 마을은 '발견된 방향을 훈련으로 잇는 생활권'으로 복원된다. 청소년에게는 마을 멘토단과 훈련 경로가, 중장년에게는 재학습 접근로가 마을을 통해 열린다. 마을은 중앙 정부가 직접 설계하기보다, 구성원이 자치적으로 훈련 경로를 만들고 국가가 최소 기준을 보장하는 방식으로 운영될 때 가장 잘 작동한다. 오스트롬이 말한 다층 자치 거버넌스의 가장 구체적인 현장이 바로 마을이다. 아마르티아 센과 마사 누스바움이 강조한 역량—실제로 무언가를 할 수 있는 힘—은 마을 단위의 훈련 환경이 갖춰질 때 비로소 구체적으로 자라날 수 있다.</w:t>
+        <w:t>마을은 생애주기의 여러 단계에서 훈련과 재학습을 담당하는 공동체다. 산업화 시대에 도시에 기능을 빼앗겨 행정 단위로 전락했던 마을은 디지털 시대에 '발견된 방향을 훈련으로 잇는 생활권'으로 복원된다. 청소년에게는 마을 멘토단과 훈련 경로가, 중장년에게는 재학습 접근로가 마을을 통해 열린다. 마을은 중앙 정부가 직접 설계하기보다 구성원이 자치적으로 훈련 경로를 만들고 국가가 최소 기준을 보장할 때 가장 잘 작동한다. 센과 누스바움이 강조한 역량—실제로 무언가를 할 수 있는 힘—은 마을 단위의 훈련 환경이 갖춰질 때 비로소 구체적으로 자라난다.</w:t>
       </w:r>
     </w:p>
     <w:p>
@@ -1173,7 +981,7 @@
           <w:color w:val="000000"/>
           <w:sz w:val="21"/>
         </w:rPr>
-        <w:t>도시는 산업화 시대에 학교와 공장을 집적하여 표준 인재를 생산·배치하는 기관이었다. 입시 경쟁과 정규 고용이 도시를 중심으로 조직되었고, 개인은 도시에 자신의 노동력과 삶의 결정권을 대규모로 위임했다. 디지털 시대에 도시는 정체성을 실제 기여로 발휘하는 무대이자 생활 기반으로 전환된다. 프로젝트 연결, 직무 전환, 생활 조정이 도시의 기능이 되며, 청년의 첫 기여와 중장년의 재설계가 도시를 통해 이루어진다. 도시에 위임되는 권리의 성격이 '표준 경로에 나를 맞추기'에서 '내 기여를 발휘할 무대 만들기'로 바뀐다.</w:t>
+        <w:t>도시는 산업화 시대에 학교와 공장을 집적하여 표준 인재를 생산·배치하는 기관이었다. 디지털 시대에 도시는 정체성을 실제 기여로 발휘하는 무대이자 생활 기반으로 전환된다. 프로젝트 연결, 직무 전환, 생활 조정이 도시의 기능이 되며, 청년의 첫 기여와 중장년의 재설계가 도시를 통해 이루어진다. 도시에 위임되는 권리의 성격이 '표준 경로에 나를 맞추기'에서 '내 기여를 발휘할 무대 만들기'로 바뀐다.</w:t>
       </w:r>
     </w:p>
     <w:p>
@@ -1189,23 +997,7 @@
           <w:color w:val="000000"/>
           <w:sz w:val="21"/>
         </w:rPr>
-        <w:t>이 전환은 도시의 형태 자체를 다시 묻게 한다. 산업화 시대의 대도시는 학교·기업·행정을 한 점에 모아 규모의 효율을 끌어낸 집적 장치였다. 그러나 모든 기능이 한 도시에 집중되면, 개인이 위임한 권리도 그 거대한 행정 단위 하나에 묶여 회수하기 어려워진다. 이것은 국가로의 권리 집중과 같은 문제를 도시 규모에서 되풀이하는 것이다. 정체성을 발휘하는 무대로서의 도시는 다른 원리를 요구한다. 사람은 자신이 어디에 무엇을 맡겼는지 보이고, 필요하면 거두어들일 수 있는 규모 안에서만 권리를 능동적으로 위임한다.</w:t>
-      </w:r>
-    </w:p>
-    <w:p>
-      <w:pPr>
-        <w:spacing w:before="0" w:after="120" w:line="384" w:lineRule="auto"/>
-        <w:jc w:val="both"/>
-      </w:pPr>
-      <w:r>
-        <w:rPr>
-          <w:rFonts w:ascii="Noto Serif KR" w:hAnsi="Noto Serif KR" w:eastAsia="Noto Serif KR"/>
-          <w:b w:val="0"/>
-          <w:i w:val="0"/>
-          <w:color w:val="000000"/>
-          <w:sz w:val="21"/>
-        </w:rPr>
-        <w:t>그래서 디지털 시대의 도시는 거대한 단일 대도시가 아니라, 사람이 체감할 수 있는 규모의 강소도시들이 연합하는 형태로 재편되어야 한다. 강소도시는 한 사람의 강점을 알아보고 기여의 기회를 연결할 만큼 작고 구체적인 생활권이다. 이 규모에서는 위임이 익명의 거대 행정에 흡수되지 않고, 내가 맡긴 결정권이 어떻게 쓰이는지 들여다보고 조정할 수 있다. 동시에 작은 도시 하나만으로는 정체성을 발휘할 시장과 데이터, 기회의 폭이 부족하다. 그래서 강소도시들은 데이터·인공지능·행정·산업의 기반을 서로 연결해 하나의 연합된 생활권을 이룬다. 발휘의 폭은 연합 전체에서 얻되, 권리의 위임과 회수는 내가 속한 작은 도시 단위에서 이루어지는 구조다. 규모의 효율은 연합으로 확보하고 권리의 통제권은 개인 가까이 남기는 것, 이것이 대도시를 강소도시의 연합으로 다시 짜야 하는 이유다.</w:t>
+        <w:t>그러나 모든 기능이 한 대도시에 집중되면 개인이 위임한 권리도 거대한 행정 단위 하나에 묶여 회수하기 어려워진다. 이것은 국가로의 권리 집중과 같은 문제를 도시 규모에서 되풀이하는 것이다. 사람은 자신이 어디에 무엇을 맡겼는지 보이고 필요하면 거두어들일 수 있는 규모 안에서만 권리를 능동적으로 위임한다. 그러므로 디지털 시대의 도시는 거대한 단일 대도시가 아니라, 사람이 체감할 수 있는 규모의 강소도시들이 연합하는 형태로 재편되어야 한다. 강소도시는 한 사람의 강점을 알아보고 기여의 기회를 연결할 만큼 작고 구체적인 생활권이다. 이 규모에서는 내가 맡긴 결정권이 어떻게 쓰이는지 들여다보고 조정할 수 있다. 동시에 작은 도시 하나만으로는 시장과 데이터, 기회의 폭이 부족하므로, 강소도시들은 데이터·인공지능·행정·산업 기반을 서로 연결해 하나의 연합된 생활권을 이룬다. 발휘의 폭은 연합 전체에서 얻되 권리의 위임과 회수는 내가 속한 작은 도시 단위에서 이루어지는 구조다. 규모의 효율은 연합으로 확보하고 권리의 통제권은 개인 가까이 남기는 것, 이것이 대도시를 강소도시의 연합으로 다시 짜야 하는 이유다.</w:t>
       </w:r>
     </w:p>
     <w:p>
@@ -1237,7 +1029,7 @@
           <w:color w:val="000000"/>
           <w:sz w:val="21"/>
         </w:rPr>
-        <w:t>국가는 산업화 시대에 권리 집중의 핵심 기구였다. 교육·고용·복지·의료를 중앙에서 일괄 관리했고, 개인이 어느 공동체에 권리를 위임할지 선택할 여지를 거의 남기지 않았다. 디지털 시대의 국가는 이 역할에서 물러나야 한다. 국가의 역할은 모든 것을 관리하는 데서, 가정·이웃·마을·도시가 각자의 역할을 잘 할 수 있도록 최소 조건을 보장하고 이들 사이를 조율하는 '메타 거버넌스(meta-governance, 다른 공동체들이 잘 작동하도록 환경을 만드는 상위 조율 기능)'로 전환되어야 한다. 모든 사람에게 권리 위임의 기회가 열리도록 최소 권리선을 세우고, 어느 공동체가 과도한 권리를 독점하지 않도록 규칙을 만드는 것이 국가의 일이다. 에스핑안데르센이 말한 사회적 투자 국가—소득 보전에서 역량 형성으로—는 이 전환의 구체적인 형태다.</w:t>
+        <w:t>국가는 산업화 시대에 권리 집중의 핵심 기구였다. 교육·고용·복지·의료를 중앙에서 일괄 관리했고, 개인이 어느 공동체에 권리를 위임할지 선택할 여지를 거의 남기지 않았다. 디지털 시대의 국가는 모든 것을 관리하는 역할에서 물러나, 가정·이웃·마을·도시가 각자의 역할을 잘 할 수 있도록 최소 조건을 보장하고 이들을 조율하는 '메타 거버넌스(meta-governance)'로 전환되어야 한다. 모든 사람에게 권리 위임의 기회가 열리도록 최소 권리선을 세우고, 어느 공동체도 권리를 과도하게 독점하지 않도록 규칙을 만드는 것이 국가의 일이다. 에스핑안데르센이 말한 사회적 투자 국가—소득 보전에서 역량 형성으로—는 이 전환의 구체적인 형태다.</w:t>
       </w:r>
     </w:p>
     <w:p>
@@ -1253,7 +1045,7 @@
           <w:color w:val="000000"/>
           <w:sz w:val="21"/>
         </w:rPr>
-        <w:t>세계는 산업화 시대에 국가 간 협정으로만 작동하던 추상적 층위였다. 개인에게는 닿지 않는 먼 곳이었다. 디지털 시대에 세계는 처음으로 개인의 권리 위임 상대로 등장한다. 국경을 넘는 협업이 가능해지면서 청년과 중장년이 세계 무대에서 기여를 발휘할 수 있다. 동시에 기후변화, 인공지능 위험, 감염병처럼 국가 단위를 넘어서는 공동 위험이 커지면서, 세계는 모든 생애단계의 안전과 직결된 능동적 거버넌스 층위가 된다. 오스트롬이 만년에 연구한 기후변화 대응 거버넌스가 보여주듯, 거버넌스 층위가 더 많고 더 분산될수록 공동 위험에 대한 적응력도 높아진다.</w:t>
+        <w:t>세계는 산업화 시대에 국가 간 협정으로만 작동하던 추상적 층위였다. 디지털 시대에 세계는 처음으로 개인의 권리 위임 상대로 등장한다. 국경을 넘는 협업이 가능해지면서 청년과 중장년이 세계 무대에서 기여를 발휘할 수 있다. 동시에 기후변화·인공지능 위험·감염병처럼 국가 단위를 넘어서는 공동 위험이 커지면서 세계는 모든 생애단계의 안전과 직결된 능동적 거버넌스 층위가 된다. 오스트롬이 만년에 연구한 기후변화 대응 거버넌스가 보여주듯, 거버넌스 층위가 더 많고 더 분산될수록 공동 위험에 대한 적응력도 높아진다.</w:t>
       </w:r>
     </w:p>
     <w:p>
@@ -1314,7 +1106,7 @@
           <w:color w:val="000000"/>
           <w:sz w:val="21"/>
         </w:rPr>
-        <w:t>국가 하나가 모든 생애단계의 필요를 독점 관리하는 구조에서, 개인이 필요에 따라 가정·이웃·마을·도시에 권리를 나누어 위임하고 상황이 바뀌면 거두어들일 수 있는 구조로 전환해야 한다. 이것은 제도의 문제이기 이전에 철학의 문제다. 로크가 말했듯, 위임은 항상 회수 가능해야 한다. 탈상품화(시장에 기대지 않고도 살아갈 수 있게 해주는 사회 보장)만으로는 부족하며, 위임의 대상을 스스로 선택하고 바꿀 수 있는 구조가 함께 필요하다.</w:t>
+        <w:t>국가 하나가 모든 생애단계의 필요를 독점 관리하는 구조에서, 개인이 필요에 따라 가정·이웃·마을·도시에 권리를 나누어 위임하고 상황이 바뀌면 거두어들일 수 있는 구조로 전환해야 한다. 로크가 말했듯 위임은 항상 회수 가능해야 한다. 탈상품화—시장에 기대지 않고도 살아갈 수 있게 해주는 사회 보장—만으로는 부족하며, 위임의 대상을 스스로 선택하고 바꿀 수 있는 구조가 함께 필요하다.</w:t>
       </w:r>
     </w:p>
     <w:p>
@@ -1341,7 +1133,7 @@
           <w:color w:val="000000"/>
           <w:sz w:val="21"/>
         </w:rPr>
-        <w:t>브론펜브레너가 지적했듯, 개인에게 가장 깊은 영향을 미치는 것은 가까운 환경에서의 직접적 상호작용이다. 산업화 시대에 약화된 이웃과 마을의 역할을 되살리는 것이 권리 재분산의 핵심이다. 이는 중앙 예산을 지방에 내려보내는 것이 아니라, 이웃과 마을이 스스로 역할을 정의하고 자치적으로 운영할 수 있는 조건을 만드는 것이다. 오스트롬이 보여주었듯, 자치는 주어지는 것이 아니라 구성원들이 스스로 규칙을 만들 때 비로소 작동한다.</w:t>
+        <w:t>브론펜브레너가 지적했듯 개인에게 가장 깊은 영향을 미치는 것은 가까운 환경에서의 직접적 상호작용이다. 산업화 시대에 약화된 이웃과 마을의 역할을 되살리는 것이 권리 재분산의 핵심이다. 이는 중앙 예산을 지방에 내려보내는 것이 아니라, 이웃과 마을이 스스로 역할을 정의하고 자치적으로 운영할 수 있는 조건을 만드는 것이다. 오스트롬이 보여주었듯 자치는 주어지는 것이 아니라 구성원들이 스스로 규칙을 만들 때 비로소 작동한다.</w:t>
       </w:r>
     </w:p>
     <w:p>
@@ -1368,7 +1160,7 @@
           <w:color w:val="000000"/>
           <w:sz w:val="21"/>
         </w:rPr>
-        <w:t>각 생애단계에서 어떤 공동체가 어떤 역할을 맡는지, 개인이 어디에 권리를 위임하는지, 그 위임이 어떤 조건에서 회수될 수 있는지를 사회적 합의로 명시해야 한다. 현행 복지 제도는 생애주기의 질적 차이를 충분히 담지 못한다. 헥만이 실증한 생애 초기 투자의 복리 효과를 감안하면, 영아기에서 청소년기까지의 공동체 지원은 단순한 복지 지출이 아니라 사회 전체의 역량에 대한 선제적 투자로 재정의되어야 한다.</w:t>
+        <w:t>각 생애단계에서 어떤 공동체가 어떤 역할을 맡는지, 개인이 어디에 권리를 위임하는지, 그 위임이 어떤 조건에서 회수될 수 있는지를 사회적 합의로 명시해야 한다. 헥만이 실증한 생애 초기 투자의 복리 효과를 감안하면, 영아기에서 청소년기까지의 공동체 지원은 복지 지출이 아니라 사회 전체의 역량에 대한 선제적 투자로 재정의되어야 한다.</w:t>
       </w:r>
     </w:p>
     <w:p>
@@ -1400,7 +1192,7 @@
           <w:color w:val="000000"/>
           <w:sz w:val="21"/>
         </w:rPr>
-        <w:t>디지털 시대의 생애주기는 직선이 아니라, 앞 단계의 결과가 다음 단계의 조건이 되는 나선형 누적 구조다. 중장년의 재설계는 청소년기의 훈련이 성공했을 때 가능하고, 노년의 전수는 청년·중장년의 발휘가 쌓였을 때 의미를 갖는다. 그래서 초기 단계의 권리 위임 격차—어떤 아이는 가정·이웃·마을의 풍부한 지지 속에서 단서를 발견하고, 어떤 아이는 그 공동체들이 모두 약한 환경에서 태어나는—는 단순한 기회 불평등이 아니라 생애 전체 사이클의 단절을 의미한다. 헥만의 연구는 이 불평등이 경제학적으로도 가장 비효율적인 낭비임을 보여준다. 일찍 메꾸지 않은 결핍은 나중에 훨씬 큰 비용을 치르게 만든다.</w:t>
+        <w:t>디지털 시대의 생애주기는 직선이 아니라, 앞 단계의 결과가 다음 단계의 조건이 되는 나선형 누적 구조다. 중장년의 재설계는 청소년기의 훈련이 성공했을 때 가능하고, 노년의 전수는 청년·중장년의 발휘가 쌓였을 때 의미를 갖는다. 초기 단계의 권리 위임 격차—어떤 아이는 가정·이웃·마을의 풍부한 지지 속에서 단서를 발견하고, 어떤 아이는 그 공동체들이 모두 약한 환경에서 태어나는—는 생애 전체 사이클의 단절을 의미한다. 헥만의 연구는 이 불평등이 경제학적으로도 가장 비효율적인 낭비임을 보여준다. 일찍 메꾸지 않은 결핍은 나중에 훨씬 큰 사회적 비용을 치르게 만든다.</w:t>
       </w:r>
     </w:p>
     <w:p>
@@ -1416,7 +1208,7 @@
           <w:color w:val="000000"/>
           <w:sz w:val="21"/>
         </w:rPr>
-        <w:t>센과 누스바움이 역량의 관점에서 강조했듯, 형식적 권리보다 중요한 것은 실질적 역량이다. 모든 사람이 투표권을 갖는다고 해서 모든 사람이 정치적 역량을 갖는 것이 아니듯, 모든 아이에게 학교가 있다고 해서 모든 아이가 발견과 훈련의 역량을 갖는 것은 아니다. 공동체는 그 역량이 실제로 작동하도록 조건을 만들어야 한다. 위임의 구조가 역량의 실현을 뒷받침할 때, 비로소 계약은 정당성을 갖는다.</w:t>
+        <w:t>센과 누스바움이 강조했듯 형식적 권리보다 중요한 것은 실질적 역량이다. 모든 아이에게 학교가 있다고 해서 모든 아이가 발견과 훈련의 역량을 갖는 것은 아니다. 공동체는 그 역량이 실제로 작동하도록 조건을 만들어야 한다. 위임의 구조가 역량의 실현을 뒷받침할 때, 비로소 계약은 정당성을 갖는다.</w:t>
       </w:r>
     </w:p>
     <w:p>
@@ -1448,7 +1240,7 @@
           <w:color w:val="000000"/>
           <w:sz w:val="21"/>
         </w:rPr>
-        <w:t>이 연구의 핵심 주장은 세 줄로 요약된다. 첫째, 공동체는 개인이 자신의 필요에 의해 권리를 위임하는 계약을 통해 구현되는 실체이며, 위임은 언제든 회수 가능해야 한다. 둘째, 산업화 시대는 이 위임이 국가 하나로 집중·고착되면서 표준화·획일화·배제의 폐해를 낳았고, 이것이 이 연구의 비판적 초점이다. 셋째, 디지털 시대의 전환은 기술의 문제가 아니라, 집중된 권리를 가정·이웃·마을·도시·국가·세계의 여러 층위로 다시 분산하고 개인에게 위임의 선택권을 돌려주는 재편의 과제다.</w:t>
+        <w:t>이 연구의 핵심 주장은 세 줄로 요약된다. 첫째, 공동체는 개인이 자신의 필요에 의해 권리를 위임하는 계약을 통해 구현되는 실체이며, 위임은 언제든 회수 가능해야 한다. 둘째, 산업화 시대에 권리가 국가로 모인 것은 그 시대 개인의 필요에 따른 선택이었으나, 정체성의 발휘를 원하는 디지털 시대 개인의 필요에는 더 이상 맞지 않는다. 셋째, 디지털 시대의 전환은 기술의 문제가 아니라, 모인 권리를 가정·이웃·마을·도시·국가·세계의 여러 층위로 다시 분산하고 개인에게 위임의 선택권을 돌려주는 재편의 과제다.</w:t>
       </w:r>
     </w:p>
     <w:p>
@@ -1464,7 +1256,7 @@
           <w:color w:val="000000"/>
           <w:sz w:val="21"/>
         </w:rPr>
-        <w:t>루소가 꿈꾼 자치, 로크가 요구한 신탁의 회수 가능성, 오스트롬이 실증한 다층 자치 거버넌스, 브론펜브레너가 밝힌 근위 과정의 중요성, 폴라니가 진단한 재착근의 필요—이 모든 논의는 같은 방향을 가리킨다. 개인은 자신의 필요에 맞는 공동체를 스스로 구성하고, 그 공동체에 권리를 위임하며, 상황이 바뀌면 권리를 거두어들일 수 있어야 한다. 그 순환이 작동하는 사회가 디지털 시대 마스터플랜이 지향하는 공동체의 모습이다.</w:t>
+        <w:t>루소가 꿈꾼 자치, 로크가 요구한 신탁의 회수 가능성, 오스트롬이 실증한 다중심 자치 거버넌스, 브론펜브레너가 밝힌 근위 과정의 중요성, 폴라니가 진단한 재배태의 필요—이 모든 논의는 같은 방향을 가리킨다. 개인은 자신의 필요에 맞는 공동체를 스스로 구성하고, 그 공동체에 권리를 위임하며, 상황이 바뀌면 권리를 거두어들일 수 있어야 한다.</w:t>
       </w:r>
     </w:p>
     <w:p>

</xml_diff>

<commit_message>
docs: apply first-line indent to body paragraphs
</commit_message>
<xml_diff>
--- a/archive/docx/p2-lifecycle-community-report.docx
+++ b/archive/docx/p2-lifecycle-community-report.docx
@@ -130,6 +130,7 @@
     <w:p>
       <w:pPr>
         <w:spacing w:before="0" w:after="160" w:line="384" w:lineRule="auto"/>
+        <w:ind w:firstLine="227"/>
         <w:jc w:val="both"/>
       </w:pPr>
       <w:r>
@@ -191,6 +192,7 @@
     <w:p>
       <w:pPr>
         <w:spacing w:before="0" w:after="120" w:line="384" w:lineRule="auto"/>
+        <w:ind w:firstLine="227"/>
         <w:jc w:val="both"/>
       </w:pPr>
       <w:r>
@@ -207,6 +209,7 @@
     <w:p>
       <w:pPr>
         <w:spacing w:before="0" w:after="120" w:line="384" w:lineRule="auto"/>
+        <w:ind w:firstLine="227"/>
         <w:jc w:val="both"/>
       </w:pPr>
       <w:r>
@@ -223,6 +226,7 @@
     <w:p>
       <w:pPr>
         <w:spacing w:before="0" w:after="120" w:line="384" w:lineRule="auto"/>
+        <w:ind w:firstLine="227"/>
         <w:jc w:val="both"/>
       </w:pPr>
       <w:r>
@@ -274,6 +278,7 @@
     <w:p>
       <w:pPr>
         <w:spacing w:before="0" w:after="120" w:line="384" w:lineRule="auto"/>
+        <w:ind w:firstLine="227"/>
         <w:jc w:val="both"/>
       </w:pPr>
       <w:r>
@@ -290,6 +295,7 @@
     <w:p>
       <w:pPr>
         <w:spacing w:before="0" w:after="120" w:line="384" w:lineRule="auto"/>
+        <w:ind w:firstLine="227"/>
         <w:jc w:val="both"/>
       </w:pPr>
       <w:r>
@@ -322,6 +328,7 @@
     <w:p>
       <w:pPr>
         <w:spacing w:before="0" w:after="120" w:line="384" w:lineRule="auto"/>
+        <w:ind w:firstLine="227"/>
         <w:jc w:val="both"/>
       </w:pPr>
       <w:r>
@@ -338,6 +345,7 @@
     <w:p>
       <w:pPr>
         <w:spacing w:before="0" w:after="120" w:line="384" w:lineRule="auto"/>
+        <w:ind w:firstLine="227"/>
         <w:jc w:val="both"/>
       </w:pPr>
       <w:r>
@@ -354,6 +362,7 @@
     <w:p>
       <w:pPr>
         <w:spacing w:before="0" w:after="120" w:line="384" w:lineRule="auto"/>
+        <w:ind w:firstLine="227"/>
         <w:jc w:val="both"/>
       </w:pPr>
       <w:r>
@@ -386,6 +395,7 @@
     <w:p>
       <w:pPr>
         <w:spacing w:before="0" w:after="120" w:line="384" w:lineRule="auto"/>
+        <w:ind w:firstLine="227"/>
         <w:jc w:val="both"/>
       </w:pPr>
       <w:r>
@@ -402,6 +412,7 @@
     <w:p>
       <w:pPr>
         <w:spacing w:before="0" w:after="120" w:line="384" w:lineRule="auto"/>
+        <w:ind w:firstLine="227"/>
         <w:jc w:val="both"/>
       </w:pPr>
       <w:r>
@@ -453,6 +464,7 @@
     <w:p>
       <w:pPr>
         <w:spacing w:before="0" w:after="120" w:line="384" w:lineRule="auto"/>
+        <w:ind w:firstLine="227"/>
         <w:jc w:val="both"/>
       </w:pPr>
       <w:r>
@@ -485,6 +497,7 @@
     <w:p>
       <w:pPr>
         <w:spacing w:before="0" w:after="120" w:line="384" w:lineRule="auto"/>
+        <w:ind w:firstLine="227"/>
         <w:jc w:val="both"/>
       </w:pPr>
       <w:r>
@@ -501,6 +514,7 @@
     <w:p>
       <w:pPr>
         <w:spacing w:before="0" w:after="120" w:line="384" w:lineRule="auto"/>
+        <w:ind w:firstLine="227"/>
         <w:jc w:val="both"/>
       </w:pPr>
       <w:r>
@@ -533,6 +547,7 @@
     <w:p>
       <w:pPr>
         <w:spacing w:before="0" w:after="120" w:line="384" w:lineRule="auto"/>
+        <w:ind w:firstLine="227"/>
         <w:jc w:val="both"/>
       </w:pPr>
       <w:r>
@@ -549,6 +564,7 @@
     <w:p>
       <w:pPr>
         <w:spacing w:before="0" w:after="120" w:line="384" w:lineRule="auto"/>
+        <w:ind w:firstLine="227"/>
         <w:jc w:val="both"/>
       </w:pPr>
       <w:r>
@@ -600,6 +616,7 @@
     <w:p>
       <w:pPr>
         <w:spacing w:before="0" w:after="120" w:line="384" w:lineRule="auto"/>
+        <w:ind w:firstLine="227"/>
         <w:jc w:val="both"/>
       </w:pPr>
       <w:r>
@@ -632,6 +649,7 @@
     <w:p>
       <w:pPr>
         <w:spacing w:before="0" w:after="120" w:line="384" w:lineRule="auto"/>
+        <w:ind w:firstLine="227"/>
         <w:jc w:val="both"/>
       </w:pPr>
       <w:r>
@@ -664,6 +682,7 @@
     <w:p>
       <w:pPr>
         <w:spacing w:before="0" w:after="120" w:line="384" w:lineRule="auto"/>
+        <w:ind w:firstLine="227"/>
         <w:jc w:val="both"/>
       </w:pPr>
       <w:r>
@@ -680,6 +699,7 @@
     <w:p>
       <w:pPr>
         <w:spacing w:before="0" w:after="120" w:line="384" w:lineRule="auto"/>
+        <w:ind w:firstLine="227"/>
         <w:jc w:val="both"/>
       </w:pPr>
       <w:r>
@@ -712,6 +732,7 @@
     <w:p>
       <w:pPr>
         <w:spacing w:before="0" w:after="120" w:line="384" w:lineRule="auto"/>
+        <w:ind w:firstLine="227"/>
         <w:jc w:val="both"/>
       </w:pPr>
       <w:r>
@@ -728,6 +749,7 @@
     <w:p>
       <w:pPr>
         <w:spacing w:before="0" w:after="120" w:line="384" w:lineRule="auto"/>
+        <w:ind w:firstLine="227"/>
         <w:jc w:val="both"/>
       </w:pPr>
       <w:r>
@@ -760,6 +782,7 @@
     <w:p>
       <w:pPr>
         <w:spacing w:before="0" w:after="120" w:line="384" w:lineRule="auto"/>
+        <w:ind w:firstLine="227"/>
         <w:jc w:val="both"/>
       </w:pPr>
       <w:r>
@@ -776,6 +799,7 @@
     <w:p>
       <w:pPr>
         <w:spacing w:before="0" w:after="120" w:line="384" w:lineRule="auto"/>
+        <w:ind w:firstLine="227"/>
         <w:jc w:val="both"/>
       </w:pPr>
       <w:r>
@@ -808,6 +832,7 @@
     <w:p>
       <w:pPr>
         <w:spacing w:before="0" w:after="120" w:line="384" w:lineRule="auto"/>
+        <w:ind w:firstLine="227"/>
         <w:jc w:val="both"/>
       </w:pPr>
       <w:r>
@@ -824,6 +849,7 @@
     <w:p>
       <w:pPr>
         <w:spacing w:before="0" w:after="120" w:line="384" w:lineRule="auto"/>
+        <w:ind w:firstLine="227"/>
         <w:jc w:val="both"/>
       </w:pPr>
       <w:r>
@@ -875,6 +901,7 @@
     <w:p>
       <w:pPr>
         <w:spacing w:before="0" w:after="120" w:line="384" w:lineRule="auto"/>
+        <w:ind w:firstLine="227"/>
         <w:jc w:val="both"/>
       </w:pPr>
       <w:r>
@@ -907,6 +934,7 @@
     <w:p>
       <w:pPr>
         <w:spacing w:before="0" w:after="120" w:line="384" w:lineRule="auto"/>
+        <w:ind w:firstLine="227"/>
         <w:jc w:val="both"/>
       </w:pPr>
       <w:r>
@@ -939,6 +967,7 @@
     <w:p>
       <w:pPr>
         <w:spacing w:before="0" w:after="120" w:line="384" w:lineRule="auto"/>
+        <w:ind w:firstLine="227"/>
         <w:jc w:val="both"/>
       </w:pPr>
       <w:r>
@@ -971,6 +1000,7 @@
     <w:p>
       <w:pPr>
         <w:spacing w:before="0" w:after="120" w:line="384" w:lineRule="auto"/>
+        <w:ind w:firstLine="227"/>
         <w:jc w:val="both"/>
       </w:pPr>
       <w:r>
@@ -987,6 +1017,7 @@
     <w:p>
       <w:pPr>
         <w:spacing w:before="0" w:after="120" w:line="384" w:lineRule="auto"/>
+        <w:ind w:firstLine="227"/>
         <w:jc w:val="both"/>
       </w:pPr>
       <w:r>
@@ -1019,6 +1050,7 @@
     <w:p>
       <w:pPr>
         <w:spacing w:before="0" w:after="120" w:line="384" w:lineRule="auto"/>
+        <w:ind w:firstLine="227"/>
         <w:jc w:val="both"/>
       </w:pPr>
       <w:r>
@@ -1035,6 +1067,7 @@
     <w:p>
       <w:pPr>
         <w:spacing w:before="0" w:after="120" w:line="384" w:lineRule="auto"/>
+        <w:ind w:firstLine="227"/>
         <w:jc w:val="both"/>
       </w:pPr>
       <w:r>
@@ -1086,6 +1119,7 @@
     <w:p>
       <w:pPr>
         <w:spacing w:before="0" w:after="120" w:line="384" w:lineRule="auto"/>
+        <w:ind w:firstLine="227"/>
         <w:jc w:val="both"/>
       </w:pPr>
       <w:r>
@@ -1182,6 +1216,7 @@
     <w:p>
       <w:pPr>
         <w:spacing w:before="0" w:after="120" w:line="384" w:lineRule="auto"/>
+        <w:ind w:firstLine="227"/>
         <w:jc w:val="both"/>
       </w:pPr>
       <w:r>
@@ -1198,6 +1233,7 @@
     <w:p>
       <w:pPr>
         <w:spacing w:before="0" w:after="120" w:line="384" w:lineRule="auto"/>
+        <w:ind w:firstLine="227"/>
         <w:jc w:val="both"/>
       </w:pPr>
       <w:r>
@@ -1230,6 +1266,7 @@
     <w:p>
       <w:pPr>
         <w:spacing w:before="0" w:after="120" w:line="384" w:lineRule="auto"/>
+        <w:ind w:firstLine="227"/>
         <w:jc w:val="both"/>
       </w:pPr>
       <w:r>
@@ -1246,6 +1283,7 @@
     <w:p>
       <w:pPr>
         <w:spacing w:before="0" w:after="120" w:line="384" w:lineRule="auto"/>
+        <w:ind w:firstLine="227"/>
         <w:jc w:val="both"/>
       </w:pPr>
       <w:r>

</xml_diff>

<commit_message>
docs: naturalize abstract/intro wording, fix Young APA ref
</commit_message>
<xml_diff>
--- a/archive/docx/p2-lifecycle-community-report.docx
+++ b/archive/docx/p2-lifecycle-community-report.docx
@@ -141,7 +141,7 @@
           <w:color w:val="000000"/>
           <w:sz w:val="21"/>
         </w:rPr>
-        <w:t>공동체는 개인이 자신의 필요에 의해 권리의 일부를 위임하는 계약을 통해 구현되는 실체다. 개인이 먼저 있고, 생애의 단계마다 달라지는 필요가 공동체를 불러낸다. 위임의 집합이 공동체를 만들고, 더 이상 그 공동체를 필요로 하지 않을 때 개인은 위임한 권리를 거두어들일 수 있어야 한다. 이 연구는 그 '위임과 회수의 계약 논리'를 이론적 토대로 삼아, 농업·산업화·디지털 세 시대의 노동 원리, 생애주기별 필요, 그 필요에 응답하는 공동체의 형성과 역할을 정합적으로 연결한다. 산업화 시대에는 표준 교육과 안정된 일자리라는 그 시대 개인의 필요에 맞추어 권리가 국가로 모였다. 그 집중은 당대의 필요에는 부합했으나, 정체성의 발휘를 원하는 디지털 시대 개인의 필요에는 더 이상 맞지 않는다. 디지털 시대는 그 모인 권리를 가정·이웃·마을·도시·국가·세계 여러 층위로 다시 분산하는 전환으로 해석된다. 이 논의는 홉스·로크·루소의 사회계약론에 뿌리를 두며, 에릭슨의 생애 발달 연구, 브론펜브레너의 생태체계 연구, 오스트롬의 다중심 거버넌스, 센과 누스바움의 역량 이론으로 보완된다. 또한 폴라니의 탈배태·재배태 개념, 마이클 영의 능력주의 비판, 에스핑안데르센의 사회적 투자론, 헥만의 생애 초기 투자 연구가 각 생애단계 논의를 뒷받침한다.</w:t>
+        <w:t>공동체는 개인이 자신의 필요에 의해 권리의 일부를 위임하는 계약을 통해 구현되는 실체다. 개인이 먼저 있고, 생애의 단계마다 필요가 달라지면 그 필요를 감당하기 위해 공동체가 만들어진다. 위임이 모여 공동체가 서고, 더 이상 그 공동체가 필요하지 않을 때 개인은 위임한 권리를 거두어들일 수 있어야 한다. 이 연구는 그 '위임과 회수의 계약 논리'를 이론적 토대로 삼아, 농업·산업화·디지털 세 시대의 노동 원리, 생애주기별 필요, 그 필요에 응답하는 공동체의 형성과 역할을 정합적으로 연결한다. 산업화 시대에는 표준 교육과 안정된 일자리라는 그 시대 개인의 필요에 맞추어 권리가 국가로 모였다. 그 집중은 당대의 필요에는 부합했으나, 정체성의 발휘를 원하는 디지털 시대 개인의 필요에는 더 이상 맞지 않는다. 디지털 시대는 그 모인 권리를 가정·이웃·마을·도시·국가·세계 여러 층위로 다시 분산하는 전환으로 해석된다. 이 논의는 홉스·로크·루소의 사회계약론에 뿌리를 두며, 에릭슨의 생애 발달 연구, 브론펜브레너의 생태체계 연구, 오스트롬의 다중심 거버넌스, 센과 누스바움의 역량 이론으로 보완된다. 또한 폴라니의 탈배태·재배태 개념, 마이클 영의 능력주의 비판, 에스핑안데르센의 사회적 투자론, 헥만의 생애 초기 투자 연구가 각 생애단계 논의를 뒷받침한다.</w:t>
       </w:r>
     </w:p>
     <w:p>
@@ -203,7 +203,7 @@
           <w:color w:val="000000"/>
           <w:sz w:val="21"/>
         </w:rPr>
-        <w:t>이 연구는 공동체를 개인이 자신의 필요에 의해 권리의 일부를 위임하는 계약으로 구현된 실체로 본다. 개인이 먼저 있고, 살아가면서 마주치는 필요가 공동체를 불러낸다. 위임이 철회되면 공동체는 근거를 잃는다. 어떤 부모가 아이를 위해 마을 돌봄 협동조합에 시간과 결정권 일부를 맡기는 것이 곧 위임이며, 이사를 떠나거나 역할을 다하지 못한다고 판단하면 그 위임을 거두어들일 수 있어야 한다는 것이 이 연구의 출발점이다. 이 관점은 공동체를 개인보다 앞서 존재하는 유기체나 자연 질서가 아닌, 개인의 선택과 위임으로 구성·유지·해소되는 계약적 실체로 본다는 점에서 기존의 공동체론과 결을 달리한다.</w:t>
+        <w:t>이 연구는 공동체를 개인이 자신의 필요에 의해 권리의 일부를 위임하는 계약으로 구현된 실체로 본다. 개인이 먼저 있고, 살아가면서 마주치는 필요에 따라 공동체가 만들어진다. 위임이 철회되면 공동체는 근거를 잃는다. 어떤 부모가 아이를 위해 마을 돌봄 협동조합에 시간과 결정권 일부를 맡기는 것이 곧 위임이며, 이사를 떠나거나 역할을 다하지 못한다고 판단하면 그 위임을 거두어들일 수 있어야 한다는 것이 이 연구의 출발점이다. 이 관점은 공동체를 개인보다 앞서 존재하는 유기체나 자연 질서가 아닌, 개인의 선택과 위임으로 구성·유지·해소되는 계약적 실체로 본다는 점에서 기존의 공동체론과 결을 달리한다.</w:t>
       </w:r>
     </w:p>
     <w:p>
@@ -1807,7 +1807,7 @@
           <w:color w:val="000000"/>
           <w:sz w:val="19"/>
         </w:rPr>
-        <w:t>The rise of the meritocracy, 1870–2033</w:t>
+        <w:t>The rise of the meritocracy, 1870–2033: An essay on education and equality</w:t>
       </w:r>
       <w:r>
         <w:rPr>
@@ -1817,7 +1817,7 @@
           <w:color w:val="000000"/>
           <w:sz w:val="19"/>
         </w:rPr>
-        <w:t>. Thames and Hudson.</w:t>
+        <w:t>. Thames &amp; Hudson.</w:t>
       </w:r>
     </w:p>
     <w:sectPr>

</xml_diff>

<commit_message>
docs: social-science tone pass + KR standard term glosses (partial)
</commit_message>
<xml_diff>
--- a/archive/docx/p2-lifecycle-community-report.docx
+++ b/archive/docx/p2-lifecycle-community-report.docx
@@ -141,7 +141,7 @@
           <w:color w:val="000000"/>
           <w:sz w:val="21"/>
         </w:rPr>
-        <w:t>공동체는 개인이 자신의 필요에 의해 권리의 일부를 위임하는 계약을 통해 구현되는 실체다. 개인이 먼저 있고, 생애의 단계마다 필요가 달라지면 그 필요를 감당하기 위해 공동체가 만들어진다. 위임이 모여 공동체가 서고, 더 이상 그 공동체가 필요하지 않을 때 개인은 위임한 권리를 거두어들일 수 있어야 한다. 이 연구는 그 '위임과 회수의 계약 논리'를 이론적 토대로 삼아, 농업·산업화·디지털 세 시대의 노동 원리, 생애주기별 필요, 그 필요에 응답하는 공동체의 형성과 역할을 정합적으로 연결한다. 산업화 시대에는 표준 교육과 안정된 일자리라는 그 시대 개인의 필요에 맞추어 권리가 국가로 모였다. 그 집중은 당대의 필요에는 부합했으나, 정체성의 발휘를 원하는 디지털 시대 개인의 필요에는 더 이상 맞지 않는다. 디지털 시대는 그 모인 권리를 가정·이웃·마을·도시·국가·세계 여러 층위로 다시 분산하는 전환으로 해석된다. 이 논의는 홉스·로크·루소의 사회계약론에 뿌리를 두며, 에릭슨의 생애 발달 연구, 브론펜브레너의 생태체계 연구, 오스트롬의 다중심 거버넌스, 센과 누스바움의 역량 이론으로 보완된다. 또한 폴라니의 탈배태·재배태 개념, 마이클 영의 능력주의 비판, 에스핑안데르센의 사회적 투자론, 헥만의 생애 초기 투자 연구가 각 생애단계 논의를 뒷받침한다.</w:t>
+        <w:t>공동체는 개인이 필요에 따라 권리의 일부를 위임하는 계약으로 구현되는 실체다. 개인이 먼저 있고, 생애 단계마다 필요가 달라지면 그 필요를 감당하기 위해 공동체가 구성된다. 위임이 모여 공동체가 서며, 그 공동체가 더 이상 필요하지 않을 때 개인은 위임한 권리를 회수할 수 있어야 한다. 이 연구는 위임과 회수의 계약 논리를 토대로 농업·산업화·디지털 세 시대의 노동 원리, 생애주기별 필요, 그 필요에 응답하는 공동체의 형성과 역할을 정합적으로 연결한다. 산업화 시대에는 표준 교육과 안정된 고용이라는 당대의 필요에 맞추어 권리가 국가로 집중되었다. 이 집중은 당대의 필요에는 부합했으나 정체성 발휘를 요구하는 디지털 시대의 필요에는 맞지 않는다. 디지털 전환은 집중된 권리를 가정·이웃·마을·도시·국가·세계의 여러 층위로 다시 분산하는 과정으로 해석된다. 논의는 홉스·로크·루소의 사회계약론을 토대로 삼고, 에릭슨의 생애 발달 이론, 브론펜브레너의 생태체계 이론, 오스트롬의 다중심 거버넌스, 센·누스바움의 역량 접근, 폴라니의 탈배태·재배태 개념, 마이클 영의 능력주의 비판, 에스핑안데르센의 사회투자론, 헥만의 생애 초기 투자 연구로 보완된다.</w:t>
       </w:r>
     </w:p>
     <w:p>
@@ -157,7 +157,7 @@
           <w:color w:val="000000"/>
           <w:sz w:val="20"/>
         </w:rPr>
-        <w:t xml:space="preserve">키워드  </w:t>
+        <w:t xml:space="preserve">주제어  </w:t>
       </w:r>
       <w:r>
         <w:rPr>
@@ -186,7 +186,7 @@
           <w:color w:val="000000"/>
           <w:sz w:val="27"/>
         </w:rPr>
-        <w:t>1.  서론 — 공동체는 어떻게 생겨나는가</w:t>
+        <w:t>1.  서론</w:t>
       </w:r>
     </w:p>
     <w:p>
@@ -203,7 +203,7 @@
           <w:color w:val="000000"/>
           <w:sz w:val="21"/>
         </w:rPr>
-        <w:t>이 연구는 공동체를 개인이 자신의 필요에 의해 권리의 일부를 위임하는 계약으로 구현된 실체로 본다. 개인이 먼저 있고, 살아가면서 마주치는 필요에 따라 공동체가 만들어진다. 위임이 철회되면 공동체는 근거를 잃는다. 어떤 부모가 아이를 위해 마을 돌봄 협동조합에 시간과 결정권 일부를 맡기는 것이 곧 위임이며, 이사를 떠나거나 역할을 다하지 못한다고 판단하면 그 위임을 거두어들일 수 있어야 한다는 것이 이 연구의 출발점이다. 이 관점은 공동체를 개인보다 앞서 존재하는 유기체나 자연 질서가 아닌, 개인의 선택과 위임으로 구성·유지·해소되는 계약적 실체로 본다는 점에서 기존의 공동체론과 결을 달리한다.</w:t>
+        <w:t>이 연구는 공동체를 개인이 필요에 따라 권리의 일부를 위임하는 계약으로 구현된 실체로 규정한다. 개인이 먼저 있고, 생애에서 마주치는 필요에 따라 공동체가 구성된다. 위임이 철회되면 공동체는 근거를 잃는다. 부모가 자녀를 위해 마을 돌봄 조직에 시간과 결정권의 일부를 맡기는 것이 위임이며, 이주하거나 그 조직이 역할을 다하지 못한다고 판단하면 위임을 회수할 수 있어야 한다. 이 관점은 공동체를 개인에 앞서 존재하는 유기체가 아니라 개인의 선택과 위임으로 구성·유지·해소되는 계약적 실체로 본다는 점에서 기존 공동체론과 구별된다.</w:t>
       </w:r>
     </w:p>
     <w:p>
@@ -220,7 +220,7 @@
           <w:color w:val="000000"/>
           <w:sz w:val="21"/>
         </w:rPr>
-        <w:t>17세기 영국의 정치철학자 토머스 홉스(Thomas Hobbes, 1588–1679)는 『리바이어던』(1651)에서 '만인의 만인에 대한 투쟁' 상태를 벗어나기 위해 개인이 권리를 통치자에게 넘긴다는 계약을 상상했다. 그러나 홉스의 모델에서 위임은 사실상 회수 불가능하다. 한번 넘긴 권리는 절대 권력에 귀속된다. 이에 맞서 17세기 영국의 철학자 존 로크(John Locke, 1632–1704)는 『통치론』(1689)에서 통치자에게 권력을 맡기는 것은 '신탁(trust)'일 뿐이며, 그 믿음이 깨지면 권리를 도로 거두어들일 수 있다고 보았다. 로크의 신탁과 저항권은 이 연구가 말하는 '위임은 회수 가능해야 한다'는 주장의 직접적인 이론적 뿌리다. 18세기 프랑스의 정치철학자 장자크 루소(Jean-Jacques Rousseau, 1712–1778)는 『사회계약론』(1762)에서 '일반의지(volonté générale)'를 통해 권리가 한 사람이나 한 기관에 집중되어서는 안 된다고 주장했다. 루소는 자치와 분산의 원리를 옹호한 사상가였다. 세 논의를 한 줄로 읽으면 이렇다. 공동체는 개인이 권리를 위임함으로써 만들어지되(홉스), 그 위임은 언제든 회수할 수 있어야 하며(로크), 권리는 어느 한 곳에 집중되어서는 안 된다(루소). 이것이 이 연구의 이론적 뼈대다.</w:t>
+        <w:t>토머스 홉스(Thomas Hobbes, 1588-1679)는 『리바이어던』(1651)에서 만인의 만인에 대한 투쟁을 벗어나기 위해 개인이 권리를 통치자에게 양도하는 계약을 제시했으나, 그 모형에서 위임은 사실상 회수 불가능하다. 존 로크(John Locke, 1632-1704)는 『통치론』(1689)에서 통치자에게 권력을 맡기는 것은 신탁(trust)이며 그 신탁이 깨지면 권리를 회수할 수 있다고 보았다. 로크의 신탁과 저항권은 이 연구가 전제하는 위임 회수 가능성의 직접적 근거다. 장자크 루소(Jean-Jacques Rousseau, 1712-1778)는 『사회계약론』(1762)에서 일반의지(general will)를 통해 권리가 한 개인이나 한 기관에 집중되어서는 안 된다고 주장하며 자치와 분산의 원리를 옹호했다. 세 논의를 종합하면, 공동체는 개인의 권리 위임으로 성립하고(홉스), 그 위임은 회수 가능해야 하며(로크), 권리는 한 곳에 집중되어서는 안 된다(루소).</w:t>
       </w:r>
     </w:p>
     <w:p>
@@ -237,7 +237,7 @@
           <w:color w:val="000000"/>
           <w:sz w:val="21"/>
         </w:rPr>
-        <w:t>이 뼈대 위에 세 가지 물음을 던진다. 시대마다 달랐던 노동의 원리는 어떻게 개인의 필요와 공동체의 형태를 규정했는가. 생애주기의 단계마다 달라지는 필요에 어떤 공동체가 응답해 왔는가. 디지털 시대의 전환은 왜 권리의 재분산이라는 관점에서 읽혀야 하는가. 이 세 물음에 대한 답이 서로 정합적으로 이어질 때, 우리는 생애주기와 공동체에 관한 하나의 완결된 논리를 갖게 된다.</w:t>
+        <w:t>이 토대 위에서 세 가지 물음을 검토한다. 시대별 노동 원리는 개인의 필요와 공동체의 형태를 어떻게 규정했는가. 생애주기 단계별로 달라지는 필요에 어떤 공동체가 응답했는가. 디지털 전환은 왜 권리 재분산의 관점에서 분석되어야 하는가.</w:t>
       </w:r>
     </w:p>
     <w:p>
@@ -256,7 +256,7 @@
           <w:color w:val="000000"/>
           <w:sz w:val="27"/>
         </w:rPr>
-        <w:t>2.  이론적 토대 — 권리 위임의 계약으로 본 공동체</w:t>
+        <w:t>2.  이론적 토대: 권리 위임의 계약으로 본 공동체</w:t>
       </w:r>
     </w:p>
     <w:p>
@@ -272,7 +272,7 @@
           <w:color w:val="000000"/>
           <w:sz w:val="23"/>
         </w:rPr>
-        <w:t>2.1  공동체 = 권리 위임의 계약적 실체</w:t>
+        <w:t>2.1  공동체는 권리 위임의 계약적 실체다</w:t>
       </w:r>
     </w:p>
     <w:p>
@@ -289,7 +289,7 @@
           <w:color w:val="000000"/>
           <w:sz w:val="21"/>
         </w:rPr>
-        <w:t>공동체를 권리 위임의 계약으로 보면 일상의 행위들이 모두 위임으로 읽힌다. 개인이 가정에 시간과 돌봄을 바치는 것, 마을 자치 조직에 결정권을 맡기는 것, 국가에 세금을 내고 법을 따르는 것이 모두 권리 위임이다. 공동체의 크기와 권한은 그 공동체에 얼마나 많은 권리가 위임되어 있느냐에 달려 있다. 개인은 혼자서 감당할 수 없는 필요가 생길 때 그 필요를 충족할 공동체에 권리를 위임한다. 필요가 변하면 위임의 대상과 규모도 바뀐다. 청년기에는 경력을 쌓기 위해 도시와 직장에 많은 권리를 위임하지만, 중장년기에는 가정과 이웃으로 위임의 무게중심이 옮겨가고, 노년기에는 돌봄과 존엄을 위한 공동체에 의존이 깊어진다. 이처럼 위임은 생애 전체에 걸쳐 끊임없이 재구성되는 동적 관계다.</w:t>
+        <w:t>공동체를 권리 위임의 계약으로 보면 일상의 행위가 위임으로 해석된다. 가정에 시간과 돌봄을 제공하는 것, 마을 자치 조직에 결정권을 맡기는 것, 국가에 세금을 내고 법을 따르는 것이 모두 권리 위임이다. 공동체의 규모와 권한은 위임된 권리의 양에 따라 결정된다. 개인은 혼자 감당할 수 없는 필요가 생기면 그 필요를 충족할 공동체에 권리를 위임하고, 필요가 변하면 위임의 대상과 규모도 달라진다. 청년기에는 도시와 직장에 많은 권리를 위임하고, 중장년기에는 가정과 이웃으로 위임의 무게중심이 이동하며, 노년기에는 돌봄과 존엄을 위한 공동체에 대한 의존이 커진다.</w:t>
       </w:r>
     </w:p>
     <w:p>
@@ -306,7 +306,7 @@
           <w:color w:val="000000"/>
           <w:sz w:val="21"/>
         </w:rPr>
-        <w:t>노벨 경제학상을 받은 인도 출신 경제학자 아마르티아 센(Amartya Sen, 1933– )은 발전을 자유의 확장으로 정의했다(『자유로서의 발전』, 1999). 단순한 소득 증가가 아니라 개인이 실제로 할 수 있는 일과 될 수 있는 존재의 폭이 넓어지는 것이 진정한 발전이다. 미국의 철학자 마사 누스바움(Martha Nussbaum, 1947– )은 이를 '역량(capabilities)'—실제로 실행할 수 있는 능력—으로 구체화했다(『역량의 창조』, 2011). 공동체가 개인에게 역량을 제공하는 한에서만 위임은 정당성을 갖는다.</w:t>
+        <w:t>아마르티아 센(Amartya Sen, 1933- )은 발전을 자유의 확장으로 정의했다(『자유로서의 발전』, 1999). 소득 증가가 아니라 개인이 실제로 할 수 있고 될 수 있는 것의 폭이 넓어지는 것이 발전이다. 마사 누스바움(Martha Nussbaum, 1947- )은 이를 역량 접근(capability approach), 곧 실제로 실행할 수 있는 능력으로 정식화했다(『역량의 창조』, 2011). 공동체가 개인에게 역량을 제공하는 한에서 위임은 정당성을 갖는다.</w:t>
       </w:r>
     </w:p>
     <w:p>
@@ -322,7 +322,7 @@
           <w:color w:val="000000"/>
           <w:sz w:val="23"/>
         </w:rPr>
-        <w:t>2.2  위임은 회수 가능해야 한다 — 산업화 시대 권리 집중의 문제</w:t>
+        <w:t>2.2  위임은 회수 가능해야 한다</w:t>
       </w:r>
     </w:p>
     <w:p>
@@ -339,7 +339,7 @@
           <w:color w:val="000000"/>
           <w:sz w:val="21"/>
         </w:rPr>
-        <w:t>로크의 신탁 이론이 가리키는 것은 위임이 조건부라는 점이다. 국가가 그 권리를 올바르게 사용하리라는 믿음이 깨지면 권리는 다시 개인에게로 돌아와야 한다. 그러나 산업화 시대에는 이 회수의 회로가 막혔다. 국가는 교육·고용·복지·의료를 중앙에서 관리하기 시작했고, 개인은 태어나면 국가 교육에 들어가고 졸업하면 국가가 인증한 기업에 취직하며 노년에는 국가 연금으로 생존하는 단선적 경로에 묶였다. 이 경로 바깥에 서는 것은 곧 사회적 낙오를 의미했다. 장애인이나 소수 언어 화자처럼 표준 경로가 맞지 않는 사람은 제도 안에서 보이지 않는 사람이 되고 만다.</w:t>
+        <w:t>로크의 신탁 이론은 위임이 조건부임을 함의한다. 국가가 권리를 올바르게 사용하리라는 신탁이 깨지면 권리는 개인에게 회복되어야 한다. 그러나 산업화 시대에는 회수 경로가 제한되었다. 국가가 교육·고용·복지·의료를 중앙에서 관리했고, 개인은 국가 교육을 거쳐 인증된 기업에 취업하고 노년에 국가 연금에 의존하는 단선 경로에 편입되었다. 이 경로 바깥에 서는 것은 사회적 배제를 의미했다. 장애인이나 소수 언어 사용자처럼 표준 경로가 맞지 않는 사람은 제도 안에서 드러나지 않았다.</w:t>
       </w:r>
     </w:p>
     <w:p>
@@ -356,7 +356,7 @@
           <w:color w:val="000000"/>
           <w:sz w:val="21"/>
         </w:rPr>
-        <w:t>이 과정에서 이웃과 마을은 공동 돌봄의 기능을 잃고 해체되었으며, 가정은 점점 좁은 역할만 남게 되었다. 반면 국가는 거의 모든 기능을 빨아들이며 비대해졌다. 권리가 집중된 공동체는 다양한 개인의 필요에 맞춤 대응할 수 없다. 표준화는 평균 바깥의 개인을 배제하고, 획일화는 다양성을 억압한다.</w:t>
+        <w:t>이 과정에서 이웃과 마을은 공동 돌봄 기능을 상실했고 가정의 역할은 축소되었으며 국가의 기능은 확대되었다. 권리가 집중된 공동체는 다양한 개인의 필요에 개별적으로 대응하기 어렵다. 표준화는 평균 바깥의 개인을 배제하고 다양성을 제약한다.</w:t>
       </w:r>
     </w:p>
     <w:p>
@@ -373,7 +373,7 @@
           <w:color w:val="000000"/>
           <w:sz w:val="21"/>
         </w:rPr>
-        <w:t>헝가리 출신 경제사학자 칼 폴라니(Karl Polanyi, 1886–1964)는 『거대한 전환』(1944)에서 산업화 시대의 시장 경제가 노동·토지·화폐를 사회적 관계에서 뜯어내어 상품으로 만들었다고 분석했다. 폴라니는 이를 '탈배태(disembedding)'—사람들이 원래 속해 있던 관계의 그물에서 떨어져 나오는 것—으로 불렀다. 산업화 시대는 이웃·마을·가정에 분산되어 있던 권리 위임을 국가 하나로 집중시킨 시대였다. 디지털 시대의 과제는 그 집중을 여러 층위로 되돌리는 것, 곧 폴라니가 말한 '재배태(re-embedding)'이다.</w:t>
+        <w:t>칼 폴라니(Karl Polanyi, 1886-1964)는 『거대한 전환』(1944)에서 산업화 시대 시장 경제가 노동·토지·화폐를 사회적 관계에서 분리하여 상품으로 만들었다고 분석하고, 이를 탈배태(disembedding)로 명명했다. 산업화 시대는 이웃·마을·가정에 분산되어 있던 권리 위임을 국가로 집중한 시대였다. 디지털 시대의 과제는 그 집중을 여러 층위로 되돌리는 재배태(re-embedding)다.</w:t>
       </w:r>
     </w:p>
     <w:p>
@@ -389,7 +389,7 @@
           <w:color w:val="000000"/>
           <w:sz w:val="23"/>
         </w:rPr>
-        <w:t>2.3  다층 자치와 생태체계 — 권리 분산의 근거</w:t>
+        <w:t>2.3  다층 자치와 생태체계</w:t>
       </w:r>
     </w:p>
     <w:p>
@@ -406,7 +406,7 @@
           <w:color w:val="000000"/>
           <w:sz w:val="21"/>
         </w:rPr>
-        <w:t>여성 최초로 노벨 경제학상을 받은 미국의 정치경제학자 엘리너 오스트롬(Elinor Ostrom, 1933–2012)은 전 세계 사례를 조사하며 사람들이 중앙 정부나 사유화된 시장 없이도 스스로 자치 규칙을 만들어 공유 자원을 지속 가능하게 관리할 수 있다는 것을 실증했다(『공유의 비극을 넘어』, 1990). 그녀는 이를 '다중심 거버넌스(polycentric governance)'—여러 층위의 공동체가 각자의 영역에서 자치적으로 문제를 나누어 맡는 구조—라고 불렀다. 권리는 가정·이웃·마을·도시·국가·세계가 층위에 따라 나누어 맡아야 하며, 어느 하나가 모든 권리를 독점하면 나머지 층위는 고사하고 개인은 선택지를 잃는다.</w:t>
+        <w:t>엘리너 오스트롬(Elinor Ostrom, 1933-2012)은 사람들이 중앙 정부나 사유화 없이도 자치 규칙을 만들어 공유 자원을 지속 가능하게 관리할 수 있음을 실증했다(『공유의 비극을 넘어』, 1990). 그는 이를 다중심 거버넌스(polycentric governance), 곧 여러 층위의 공동체가 각자의 영역에서 문제를 분담하는 구조로 설명했다. 권리는 가정·이웃·마을·도시·국가·세계가 층위에 따라 분담해야 하며, 한 층위가 권리를 독점하면 나머지 층위는 약화되고 개인의 선택지는 줄어든다.</w:t>
       </w:r>
     </w:p>
     <w:p>
@@ -423,7 +423,7 @@
           <w:color w:val="000000"/>
           <w:sz w:val="21"/>
         </w:rPr>
-        <w:t>미국의 발달심리학자 유리 브론펜브레너(Urie Bronfenbrenner, 1917–2005)는 개인의 발달을 여러 겹으로 중첩된 생태체계 안에서 이해했다(『인간 발달의 생태학』, 1979). 가정(미시체계), 이웃과 학교(중간체계), 부모의 직장(외체계), 사회의 가치 규범(거시체계)이 중첩되어 상호작용하는 구조다. 그의 핵심 통찰은 개인에게 가장 깊은 영향을 미치는 것이 가까운 공동체와의 직접적 상호작용—'근위 과정(proximal process)'—이라는 점이다. 산업화 시대는 이 근위 과정이 일어나야 할 가정·이웃·마을을 약화시키고 거시체계인 국가에 권리를 집중함으로써 개인의 발달을 가장 중요한 토대에서 분리시켰다.</w:t>
+        <w:t>유리 브론펜브레너(Urie Bronfenbrenner, 1917-2005)는 개인의 발달을 중첩된 생태체계 안에서 분석했다(『인간 발달의 생태학』, 1979). 가정(미시체계), 이웃과 학교(중간체계), 부모의 직장(외체계), 사회의 가치 규범(거시체계)이 상호작용한다. 그의 핵심 명제는 개인에게 가장 큰 영향을 미치는 것이 가까운 공동체와의 직접적 상호작용, 곧 근접 과정(proximal process)이라는 것이다. 산업화 시대는 근접 과정이 일어나는 가정·이웃·마을을 약화시키고 권리를 거시체계인 국가로 집중함으로써 개인 발달의 토대를 약화시켰다.</w:t>
       </w:r>
     </w:p>
     <w:p>
@@ -442,7 +442,7 @@
           <w:color w:val="000000"/>
           <w:sz w:val="27"/>
         </w:rPr>
-        <w:t>3.  세 시대의 노동 원리 — 협동, 분업, 정체성 발휘</w:t>
+        <w:t>3.  세 시대의 노동 원리: 협동, 분업, 정체성 발휘</w:t>
       </w:r>
     </w:p>
     <w:p>
@@ -458,7 +458,7 @@
           <w:color w:val="000000"/>
           <w:sz w:val="23"/>
         </w:rPr>
-        <w:t>3.1  농업 시대의 노동 원리: 협동</w:t>
+        <w:t>3.1  농업 시대: 협동</w:t>
       </w:r>
     </w:p>
     <w:p>
@@ -475,7 +475,7 @@
           <w:color w:val="000000"/>
           <w:sz w:val="21"/>
         </w:rPr>
-        <w:t>농업 시대의 노동 원리는 협동이었다. 혼자서는 감당할 수 없는 땅 갈기·씨 뿌리기·수확·방어를 함께 해야 생존할 수 있었다. 가정에는 양육과 출산의 역할이, 이웃에는 품앗이와 두레의 노동이, 마을에는 공동 경작지 관리와 자치 의사결정이 위임되었다. 국가는 신분 질서와 조세를 관장하는 먼 존재로 개인의 일상에 깊이 개입하지 않았다. 한국의 품앗이—이웃집 모내기를 함께 해주고 추수 때 다시 도움을 받는 방식—는 비공식적이지만 정교한 권리 위임과 회수의 순환을 보여주는 사례다. 생애주기도 협동의 논리를 따랐다. 아이는 공동체 노동에 참여하기 위한 준비를 했고, 청년기는 혼인과 토지 상속으로 새 가정을 구성하는 시기였으며, 중장년은 마을 자치의 중심이었고, 노년은 권위와 봉양의 대상으로 공동체에 머물렀다.</w:t>
+        <w:t>농업 시대의 노동 원리는 협동이었다. 경작·수확·방어는 공동 노동을 요구했다. 가정은 양육과 출산을, 이웃은 품앗이와 두레를, 마을은 공동 경작지 관리와 자치 의사결정을 분담했다. 국가는 신분 질서와 조세를 관장하는 원거리 존재였다. 한국의 품앗이는 비공식적이지만 정교한 권리 위임과 회수의 사례다. 생애주기도 협동의 논리를 따라, 아동기는 공동 노동의 준비기, 청년기는 혼인과 토지 상속으로 새 가정을 구성하는 시기, 중장년은 마을 자치의 중심, 노년은 봉양의 대상이었다.</w:t>
       </w:r>
     </w:p>
     <w:p>
@@ -491,7 +491,7 @@
           <w:color w:val="000000"/>
           <w:sz w:val="23"/>
         </w:rPr>
-        <w:t>3.2  산업화 시대의 노동 원리: 분업</w:t>
+        <w:t>3.2  산업화 시대: 분업</w:t>
       </w:r>
     </w:p>
     <w:p>
@@ -508,7 +508,7 @@
           <w:color w:val="000000"/>
           <w:sz w:val="21"/>
         </w:rPr>
-        <w:t>산업화 시대의 노동 원리는 분업이었다. 복잡한 생산 과정을 잘게 쪼개어 각자에게 반복 담당하게 하는 방식으로 공장과 관료제 조직은 생산성을 획기적으로 높였다. 한 사람이 전체를 이해할 필요 없이 정해진 직무를 정확히 수행하는 표준화된 노동력이 필요했다. '좋은 일자리'를 위한 표준화된 교육, 입시 경쟁, 정규직 고용과 연금으로 이어지는 단선 경로가 삶의 목표가 되었다.</w:t>
+        <w:t>산업화 시대의 노동 원리는 분업이었다. 생산 과정을 분할하여 각자에게 반복 직무를 배정함으로써 공장과 관료제는 생산성을 높였다. 전체를 이해할 필요 없이 정해진 직무를 정확히 수행하는 표준화된 노동력이 요구되었고, 표준 교육과 입시 경쟁, 정규직 고용과 연금으로 이어지는 단선 경로가 삶의 목표가 되었다.</w:t>
       </w:r>
     </w:p>
     <w:p>
@@ -525,7 +525,7 @@
           <w:color w:val="000000"/>
           <w:sz w:val="21"/>
         </w:rPr>
-        <w:t>분업의 논리는 공동체에도 적용되었다. 국가는 교육·고용·복지·의료를 일괄 관리하는 거대한 분업 기구가 되었고, 이웃과 마을은 기능을 잃었다. 개인은 여러 공동체에 권리를 분산해 위임하던 상태에서 국가와 도시 두 층위에만 의존하는 상태로 바뀌었다. 영국의 사회학자 마이클 영(Michael Young, 1915–2002)은 『능력주의의 부상』(1958)에서 이런 시스템이 탈락자에게 '네가 못난 것'이라는 낙인을 찍으며 구조적 배제를 개인의 실패로 위장한다고 경고했다.</w:t>
+        <w:t>분업의 논리는 공동체에도 적용되었다. 국가는 교육·고용·복지·의료를 일괄 관리하는 분업 기구가 되었고 이웃과 마을은 기능을 상실했다. 개인은 권리를 여러 공동체에 분산하던 상태에서 국가와 도시 두 층위에만 의존하는 상태로 전환되었다. 마이클 영(Michael Young, 1915-2002)은 『능력주의의 부상』(1958)에서 이러한 체계가 탈락자에게 책임을 전가하여 구조적 배제를 개인의 실패로 치환한다고 경고했다.</w:t>
       </w:r>
     </w:p>
     <w:p>
@@ -541,7 +541,7 @@
           <w:color w:val="000000"/>
           <w:sz w:val="23"/>
         </w:rPr>
-        <w:t>3.3  디지털 시대의 노동 원리: 정체성 발휘</w:t>
+        <w:t>3.3  디지털 시대: 정체성 발휘</w:t>
       </w:r>
     </w:p>
     <w:p>
@@ -558,7 +558,7 @@
           <w:color w:val="000000"/>
           <w:sz w:val="21"/>
         </w:rPr>
-        <w:t>디지털 시대의 노동 원리는 정체성 발휘다. 인공지능과 자동화가 반복 직무를 대체하면서 표준화된 분업 노동의 경제적 가치는 낮아지고, 각 개인만이 가진 고유한 역량의 가치는 높아진다. 예를 들어 세금 계산서 처리는 자동화로 대체되지만, 복잡한 세무 분쟁을 풀어내는 맥락 이해력은 오히려 더 귀해진다. 플랫폼과 디지털 도구가 기획·제작·유통의 비용을 낮추면서 개인은 큰 조직에 들어가야만 생산자가 되는 제약에서 풀려나고 있다. 일한다는 것은 조직이 부여한 직무를 수행하는 것이 아니라 자신의 고유한 정체성을 실제 기여로 발휘하는 것이다.</w:t>
+        <w:t>디지털 시대의 노동 원리는 정체성 발휘다. 인공지능과 자동화가 반복 직무를 대체하면서 표준화된 분업 노동의 경제적 가치는 낮아지고 개인 고유의 역량이 갖는 가치는 높아진다. 세금 계산서 처리는 자동화되지만 복잡한 세무 분쟁을 해석하는 맥락 이해력은 더 희소해진다. 플랫폼과 디지털 도구가 기획·제작·유통 비용을 낮추면서 개인은 대규모 조직에 속해야만 생산자가 되는 제약에서 벗어난다. 노동은 조직이 부여한 직무의 수행이 아니라 개인의 고유한 정체성을 실제 성과로 발휘하는 것으로 재정의된다.</w:t>
       </w:r>
     </w:p>
     <w:p>
@@ -575,7 +575,7 @@
           <w:color w:val="000000"/>
           <w:sz w:val="21"/>
         </w:rPr>
-        <w:t>이 전환은 권리 위임의 방식도 바꾼다. 국가 하나에 집중되었던 권리가 다시 여러 공동체로 분산될 조건이 만들어진다. 가정은 정체성의 단서를 가장 먼저 읽는 공간으로 중요성이 되살아나고, 이웃과 마을은 정체성을 실험하고 훈련하는 관계망으로 복원된다. 도시는 그 정체성을 실제 기여로 발휘하는 무대가 되며, 국가는 모든 것을 관리하는 기관에서 여러 공동체가 잘 작동하도록 최소 조건을 보장하는 조율자로 역할이 바뀐다. 세계는 처음으로 개인의 발휘 무대로 직접 열린다. 국경을 넘는 협업이 가능해지면서, 국내 노동시장에서 자리를 얻지 못한 사람도 세계 무대에서 기여할 경로가 생긴다.</w:t>
+        <w:t>이 전환은 권리 위임 방식도 바꾼다. 국가에 집중되었던 권리가 여러 공동체로 다시 분산될 조건이 형성된다. 가정은 정체성의 단서를 가장 먼저 읽는 공간으로서 중요성을 회복하고, 이웃과 마을은 정체성을 실험하고 훈련하는 관계망이 된다. 도시는 정체성을 실제 성과로 발휘하는 장이 되며, 국가는 모든 것을 관리하는 기관에서 여러 공동체가 작동하도록 최소 조건을 보장하는 조율자로 전환된다. 세계는 처음으로 개인의 발휘 영역으로 열린다. 국경을 넘는 협업이 가능해지면서 국내 노동시장에서 자리를 얻지 못한 사람도 세계 무대에서 성과를 낼 경로를 갖는다.</w:t>
       </w:r>
     </w:p>
     <w:p>
@@ -594,7 +594,7 @@
           <w:color w:val="000000"/>
           <w:sz w:val="27"/>
         </w:rPr>
-        <w:t>4.  생애주기별 필요 — 어떤 공동체에 무엇을 위임하는가</w:t>
+        <w:t>4.  생애주기별 필요: 어떤 공동체에 무엇을 위임하는가</w:t>
       </w:r>
     </w:p>
     <w:p>
@@ -610,7 +610,7 @@
           <w:color w:val="000000"/>
           <w:sz w:val="23"/>
         </w:rPr>
-        <w:t>4.1  태아·영아 — 단서가 드러나는 시기</w:t>
+        <w:t>4.1  태아·영아기</w:t>
       </w:r>
     </w:p>
     <w:p>
@@ -627,7 +627,7 @@
           <w:color w:val="000000"/>
           <w:sz w:val="21"/>
         </w:rPr>
-        <w:t>태아·영아기는 고유한 가능성의 단서가 처음 드러나는 시기다. 농업 시대의 필요는 무사한 출산과 건강한 몸이었고, 가정·이웃·마을이 공동으로 출산을 돕고 아이를 거두었다. 산업화 시대에는 표준 발달표에 맞는 보살핌이 필요로 규정되었고, 국가가 임신·출산·영유아 건강 관리를 담당하며 가정을 보완했다. 디지털 시대에는 타고난 기질과 강점의 단서를 일찍 발견하고 기록하는 것이 새로운 필요로 등장한다. 생체·행동 데이터를 읽는 기술이 등장하면서, 아이가 어떤 방식으로 환경에 반응하는지를 예전보다 훨씬 일찍 포착할 수 있게 되었다. 가정의 역할은 단순 양육에서 정체성의 단서를 가장 먼저 읽고 기록하는 생활 기반으로 깊어진다. 미국의 경제학자 제임스 헥만(James Heckman, 1944– )은 장기 추적 연구에서 생애 초기 양육·교육 환경에 대한 투자가 이후 어느 시기보다 높은 복리 효과를 낳는다는 것을 실증했다. 돌봄의 질을 높이는 데 1달러를 쓰면 성인이 된 후 범죄 예방·소득 향상·복지 지출 감소로 수배의 사회적 수익이 돌아온다. 그래서 데이터가 닿지 않는 아이를 먼저 찾아가 발달을 지원하는 일은, 아이의 삶에 가장 가까운 도시와 마을이 맡는 것이 효과적이다. 국가는 직접 제공자가 아니라, 어느 도시에 태어나도 기초 돌봄에서 밀려나지 않도록 도시 간 격차를 메우는 최소 보장선을 까는 데 그친다.</w:t>
+        <w:t>태아·영아기는 고유한 가능성의 단서가 처음 드러나는 시기다. 농업 시대의 필요는 건강한 출산이었고 가정·이웃·마을이 공동으로 출산을 도왔다. 산업화 시대에는 표준 발달 기준에 맞는 양육이 필요로 규정되었고 국가가 임신·출산·영유아 건강 관리를 담당했다. 디지털 시대에는 타고난 기질과 강점의 단서를 일찍 발견하고 기록하는 것이 새로운 필요로 등장한다. 생체·행동 데이터를 분석하는 기술이 아이의 반응 양식을 이전보다 일찍 포착할 수 있게 하면서, 가정의 역할은 양육에서 정체성의 단서를 가장 먼저 읽고 기록하는 생활 기반으로 확대된다. 제임스 헥만(James Heckman, 1944- )은 생애 초기 양육·교육 환경에 대한 투자가 이후 어느 시기보다 높은 복리 효과를 낳으며, 성인기의 범죄 예방·소득 향상·복지 지출 감소로 수 배의 사회적 수익을 낳음을 실증했다. 데이터가 닿지 않는 아이를 먼저 찾아 지원하는 일은 삶에 가장 가까운 도시와 마을이 맡는 것이 효과적이며, 국가는 직접 제공자가 아니라 어느 도시에서 태어나도 기초 돌봄에서 밀려나지 않도록 도시 간 격차를 메우는 최소 보장선을 담당한다.</w:t>
       </w:r>
     </w:p>
     <w:p>
@@ -643,7 +643,7 @@
           <w:color w:val="000000"/>
           <w:sz w:val="23"/>
         </w:rPr>
-        <w:t>4.2  유아·아동 — 발견하고 실험하는 시기</w:t>
+        <w:t>4.2  유아·아동기</w:t>
       </w:r>
     </w:p>
     <w:p>
@@ -660,7 +660,7 @@
           <w:color w:val="000000"/>
           <w:sz w:val="21"/>
         </w:rPr>
-        <w:t>유아·아동기는 여러 강점의 단서를 체험으로 확인하는 시기다. 농업 시대에는 집안일과 농사일을 익히는 것이, 산업화 시대에는 취학 준비와 기초 학력 습득이 과제였다. 두 시대 모두 아이의 필요는 외부 사회가 정의했다. 디지털 시대에는 다양한 체험으로 관심과 강점을 발견하고 실험하는 것이 이 단계의 과제가 된다. 한 아이는 블록 쌓기에서 공간 감각의 단서를 보이고, 다른 아이는 친구의 감정을 빠르게 읽는 공감 능력을 드러낸다. 이를 위해 가정은 관심을 지지하고, 이웃은 다양한 체험 기회를 열며, 마을은 공동 발견 프로그램을 제공한다. 가정 하나 혹은 국가 하나가 교육을 독점하는 구조에서 벗어나 가정·이웃·마을이 나누어 역할을 맡는 분산형 위임 구조로 이행하는 것이 이 단계의 핵심이다. 브론펜브레너가 중간체계(mesosystem)라고 부른 가정·이웃·마을의 상호 강화 구조가 이 단계에서 결정적으로 작동해야 한다. 체험이 풍부한 아이와 그렇지 못한 아이의 간격은 이미 이 단계에서 벌어지기 시작하므로, 국가는 기회의 바닥을 보장하는 역할로 이 분산 구조를 뒤에서 떠받쳐야 한다.</w:t>
+        <w:t>유아·아동기는 여러 강점의 단서를 체험으로 확인하는 시기다. 농업 시대에는 집안일과 농사일 습득이, 산업화 시대에는 취학 준비와 기초 학력이 과제였고 두 시대 모두 아이의 필요는 외부 사회가 정의했다. 디지털 시대에는 다양한 체험으로 관심과 강점을 발견하고 실험하는 것이 과제가 된다. 가정은 관심을 지지하고, 이웃은 체험 기회를 제공하며, 마을은 공동 발견 프로그램을 운영한다. 가정이나 국가가 교육을 독점하는 구조에서 가정·이웃·마을이 역할을 분담하는 분산형 위임 구조로 이행하는 것이 이 단계의 핵심이다. 브론펜브레너가 중간체계(mesosystem)로 규정한 가정·이웃·마을의 상호 강화 구조가 이 단계에서 작동해야 한다. 체험이 풍부한 아이와 그렇지 못한 아이의 격차는 이미 이 단계에서 발생하므로 국가는 기회의 바닥을 보장하여 분산 구조를 뒷받침해야 한다.</w:t>
       </w:r>
     </w:p>
     <w:p>
@@ -676,7 +676,7 @@
           <w:color w:val="000000"/>
           <w:sz w:val="23"/>
         </w:rPr>
-        <w:t>4.3  청소년 — 훈련하고 방향을 정하는 시기</w:t>
+        <w:t>4.3  청소년기</w:t>
       </w:r>
     </w:p>
     <w:p>
@@ -693,7 +693,23 @@
           <w:color w:val="000000"/>
           <w:sz w:val="21"/>
         </w:rPr>
-        <w:t>청소년기는 정체성의 위기가 가장 첨예하게 나타나는 시기다. 독일 태생의 미국 발달심리학자 에릭 에릭슨(Erik H. Erikson, 1902–1994)은 생애 발달을 여덟 단계로 나누어 각 단계의 심리사회적 과제를 제시했다(『아동기와 사회』, 1950). 청소년기의 핵심 과제는 '정체성 대 역할 혼미'였다. 나는 누구인가, 무엇을 할 수 있는가를 탐색하고 방향을 정하는 것이 이 단계의 본질적 필요다.</w:t>
+        <w:t>청소년기는 정체성의 위기가 가장 첨예한 시기다. 에릭 에릭슨(Erik H. Erikson, 1902-1994)은 생애 발달을 여덟 단계로 나누어 각 단계의 심리사회적 과제를 제시했다(『아동기와 사회』, 1950). 청소년기의 과제는 정체성 대 역할 혼미(identity vs. role confusion)다. 농업 시대에는 가업 기술 습득이, 산업화 시대에는 입시 경쟁과 진학이 이 필요를 충족했다. 성적이 정체성을 규정했고 도시의 입시 교육과 국가의 대입 제도가 청소년의 권리 위임을 독점했다. 디지털 시대에는 마을이 멘토와 훈련 경로를 제공하고 도시가 심화 경로와 재진입 통로를 마련하여 각자의 강점이 점수 서열 바깥에서 길러질 조건을 형성한다.</w:t>
+      </w:r>
+    </w:p>
+    <w:p>
+      <w:pPr>
+        <w:keepNext/>
+        <w:spacing w:before="240" w:after="80"/>
+      </w:pPr>
+      <w:r>
+        <w:rPr>
+          <w:rFonts w:ascii="Noto Sans KR" w:hAnsi="Noto Sans KR" w:eastAsia="Noto Sans KR"/>
+          <w:b/>
+          <w:i w:val="0"/>
+          <w:color w:val="000000"/>
+          <w:sz w:val="23"/>
+        </w:rPr>
+        <w:t>4.4  청년기</w:t>
       </w:r>
     </w:p>
     <w:p>
@@ -710,7 +726,7 @@
           <w:color w:val="000000"/>
           <w:sz w:val="21"/>
         </w:rPr>
-        <w:t>농업 시대에는 가업 기술 습득이, 산업화 시대에는 입시 경쟁과 상급 학교 진학이 이 필요를 채웠다. 성적이 정체성을 규정했고, 도시의 입시 학교와 국가의 대입 제도가 청소년의 권리 위임을 거의 독점했다. 마이클 영이 경고했듯 이 구조는 탈락자에게 구조적 배제를 개인의 실패로 위장했다. 디지털 시대에는 마을이 멘토와 훈련 경로를 제공하고, 도시가 심화 경로와 재진입 통로를 마련하여 각자의 강점이 점수 서열 바깥에서 길러질 수 있는 공간이 만들어진다.</w:t>
+        <w:t>청년기는 훈련으로 다듬어진 강점을 실제 성과로 발휘하는 시기다. 농업 시대에는 토지와 혼인을 통한 새 가정 구성이, 산업화 시대에는 안정된 직장 취업과 정착이 목표였고 두 경우 모두 필요는 외부가 규정했으며 국가와 도시가 경로를 통제했다. 디지털 시대 청년의 필요는 정체성을 실제 성과로 발휘할 영역이다. 인공지능과 플랫폼이 진입 비용을 낮추면서 개인은 대기업에 고용되지 않고도 가치를 생산할 수 있다. 산업화 시대 청년이 노동력과 결정권을 기업과 국가에 대규모로 위임하는 것이 거의 유일한 선택지였다면, 디지털 시대에는 도시에 발휘의 기반을 위임하고 세계와 선택적으로 협업하며 재편할 수 있는 유연한 위임 구조가 가능하다. 예스타 에스핑안데르센(Gøsta Esping-Andersen, 1947- )은 지식경제 시대에는 복지를 소득 보전에 한정하지 말고 교육·보육·재훈련 같은 사람에 대한 사전 투자, 곧 사회투자(social investment)로 전환해야 한다고 강조했다.</w:t>
       </w:r>
     </w:p>
     <w:p>
@@ -726,7 +742,7 @@
           <w:color w:val="000000"/>
           <w:sz w:val="23"/>
         </w:rPr>
-        <w:t>4.4  청년 — 발휘하는 시기</w:t>
+        <w:t>4.5  중장년기</w:t>
       </w:r>
     </w:p>
     <w:p>
@@ -743,7 +759,23 @@
           <w:color w:val="000000"/>
           <w:sz w:val="21"/>
         </w:rPr>
-        <w:t>청년기는 훈련을 통해 다듬어진 강점을 실제 기여로 발휘하는 시기다. 농업 시대에는 토지와 혼인을 통해 새 가정을 구성하는 것이, 산업화 시대에는 좋은 직장에 취업하고 정착하는 것이 목표였다. 두 경우 모두 필요는 외부가 규정했고 국가와 도시가 그 경로를 통제했다.</w:t>
+        <w:t>중장년기는 디지털 전환의 혜택과 위험이 가장 불균등하게 갈리는 시기다. 산업화 시대의 목표는 고용 유지와 가족 부양이었고 권리 위임은 직장과 국가를 향했다. 안정된 고용이 유지되는 한 개인은 노동 시간과 역량을 기업에, 연금 권리를 국가에 위임하는 계약을 따랐다. 디지털 전환은 자동화와 인공지능이 기존 직무를 대체하면서 재학습과 강점의 재설계를 요구한다. 마을과 도시가 재학습 경로를 제공하고 가정과 국가가 전환기 보호를 담당하는 것은 축소되었던 선택권을 다시 분산하여 회복하는 과정이다. 에릭슨은 중장년기의 과제를 생산성 대 침체(generativity vs. stagnation)로 규정했다. 자신이 축적한 것을 새 방향으로 확장하지 못하면 정체와 고립에 빠진다. 이 과제에 응답하는 것은 개인의 의지가 아니라 재학습 기회를 제공하고 새 역할을 연결하며 전환기의 불안을 분담하는 공동체의 구조다.</w:t>
+      </w:r>
+    </w:p>
+    <w:p>
+      <w:pPr>
+        <w:keepNext/>
+        <w:spacing w:before="240" w:after="80"/>
+      </w:pPr>
+      <w:r>
+        <w:rPr>
+          <w:rFonts w:ascii="Noto Sans KR" w:hAnsi="Noto Sans KR" w:eastAsia="Noto Sans KR"/>
+          <w:b/>
+          <w:i w:val="0"/>
+          <w:color w:val="000000"/>
+          <w:sz w:val="23"/>
+        </w:rPr>
+        <w:t>4.6  노년기</w:t>
       </w:r>
     </w:p>
     <w:p>
@@ -760,107 +792,7 @@
           <w:color w:val="000000"/>
           <w:sz w:val="21"/>
         </w:rPr>
-        <w:t>디지털 시대의 청년이 필요로 하는 것은 자기 정체성을 실제 기여로 발휘할 무대다. 인공지능과 플랫폼이 진입 비용을 낮추면서 개인은 대기업에 고용되지 않고도 가치를 생산할 수 있게 되었다. 산업화 시대에 청년은 노동력과 결정권을 기업과 국가에 대규모로 위임하는 것이 거의 유일한 선택지였다면, 디지털 시대에는 도시에 발휘의 기반을 위임하고 세계와 선택적으로 협업하며 언제든 재편할 수 있는 유연한 위임 구조가 가능해진다. 덴마크 출신의 사회정책학자 예스타 에스핑안데르센(Gøsta Esping-Andersen, 1947– )은 지식경제 시대에는 복지를 소득 보전에만 쓰지 말고 교육·보육·재훈련 같은 사람에 대한 사전 투자—'사회적 투자(social investment)'—로 전환해야 한다고 강조했다.</w:t>
-      </w:r>
-    </w:p>
-    <w:p>
-      <w:pPr>
-        <w:keepNext/>
-        <w:spacing w:before="240" w:after="80"/>
-      </w:pPr>
-      <w:r>
-        <w:rPr>
-          <w:rFonts w:ascii="Noto Sans KR" w:hAnsi="Noto Sans KR" w:eastAsia="Noto Sans KR"/>
-          <w:b/>
-          <w:i w:val="0"/>
-          <w:color w:val="000000"/>
-          <w:sz w:val="23"/>
-        </w:rPr>
-        <w:t>4.5  중장년 — 재설계하고 확장하는 시기</w:t>
-      </w:r>
-    </w:p>
-    <w:p>
-      <w:pPr>
-        <w:spacing w:before="0" w:after="120" w:line="384" w:lineRule="auto"/>
-        <w:ind w:firstLine="227"/>
-        <w:jc w:val="both"/>
-      </w:pPr>
-      <w:r>
-        <w:rPr>
-          <w:rFonts w:ascii="Noto Serif KR" w:hAnsi="Noto Serif KR" w:eastAsia="Noto Serif KR"/>
-          <w:b w:val="0"/>
-          <w:i w:val="0"/>
-          <w:color w:val="000000"/>
-          <w:sz w:val="21"/>
-        </w:rPr>
-        <w:t>중장년기는 디지털 전환의 혜택과 위험이 가장 불균등하게 갈리는 시기다. 산업화 시대의 목표는 고용 유지와 가족 부양이었고, 권리 위임은 주로 직장과 국가를 향해 있었다. 안정된 고용이 유지되는 한 개인은 자신의 노동 시간과 역량을 기업에 위임하고 연금 권리는 국가에 맡겨두는 계약을 따랐다. 디지털 전환은 자동화와 인공지능이 기존 직무를 대체하면서 재학습과 강점의 재설계를 요구한다. 마을과 도시가 재학습의 접근로를 열고 가정과 국가가 전환기 보호를 제공하는 것은, 빼앗겼던 선택권을 다시 분산해 돌려주는 과정이다. 직업 전환을 원하는 중장년이 마을 단위 재교육 센터에서 새 기술을 배우고 국가는 그 기간 동안 소득을 일부 보전해주는 구조가 이에 해당한다.</w:t>
-      </w:r>
-    </w:p>
-    <w:p>
-      <w:pPr>
-        <w:spacing w:before="0" w:after="120" w:line="384" w:lineRule="auto"/>
-        <w:ind w:firstLine="227"/>
-        <w:jc w:val="both"/>
-      </w:pPr>
-      <w:r>
-        <w:rPr>
-          <w:rFonts w:ascii="Noto Serif KR" w:hAnsi="Noto Serif KR" w:eastAsia="Noto Serif KR"/>
-          <w:b w:val="0"/>
-          <w:i w:val="0"/>
-          <w:color w:val="000000"/>
-          <w:sz w:val="21"/>
-        </w:rPr>
-        <w:t>에릭슨은 중장년기의 핵심 과제를 '생산성 대 침체(generativity vs. stagnation)'로 정의했다. 자신이 쌓은 것을 새 방향으로 확장하고 다음 세대를 위한 무언가를 만들어내지 못하면 정체와 고립으로 빠진다. 이 심리적 위기에 응답하는 것은 개인의 의지가 아니라 공동체의 구조다. 재학습의 기회를 만들고 새 역할을 연결하며 전환기의 불안을 함께 감당하는 공동체가 있어야 한다.</w:t>
-      </w:r>
-    </w:p>
-    <w:p>
-      <w:pPr>
-        <w:keepNext/>
-        <w:spacing w:before="240" w:after="80"/>
-      </w:pPr>
-      <w:r>
-        <w:rPr>
-          <w:rFonts w:ascii="Noto Sans KR" w:hAnsi="Noto Sans KR" w:eastAsia="Noto Sans KR"/>
-          <w:b/>
-          <w:i w:val="0"/>
-          <w:color w:val="000000"/>
-          <w:sz w:val="23"/>
-        </w:rPr>
-        <w:t>4.6  노년 — 전수하고 연결하는 시기</w:t>
-      </w:r>
-    </w:p>
-    <w:p>
-      <w:pPr>
-        <w:spacing w:before="0" w:after="120" w:line="384" w:lineRule="auto"/>
-        <w:ind w:firstLine="227"/>
-        <w:jc w:val="both"/>
-      </w:pPr>
-      <w:r>
-        <w:rPr>
-          <w:rFonts w:ascii="Noto Serif KR" w:hAnsi="Noto Serif KR" w:eastAsia="Noto Serif KR"/>
-          <w:b w:val="0"/>
-          <w:i w:val="0"/>
-          <w:color w:val="000000"/>
-          <w:sz w:val="21"/>
-        </w:rPr>
-        <w:t>농업 시대의 노년은 권위와 봉양, 산업화 시대의 노년은 은퇴와 부양의 시기였다. 두 시대 모두 노인을 '받는 존재'로 정의했다. 디지털 시대는 건강을 미리 예측·예방하면서 존엄과 판단의 주도권을 지키고, 경험을 다음 세대에 전수하며 세대를 연결하는 '능동적 전수자'로서의 노년을 제안한다.</w:t>
-      </w:r>
-    </w:p>
-    <w:p>
-      <w:pPr>
-        <w:spacing w:before="0" w:after="120" w:line="384" w:lineRule="auto"/>
-        <w:ind w:firstLine="227"/>
-        <w:jc w:val="both"/>
-      </w:pPr>
-      <w:r>
-        <w:rPr>
-          <w:rFonts w:ascii="Noto Serif KR" w:hAnsi="Noto Serif KR" w:eastAsia="Noto Serif KR"/>
-          <w:b w:val="0"/>
-          <w:i w:val="0"/>
-          <w:color w:val="000000"/>
-          <w:sz w:val="21"/>
-        </w:rPr>
-        <w:t>에릭슨은 노년기의 과제를 '자아통합 대 절망(ego integrity vs. despair)'으로 보았다. 자신의 삶 전체를 돌아보며 '그래도 이 삶은 의미가 있었다'는 통합감을 얻지 못하면 절망에 빠진다. 전수할 통로가 있고 역할이 주어지며 관계 안에 머물 수 있는 공동체 구조가 통합을 가능하게 한다. 가정은 돌봄과 존엄의 생활 공간을, 이웃은 관계의 지속을, 마을과 도시는 멘토와 자문의 역할을 연결하고, 국가는 소득의 최소 기반과 고립 방지의 역할을 맡는다. 폴라니의 언어로 말하면, 노인이 시장과 국가 연금에만 의존하는 상태는 탈배태의 전형이다. 재배태은 노인이 관계와 역할의 그물 안으로 돌아오는 것이며, 그 그물을 유지하는 것은 각 공동체가 노인으로부터 위임받은 관계·시간·경험을 제대로 활용하고 돌려주는 것이다.</w:t>
+        <w:t>농업 시대의 노년은 봉양의 대상, 산업화 시대의 노년은 은퇴와 부양의 대상이었고 두 시대 모두 노인을 수혜자로 규정했다. 디지털 시대는 건강을 미리 예측·예방하면서 존엄과 판단의 주도권을 유지하고, 경험을 다음 세대에 전수하며 세대를 연결하는 능동적 전수자로서의 노년을 제시한다. 에릭슨은 노년기의 과제를 자아통합 대 절망(ego integrity vs. despair)으로 규정했다. 삶 전체를 통합적으로 수용하지 못하면 절망에 빠진다. 전수 통로와 역할이 주어지고 관계 안에 머물 수 있는 공동체 구조가 통합을 가능하게 한다. 가정은 돌봄과 존엄의 생활 공간을, 이웃은 관계의 지속을, 마을과 도시는 멘토와 자문 역할을 담당하고 국가는 소득의 최소 기반과 고립 방지를 맡는다. 폴라니의 개념으로 보면 노인이 시장과 국가 연금에만 의존하는 상태는 탈배태이며, 재배태는 노인이 관계와 역할의 그물로 회복되는 것이다.</w:t>
       </w:r>
     </w:p>
     <w:p>
@@ -879,7 +811,7 @@
           <w:color w:val="000000"/>
           <w:sz w:val="27"/>
         </w:rPr>
-        <w:t>5.  공동체의 형성·역할·기능 — 층위별 권리 위임의 구조</w:t>
+        <w:t>5.  공동체의 형성·역할·기능: 층위별 권리 위임의 구조</w:t>
       </w:r>
     </w:p>
     <w:p>
@@ -895,7 +827,7 @@
           <w:color w:val="000000"/>
           <w:sz w:val="23"/>
         </w:rPr>
-        <w:t>5.1  가정 — 정체성의 첫 번째 공동체</w:t>
+        <w:t>5.1  가정</w:t>
       </w:r>
     </w:p>
     <w:p>
@@ -912,7 +844,7 @@
           <w:color w:val="000000"/>
           <w:sz w:val="21"/>
         </w:rPr>
-        <w:t>가정은 개인이 태어나는 순간부터 가장 먼저 권리를 위임받는 공동체다. 농업 시대에 가정은 노동·양육·부양·교육을 모두 떠안는 전능한 공동체였고, 산업화 시대에는 교육을 학교에, 의료를 병원에 위임하면서 역할이 좁아졌다. 디지털 시대에 가정의 핵심 역할은 정체성의 단서를 가장 먼저 읽는 생활 기반이다. 아이가 어디에 반응하는지, 무엇을 할 때 활기를 띠는지를 가장 가까이에서 관찰하고 기록하는 것이다. 또한 중장년의 전환기와 노년의 돌봄·존엄을 지지하는 역할도 함께 맡는다. 브론펜브레너가 말한 미시체계(microsystem)—개인이 직접 몸담는 가장 가까운 환경—가 바로 가정이며, 이 층위가 건강해야 다른 모든 공동체에서의 위임도 의미를 가질 수 있다.</w:t>
+        <w:t>가정은 개인이 태어나는 순간부터 가장 먼저 권리를 위임받는 공동체다. 농업 시대에 가정은 노동·양육·부양·교육을 모두 담당했고, 산업화 시대에는 교육을 학교에, 의료를 병원에 위임하면서 역할이 축소되었다. 디지털 시대 가정의 핵심 역할은 정체성의 단서를 가장 먼저 읽는 생활 기반이다. 아이가 무엇에 반응하고 어떤 활동에서 활기를 보이는지를 가까이에서 관찰하고 기록한다. 또한 중장년의 전환기와 노년의 돌봄·존엄을 지지한다. 브론펜브레너가 미시체계(microsystem)로 규정한, 개인이 직접 속하는 가장 가까운 환경이 가정이며, 이 층위가 건강해야 다른 공동체의 위임도 의미를 갖는다.</w:t>
       </w:r>
     </w:p>
     <w:p>
@@ -928,7 +860,7 @@
           <w:color w:val="000000"/>
           <w:sz w:val="23"/>
         </w:rPr>
-        <w:t>5.2  이웃 — 실험의 공동체</w:t>
+        <w:t>5.2  이웃</w:t>
       </w:r>
     </w:p>
     <w:p>
@@ -945,7 +877,7 @@
           <w:color w:val="000000"/>
           <w:sz w:val="21"/>
         </w:rPr>
-        <w:t>이웃은 산업화 시대에 가장 크게 위축된 공동체다. 표준 제도가 모든 것을 조직하면서 이웃 간 상호 돌봄과 협동의 기능은 사라졌다. 정체성을 발휘하는 시대에 이웃은 다시 중요해진다. 아이가 흥미를 실험하고 어른이 새 관계를 맺는 일상망이다. 관심 기반 모임, 생활 멘토, 상호 돌봄의 품앗이가 이웃에서 이루어질 때 개인은 발견의 기회를 얻는다. 단절된 사람이 다시 관계망으로 돌아오는 첫 번째 통로도 이웃이다. 오스트롬이 연구한 스위스 알프스의 목초지 공동 관리, 일본 어촌의 어장 자치는 이웃 규모의 자치가 얼마나 정교하게 작동할 수 있는지를 보여준다.</w:t>
+        <w:t>이웃은 산업화 시대에 가장 크게 위축된 공동체다. 표준 제도가 모든 것을 조직하면서 이웃 간 상호 돌봄과 협동 기능이 소멸했다. 정체성 발휘의 시대에 이웃은 아이가 흥미를 실험하고 성인이 새 관계를 맺는 일상망으로서 중요성을 회복한다. 관심 기반 모임, 생활 멘토, 상호 돌봄이 이웃 단위에서 이루어질 때 개인은 발견의 기회를 얻으며, 단절된 사람이 관계망으로 복귀하는 첫 경로도 이웃이다. 오스트롬이 분석한 스위스 알프스 목초지 공동 관리와 일본 어촌의 어장 자치는 이웃 규모의 자치가 정교하게 작동할 수 있음을 보여준다.</w:t>
       </w:r>
     </w:p>
     <w:p>
@@ -961,7 +893,7 @@
           <w:color w:val="000000"/>
           <w:sz w:val="23"/>
         </w:rPr>
-        <w:t>5.3  마을 — 훈련과 재학습의 공동체</w:t>
+        <w:t>5.3  마을</w:t>
       </w:r>
     </w:p>
     <w:p>
@@ -978,7 +910,7 @@
           <w:color w:val="000000"/>
           <w:sz w:val="21"/>
         </w:rPr>
-        <w:t>마을은 생애주기의 여러 단계에서 훈련과 재학습을 담당하는 공동체다. 산업화 시대에 도시에 기능을 빼앗겨 행정 단위로 전락했던 마을은 디지털 시대에 '발견된 방향을 훈련으로 잇는 생활권'으로 복원된다. 청소년에게는 마을 멘토단과 훈련 경로가, 중장년에게는 재학습 접근로가 마을을 통해 열린다. 마을은 중앙 정부가 직접 설계하기보다 구성원이 자치적으로 훈련 경로를 만들고 국가가 최소 기준을 보장할 때 가장 잘 작동한다. 센과 누스바움이 강조한 역량—실제로 무언가를 할 수 있는 힘—은 마을 단위의 훈련 환경이 갖춰질 때 비로소 구체적으로 자라난다.</w:t>
+        <w:t>마을은 생애주기의 여러 단계에서 훈련과 재학습을 담당하는 공동체다. 산업화 시대에 도시에 기능을 넘기고 행정 단위로 축소되었던 마을은 디지털 시대에 발견된 방향을 훈련으로 연결하는 생활권으로 재편된다. 청소년에게는 마을 멘토단과 훈련 경로가, 중장년에게는 재학습 경로가 마을을 통해 제공된다. 마을은 중앙 정부가 직접 설계하기보다 구성원이 자치적으로 훈련 경로를 만들고 국가가 최소 기준을 보장할 때 가장 잘 작동한다. 센과 누스바움이 강조한 역량은 마을 단위의 훈련 환경이 갖춰질 때 구체적으로 형성된다.</w:t>
       </w:r>
     </w:p>
     <w:p>
@@ -994,7 +926,7 @@
           <w:color w:val="000000"/>
           <w:sz w:val="23"/>
         </w:rPr>
-        <w:t>5.4  도시 — 발휘의 무대</w:t>
+        <w:t>5.4  도시</w:t>
       </w:r>
     </w:p>
     <w:p>
@@ -1011,7 +943,7 @@
           <w:color w:val="000000"/>
           <w:sz w:val="21"/>
         </w:rPr>
-        <w:t>도시는 산업화 시대에 학교와 공장을 집적하여 표준 인재를 생산·배치하는 기관이었다. 디지털 시대에 도시는 정체성을 실제 기여로 발휘하는 무대이자 생활 기반으로 전환된다. 프로젝트 연결, 직무 전환, 생활 조정이 도시의 기능이 되며, 청년의 첫 기여와 중장년의 재설계가 도시를 통해 이루어진다. 도시에 위임되는 권리의 성격이 '표준 경로에 나를 맞추기'에서 '내 기여를 발휘할 무대 만들기'로 바뀐다.</w:t>
+        <w:t>도시는 산업화 시대에 학교와 공장을 집적하여 표준 인재를 생산·배치하는 기관이었다. 디지털 시대에 도시는 정체성을 실제 성과로 발휘하는 장이자 생활 기반으로 전환된다. 프로젝트 연결, 직무 전환, 생활 조정이 도시의 기능이 되며, 청년의 첫 성과와 중장년의 재설계가 도시를 통해 이루어진다. 도시에 위임되는 권리의 성격은 표준 경로에 자신을 맞추는 것에서 자신의 성과를 발휘할 기반을 만드는 것으로 바뀐다.</w:t>
       </w:r>
     </w:p>
     <w:p>
@@ -1028,7 +960,7 @@
           <w:color w:val="000000"/>
           <w:sz w:val="21"/>
         </w:rPr>
-        <w:t>그러나 모든 기능이 한 대도시에 집중되면 개인이 위임한 권리도 거대한 행정 단위 하나에 묶여 회수하기 어려워진다. 이것은 국가로의 권리 집중과 같은 문제를 도시 규모에서 되풀이하는 것이다. 사람은 자신이 어디에 무엇을 맡겼는지 보이고 필요하면 거두어들일 수 있는 규모 안에서만 권리를 능동적으로 위임한다. 그러므로 디지털 시대의 도시는 거대한 단일 대도시가 아니라, 사람이 체감할 수 있는 규모의 강소도시들이 연합하는 형태로 재편되어야 한다. 강소도시는 한 사람의 강점을 알아보고 기여의 기회를 연결할 만큼 작고 구체적인 생활권이다. 이 규모에서는 내가 맡긴 결정권이 어떻게 쓰이는지 들여다보고 조정할 수 있다. 동시에 작은 도시 하나만으로는 시장과 데이터, 기회의 폭이 부족하므로, 강소도시들은 데이터·인공지능·행정·산업 기반을 서로 연결해 하나의 연합된 생활권을 이룬다. 발휘의 폭은 연합 전체에서 얻되 권리의 위임과 회수는 내가 속한 작은 도시 단위에서 이루어지는 구조다. 규모의 효율은 연합으로 확보하고 권리의 통제권은 개인 가까이 남기는 것, 이것이 대도시를 강소도시의 연합으로 다시 짜야 하는 이유다.</w:t>
+        <w:t>그러나 모든 기능이 한 대도시에 집중되면 개인이 위임한 권리도 거대한 행정 단위에 묶여 회수하기 어려워진다. 이는 국가로의 권리 집중과 동일한 문제를 도시 규모에서 반복하는 것이다. 개인은 자신이 어디에 무엇을 맡겼는지 확인하고 필요하면 회수할 수 있는 규모 안에서만 권리를 능동적으로 위임한다. 따라서 디지털 시대의 도시는 단일 대도시가 아니라 체감 가능한 규모의 강소도시들이 연합하는 형태로 재편되어야 한다. 강소도시는 한 사람의 강점을 알아보고 성과의 기회를 연결할 만큼 작고 구체적인 생활권이며, 이 규모에서는 위임한 결정권이 어떻게 쓰이는지 확인하고 조정할 수 있다. 동시에 작은 도시 하나만으로는 시장과 데이터, 기회의 폭이 부족하므로 강소도시들은 데이터·인공지능·행정·산업 기반을 연결해 하나의 연합 생활권을 구성한다. 발휘의 폭은 연합 전체에서 확보하되 권리의 위임과 회수는 개인이 속한 작은 도시 단위에서 이루어지는 구조다. 규모의 효율은 연합으로 확보하고 권리의 통제권은 개인 가까이에 남기는 것이 대도시를 강소도시의 연합으로 재편해야 하는 근거다.</w:t>
       </w:r>
     </w:p>
     <w:p>
@@ -1044,7 +976,7 @@
           <w:color w:val="000000"/>
           <w:sz w:val="23"/>
         </w:rPr>
-        <w:t>5.5  국가와 세계 — 조율과 공동 위험 관리</w:t>
+        <w:t>5.5  국가와 세계</w:t>
       </w:r>
     </w:p>
     <w:p>
@@ -1061,7 +993,7 @@
           <w:color w:val="000000"/>
           <w:sz w:val="21"/>
         </w:rPr>
-        <w:t>국가는 산업화 시대에 권리 집중의 핵심 기구였다. 교육·고용·복지·의료를 중앙에서 일괄 관리했고, 개인이 어느 공동체에 권리를 위임할지 선택할 여지를 거의 남기지 않았다. 디지털 시대의 국가는 모든 것을 관리하는 역할에서 물러나, 가정·이웃·마을·도시가 각자의 역할을 잘 할 수 있도록 최소 조건을 보장하고 이들을 조율하는 '메타 거버넌스(meta-governance)'로 전환되어야 한다. 모든 사람에게 권리 위임의 기회가 열리도록 최소 권리선을 세우고, 어느 공동체도 권리를 과도하게 독점하지 않도록 규칙을 만드는 것이 국가의 일이다. 에스핑안데르센이 말한 사회적 투자 국가—소득 보전에서 역량 형성으로—는 이 전환의 구체적인 형태다.</w:t>
+        <w:t>국가는 산업화 시대 권리 집중의 핵심 기구였다. 교육·고용·복지·의료를 중앙에서 일괄 관리했고 개인이 권리를 위임할 공동체를 선택할 여지를 거의 남기지 않았다. 디지털 시대의 국가는 모든 것을 관리하는 역할에서 물러나, 가정·이웃·마을·도시가 각자의 역할을 수행하도록 최소 조건을 보장하고 이들을 조율하는 메타 거버넌스(meta-governance)로 전환되어야 한다. 모든 사람에게 권리 위임의 기회가 열리도록 최소 권리선을 설정하고, 어느 공동체도 권리를 과도하게 독점하지 않도록 규칙을 만드는 것이 국가의 역할이다. 에스핑안데르센이 제시한 사회투자 국가, 곧 소득 보전에서 역량 형성으로의 전환이 그 구체적 형태다.</w:t>
       </w:r>
     </w:p>
     <w:p>
@@ -1078,7 +1010,7 @@
           <w:color w:val="000000"/>
           <w:sz w:val="21"/>
         </w:rPr>
-        <w:t>세계는 산업화 시대에 국가 간 협정으로만 작동하던 추상적 층위였다. 디지털 시대에 세계는 처음으로 개인의 권리 위임 상대로 등장한다. 국경을 넘는 협업이 가능해지면서 청년과 중장년이 세계 무대에서 기여를 발휘할 수 있다. 동시에 기후변화·인공지능 위험·감염병처럼 국가 단위를 넘어서는 공동 위험이 커지면서 세계는 모든 생애단계의 안전과 직결된 능동적 거버넌스 층위가 된다. 오스트롬이 만년에 연구한 기후변화 대응 거버넌스가 보여주듯, 거버넌스 층위가 더 많고 더 분산될수록 공동 위험에 대한 적응력도 높아진다.</w:t>
+        <w:t>세계는 산업화 시대에 국가 간 협정으로만 작동하던 추상적 층위였다. 디지털 시대에 세계는 처음으로 개인의 권리 위임 상대로 등장한다. 국경을 넘는 협업이 가능해지면서 청년과 중장년이 세계 무대에서 성과를 발휘할 수 있다. 동시에 기후변화·인공지능 위험·감염병처럼 국가 단위를 넘는 공동 위험이 커지면서 세계는 모든 생애단계의 안전과 직결된 거버넌스 층위가 된다. 오스트롬이 만년에 분석한 기후변화 거버넌스가 보여주듯 거버넌스 층위가 분산될수록 공동 위험에 대한 적응력이 높아진다.</w:t>
       </w:r>
     </w:p>
     <w:p>
@@ -1097,7 +1029,7 @@
           <w:color w:val="000000"/>
           <w:sz w:val="27"/>
         </w:rPr>
-        <w:t>6.  디지털 전환이 공동체에 요구하는 것 — 권리의 재분산</w:t>
+        <w:t>6.  디지털 전환이 공동체에 요구하는 것: 권리의 재분산</w:t>
       </w:r>
     </w:p>
     <w:p>
@@ -1140,7 +1072,7 @@
           <w:color w:val="000000"/>
           <w:sz w:val="21"/>
         </w:rPr>
-        <w:t>국가 하나가 모든 생애단계의 필요를 독점 관리하는 구조에서, 개인이 필요에 따라 가정·이웃·마을·도시에 권리를 나누어 위임하고 상황이 바뀌면 거두어들일 수 있는 구조로 전환해야 한다. 로크가 말했듯 위임은 항상 회수 가능해야 한다. 탈상품화—시장에 기대지 않고도 살아갈 수 있게 해주는 사회 보장—만으로는 부족하며, 위임의 대상을 스스로 선택하고 바꿀 수 있는 구조가 함께 필요하다.</w:t>
+        <w:t>국가가 모든 생애단계의 필요를 독점 관리하는 구조에서, 개인이 필요에 따라 가정·이웃·마을·도시에 권리를 분산 위임하고 상황이 바뀌면 회수할 수 있는 구조로 전환해야 한다. 로크가 제시했듯 위임은 항상 회수 가능해야 한다. 탈상품화(decommodification), 곧 시장에 기대지 않고도 살아갈 수 있게 하는 사회 보장만으로는 부족하며, 위임 대상을 선택하고 변경할 수 있는 구조가 함께 필요하다.</w:t>
       </w:r>
     </w:p>
     <w:p>
@@ -1157,7 +1089,7 @@
           <w:color w:val="000000"/>
           <w:sz w:val="21"/>
         </w:rPr>
-        <w:t xml:space="preserve">둘째, 가까운 공동체의 역량을 복원해야 한다. </w:t>
+        <w:t xml:space="preserve">둘째, 가까운 공동체의 역량을 회복해야 한다. </w:t>
       </w:r>
       <w:r>
         <w:rPr>
@@ -1167,7 +1099,7 @@
           <w:color w:val="000000"/>
           <w:sz w:val="21"/>
         </w:rPr>
-        <w:t>브론펜브레너가 지적했듯 개인에게 가장 깊은 영향을 미치는 것은 가까운 환경에서의 직접적 상호작용이다. 산업화 시대에 약화된 이웃과 마을의 역할을 되살리는 것이 권리 재분산의 핵심이다. 이는 중앙 예산을 지방에 내려보내는 것이 아니라, 이웃과 마을이 스스로 역할을 정의하고 자치적으로 운영할 수 있는 조건을 만드는 것이다. 오스트롬이 보여주었듯 자치는 주어지는 것이 아니라 구성원들이 스스로 규칙을 만들 때 비로소 작동한다.</w:t>
+        <w:t>브론펜브레너가 지적했듯 개인에게 가장 큰 영향을 미치는 것은 가까운 환경에서의 직접적 상호작용이다. 산업화 시대에 약화된 이웃과 마을의 역할을 회복하는 것이 권리 재분산의 핵심이다. 이는 중앙 예산을 지방에 이전하는 것이 아니라 이웃과 마을이 스스로 역할을 정의하고 자치적으로 운영할 조건을 만드는 것이다. 오스트롬이 보여주었듯 자치는 구성원이 스스로 규칙을 만들 때 작동한다.</w:t>
       </w:r>
     </w:p>
     <w:p>
@@ -1194,7 +1126,7 @@
           <w:color w:val="000000"/>
           <w:sz w:val="21"/>
         </w:rPr>
-        <w:t>각 생애단계에서 어떤 공동체가 어떤 역할을 맡는지, 개인이 어디에 권리를 위임하는지, 그 위임이 어떤 조건에서 회수될 수 있는지를 사회적 합의로 명시해야 한다. 헥만이 실증한 생애 초기 투자의 복리 효과를 감안하면, 영아기에서 청소년기까지의 공동체 지원은 복지 지출이 아니라 사회 전체의 역량에 대한 선제적 투자로 재정의되어야 한다.</w:t>
+        <w:t>각 생애단계에서 어떤 공동체가 어떤 역할을 맡고 개인이 어디에 권리를 위임하며 그 위임이 어떤 조건에서 회수되는지를 사회적 합의로 명시해야 한다. 헥만이 실증한 생애 초기 투자의 복리 효과를 고려하면, 영아기에서 청소년기까지의 공동체 지원은 복지 지출이 아니라 사회 전체 역량에 대한 선제적 투자로 재정의되어야 한다.</w:t>
       </w:r>
     </w:p>
     <w:p>
@@ -1210,7 +1142,7 @@
           <w:color w:val="000000"/>
           <w:sz w:val="23"/>
         </w:rPr>
-        <w:t>6.2  생애는 누적의 사이클이다</w:t>
+        <w:t>6.2  생애주기는 누적 구조다</w:t>
       </w:r>
     </w:p>
     <w:p>
@@ -1227,24 +1159,7 @@
           <w:color w:val="000000"/>
           <w:sz w:val="21"/>
         </w:rPr>
-        <w:t>디지털 시대의 생애주기는 직선이 아니라, 앞 단계의 결과가 다음 단계의 조건이 되는 나선형 누적 구조다. 중장년의 재설계는 청소년기의 훈련이 성공했을 때 가능하고, 노년의 전수는 청년·중장년의 발휘가 쌓였을 때 의미를 갖는다. 초기 단계의 권리 위임 격차—어떤 아이는 가정·이웃·마을의 풍부한 지지 속에서 단서를 발견하고, 어떤 아이는 그 공동체들이 모두 약한 환경에서 태어나는—는 생애 전체 사이클의 단절을 의미한다. 헥만의 연구는 이 불평등이 경제학적으로도 가장 비효율적인 낭비임을 보여준다. 일찍 메꾸지 않은 결핍은 나중에 훨씬 큰 사회적 비용을 치르게 만든다.</w:t>
-      </w:r>
-    </w:p>
-    <w:p>
-      <w:pPr>
-        <w:spacing w:before="0" w:after="120" w:line="384" w:lineRule="auto"/>
-        <w:ind w:firstLine="227"/>
-        <w:jc w:val="both"/>
-      </w:pPr>
-      <w:r>
-        <w:rPr>
-          <w:rFonts w:ascii="Noto Serif KR" w:hAnsi="Noto Serif KR" w:eastAsia="Noto Serif KR"/>
-          <w:b w:val="0"/>
-          <w:i w:val="0"/>
-          <w:color w:val="000000"/>
-          <w:sz w:val="21"/>
-        </w:rPr>
-        <w:t>센과 누스바움이 강조했듯 형식적 권리보다 중요한 것은 실질적 역량이다. 모든 아이에게 학교가 있다고 해서 모든 아이가 발견과 훈련의 역량을 갖는 것은 아니다. 공동체는 그 역량이 실제로 작동하도록 조건을 만들어야 한다. 위임의 구조가 역량의 실현을 뒷받침할 때, 비로소 계약은 정당성을 갖는다.</w:t>
+        <w:t>디지털 시대의 생애주기는 앞 단계의 결과가 다음 단계의 조건이 되는 누적 구조다. 중장년의 재설계는 청소년기 훈련의 성공을 전제하고, 노년의 전수는 청년·중장년의 성과 축적을 전제한다. 초기 단계의 권리 위임 격차, 곧 어떤 아이는 가정·이웃·마을의 풍부한 지지 속에서 단서를 발견하고 어떤 아이는 그 공동체가 모두 약한 환경에서 자라는 차이는 생애 전체의 단절로 이어진다. 헥만의 연구는 이 불평등이 경제적으로도 비효율적인 손실임을 보여준다. 일찍 보완하지 않은 결핍은 이후에 더 큰 사회적 비용을 요구한다.</w:t>
       </w:r>
     </w:p>
     <w:p>
@@ -1277,7 +1192,7 @@
           <w:color w:val="000000"/>
           <w:sz w:val="21"/>
         </w:rPr>
-        <w:t>이 연구의 핵심 주장은 세 줄로 요약된다. 첫째, 공동체는 개인이 자신의 필요에 의해 권리를 위임하는 계약을 통해 구현되는 실체이며, 위임은 언제든 회수 가능해야 한다. 둘째, 산업화 시대에 권리가 국가로 모인 것은 그 시대 개인의 필요에 따른 선택이었으나, 정체성의 발휘를 원하는 디지털 시대 개인의 필요에는 더 이상 맞지 않는다. 셋째, 디지털 시대의 전환은 기술의 문제가 아니라, 모인 권리를 가정·이웃·마을·도시·국가·세계의 여러 층위로 다시 분산하고 개인에게 위임의 선택권을 돌려주는 재편의 과제다.</w:t>
+        <w:t>이 연구의 핵심 주장은 세 가지다. 첫째, 공동체는 개인이 필요에 따라 권리를 위임하는 계약으로 구현되는 실체이며 위임은 회수 가능해야 한다. 둘째, 산업화 시대에 권리가 국가로 집중된 것은 당대 개인의 필요에 따른 선택이었으나 정체성 발휘를 요구하는 디지털 시대의 필요에는 맞지 않는다. 셋째, 디지털 전환은 기술의 문제가 아니라 집중된 권리를 가정·이웃·마을·도시·국가·세계의 여러 층위로 재분산하고 개인에게 위임의 선택권을 돌려주는 재편의 과제다.</w:t>
       </w:r>
     </w:p>
     <w:p>
@@ -1294,7 +1209,7 @@
           <w:color w:val="000000"/>
           <w:sz w:val="21"/>
         </w:rPr>
-        <w:t>루소가 꿈꾼 자치, 로크가 요구한 신탁의 회수 가능성, 오스트롬이 실증한 다중심 자치 거버넌스, 브론펜브레너가 밝힌 근위 과정의 중요성, 폴라니가 진단한 재배태의 필요—이 모든 논의는 같은 방향을 가리킨다. 개인은 자신의 필요에 맞는 공동체를 스스로 구성하고, 그 공동체에 권리를 위임하며, 상황이 바뀌면 권리를 거두어들일 수 있어야 한다.</w:t>
+        <w:t>루소의 자치, 로크의 신탁 회수 가능성, 오스트롬의 다중심 자치, 브론펜브레너의 근접 과정, 폴라니의 재배태는 같은 방향을 가리킨다. 개인은 필요에 맞는 공동체를 구성하고 그 공동체에 권리를 위임하며 상황이 바뀌면 권리를 회수할 수 있어야 한다.</w:t>
       </w:r>
     </w:p>
     <w:p>

</xml_diff>

<commit_message>
docs: compress P2 report to ~10p, social-science tone, EN-KR term glosses
</commit_message>
<xml_diff>
--- a/archive/docx/p2-lifecycle-community-report.docx
+++ b/archive/docx/p2-lifecycle-community-report.docx
@@ -306,7 +306,7 @@
           <w:color w:val="000000"/>
           <w:sz w:val="21"/>
         </w:rPr>
-        <w:t>아마르티아 센(Amartya Sen, 1933- )은 발전을 자유의 확장으로 정의했다(『자유로서의 발전』, 1999). 소득 증가가 아니라 개인이 실제로 할 수 있고 될 수 있는 것의 폭이 넓어지는 것이 발전이다. 마사 누스바움(Martha Nussbaum, 1947- )은 이를 역량 접근(capability approach), 곧 실제로 실행할 수 있는 능력으로 정식화했다(『역량의 창조』, 2011). 공동체가 개인에게 역량을 제공하는 한에서 위임은 정당성을 갖는다.</w:t>
+        <w:t>아마르티아 센(Amartya Sen, 1933- )은 발전을 자유의 확장, 곧 개인이 실제로 할 수 있고 될 수 있는 것의 폭이 넓어지는 것으로 정의했다(『자유로서의 발전』, 1999). 마사 누스바움(Martha Nussbaum, 1947- )은 이를 역량 접근(capability approach), 곧 실제로 실행할 수 있는 능력으로 정식화했다(『역량의 창조』, 2011). 공동체가 개인에게 역량을 제공하는 한에서 위임은 정당성을 갖는다.</w:t>
       </w:r>
     </w:p>
     <w:p>
@@ -356,7 +356,7 @@
           <w:color w:val="000000"/>
           <w:sz w:val="21"/>
         </w:rPr>
-        <w:t>이 과정에서 이웃과 마을은 공동 돌봄 기능을 상실했고 가정의 역할은 축소되었으며 국가의 기능은 확대되었다. 권리가 집중된 공동체는 다양한 개인의 필요에 개별적으로 대응하기 어렵다. 표준화는 평균 바깥의 개인을 배제하고 다양성을 제약한다.</w:t>
+        <w:t>이 과정에서 이웃과 마을은 공동 돌봄 기능을 상실했고 가정의 역할은 축소되었으며 국가의 기능은 확대되었다. 권리가 집중된 공동체는 다양한 개인의 필요에 개별 대응하기 어렵고, 표준화는 평균 바깥의 개인을 배제한다.</w:t>
       </w:r>
     </w:p>
     <w:p>
@@ -475,7 +475,7 @@
           <w:color w:val="000000"/>
           <w:sz w:val="21"/>
         </w:rPr>
-        <w:t>농업 시대의 노동 원리는 협동이었다. 경작·수확·방어는 공동 노동을 요구했다. 가정은 양육과 출산을, 이웃은 품앗이와 두레를, 마을은 공동 경작지 관리와 자치 의사결정을 분담했다. 국가는 신분 질서와 조세를 관장하는 원거리 존재였다. 한국의 품앗이는 비공식적이지만 정교한 권리 위임과 회수의 사례다. 생애주기도 협동의 논리를 따라, 아동기는 공동 노동의 준비기, 청년기는 혼인과 토지 상속으로 새 가정을 구성하는 시기, 중장년은 마을 자치의 중심, 노년은 봉양의 대상이었다.</w:t>
+        <w:t>농업 시대의 노동 원리는 협동이었다. 경작·수확·방어는 공동 노동을 요구했다. 가정은 양육과 출산을, 이웃은 품앗이와 두레를, 마을은 공동 경작지 관리와 자치 의사결정을 분담했다. 국가는 신분 질서와 조세를 관장하는 원거리 존재였다. 한국의 품앗이는 비공식적이지만 정교한 권리 위임과 회수의 사례다. 생애주기도 협동의 논리를 따라 아동기는 공동 노동의 준비기, 청년기는 새 가정 구성기, 중장년은 마을 자치의 중심, 노년은 봉양의 대상이었다.</w:t>
       </w:r>
     </w:p>
     <w:p>
@@ -660,7 +660,7 @@
           <w:color w:val="000000"/>
           <w:sz w:val="21"/>
         </w:rPr>
-        <w:t>유아·아동기는 여러 강점의 단서를 체험으로 확인하는 시기다. 농업 시대에는 집안일과 농사일 습득이, 산업화 시대에는 취학 준비와 기초 학력이 과제였고 두 시대 모두 아이의 필요는 외부 사회가 정의했다. 디지털 시대에는 다양한 체험으로 관심과 강점을 발견하고 실험하는 것이 과제가 된다. 가정은 관심을 지지하고, 이웃은 체험 기회를 제공하며, 마을은 공동 발견 프로그램을 운영한다. 가정이나 국가가 교육을 독점하는 구조에서 가정·이웃·마을이 역할을 분담하는 분산형 위임 구조로 이행하는 것이 이 단계의 핵심이다. 브론펜브레너가 중간체계(mesosystem)로 규정한 가정·이웃·마을의 상호 강화 구조가 이 단계에서 작동해야 한다. 체험이 풍부한 아이와 그렇지 못한 아이의 격차는 이미 이 단계에서 발생하므로 국가는 기회의 바닥을 보장하여 분산 구조를 뒷받침해야 한다.</w:t>
+        <w:t>유아·아동기는 여러 강점의 단서를 체험으로 확인하는 시기다. 농업 시대에는 집안일과 농사일 습득이, 산업화 시대에는 취학 준비와 기초 학력이 과제였고 두 시대 모두 아이의 필요는 외부 사회가 정의했다. 디지털 시대에는 다양한 체험으로 관심과 강점을 발견하고 실험하는 것이 과제가 된다. 가정은 관심을 지지하고 이웃은 체험 기회를 제공하며 마을은 공동 발견 프로그램을 운영한다. 가정이나 국가가 교육을 독점하는 구조에서 가정·이웃·마을이 역할을 분담하는 분산형 위임 구조로 이행하는 것이 이 단계의 핵심이며, 브론펜브레너가 중간체계(mesosystem)로 규정한 상호 강화 구조가 작동해야 한다. 체험 격차가 이미 이 단계에서 발생하므로 국가는 기회의 바닥을 보장해 분산 구조를 뒷받침한다.</w:t>
       </w:r>
     </w:p>
     <w:p>
@@ -693,7 +693,7 @@
           <w:color w:val="000000"/>
           <w:sz w:val="21"/>
         </w:rPr>
-        <w:t>청소년기는 정체성의 위기가 가장 첨예한 시기다. 에릭 에릭슨(Erik H. Erikson, 1902-1994)은 생애 발달을 여덟 단계로 나누어 각 단계의 심리사회적 과제를 제시했다(『아동기와 사회』, 1950). 청소년기의 과제는 정체성 대 역할 혼미(identity vs. role confusion)다. 농업 시대에는 가업 기술 습득이, 산업화 시대에는 입시 경쟁과 진학이 이 필요를 충족했다. 성적이 정체성을 규정했고 도시의 입시 교육과 국가의 대입 제도가 청소년의 권리 위임을 독점했다. 디지털 시대에는 마을이 멘토와 훈련 경로를 제공하고 도시가 심화 경로와 재진입 통로를 마련하여 각자의 강점이 점수 서열 바깥에서 길러질 조건을 형성한다.</w:t>
+        <w:t>청소년기는 정체성의 위기가 가장 첨예한 시기다. 에릭 에릭슨(Erik H. Erikson, 1902-1994)은 생애 발달을 여덟 단계로 나누어 각 단계의 심리사회적 과제를 제시했다(『아동기와 사회』, 1950). 청소년기의 과제는 정체성 대 역할 혼미(identity vs. role confusion)다. 농업 시대에는 가업 기술 습득이, 산업화 시대에는 입시 경쟁과 진학이 이 필요를 충족했고, 성적이 정체성을 규정하면서 도시의 입시 교육과 국가의 대입 제도가 청소년의 권리 위임을 독점했다. 디지털 시대에는 마을이 멘토와 훈련 경로를, 도시가 심화 경로와 재진입 통로를 마련해 각자의 강점이 점수 서열 바깥에서 길러질 조건을 형성한다.</w:t>
       </w:r>
     </w:p>
     <w:p>
@@ -726,7 +726,7 @@
           <w:color w:val="000000"/>
           <w:sz w:val="21"/>
         </w:rPr>
-        <w:t>청년기는 훈련으로 다듬어진 강점을 실제 성과로 발휘하는 시기다. 농업 시대에는 토지와 혼인을 통한 새 가정 구성이, 산업화 시대에는 안정된 직장 취업과 정착이 목표였고 두 경우 모두 필요는 외부가 규정했으며 국가와 도시가 경로를 통제했다. 디지털 시대 청년의 필요는 정체성을 실제 성과로 발휘할 영역이다. 인공지능과 플랫폼이 진입 비용을 낮추면서 개인은 대기업에 고용되지 않고도 가치를 생산할 수 있다. 산업화 시대 청년이 노동력과 결정권을 기업과 국가에 대규모로 위임하는 것이 거의 유일한 선택지였다면, 디지털 시대에는 도시에 발휘의 기반을 위임하고 세계와 선택적으로 협업하며 재편할 수 있는 유연한 위임 구조가 가능하다. 예스타 에스핑안데르센(Gøsta Esping-Andersen, 1947- )은 지식경제 시대에는 복지를 소득 보전에 한정하지 말고 교육·보육·재훈련 같은 사람에 대한 사전 투자, 곧 사회투자(social investment)로 전환해야 한다고 강조했다.</w:t>
+        <w:t>청년기는 훈련으로 다듬어진 강점을 실제 성과로 발휘하는 시기다. 농업 시대에는 토지와 혼인을 통한 새 가정 구성이, 산업화 시대에는 안정된 직장 취업과 정착이 목표였고 두 경우 모두 필요는 외부가 규정했으며 국가와 도시가 경로를 통제했다. 디지털 시대 청년의 필요는 정체성을 실제 성과로 발휘할 영역이다. 인공지능과 플랫폼이 진입 비용을 낮추면서 개인은 대기업에 고용되지 않고도 가치를 생산할 수 있다. 산업화 시대 청년에게 노동력과 결정권을 기업·국가에 대규모로 위임하는 것이 거의 유일한 선택지였다면, 디지털 시대에는 도시에 발휘의 기반을 위임하고 세계와 선택적으로 협업하며 재편할 수 있는 유연한 위임 구조가 가능하다. 예스타 에스핑안데르센(Gøsta Esping-Andersen, 1947- )은 지식경제 시대에는 복지를 소득 보전에 한정하지 말고 교육·보육·재훈련 같은 사람에 대한 사전 투자, 곧 사회투자(social investment)로 전환해야 한다고 강조했다.</w:t>
       </w:r>
     </w:p>
     <w:p>
@@ -792,7 +792,7 @@
           <w:color w:val="000000"/>
           <w:sz w:val="21"/>
         </w:rPr>
-        <w:t>농업 시대의 노년은 봉양의 대상, 산업화 시대의 노년은 은퇴와 부양의 대상이었고 두 시대 모두 노인을 수혜자로 규정했다. 디지털 시대는 건강을 미리 예측·예방하면서 존엄과 판단의 주도권을 유지하고, 경험을 다음 세대에 전수하며 세대를 연결하는 능동적 전수자로서의 노년을 제시한다. 에릭슨은 노년기의 과제를 자아통합 대 절망(ego integrity vs. despair)으로 규정했다. 삶 전체를 통합적으로 수용하지 못하면 절망에 빠진다. 전수 통로와 역할이 주어지고 관계 안에 머물 수 있는 공동체 구조가 통합을 가능하게 한다. 가정은 돌봄과 존엄의 생활 공간을, 이웃은 관계의 지속을, 마을과 도시는 멘토와 자문 역할을 담당하고 국가는 소득의 최소 기반과 고립 방지를 맡는다. 폴라니의 개념으로 보면 노인이 시장과 국가 연금에만 의존하는 상태는 탈배태이며, 재배태는 노인이 관계와 역할의 그물로 회복되는 것이다.</w:t>
+        <w:t>농업 시대의 노년은 봉양의 대상, 산업화 시대의 노년은 은퇴와 부양의 대상이었고 두 시대 모두 노인을 수혜자로 규정했다. 디지털 시대는 건강을 미리 예측·예방하면서 존엄과 판단의 주도권을 유지하고, 경험을 다음 세대에 전수하며 세대를 연결하는 능동적 전수자로서의 노년을 제시한다. 에릭슨은 노년기의 과제를 자아통합 대 절망(ego integrity vs. despair)으로 규정했다. 삶 전체를 통합적으로 수용하지 못하면 절망에 빠진다. 전수 통로와 역할이 주어지고 관계 안에 머물 수 있는 공동체 구조가 통합을 가능하게 한다. 가정은 돌봄과 존엄의 생활 공간을, 이웃은 관계의 지속을, 마을과 도시는 멘토와 자문을 담당하고 국가는 소득의 최소 기반과 고립 방지를 맡는다. 폴라니의 개념으로 보면 노인이 시장과 국가 연금에만 의존하는 상태는 탈배태이며, 재배태는 노인이 관계와 역할의 그물로 회복되는 것이다.</w:t>
       </w:r>
     </w:p>
     <w:p>
@@ -877,7 +877,7 @@
           <w:color w:val="000000"/>
           <w:sz w:val="21"/>
         </w:rPr>
-        <w:t>이웃은 산업화 시대에 가장 크게 위축된 공동체다. 표준 제도가 모든 것을 조직하면서 이웃 간 상호 돌봄과 협동 기능이 소멸했다. 정체성 발휘의 시대에 이웃은 아이가 흥미를 실험하고 성인이 새 관계를 맺는 일상망으로서 중요성을 회복한다. 관심 기반 모임, 생활 멘토, 상호 돌봄이 이웃 단위에서 이루어질 때 개인은 발견의 기회를 얻으며, 단절된 사람이 관계망으로 복귀하는 첫 경로도 이웃이다. 오스트롬이 분석한 스위스 알프스 목초지 공동 관리와 일본 어촌의 어장 자치는 이웃 규모의 자치가 정교하게 작동할 수 있음을 보여준다.</w:t>
+        <w:t>이웃은 산업화 시대에 가장 크게 위축된 공동체다. 표준 제도가 모든 것을 조직하면서 이웃 간 상호 돌봄과 협동 기능이 소멸했다. 정체성 발휘의 시대에 이웃은 아이가 흥미를 실험하고 성인이 새 관계를 맺는 일상망으로서 중요성을 회복한다. 관심 기반 모임과 상호 돌봄이 이웃 단위에서 이루어질 때 개인은 발견의 기회를 얻으며, 단절된 사람이 관계망으로 복귀하는 첫 경로도 이웃이다. 오스트롬이 분석한 스위스 알프스 목초지와 일본 어촌의 어장 자치는 이웃 규모의 자치가 정교하게 작동함을 보여준다.</w:t>
       </w:r>
     </w:p>
     <w:p>
@@ -960,7 +960,7 @@
           <w:color w:val="000000"/>
           <w:sz w:val="21"/>
         </w:rPr>
-        <w:t>그러나 모든 기능이 한 대도시에 집중되면 개인이 위임한 권리도 거대한 행정 단위에 묶여 회수하기 어려워진다. 이는 국가로의 권리 집중과 동일한 문제를 도시 규모에서 반복하는 것이다. 개인은 자신이 어디에 무엇을 맡겼는지 확인하고 필요하면 회수할 수 있는 규모 안에서만 권리를 능동적으로 위임한다. 따라서 디지털 시대의 도시는 단일 대도시가 아니라 체감 가능한 규모의 강소도시들이 연합하는 형태로 재편되어야 한다. 강소도시는 한 사람의 강점을 알아보고 성과의 기회를 연결할 만큼 작고 구체적인 생활권이며, 이 규모에서는 위임한 결정권이 어떻게 쓰이는지 확인하고 조정할 수 있다. 동시에 작은 도시 하나만으로는 시장과 데이터, 기회의 폭이 부족하므로 강소도시들은 데이터·인공지능·행정·산업 기반을 연결해 하나의 연합 생활권을 구성한다. 발휘의 폭은 연합 전체에서 확보하되 권리의 위임과 회수는 개인이 속한 작은 도시 단위에서 이루어지는 구조다. 규모의 효율은 연합으로 확보하고 권리의 통제권은 개인 가까이에 남기는 것이 대도시를 강소도시의 연합으로 재편해야 하는 근거다.</w:t>
+        <w:t>그러나 모든 기능이 한 대도시에 집중되면 개인이 위임한 권리도 거대한 행정 단위에 묶여 회수하기 어려워진다. 이는 국가로의 권리 집중과 동일한 문제를 도시 규모에서 반복하는 것이다. 개인은 자신이 어디에 무엇을 맡겼는지 확인하고 필요하면 회수할 수 있는 규모 안에서만 권리를 능동적으로 위임한다. 따라서 디지털 시대의 도시는 단일 대도시가 아니라 체감 가능한 규모의 강소도시들이 연합하는 형태로 재편되어야 한다. 강소도시는 한 사람의 강점을 알아보고 성과의 기회를 연결할 만큼 작고 구체적인 생활권으로, 위임한 결정권이 어떻게 쓰이는지 확인하고 조정할 수 있다. 작은 도시 하나만으로는 시장과 데이터의 폭이 부족하므로 강소도시들은 데이터·인공지능·행정·산업 기반을 연결해 하나의 연합 생활권을 구성한다. 발휘의 폭은 연합에서 확보하되 권리의 위임과 회수는 개인이 속한 작은 도시 단위에서 이루어지는 구조다. 규모의 효율은 연합으로, 권리의 통제권은 개인 가까이에 남기는 것이 대도시를 강소도시 연합으로 재편해야 하는 근거다.</w:t>
       </w:r>
     </w:p>
     <w:p>

</xml_diff>

<commit_message>
docs: P2 report final compression + EN-KR term glosses, proximal process=근접 과정
</commit_message>
<xml_diff>
--- a/archive/docx/p2-lifecycle-community-report.docx
+++ b/archive/docx/p2-lifecycle-community-report.docx
@@ -7,7 +7,7 @@
     <w:p/>
     <w:p>
       <w:pPr>
-        <w:spacing w:before="0" w:after="480" w:line="384" w:lineRule="auto"/>
+        <w:spacing w:before="0" w:after="480" w:line="360" w:lineRule="auto"/>
         <w:jc w:val="center"/>
       </w:pPr>
       <w:r>
@@ -41,7 +41,7 @@
     </w:p>
     <w:p>
       <w:pPr>
-        <w:spacing w:before="0" w:after="800" w:line="384" w:lineRule="auto"/>
+        <w:spacing w:before="0" w:after="800" w:line="360" w:lineRule="auto"/>
         <w:jc w:val="center"/>
       </w:pPr>
       <w:r>
@@ -57,7 +57,7 @@
     </w:p>
     <w:p>
       <w:pPr>
-        <w:spacing w:before="0" w:after="80" w:line="384" w:lineRule="auto"/>
+        <w:spacing w:before="0" w:after="80" w:line="360" w:lineRule="auto"/>
         <w:jc w:val="center"/>
       </w:pPr>
       <w:r>
@@ -73,7 +73,7 @@
     </w:p>
     <w:p>
       <w:pPr>
-        <w:spacing w:before="0" w:after="80" w:line="384" w:lineRule="auto"/>
+        <w:spacing w:before="0" w:after="80" w:line="360" w:lineRule="auto"/>
         <w:jc w:val="center"/>
       </w:pPr>
       <w:r>
@@ -89,7 +89,7 @@
     </w:p>
     <w:p>
       <w:pPr>
-        <w:spacing w:before="0" w:after="120" w:line="384" w:lineRule="auto"/>
+        <w:spacing w:before="0" w:after="100" w:line="360" w:lineRule="auto"/>
         <w:jc w:val="center"/>
       </w:pPr>
       <w:r>
@@ -111,7 +111,7 @@
     <w:p>
       <w:pPr>
         <w:keepNext/>
-        <w:spacing w:before="360" w:after="160"/>
+        <w:spacing w:before="280" w:after="120"/>
         <w:pBdr>
           <w:bottom w:val="single" w:sz="8" w:space="4" w:color="000000"/>
         </w:pBdr>
@@ -129,7 +129,7 @@
     </w:p>
     <w:p>
       <w:pPr>
-        <w:spacing w:before="0" w:after="160" w:line="384" w:lineRule="auto"/>
+        <w:spacing w:before="0" w:after="160" w:line="360" w:lineRule="auto"/>
         <w:ind w:firstLine="227"/>
         <w:jc w:val="both"/>
       </w:pPr>
@@ -141,12 +141,12 @@
           <w:color w:val="000000"/>
           <w:sz w:val="21"/>
         </w:rPr>
-        <w:t>공동체는 개인이 필요에 따라 권리의 일부를 위임하는 계약으로 구현되는 실체다. 개인이 먼저 있고, 생애 단계마다 필요가 달라지면 그 필요를 감당하기 위해 공동체가 구성된다. 위임이 모여 공동체가 서며, 그 공동체가 더 이상 필요하지 않을 때 개인은 위임한 권리를 회수할 수 있어야 한다. 이 연구는 위임과 회수의 계약 논리를 토대로 농업·산업화·디지털 세 시대의 노동 원리, 생애주기별 필요, 그 필요에 응답하는 공동체의 형성과 역할을 정합적으로 연결한다. 산업화 시대에는 표준 교육과 안정된 고용이라는 당대의 필요에 맞추어 권리가 국가로 집중되었다. 이 집중은 당대의 필요에는 부합했으나 정체성 발휘를 요구하는 디지털 시대의 필요에는 맞지 않는다. 디지털 전환은 집중된 권리를 가정·이웃·마을·도시·국가·세계의 여러 층위로 다시 분산하는 과정으로 해석된다. 논의는 홉스·로크·루소의 사회계약론을 토대로 삼고, 에릭슨의 생애 발달 이론, 브론펜브레너의 생태체계 이론, 오스트롬의 다중심 거버넌스, 센·누스바움의 역량 접근, 폴라니의 탈배태·재배태 개념, 마이클 영의 능력주의 비판, 에스핑안데르센의 사회투자론, 헥만의 생애 초기 투자 연구로 보완된다.</w:t>
+        <w:t>공동체는 개인이 필요에 따라 권리의 일부를 위임하는 계약으로 구현되는 실체다. 개인이 먼저 있고, 생애 단계마다 필요가 달라지면 공동체가 구성된다. 위임이 더 이상 필요하지 않을 때 개인은 위임한 권리를 회수할 수 있어야 한다. 이 연구는 위임과 회수의 계약 논리를 토대로 농업·산업화·디지털 세 시대의 노동 원리, 생애주기별 필요, 그 필요에 응답하는 공동체의 형성과 역할을 정합적으로 연결한다. 산업화 시대의 권리 집중은 당대의 필요에는 부합했으나 정체성 발휘를 요구하는 디지털 시대에는 맞지 않는다. 디지털 전환은 집중된 권리를 가정·이웃·마을·도시·국가·세계의 여러 층위로 다시 분산하는 과정으로 해석된다. 논의는 홉스·로크·루소의 사회계약론을 토대로 삼고, 에릭슨의 생애 발달 이론, 브론펜브레너의 생태체계 이론, 오스트롬의 다중심 거버넌스, 센·누스바움의 역량 접근, 폴라니의 탈배태·재배태 개념, 마이클 영의 능력주의 비판, 에스핑안데르센의 사회투자론, 헥만의 생애 초기 투자 연구로 보완된다.</w:t>
       </w:r>
     </w:p>
     <w:p>
       <w:pPr>
-        <w:spacing w:before="0" w:after="80" w:line="384" w:lineRule="auto"/>
+        <w:spacing w:before="0" w:after="80" w:line="360" w:lineRule="auto"/>
         <w:jc w:val="both"/>
       </w:pPr>
       <w:r>
@@ -173,7 +173,7 @@
     <w:p>
       <w:pPr>
         <w:keepNext/>
-        <w:spacing w:before="360" w:after="160"/>
+        <w:spacing w:before="280" w:after="120"/>
         <w:pBdr>
           <w:bottom w:val="single" w:sz="8" w:space="4" w:color="000000"/>
         </w:pBdr>
@@ -191,7 +191,7 @@
     </w:p>
     <w:p>
       <w:pPr>
-        <w:spacing w:before="0" w:after="120" w:line="384" w:lineRule="auto"/>
+        <w:spacing w:before="0" w:after="100" w:line="360" w:lineRule="auto"/>
         <w:ind w:firstLine="227"/>
         <w:jc w:val="both"/>
       </w:pPr>
@@ -203,12 +203,12 @@
           <w:color w:val="000000"/>
           <w:sz w:val="21"/>
         </w:rPr>
-        <w:t>이 연구는 공동체를 개인이 필요에 따라 권리의 일부를 위임하는 계약으로 구현된 실체로 규정한다. 개인이 먼저 있고, 생애에서 마주치는 필요에 따라 공동체가 구성된다. 위임이 철회되면 공동체는 근거를 잃는다. 부모가 자녀를 위해 마을 돌봄 조직에 시간과 결정권의 일부를 맡기는 것이 위임이며, 이주하거나 그 조직이 역할을 다하지 못한다고 판단하면 위임을 회수할 수 있어야 한다. 이 관점은 공동체를 개인에 앞서 존재하는 유기체가 아니라 개인의 선택과 위임으로 구성·유지·해소되는 계약적 실체로 본다는 점에서 기존 공동체론과 구별된다.</w:t>
+        <w:t>이 연구는 공동체를 개인이 필요에 따라 권리의 일부를 위임하는 계약으로 구현된 실체로 규정한다. 개인이 먼저 있고, 생애에서 마주치는 필요에 따라 공동체가 구성된다. 위임이 철회되면 공동체는 근거를 잃는다. 부모가 마을 돌봄 조직에 결정권의 일부를 맡기는 것이 위임이며, 그 조직이 역할을 다하지 못하면 위임을 회수할 수 있어야 한다. 이 관점은 공동체를 개인의 선택과 위임으로 구성·유지·해소되는 계약적 실체로 본다는 점에서 기존 공동체론과 구별된다.</w:t>
       </w:r>
     </w:p>
     <w:p>
       <w:pPr>
-        <w:spacing w:before="0" w:after="120" w:line="384" w:lineRule="auto"/>
+        <w:spacing w:before="0" w:after="100" w:line="360" w:lineRule="auto"/>
         <w:ind w:firstLine="227"/>
         <w:jc w:val="both"/>
       </w:pPr>
@@ -220,30 +220,13 @@
           <w:color w:val="000000"/>
           <w:sz w:val="21"/>
         </w:rPr>
-        <w:t>토머스 홉스(Thomas Hobbes, 1588-1679)는 『리바이어던』(1651)에서 만인의 만인에 대한 투쟁을 벗어나기 위해 개인이 권리를 통치자에게 양도하는 계약을 제시했으나, 그 모형에서 위임은 사실상 회수 불가능하다. 존 로크(John Locke, 1632-1704)는 『통치론』(1689)에서 통치자에게 권력을 맡기는 것은 신탁(trust)이며 그 신탁이 깨지면 권리를 회수할 수 있다고 보았다. 로크의 신탁과 저항권은 이 연구가 전제하는 위임 회수 가능성의 직접적 근거다. 장자크 루소(Jean-Jacques Rousseau, 1712-1778)는 『사회계약론』(1762)에서 일반의지(general will)를 통해 권리가 한 개인이나 한 기관에 집중되어서는 안 된다고 주장하며 자치와 분산의 원리를 옹호했다. 세 논의를 종합하면, 공동체는 개인의 권리 위임으로 성립하고(홉스), 그 위임은 회수 가능해야 하며(로크), 권리는 한 곳에 집중되어서는 안 된다(루소).</w:t>
-      </w:r>
-    </w:p>
-    <w:p>
-      <w:pPr>
-        <w:spacing w:before="0" w:after="120" w:line="384" w:lineRule="auto"/>
-        <w:ind w:firstLine="227"/>
-        <w:jc w:val="both"/>
-      </w:pPr>
-      <w:r>
-        <w:rPr>
-          <w:rFonts w:ascii="Noto Serif KR" w:hAnsi="Noto Serif KR" w:eastAsia="Noto Serif KR"/>
-          <w:b w:val="0"/>
-          <w:i w:val="0"/>
-          <w:color w:val="000000"/>
-          <w:sz w:val="21"/>
-        </w:rPr>
-        <w:t>이 토대 위에서 세 가지 물음을 검토한다. 시대별 노동 원리는 개인의 필요와 공동체의 형태를 어떻게 규정했는가. 생애주기 단계별로 달라지는 필요에 어떤 공동체가 응답했는가. 디지털 전환은 왜 권리 재분산의 관점에서 분석되어야 하는가.</w:t>
+        <w:t>토머스 홉스(Thomas Hobbes, 1588-1679)는 『리바이어던』(1651)에서 만인의 만인에 대한 투쟁을 벗어나기 위해 개인이 권리를 통치자에게 양도하는 계약을 제시했으나, 그 모형에서 위임은 회수 불가능하다. 존 로크(John Locke, 1632-1704)는 『통치론』(1689)에서 통치자에게 권력을 맡기는 것은 신탁(trust)이며 신탁이 깨지면 권리를 회수할 수 있다고 보았다. 로크의 신탁과 저항권은 이 연구가 전제하는 위임 회수 가능성의 직접적 근거다. 장자크 루소(Jean-Jacques Rousseau, 1712-1778)는 『사회계약론』(1762)에서 일반의지(general will)를 통해 권리가 한 개인이나 한 기관에 집중되어서는 안 된다고 주장하며 자치와 분산의 원리를 옹호했다. 세 논의를 종합하면, 공동체는 개인의 권리 위임으로 성립하고(홉스), 위임은 회수 가능해야 하며(로크), 권리는 한 곳에 집중되어서는 안 된다(루소).</w:t>
       </w:r>
     </w:p>
     <w:p>
       <w:pPr>
         <w:keepNext/>
-        <w:spacing w:before="360" w:after="160"/>
+        <w:spacing w:before="280" w:after="120"/>
         <w:pBdr>
           <w:bottom w:val="single" w:sz="8" w:space="4" w:color="000000"/>
         </w:pBdr>
@@ -262,7 +245,7 @@
     <w:p>
       <w:pPr>
         <w:keepNext/>
-        <w:spacing w:before="240" w:after="80"/>
+        <w:spacing w:before="180" w:after="60"/>
       </w:pPr>
       <w:r>
         <w:rPr>
@@ -277,7 +260,7 @@
     </w:p>
     <w:p>
       <w:pPr>
-        <w:spacing w:before="0" w:after="120" w:line="384" w:lineRule="auto"/>
+        <w:spacing w:before="0" w:after="100" w:line="360" w:lineRule="auto"/>
         <w:ind w:firstLine="227"/>
         <w:jc w:val="both"/>
       </w:pPr>
@@ -289,12 +272,12 @@
           <w:color w:val="000000"/>
           <w:sz w:val="21"/>
         </w:rPr>
-        <w:t>공동체를 권리 위임의 계약으로 보면 일상의 행위가 위임으로 해석된다. 가정에 시간과 돌봄을 제공하는 것, 마을 자치 조직에 결정권을 맡기는 것, 국가에 세금을 내고 법을 따르는 것이 모두 권리 위임이다. 공동체의 규모와 권한은 위임된 권리의 양에 따라 결정된다. 개인은 혼자 감당할 수 없는 필요가 생기면 그 필요를 충족할 공동체에 권리를 위임하고, 필요가 변하면 위임의 대상과 규모도 달라진다. 청년기에는 도시와 직장에 많은 권리를 위임하고, 중장년기에는 가정과 이웃으로 위임의 무게중심이 이동하며, 노년기에는 돌봄과 존엄을 위한 공동체에 대한 의존이 커진다.</w:t>
+        <w:t>공동체를 권리 위임의 계약으로 보면 일상의 행위가 위임으로 해석된다. 가정에 시간과 돌봄을 제공하는 것, 마을 자치 조직에 결정권을 맡기는 것, 국가에 세금을 내고 법을 따르는 것이 모두 권리 위임이다. 공동체의 규모와 권한은 위임된 권리의 양에 따라 결정된다. 개인은 혼자 감당할 수 없는 필요가 생기면 그 필요를 충족할 공동체에 권리를 위임하며, 필요가 변하면 위임의 대상과 규모도 달라진다. 청년기에는 도시와 직장에, 중장년기에는 가정과 이웃에, 노년기에는 돌봄 공동체에 위임의 무게중심이 이동한다.</w:t>
       </w:r>
     </w:p>
     <w:p>
       <w:pPr>
-        <w:spacing w:before="0" w:after="120" w:line="384" w:lineRule="auto"/>
+        <w:spacing w:before="0" w:after="100" w:line="360" w:lineRule="auto"/>
         <w:ind w:firstLine="227"/>
         <w:jc w:val="both"/>
       </w:pPr>
@@ -312,7 +295,7 @@
     <w:p>
       <w:pPr>
         <w:keepNext/>
-        <w:spacing w:before="240" w:after="80"/>
+        <w:spacing w:before="180" w:after="60"/>
       </w:pPr>
       <w:r>
         <w:rPr>
@@ -327,7 +310,7 @@
     </w:p>
     <w:p>
       <w:pPr>
-        <w:spacing w:before="0" w:after="120" w:line="384" w:lineRule="auto"/>
+        <w:spacing w:before="0" w:after="100" w:line="360" w:lineRule="auto"/>
         <w:ind w:firstLine="227"/>
         <w:jc w:val="both"/>
       </w:pPr>
@@ -339,12 +322,12 @@
           <w:color w:val="000000"/>
           <w:sz w:val="21"/>
         </w:rPr>
-        <w:t>로크의 신탁 이론은 위임이 조건부임을 함의한다. 국가가 권리를 올바르게 사용하리라는 신탁이 깨지면 권리는 개인에게 회복되어야 한다. 그러나 산업화 시대에는 회수 경로가 제한되었다. 국가가 교육·고용·복지·의료를 중앙에서 관리했고, 개인은 국가 교육을 거쳐 인증된 기업에 취업하고 노년에 국가 연금에 의존하는 단선 경로에 편입되었다. 이 경로 바깥에 서는 것은 사회적 배제를 의미했다. 장애인이나 소수 언어 사용자처럼 표준 경로가 맞지 않는 사람은 제도 안에서 드러나지 않았다.</w:t>
+        <w:t>로크의 신탁 이론은 위임이 조건부임을 함의한다. 신탁이 깨지면 권리는 개인에게 회복되어야 한다. 그러나 산업화 시대에는 회수 경로가 제한되었다. 국가가 교육·고용·복지·의료를 중앙에서 관리했고, 개인은 국가 교육을 거쳐 인증된 기업에 취업하고 노년에 국가 연금에 의존하는 단선 경로에 편입되었다. 이 경로 바깥에 서는 것은 사회적 배제를 의미했고, 장애인이나 소수 언어 사용자처럼 표준 경로가 맞지 않는 사람은 제도 안에서 드러나지 않았다.</w:t>
       </w:r>
     </w:p>
     <w:p>
       <w:pPr>
-        <w:spacing w:before="0" w:after="120" w:line="384" w:lineRule="auto"/>
+        <w:spacing w:before="0" w:after="100" w:line="360" w:lineRule="auto"/>
         <w:ind w:firstLine="227"/>
         <w:jc w:val="both"/>
       </w:pPr>
@@ -361,7 +344,7 @@
     </w:p>
     <w:p>
       <w:pPr>
-        <w:spacing w:before="0" w:after="120" w:line="384" w:lineRule="auto"/>
+        <w:spacing w:before="0" w:after="100" w:line="360" w:lineRule="auto"/>
         <w:ind w:firstLine="227"/>
         <w:jc w:val="both"/>
       </w:pPr>
@@ -379,7 +362,7 @@
     <w:p>
       <w:pPr>
         <w:keepNext/>
-        <w:spacing w:before="240" w:after="80"/>
+        <w:spacing w:before="180" w:after="60"/>
       </w:pPr>
       <w:r>
         <w:rPr>
@@ -394,7 +377,7 @@
     </w:p>
     <w:p>
       <w:pPr>
-        <w:spacing w:before="0" w:after="120" w:line="384" w:lineRule="auto"/>
+        <w:spacing w:before="0" w:after="100" w:line="360" w:lineRule="auto"/>
         <w:ind w:firstLine="227"/>
         <w:jc w:val="both"/>
       </w:pPr>
@@ -411,7 +394,7 @@
     </w:p>
     <w:p>
       <w:pPr>
-        <w:spacing w:before="0" w:after="120" w:line="384" w:lineRule="auto"/>
+        <w:spacing w:before="0" w:after="100" w:line="360" w:lineRule="auto"/>
         <w:ind w:firstLine="227"/>
         <w:jc w:val="both"/>
       </w:pPr>
@@ -423,13 +406,13 @@
           <w:color w:val="000000"/>
           <w:sz w:val="21"/>
         </w:rPr>
-        <w:t>유리 브론펜브레너(Urie Bronfenbrenner, 1917-2005)는 개인의 발달을 중첩된 생태체계 안에서 분석했다(『인간 발달의 생태학』, 1979). 가정(미시체계), 이웃과 학교(중간체계), 부모의 직장(외체계), 사회의 가치 규범(거시체계)이 상호작용한다. 그의 핵심 명제는 개인에게 가장 큰 영향을 미치는 것이 가까운 공동체와의 직접적 상호작용, 곧 근접 과정(proximal process)이라는 것이다. 산업화 시대는 근접 과정이 일어나는 가정·이웃·마을을 약화시키고 권리를 거시체계인 국가로 집중함으로써 개인 발달의 토대를 약화시켰다.</w:t>
+        <w:t>유리 브론펜브레너(Urie Bronfenbrenner, 1917-2005)는 개인의 발달을 가정(미시체계), 이웃과 학교(중간체계), 부모의 직장(외체계), 사회의 가치 규범(거시체계)이 상호작용하는 중첩된 생태체계로 분석했다(『인간 발달의 생태학』, 1979). 그의 핵심 명제는 개인에게 가장 큰 영향을 미치는 것이 가까운 공동체와의 직접적 상호작용, 곧 근접 과정(proximal process)이라는 것이다. 산업화 시대는 근접 과정이 일어나는 가정·이웃·마을을 약화시키고 권리를 국가로 집중함으로써 개인 발달의 토대를 약화시켰다.</w:t>
       </w:r>
     </w:p>
     <w:p>
       <w:pPr>
         <w:keepNext/>
-        <w:spacing w:before="360" w:after="160"/>
+        <w:spacing w:before="280" w:after="120"/>
         <w:pBdr>
           <w:bottom w:val="single" w:sz="8" w:space="4" w:color="000000"/>
         </w:pBdr>
@@ -448,7 +431,7 @@
     <w:p>
       <w:pPr>
         <w:keepNext/>
-        <w:spacing w:before="240" w:after="80"/>
+        <w:spacing w:before="180" w:after="60"/>
       </w:pPr>
       <w:r>
         <w:rPr>
@@ -463,7 +446,7 @@
     </w:p>
     <w:p>
       <w:pPr>
-        <w:spacing w:before="0" w:after="120" w:line="384" w:lineRule="auto"/>
+        <w:spacing w:before="0" w:after="100" w:line="360" w:lineRule="auto"/>
         <w:ind w:firstLine="227"/>
         <w:jc w:val="both"/>
       </w:pPr>
@@ -481,7 +464,7 @@
     <w:p>
       <w:pPr>
         <w:keepNext/>
-        <w:spacing w:before="240" w:after="80"/>
+        <w:spacing w:before="180" w:after="60"/>
       </w:pPr>
       <w:r>
         <w:rPr>
@@ -496,7 +479,7 @@
     </w:p>
     <w:p>
       <w:pPr>
-        <w:spacing w:before="0" w:after="120" w:line="384" w:lineRule="auto"/>
+        <w:spacing w:before="0" w:after="100" w:line="360" w:lineRule="auto"/>
         <w:ind w:firstLine="227"/>
         <w:jc w:val="both"/>
       </w:pPr>
@@ -513,7 +496,7 @@
     </w:p>
     <w:p>
       <w:pPr>
-        <w:spacing w:before="0" w:after="120" w:line="384" w:lineRule="auto"/>
+        <w:spacing w:before="0" w:after="100" w:line="360" w:lineRule="auto"/>
         <w:ind w:firstLine="227"/>
         <w:jc w:val="both"/>
       </w:pPr>
@@ -531,7 +514,7 @@
     <w:p>
       <w:pPr>
         <w:keepNext/>
-        <w:spacing w:before="240" w:after="80"/>
+        <w:spacing w:before="180" w:after="60"/>
       </w:pPr>
       <w:r>
         <w:rPr>
@@ -546,7 +529,7 @@
     </w:p>
     <w:p>
       <w:pPr>
-        <w:spacing w:before="0" w:after="120" w:line="384" w:lineRule="auto"/>
+        <w:spacing w:before="0" w:after="100" w:line="360" w:lineRule="auto"/>
         <w:ind w:firstLine="227"/>
         <w:jc w:val="both"/>
       </w:pPr>
@@ -563,7 +546,7 @@
     </w:p>
     <w:p>
       <w:pPr>
-        <w:spacing w:before="0" w:after="120" w:line="384" w:lineRule="auto"/>
+        <w:spacing w:before="0" w:after="100" w:line="360" w:lineRule="auto"/>
         <w:ind w:firstLine="227"/>
         <w:jc w:val="both"/>
       </w:pPr>
@@ -575,13 +558,13 @@
           <w:color w:val="000000"/>
           <w:sz w:val="21"/>
         </w:rPr>
-        <w:t>이 전환은 권리 위임 방식도 바꾼다. 국가에 집중되었던 권리가 여러 공동체로 다시 분산될 조건이 형성된다. 가정은 정체성의 단서를 가장 먼저 읽는 공간으로서 중요성을 회복하고, 이웃과 마을은 정체성을 실험하고 훈련하는 관계망이 된다. 도시는 정체성을 실제 성과로 발휘하는 장이 되며, 국가는 모든 것을 관리하는 기관에서 여러 공동체가 작동하도록 최소 조건을 보장하는 조율자로 전환된다. 세계는 처음으로 개인의 발휘 영역으로 열린다. 국경을 넘는 협업이 가능해지면서 국내 노동시장에서 자리를 얻지 못한 사람도 세계 무대에서 성과를 낼 경로를 갖는다.</w:t>
+        <w:t>이 전환은 권리 위임 방식도 바꾼다. 국가에 집중되었던 권리가 여러 공동체로 다시 분산될 조건이 형성된다. 가정은 정체성의 단서를 읽는 공간으로 중요성을 회복하고, 이웃과 마을은 정체성을 실험·훈련하는 관계망이 되며, 도시는 성과를 발휘하는 장이, 국가는 여러 공동체가 작동하도록 최소 조건을 보장하는 조율자가 된다. 세계는 처음으로 개인의 발휘 영역으로 열려, 국내 노동시장에서 자리를 얻지 못한 사람도 세계 무대에서 성과를 낼 경로를 갖는다.</w:t>
       </w:r>
     </w:p>
     <w:p>
       <w:pPr>
         <w:keepNext/>
-        <w:spacing w:before="360" w:after="160"/>
+        <w:spacing w:before="280" w:after="120"/>
         <w:pBdr>
           <w:bottom w:val="single" w:sz="8" w:space="4" w:color="000000"/>
         </w:pBdr>
@@ -600,7 +583,7 @@
     <w:p>
       <w:pPr>
         <w:keepNext/>
-        <w:spacing w:before="240" w:after="80"/>
+        <w:spacing w:before="180" w:after="60"/>
       </w:pPr>
       <w:r>
         <w:rPr>
@@ -615,7 +598,7 @@
     </w:p>
     <w:p>
       <w:pPr>
-        <w:spacing w:before="0" w:after="120" w:line="384" w:lineRule="auto"/>
+        <w:spacing w:before="0" w:after="100" w:line="360" w:lineRule="auto"/>
         <w:ind w:firstLine="227"/>
         <w:jc w:val="both"/>
       </w:pPr>
@@ -627,13 +610,13 @@
           <w:color w:val="000000"/>
           <w:sz w:val="21"/>
         </w:rPr>
-        <w:t>태아·영아기는 고유한 가능성의 단서가 처음 드러나는 시기다. 농업 시대의 필요는 건강한 출산이었고 가정·이웃·마을이 공동으로 출산을 도왔다. 산업화 시대에는 표준 발달 기준에 맞는 양육이 필요로 규정되었고 국가가 임신·출산·영유아 건강 관리를 담당했다. 디지털 시대에는 타고난 기질과 강점의 단서를 일찍 발견하고 기록하는 것이 새로운 필요로 등장한다. 생체·행동 데이터를 분석하는 기술이 아이의 반응 양식을 이전보다 일찍 포착할 수 있게 하면서, 가정의 역할은 양육에서 정체성의 단서를 가장 먼저 읽고 기록하는 생활 기반으로 확대된다. 제임스 헥만(James Heckman, 1944- )은 생애 초기 양육·교육 환경에 대한 투자가 이후 어느 시기보다 높은 복리 효과를 낳으며, 성인기의 범죄 예방·소득 향상·복지 지출 감소로 수 배의 사회적 수익을 낳음을 실증했다. 데이터가 닿지 않는 아이를 먼저 찾아 지원하는 일은 삶에 가장 가까운 도시와 마을이 맡는 것이 효과적이며, 국가는 직접 제공자가 아니라 어느 도시에서 태어나도 기초 돌봄에서 밀려나지 않도록 도시 간 격차를 메우는 최소 보장선을 담당한다.</w:t>
+        <w:t>태아·영아기는 고유한 가능성의 단서가 처음 드러나는 시기다. 농업 시대의 필요는 건강한 출산이었고 가정·이웃·마을이 공동으로 출산을 도왔다. 산업화 시대에는 표준 발달 기준에 맞는 양육이 필요로 규정되었고 국가가 임신·출산·영유아 건강 관리를 담당했다. 디지털 시대에는 타고난 기질과 강점의 단서를 일찍 발견하고 기록하는 것이 새로운 필요로 등장한다. 생체·행동 데이터를 분석하는 기술이 아이의 반응 양식을 이전보다 일찍 포착할 수 있게 하면서, 가정의 역할은 양육에서 정체성의 단서를 가장 먼저 읽고 기록하는 생활 기반으로 확대된다. 제임스 헥만(James Heckman, 1944- )은 생애 초기 환경에 대한 투자가 이후 어느 시기보다 높은 복리 효과를 낳아 성인기의 범죄 예방·소득 향상·복지 지출 감소로 수 배의 사회적 수익을 낳음을 실증했다. 데이터가 닿지 않는 아이를 먼저 찾아 지원하는 일은 삶에 가장 가까운 도시와 마을이 맡는 것이 효과적이며, 국가는 직접 제공자가 아니라 어느 도시에서 태어나도 기초 돌봄에서 밀려나지 않도록 도시 간 격차를 메우는 최소 보장선을 담당한다.</w:t>
       </w:r>
     </w:p>
     <w:p>
       <w:pPr>
         <w:keepNext/>
-        <w:spacing w:before="240" w:after="80"/>
+        <w:spacing w:before="180" w:after="60"/>
       </w:pPr>
       <w:r>
         <w:rPr>
@@ -648,7 +631,7 @@
     </w:p>
     <w:p>
       <w:pPr>
-        <w:spacing w:before="0" w:after="120" w:line="384" w:lineRule="auto"/>
+        <w:spacing w:before="0" w:after="100" w:line="360" w:lineRule="auto"/>
         <w:ind w:firstLine="227"/>
         <w:jc w:val="both"/>
       </w:pPr>
@@ -666,7 +649,7 @@
     <w:p>
       <w:pPr>
         <w:keepNext/>
-        <w:spacing w:before="240" w:after="80"/>
+        <w:spacing w:before="180" w:after="60"/>
       </w:pPr>
       <w:r>
         <w:rPr>
@@ -681,7 +664,7 @@
     </w:p>
     <w:p>
       <w:pPr>
-        <w:spacing w:before="0" w:after="120" w:line="384" w:lineRule="auto"/>
+        <w:spacing w:before="0" w:after="100" w:line="360" w:lineRule="auto"/>
         <w:ind w:firstLine="227"/>
         <w:jc w:val="both"/>
       </w:pPr>
@@ -693,13 +676,13 @@
           <w:color w:val="000000"/>
           <w:sz w:val="21"/>
         </w:rPr>
-        <w:t>청소년기는 정체성의 위기가 가장 첨예한 시기다. 에릭 에릭슨(Erik H. Erikson, 1902-1994)은 생애 발달을 여덟 단계로 나누어 각 단계의 심리사회적 과제를 제시했다(『아동기와 사회』, 1950). 청소년기의 과제는 정체성 대 역할 혼미(identity vs. role confusion)다. 농업 시대에는 가업 기술 습득이, 산업화 시대에는 입시 경쟁과 진학이 이 필요를 충족했고, 성적이 정체성을 규정하면서 도시의 입시 교육과 국가의 대입 제도가 청소년의 권리 위임을 독점했다. 디지털 시대에는 마을이 멘토와 훈련 경로를, 도시가 심화 경로와 재진입 통로를 마련해 각자의 강점이 점수 서열 바깥에서 길러질 조건을 형성한다.</w:t>
+        <w:t>청소년기는 정체성의 위기가 가장 첨예한 시기다. 에릭 에릭슨(Erik H. Erikson, 1902-1994)은 생애 발달을 여덟 단계로 나누어 각 단계의 심리사회적 과제를 제시했고(『아동기와 사회』, 1950), 청소년기의 과제를 정체성 대 역할 혼미(identity vs. role confusion)로 규정했다. 농업 시대에는 가업 기술 습득이, 산업화 시대에는 입시 경쟁과 진학이 이 필요를 충족했고, 성적이 정체성을 규정하면서 도시의 입시 교육과 국가의 대입 제도가 청소년의 권리 위임을 독점했다. 디지털 시대에는 마을이 멘토와 훈련 경로를, 도시가 심화 경로와 재진입 통로를 마련해 각자의 강점이 점수 서열 바깥에서 길러질 조건을 형성한다.</w:t>
       </w:r>
     </w:p>
     <w:p>
       <w:pPr>
         <w:keepNext/>
-        <w:spacing w:before="240" w:after="80"/>
+        <w:spacing w:before="180" w:after="60"/>
       </w:pPr>
       <w:r>
         <w:rPr>
@@ -714,7 +697,7 @@
     </w:p>
     <w:p>
       <w:pPr>
-        <w:spacing w:before="0" w:after="120" w:line="384" w:lineRule="auto"/>
+        <w:spacing w:before="0" w:after="100" w:line="360" w:lineRule="auto"/>
         <w:ind w:firstLine="227"/>
         <w:jc w:val="both"/>
       </w:pPr>
@@ -726,13 +709,13 @@
           <w:color w:val="000000"/>
           <w:sz w:val="21"/>
         </w:rPr>
-        <w:t>청년기는 훈련으로 다듬어진 강점을 실제 성과로 발휘하는 시기다. 농업 시대에는 토지와 혼인을 통한 새 가정 구성이, 산업화 시대에는 안정된 직장 취업과 정착이 목표였고 두 경우 모두 필요는 외부가 규정했으며 국가와 도시가 경로를 통제했다. 디지털 시대 청년의 필요는 정체성을 실제 성과로 발휘할 영역이다. 인공지능과 플랫폼이 진입 비용을 낮추면서 개인은 대기업에 고용되지 않고도 가치를 생산할 수 있다. 산업화 시대 청년에게 노동력과 결정권을 기업·국가에 대규모로 위임하는 것이 거의 유일한 선택지였다면, 디지털 시대에는 도시에 발휘의 기반을 위임하고 세계와 선택적으로 협업하며 재편할 수 있는 유연한 위임 구조가 가능하다. 예스타 에스핑안데르센(Gøsta Esping-Andersen, 1947- )은 지식경제 시대에는 복지를 소득 보전에 한정하지 말고 교육·보육·재훈련 같은 사람에 대한 사전 투자, 곧 사회투자(social investment)로 전환해야 한다고 강조했다.</w:t>
+        <w:t>청년기는 훈련으로 다듬어진 강점을 실제 성과로 발휘하는 시기다. 농업 시대에는 토지와 혼인을 통한 새 가정 구성이, 산업화 시대에는 안정된 직장 취업이 목표였고 필요는 외부가 규정했다. 디지털 시대 청년의 필요는 정체성을 실제 성과로 발휘할 영역이다. 인공지능과 플랫폼이 진입 비용을 낮추면서 개인은 대기업에 고용되지 않고도 가치를 생산할 수 있다. 산업화 시대 청년에게 노동력과 결정권을 기업·국가에 대규모로 위임하는 것이 거의 유일한 선택지였다면, 디지털 시대에는 도시에 발휘의 기반을 위임하고 세계와 선택적으로 협업하며 재편할 수 있는 유연한 위임 구조가 가능하다. 예스타 에스핑안데르센(Gøsta Esping-Andersen, 1947- )은 지식경제에서는 복지를 소득 보전이 아니라 교육·보육·재훈련 같은 사전 투자, 곧 사회적 투자(social investment)로 전환해야 한다고 강조했다.</w:t>
       </w:r>
     </w:p>
     <w:p>
       <w:pPr>
         <w:keepNext/>
-        <w:spacing w:before="240" w:after="80"/>
+        <w:spacing w:before="180" w:after="60"/>
       </w:pPr>
       <w:r>
         <w:rPr>
@@ -747,7 +730,7 @@
     </w:p>
     <w:p>
       <w:pPr>
-        <w:spacing w:before="0" w:after="120" w:line="384" w:lineRule="auto"/>
+        <w:spacing w:before="0" w:after="100" w:line="360" w:lineRule="auto"/>
         <w:ind w:firstLine="227"/>
         <w:jc w:val="both"/>
       </w:pPr>
@@ -759,13 +742,13 @@
           <w:color w:val="000000"/>
           <w:sz w:val="21"/>
         </w:rPr>
-        <w:t>중장년기는 디지털 전환의 혜택과 위험이 가장 불균등하게 갈리는 시기다. 산업화 시대의 목표는 고용 유지와 가족 부양이었고 권리 위임은 직장과 국가를 향했다. 안정된 고용이 유지되는 한 개인은 노동 시간과 역량을 기업에, 연금 권리를 국가에 위임하는 계약을 따랐다. 디지털 전환은 자동화와 인공지능이 기존 직무를 대체하면서 재학습과 강점의 재설계를 요구한다. 마을과 도시가 재학습 경로를 제공하고 가정과 국가가 전환기 보호를 담당하는 것은 축소되었던 선택권을 다시 분산하여 회복하는 과정이다. 에릭슨은 중장년기의 과제를 생산성 대 침체(generativity vs. stagnation)로 규정했다. 자신이 축적한 것을 새 방향으로 확장하지 못하면 정체와 고립에 빠진다. 이 과제에 응답하는 것은 개인의 의지가 아니라 재학습 기회를 제공하고 새 역할을 연결하며 전환기의 불안을 분담하는 공동체의 구조다.</w:t>
+        <w:t>중장년기는 디지털 전환의 혜택과 위험이 가장 불균등하게 갈리는 시기다. 산업화 시대의 목표는 고용 유지와 가족 부양이었고 권리 위임은 직장과 국가를 향했다. 디지털 전환은 자동화와 인공지능이 기존 직무를 대체하면서 재학습과 강점의 재설계를 요구한다. 마을과 도시가 재학습 경로를 제공하고 가정과 국가가 전환기 보호를 담당하는 것은 축소되었던 선택권을 다시 분산해 회복하는 과정이다. 에릭슨은 중장년기의 과제를 생산성 대 침체(generativity vs. stagnation)로 규정했다. 축적한 것을 새 방향으로 확장하지 못하면 정체와 고립에 빠지며, 이 과제에 응답하는 것은 개인의 의지가 아니라 재학습 기회와 새 역할을 제공하고 전환기 불안을 분담하는 공동체의 구조다.</w:t>
       </w:r>
     </w:p>
     <w:p>
       <w:pPr>
         <w:keepNext/>
-        <w:spacing w:before="240" w:after="80"/>
+        <w:spacing w:before="180" w:after="60"/>
       </w:pPr>
       <w:r>
         <w:rPr>
@@ -780,7 +763,7 @@
     </w:p>
     <w:p>
       <w:pPr>
-        <w:spacing w:before="0" w:after="120" w:line="384" w:lineRule="auto"/>
+        <w:spacing w:before="0" w:after="100" w:line="360" w:lineRule="auto"/>
         <w:ind w:firstLine="227"/>
         <w:jc w:val="both"/>
       </w:pPr>
@@ -792,13 +775,13 @@
           <w:color w:val="000000"/>
           <w:sz w:val="21"/>
         </w:rPr>
-        <w:t>농업 시대의 노년은 봉양의 대상, 산업화 시대의 노년은 은퇴와 부양의 대상이었고 두 시대 모두 노인을 수혜자로 규정했다. 디지털 시대는 건강을 미리 예측·예방하면서 존엄과 판단의 주도권을 유지하고, 경험을 다음 세대에 전수하며 세대를 연결하는 능동적 전수자로서의 노년을 제시한다. 에릭슨은 노년기의 과제를 자아통합 대 절망(ego integrity vs. despair)으로 규정했다. 삶 전체를 통합적으로 수용하지 못하면 절망에 빠진다. 전수 통로와 역할이 주어지고 관계 안에 머물 수 있는 공동체 구조가 통합을 가능하게 한다. 가정은 돌봄과 존엄의 생활 공간을, 이웃은 관계의 지속을, 마을과 도시는 멘토와 자문을 담당하고 국가는 소득의 최소 기반과 고립 방지를 맡는다. 폴라니의 개념으로 보면 노인이 시장과 국가 연금에만 의존하는 상태는 탈배태이며, 재배태는 노인이 관계와 역할의 그물로 회복되는 것이다.</w:t>
+        <w:t>농업 시대의 노년은 봉양의 대상, 산업화 시대의 노년은 은퇴와 부양의 대상이었고 두 시대 모두 노인을 수혜자로 규정했다. 디지털 시대는 건강을 예측·예방하며 존엄과 판단의 주도권을 유지하고, 경험을 다음 세대에 전수하며 세대를 연결하는 능동적 전수자로서의 노년을 제시한다. 에릭슨은 노년기의 과제를 자아통합 대 절망(ego integrity vs. despair)으로 규정했다. 삶 전체를 통합적으로 수용하지 못하면 절망에 빠진다. 전수 통로와 역할이 주어지고 관계 안에 머물 수 있는 공동체 구조가 통합을 가능하게 한다. 가정은 돌봄과 존엄의 생활 공간을, 이웃은 관계의 지속을, 마을과 도시는 멘토와 자문을 담당하고 국가는 소득의 최소 기반과 고립 방지를 맡는다. 폴라니의 개념으로 보면 노인이 시장과 국가 연금에만 의존하는 상태는 탈배태이며, 재배태는 노인을 관계와 역할의 그물로 되돌리는 것이다.</w:t>
       </w:r>
     </w:p>
     <w:p>
       <w:pPr>
         <w:keepNext/>
-        <w:spacing w:before="360" w:after="160"/>
+        <w:spacing w:before="280" w:after="120"/>
         <w:pBdr>
           <w:bottom w:val="single" w:sz="8" w:space="4" w:color="000000"/>
         </w:pBdr>
@@ -817,7 +800,7 @@
     <w:p>
       <w:pPr>
         <w:keepNext/>
-        <w:spacing w:before="240" w:after="80"/>
+        <w:spacing w:before="180" w:after="60"/>
       </w:pPr>
       <w:r>
         <w:rPr>
@@ -832,7 +815,7 @@
     </w:p>
     <w:p>
       <w:pPr>
-        <w:spacing w:before="0" w:after="120" w:line="384" w:lineRule="auto"/>
+        <w:spacing w:before="0" w:after="100" w:line="360" w:lineRule="auto"/>
         <w:ind w:firstLine="227"/>
         <w:jc w:val="both"/>
       </w:pPr>
@@ -844,13 +827,13 @@
           <w:color w:val="000000"/>
           <w:sz w:val="21"/>
         </w:rPr>
-        <w:t>가정은 개인이 태어나는 순간부터 가장 먼저 권리를 위임받는 공동체다. 농업 시대에 가정은 노동·양육·부양·교육을 모두 담당했고, 산업화 시대에는 교육을 학교에, 의료를 병원에 위임하면서 역할이 축소되었다. 디지털 시대 가정의 핵심 역할은 정체성의 단서를 가장 먼저 읽는 생활 기반이다. 아이가 무엇에 반응하고 어떤 활동에서 활기를 보이는지를 가까이에서 관찰하고 기록한다. 또한 중장년의 전환기와 노년의 돌봄·존엄을 지지한다. 브론펜브레너가 미시체계(microsystem)로 규정한, 개인이 직접 속하는 가장 가까운 환경이 가정이며, 이 층위가 건강해야 다른 공동체의 위임도 의미를 갖는다.</w:t>
+        <w:t>가정은 개인이 태어나는 순간부터 가장 먼저 권리를 위임받는 공동체다. 농업 시대에 가정은 노동·양육·부양·교육을 모두 담당했고 산업화 시대에는 교육과 의료를 학교·병원에 위임하면서 역할이 축소되었다. 디지털 시대 가정의 핵심 역할은 정체성의 단서를 가장 먼저 읽는 생활 기반이며, 중장년의 전환기와 노년의 돌봄·존엄을 지지한다. 브론펜브레너가 미시체계(microsystem)로 규정한, 개인이 직접 속하는 가장 가까운 환경이 가정이며 이 층위가 건강해야 다른 공동체의 위임도 의미를 갖는다.</w:t>
       </w:r>
     </w:p>
     <w:p>
       <w:pPr>
         <w:keepNext/>
-        <w:spacing w:before="240" w:after="80"/>
+        <w:spacing w:before="180" w:after="60"/>
       </w:pPr>
       <w:r>
         <w:rPr>
@@ -865,7 +848,7 @@
     </w:p>
     <w:p>
       <w:pPr>
-        <w:spacing w:before="0" w:after="120" w:line="384" w:lineRule="auto"/>
+        <w:spacing w:before="0" w:after="100" w:line="360" w:lineRule="auto"/>
         <w:ind w:firstLine="227"/>
         <w:jc w:val="both"/>
       </w:pPr>
@@ -877,13 +860,13 @@
           <w:color w:val="000000"/>
           <w:sz w:val="21"/>
         </w:rPr>
-        <w:t>이웃은 산업화 시대에 가장 크게 위축된 공동체다. 표준 제도가 모든 것을 조직하면서 이웃 간 상호 돌봄과 협동 기능이 소멸했다. 정체성 발휘의 시대에 이웃은 아이가 흥미를 실험하고 성인이 새 관계를 맺는 일상망으로서 중요성을 회복한다. 관심 기반 모임과 상호 돌봄이 이웃 단위에서 이루어질 때 개인은 발견의 기회를 얻으며, 단절된 사람이 관계망으로 복귀하는 첫 경로도 이웃이다. 오스트롬이 분석한 스위스 알프스 목초지와 일본 어촌의 어장 자치는 이웃 규모의 자치가 정교하게 작동함을 보여준다.</w:t>
+        <w:t xml:space="preserve">이웃은 산업화 시대에 표준 제도가 모든 것을 조직하면서 상호 돌봄과 협동 기능이 소멸해 가장 크게 위축된 공동체다. 정체성 발휘의 시대에 이웃은 아이가 흥미를 실험하고 성인이 새 관계를 맺는 일상망으로서 중요성을 회복한다. 관심 기반 모임과 상호 돌봄이 이웃 단위에서 이루어질 때 개인은 발견의 기회를 얻으며, 단절된 사람이 관계망으로 복귀하는 첫 경로도 이웃이다. </w:t>
       </w:r>
     </w:p>
     <w:p>
       <w:pPr>
         <w:keepNext/>
-        <w:spacing w:before="240" w:after="80"/>
+        <w:spacing w:before="180" w:after="60"/>
       </w:pPr>
       <w:r>
         <w:rPr>
@@ -898,7 +881,7 @@
     </w:p>
     <w:p>
       <w:pPr>
-        <w:spacing w:before="0" w:after="120" w:line="384" w:lineRule="auto"/>
+        <w:spacing w:before="0" w:after="100" w:line="360" w:lineRule="auto"/>
         <w:ind w:firstLine="227"/>
         <w:jc w:val="both"/>
       </w:pPr>
@@ -910,13 +893,13 @@
           <w:color w:val="000000"/>
           <w:sz w:val="21"/>
         </w:rPr>
-        <w:t>마을은 생애주기의 여러 단계에서 훈련과 재학습을 담당하는 공동체다. 산업화 시대에 도시에 기능을 넘기고 행정 단위로 축소되었던 마을은 디지털 시대에 발견된 방향을 훈련으로 연결하는 생활권으로 재편된다. 청소년에게는 마을 멘토단과 훈련 경로가, 중장년에게는 재학습 경로가 마을을 통해 제공된다. 마을은 중앙 정부가 직접 설계하기보다 구성원이 자치적으로 훈련 경로를 만들고 국가가 최소 기준을 보장할 때 가장 잘 작동한다. 센과 누스바움이 강조한 역량은 마을 단위의 훈련 환경이 갖춰질 때 구체적으로 형성된다.</w:t>
+        <w:t>마을은 생애주기의 여러 단계에서 훈련과 재학습을 담당하는 공동체다. 산업화 시대에 도시에 기능을 넘기고 행정 단위로 축소되었던 마을은 디지털 시대에 발견된 방향을 훈련으로 연결하는 생활권으로 재편된다. 청소년에게는 멘토단과 훈련 경로가, 중장년에게는 재학습 경로가 마을을 통해 제공되며, 구성원이 자치적으로 경로를 만들고 국가가 최소 기준을 보장할 때 가장 잘 작동한다. 센과 누스바움이 강조한 역량은 마을 단위의 훈련 환경이 갖춰질 때 구체적으로 형성된다.</w:t>
       </w:r>
     </w:p>
     <w:p>
       <w:pPr>
         <w:keepNext/>
-        <w:spacing w:before="240" w:after="80"/>
+        <w:spacing w:before="180" w:after="60"/>
       </w:pPr>
       <w:r>
         <w:rPr>
@@ -931,7 +914,7 @@
     </w:p>
     <w:p>
       <w:pPr>
-        <w:spacing w:before="0" w:after="120" w:line="384" w:lineRule="auto"/>
+        <w:spacing w:before="0" w:after="100" w:line="360" w:lineRule="auto"/>
         <w:ind w:firstLine="227"/>
         <w:jc w:val="both"/>
       </w:pPr>
@@ -943,12 +926,12 @@
           <w:color w:val="000000"/>
           <w:sz w:val="21"/>
         </w:rPr>
-        <w:t>도시는 산업화 시대에 학교와 공장을 집적하여 표준 인재를 생산·배치하는 기관이었다. 디지털 시대에 도시는 정체성을 실제 성과로 발휘하는 장이자 생활 기반으로 전환된다. 프로젝트 연결, 직무 전환, 생활 조정이 도시의 기능이 되며, 청년의 첫 성과와 중장년의 재설계가 도시를 통해 이루어진다. 도시에 위임되는 권리의 성격은 표준 경로에 자신을 맞추는 것에서 자신의 성과를 발휘할 기반을 만드는 것으로 바뀐다.</w:t>
+        <w:t>도시는 산업화 시대에 학교와 공장을 집적해 표준 인재를 생산·배치하는 기관이었다. 디지털 시대에 도시는 정체성을 실제 성과로 발휘하는 장이자 생활 기반으로 전환되어, 프로젝트 연결·직무 전환·생활 조정을 담당하고 청년의 첫 성과와 중장년의 재설계가 도시를 통해 이루어진다. 도시에 위임되는 권리의 성격은 표준 경로에 자신을 맞추는 것에서 성과를 발휘할 기반을 만드는 것으로 바뀐다.</w:t>
       </w:r>
     </w:p>
     <w:p>
       <w:pPr>
-        <w:spacing w:before="0" w:after="120" w:line="384" w:lineRule="auto"/>
+        <w:spacing w:before="0" w:after="100" w:line="360" w:lineRule="auto"/>
         <w:ind w:firstLine="227"/>
         <w:jc w:val="both"/>
       </w:pPr>
@@ -960,13 +943,13 @@
           <w:color w:val="000000"/>
           <w:sz w:val="21"/>
         </w:rPr>
-        <w:t>그러나 모든 기능이 한 대도시에 집중되면 개인이 위임한 권리도 거대한 행정 단위에 묶여 회수하기 어려워진다. 이는 국가로의 권리 집중과 동일한 문제를 도시 규모에서 반복하는 것이다. 개인은 자신이 어디에 무엇을 맡겼는지 확인하고 필요하면 회수할 수 있는 규모 안에서만 권리를 능동적으로 위임한다. 따라서 디지털 시대의 도시는 단일 대도시가 아니라 체감 가능한 규모의 강소도시들이 연합하는 형태로 재편되어야 한다. 강소도시는 한 사람의 강점을 알아보고 성과의 기회를 연결할 만큼 작고 구체적인 생활권으로, 위임한 결정권이 어떻게 쓰이는지 확인하고 조정할 수 있다. 작은 도시 하나만으로는 시장과 데이터의 폭이 부족하므로 강소도시들은 데이터·인공지능·행정·산업 기반을 연결해 하나의 연합 생활권을 구성한다. 발휘의 폭은 연합에서 확보하되 권리의 위임과 회수는 개인이 속한 작은 도시 단위에서 이루어지는 구조다. 규모의 효율은 연합으로, 권리의 통제권은 개인 가까이에 남기는 것이 대도시를 강소도시 연합으로 재편해야 하는 근거다.</w:t>
+        <w:t>그러나 모든 기능이 한 대도시에 집중되면 개인이 위임한 권리도 거대한 행정 단위에 묶여 회수하기 어려워진다. 국가로의 권리 집중과 동일한 문제를 도시 규모에서 반복하는 것이다. 따라서 디지털 시대의 도시는 단일 대도시가 아니라 체감 가능한 규모의 강소도시들이 연합하는 형태로 재편되어야 한다. 강소도시는 한 사람의 강점을 알아보고 성과의 기회를 연결할 만큼 작고 구체적인 생활권으로, 위임한 결정권이 어떻게 쓰이는지 확인하고 조정할 수 있다. 강소도시들은 데이터·인공지능·행정·산업 기반을 연결해 연합 생활권을 구성하며, 규모의 효율은 연합으로 확보하되 권리의 위임과 회수는 개인이 속한 작은 도시 단위에서 이루어지는 것이 강소도시 연합의 근거다.</w:t>
       </w:r>
     </w:p>
     <w:p>
       <w:pPr>
         <w:keepNext/>
-        <w:spacing w:before="240" w:after="80"/>
+        <w:spacing w:before="180" w:after="60"/>
       </w:pPr>
       <w:r>
         <w:rPr>
@@ -981,7 +964,7 @@
     </w:p>
     <w:p>
       <w:pPr>
-        <w:spacing w:before="0" w:after="120" w:line="384" w:lineRule="auto"/>
+        <w:spacing w:before="0" w:after="100" w:line="360" w:lineRule="auto"/>
         <w:ind w:firstLine="227"/>
         <w:jc w:val="both"/>
       </w:pPr>
@@ -993,12 +976,12 @@
           <w:color w:val="000000"/>
           <w:sz w:val="21"/>
         </w:rPr>
-        <w:t>국가는 산업화 시대 권리 집중의 핵심 기구였다. 교육·고용·복지·의료를 중앙에서 일괄 관리했고 개인이 권리를 위임할 공동체를 선택할 여지를 거의 남기지 않았다. 디지털 시대의 국가는 모든 것을 관리하는 역할에서 물러나, 가정·이웃·마을·도시가 각자의 역할을 수행하도록 최소 조건을 보장하고 이들을 조율하는 메타 거버넌스(meta-governance)로 전환되어야 한다. 모든 사람에게 권리 위임의 기회가 열리도록 최소 권리선을 설정하고, 어느 공동체도 권리를 과도하게 독점하지 않도록 규칙을 만드는 것이 국가의 역할이다. 에스핑안데르센이 제시한 사회투자 국가, 곧 소득 보전에서 역량 형성으로의 전환이 그 구체적 형태다.</w:t>
+        <w:t>국가는 산업화 시대 권리 집중의 핵심 기구였다. 교육·고용·복지·의료를 중앙에서 일괄 관리했고 개인이 권리를 위임할 공동체를 선택할 여지를 거의 남기지 않았다. 디지털 시대의 국가는 모든 것을 관리하는 역할에서 물러나, 가정·이웃·마을·도시가 각자의 역할을 수행하도록 최소 조건을 보장하고 조율하는 메타 거버넌스(meta-governance)로 전환되어야 한다. 모든 사람에게 권리 위임의 기회가 열리도록 최소 권리선을 설정하고 어느 공동체도 권리를 과도하게 독점하지 않도록 규칙을 만드는 것이 국가의 역할이며, 에스핑안데르센이 제시한 사회적 투자 국가, 곧 소득 보전에서 역량 형성으로의 전환이 그 구체적 형태다.</w:t>
       </w:r>
     </w:p>
     <w:p>
       <w:pPr>
-        <w:spacing w:before="0" w:after="120" w:line="384" w:lineRule="auto"/>
+        <w:spacing w:before="0" w:after="100" w:line="360" w:lineRule="auto"/>
         <w:ind w:firstLine="227"/>
         <w:jc w:val="both"/>
       </w:pPr>
@@ -1010,13 +993,13 @@
           <w:color w:val="000000"/>
           <w:sz w:val="21"/>
         </w:rPr>
-        <w:t>세계는 산업화 시대에 국가 간 협정으로만 작동하던 추상적 층위였다. 디지털 시대에 세계는 처음으로 개인의 권리 위임 상대로 등장한다. 국경을 넘는 협업이 가능해지면서 청년과 중장년이 세계 무대에서 성과를 발휘할 수 있다. 동시에 기후변화·인공지능 위험·감염병처럼 국가 단위를 넘는 공동 위험이 커지면서 세계는 모든 생애단계의 안전과 직결된 거버넌스 층위가 된다. 오스트롬이 만년에 분석한 기후변화 거버넌스가 보여주듯 거버넌스 층위가 분산될수록 공동 위험에 대한 적응력이 높아진다.</w:t>
+        <w:t>세계는 산업화 시대에 국가 간 협정으로만 작동하던 추상적 층위였다. 디지털 시대에 세계는 처음으로 개인의 권리 위임 상대로 등장한다. 국경을 넘는 협업이 가능해지면서 청년과 중장년이 세계 무대에서 성과를 발휘할 수 있고, 기후변화·인공지능 위험·감염병처럼 국가 단위를 넘는 공동 위험도 커지면서 세계는 모든 생애단계의 안전과 직결된 거버넌스 층위가 된다. 오스트롬이 분석한 기후변화 거버넌스가 보여주듯 거버넌스 층위가 분산될수록 공동 위험에 대한 적응력이 높아진다.</w:t>
       </w:r>
     </w:p>
     <w:p>
       <w:pPr>
         <w:keepNext/>
-        <w:spacing w:before="360" w:after="160"/>
+        <w:spacing w:before="280" w:after="120"/>
         <w:pBdr>
           <w:bottom w:val="single" w:sz="8" w:space="4" w:color="000000"/>
         </w:pBdr>
@@ -1035,7 +1018,7 @@
     <w:p>
       <w:pPr>
         <w:keepNext/>
-        <w:spacing w:before="240" w:after="80"/>
+        <w:spacing w:before="180" w:after="60"/>
       </w:pPr>
       <w:r>
         <w:rPr>
@@ -1050,7 +1033,7 @@
     </w:p>
     <w:p>
       <w:pPr>
-        <w:spacing w:before="0" w:after="120" w:line="384" w:lineRule="auto"/>
+        <w:spacing w:before="0" w:after="100" w:line="360" w:lineRule="auto"/>
         <w:ind w:firstLine="227"/>
         <w:jc w:val="both"/>
       </w:pPr>
@@ -1072,12 +1055,12 @@
           <w:color w:val="000000"/>
           <w:sz w:val="21"/>
         </w:rPr>
-        <w:t>국가가 모든 생애단계의 필요를 독점 관리하는 구조에서, 개인이 필요에 따라 가정·이웃·마을·도시에 권리를 분산 위임하고 상황이 바뀌면 회수할 수 있는 구조로 전환해야 한다. 로크가 제시했듯 위임은 항상 회수 가능해야 한다. 탈상품화(decommodification), 곧 시장에 기대지 않고도 살아갈 수 있게 하는 사회 보장만으로는 부족하며, 위임 대상을 선택하고 변경할 수 있는 구조가 함께 필요하다.</w:t>
+        <w:t>국가가 모든 생애단계의 필요를 독점 관리하는 구조에서, 개인이 필요에 따라 가정·이웃·마을·도시에 권리를 분산 위임하고 상황이 바뀌면 회수할 수 있는 구조로 전환해야 한다. 탈상품화(decommodification), 곧 시장에 기대지 않고도 살아갈 수 있게 하는 사회 보장만으로는 부족하며, 위임 대상을 선택하고 변경할 수 있는 구조가 함께 필요하다.</w:t>
       </w:r>
     </w:p>
     <w:p>
       <w:pPr>
-        <w:spacing w:before="0" w:after="120" w:line="384" w:lineRule="auto"/>
+        <w:spacing w:before="0" w:after="100" w:line="360" w:lineRule="auto"/>
         <w:ind w:firstLine="227"/>
         <w:jc w:val="both"/>
       </w:pPr>
@@ -1104,7 +1087,7 @@
     </w:p>
     <w:p>
       <w:pPr>
-        <w:spacing w:before="0" w:after="120" w:line="384" w:lineRule="auto"/>
+        <w:spacing w:before="0" w:after="100" w:line="360" w:lineRule="auto"/>
         <w:ind w:firstLine="227"/>
         <w:jc w:val="both"/>
       </w:pPr>
@@ -1132,7 +1115,7 @@
     <w:p>
       <w:pPr>
         <w:keepNext/>
-        <w:spacing w:before="240" w:after="80"/>
+        <w:spacing w:before="180" w:after="60"/>
       </w:pPr>
       <w:r>
         <w:rPr>
@@ -1147,7 +1130,7 @@
     </w:p>
     <w:p>
       <w:pPr>
-        <w:spacing w:before="0" w:after="120" w:line="384" w:lineRule="auto"/>
+        <w:spacing w:before="0" w:after="100" w:line="360" w:lineRule="auto"/>
         <w:ind w:firstLine="227"/>
         <w:jc w:val="both"/>
       </w:pPr>
@@ -1165,7 +1148,7 @@
     <w:p>
       <w:pPr>
         <w:keepNext/>
-        <w:spacing w:before="240" w:after="80"/>
+        <w:spacing w:before="180" w:after="60"/>
       </w:pPr>
       <w:r>
         <w:rPr>
@@ -1180,7 +1163,7 @@
     </w:p>
     <w:p>
       <w:pPr>
-        <w:spacing w:before="0" w:after="120" w:line="384" w:lineRule="auto"/>
+        <w:spacing w:before="0" w:after="100" w:line="360" w:lineRule="auto"/>
         <w:ind w:firstLine="227"/>
         <w:jc w:val="both"/>
       </w:pPr>
@@ -1197,7 +1180,7 @@
     </w:p>
     <w:p>
       <w:pPr>
-        <w:spacing w:before="0" w:after="120" w:line="384" w:lineRule="auto"/>
+        <w:spacing w:before="0" w:after="100" w:line="360" w:lineRule="auto"/>
         <w:ind w:firstLine="227"/>
         <w:jc w:val="both"/>
       </w:pPr>
@@ -1215,7 +1198,7 @@
     <w:p>
       <w:pPr>
         <w:keepNext/>
-        <w:spacing w:before="360" w:after="160"/>
+        <w:spacing w:before="280" w:after="120"/>
         <w:pBdr>
           <w:bottom w:val="single" w:sz="8" w:space="4" w:color="000000"/>
         </w:pBdr>

</xml_diff>

<commit_message>
docs: align KR terms to confirmed standard (사회투자, 메타거버넌스)
</commit_message>
<xml_diff>
--- a/archive/docx/p2-lifecycle-community-report.docx
+++ b/archive/docx/p2-lifecycle-community-report.docx
@@ -709,7 +709,7 @@
           <w:color w:val="000000"/>
           <w:sz w:val="21"/>
         </w:rPr>
-        <w:t>청년기는 훈련으로 다듬어진 강점을 실제 성과로 발휘하는 시기다. 농업 시대에는 토지와 혼인을 통한 새 가정 구성이, 산업화 시대에는 안정된 직장 취업이 목표였고 필요는 외부가 규정했다. 디지털 시대 청년의 필요는 정체성을 실제 성과로 발휘할 영역이다. 인공지능과 플랫폼이 진입 비용을 낮추면서 개인은 대기업에 고용되지 않고도 가치를 생산할 수 있다. 산업화 시대 청년에게 노동력과 결정권을 기업·국가에 대규모로 위임하는 것이 거의 유일한 선택지였다면, 디지털 시대에는 도시에 발휘의 기반을 위임하고 세계와 선택적으로 협업하며 재편할 수 있는 유연한 위임 구조가 가능하다. 예스타 에스핑안데르센(Gøsta Esping-Andersen, 1947- )은 지식경제에서는 복지를 소득 보전이 아니라 교육·보육·재훈련 같은 사전 투자, 곧 사회적 투자(social investment)로 전환해야 한다고 강조했다.</w:t>
+        <w:t>청년기는 훈련으로 다듬어진 강점을 실제 성과로 발휘하는 시기다. 농업 시대에는 토지와 혼인을 통한 새 가정 구성이, 산업화 시대에는 안정된 직장 취업이 목표였고 필요는 외부가 규정했다. 디지털 시대 청년의 필요는 정체성을 실제 성과로 발휘할 영역이다. 인공지능과 플랫폼이 진입 비용을 낮추면서 개인은 대기업에 고용되지 않고도 가치를 생산할 수 있다. 산업화 시대 청년에게 노동력과 결정권을 기업·국가에 대규모로 위임하는 것이 거의 유일한 선택지였다면, 디지털 시대에는 도시에 발휘의 기반을 위임하고 세계와 선택적으로 협업하며 재편할 수 있는 유연한 위임 구조가 가능하다. 예스타 에스핑안데르센(Gøsta Esping-Andersen, 1947- )은 지식경제에서는 복지를 소득 보전이 아니라 교육·보육·재훈련 같은 사전 투자, 곧 사회투자(social investment)로 전환해야 한다고 강조했다.</w:t>
       </w:r>
     </w:p>
     <w:p>
@@ -860,7 +860,7 @@
           <w:color w:val="000000"/>
           <w:sz w:val="21"/>
         </w:rPr>
-        <w:t xml:space="preserve">이웃은 산업화 시대에 표준 제도가 모든 것을 조직하면서 상호 돌봄과 협동 기능이 소멸해 가장 크게 위축된 공동체다. 정체성 발휘의 시대에 이웃은 아이가 흥미를 실험하고 성인이 새 관계를 맺는 일상망으로서 중요성을 회복한다. 관심 기반 모임과 상호 돌봄이 이웃 단위에서 이루어질 때 개인은 발견의 기회를 얻으며, 단절된 사람이 관계망으로 복귀하는 첫 경로도 이웃이다. </w:t>
+        <w:t>이웃은 산업화 시대에 표준 제도가 모든 것을 조직하면서 상호 돌봄과 협동 기능이 소멸해 가장 크게 위축된 공동체다. 정체성 발휘의 시대에 이웃은 아이가 흥미를 실험하고 성인이 새 관계를 맺는 일상망으로서 중요성을 회복한다. 관심 기반 모임과 상호 돌봄이 이웃 단위에서 이루어질 때 개인은 발견의 기회를 얻으며, 단절된 사람이 관계망으로 복귀하는 첫 경로도 이웃이다. 오스트롬이 분석한 스위스 알프스 목초지와 일본 어촌의 어장 자치는 이웃 규모의 자치가 정교하게 작동함을 보여준다.</w:t>
       </w:r>
     </w:p>
     <w:p>
@@ -976,7 +976,7 @@
           <w:color w:val="000000"/>
           <w:sz w:val="21"/>
         </w:rPr>
-        <w:t>국가는 산업화 시대 권리 집중의 핵심 기구였다. 교육·고용·복지·의료를 중앙에서 일괄 관리했고 개인이 권리를 위임할 공동체를 선택할 여지를 거의 남기지 않았다. 디지털 시대의 국가는 모든 것을 관리하는 역할에서 물러나, 가정·이웃·마을·도시가 각자의 역할을 수행하도록 최소 조건을 보장하고 조율하는 메타 거버넌스(meta-governance)로 전환되어야 한다. 모든 사람에게 권리 위임의 기회가 열리도록 최소 권리선을 설정하고 어느 공동체도 권리를 과도하게 독점하지 않도록 규칙을 만드는 것이 국가의 역할이며, 에스핑안데르센이 제시한 사회적 투자 국가, 곧 소득 보전에서 역량 형성으로의 전환이 그 구체적 형태다.</w:t>
+        <w:t>국가는 산업화 시대 권리 집중의 핵심 기구였다. 교육·고용·복지·의료를 중앙에서 일괄 관리했고 개인이 권리를 위임할 공동체를 선택할 여지를 거의 남기지 않았다. 디지털 시대의 국가는 모든 것을 관리하는 역할에서 물러나, 가정·이웃·마을·도시가 각자의 역할을 수행하도록 최소 조건을 보장하고 조율하는 메타거버넌스(meta-governance)로 전환되어야 한다. 모든 사람에게 권리 위임의 기회가 열리도록 최소 권리선을 설정하고 어느 공동체도 권리를 과도하게 독점하지 않도록 규칙을 만드는 것이 국가의 역할이며, 에스핑안데르센이 제시한 사회투자 국가, 곧 소득 보전에서 역량 형성으로의 전환이 그 구체적 형태다.</w:t>
       </w:r>
     </w:p>
     <w:p>

</xml_diff>

<commit_message>
docs: explain theory concepts before connecting to Taejae frame
</commit_message>
<xml_diff>
--- a/archive/docx/p2-lifecycle-community-report.docx
+++ b/archive/docx/p2-lifecycle-community-report.docx
@@ -141,7 +141,7 @@
           <w:color w:val="000000"/>
           <w:sz w:val="21"/>
         </w:rPr>
-        <w:t>공동체는 개인이 필요에 따라 권리의 일부를 위임하는 계약으로 구현되는 실체다. 개인이 먼저 있고, 생애 단계마다 필요가 달라지면 공동체가 구성된다. 위임이 더 이상 필요하지 않을 때 개인은 위임한 권리를 회수할 수 있어야 한다. 이 연구는 위임과 회수의 계약 논리를 토대로 농업·산업화·디지털 세 시대의 노동 원리, 생애주기별 필요, 그 필요에 응답하는 공동체의 형성과 역할을 정합적으로 연결한다. 산업화 시대의 권리 집중은 당대의 필요에는 부합했으나 정체성 발휘를 요구하는 디지털 시대에는 맞지 않는다. 디지털 전환은 집중된 권리를 가정·이웃·마을·도시·국가·세계의 여러 층위로 다시 분산하는 과정으로 해석된다. 논의는 홉스·로크·루소의 사회계약론을 토대로 삼고, 에릭슨의 생애 발달 이론, 브론펜브레너의 생태체계 이론, 오스트롬의 다중심 거버넌스, 센·누스바움의 역량 접근, 폴라니의 탈배태·재배태 개념, 마이클 영의 능력주의 비판, 에스핑안데르센의 사회투자론, 헥만의 생애 초기 투자 연구로 보완된다.</w:t>
+        <w:t>공동체는 개인이 필요에 따라 권리의 일부를 위임하는 계약으로 구현되는 실체다. 개인이 먼저 있고, 생애 단계마다 필요가 달라지면 공동체가 구성된다. 위임이 더 이상 필요하지 않을 때 개인은 위임한 권리를 회수할 수 있어야 한다. 이 연구는 위임과 회수의 계약 논리를 토대로 농업·산업화·디지털 세 시대의 노동 원리, 생애주기별 필요, 그 필요에 응답하는 공동체의 형성과 역할을 정합적으로 연결한다. 산업화 시대의 권리 집중은 당대의 필요에는 부합했으나 정체성 발휘를 요구하는 디지털 시대에는 맞지 않는다. 디지털 전환은 집중된 권리를 가정·이웃·마을·도시·국가·세계의 여러 층위로 다시 분산하는 과정으로 해석된다. 이를 위해 공동체는 선행하는 실체가 아니라 위임된 권리와 책임이 제도화된 관계로 다루어진다. 각 이론은 이 관계를 설명하는 데 필요한 범위에서 검토된다.</w:t>
       </w:r>
     </w:p>
     <w:p>
@@ -356,7 +356,7 @@
           <w:color w:val="000000"/>
           <w:sz w:val="21"/>
         </w:rPr>
-        <w:t>칼 폴라니(Karl Polanyi, 1886-1964)는 『거대한 전환』(1944)에서 산업화 시대 시장 경제가 노동·토지·화폐를 사회적 관계에서 분리하여 상품으로 만들었다고 분석하고, 이를 탈배태(disembedding)로 명명했다. 산업화 시대는 이웃·마을·가정에 분산되어 있던 권리 위임을 국가로 집중한 시대였다. 디지털 시대의 과제는 그 집중을 여러 층위로 되돌리는 재배태(re-embedding)다.</w:t>
+        <w:t>칼 폴라니(Karl Polanyi, 1886-1964)는 『거대한 전환』(1944)에서 산업화 이후 시장이 사회의 한 부분에 머무르지 않고 사회 전체를 조직하는 원리가 되었다고 보았다. 그 과정에서 노동·토지·화폐는 본래 상품으로 생산된 것이 아닌데도 상품처럼 거래되었다. 폴라니는 이를 허구상품(fictitious commodities)이라고 불렀다. 노동이 생활 공동체의 관계에서 분리되어 시장 가격으로 평가되는 과정이 탈배태(disembedding)다. 이 연구에서 탈배태는 개인의 필요를 가까운 공동체가 감당하지 못하고 국가·시장 경로로만 처리하는 상태를 가리킨다. 재배태(re-embedding)는 그 필요를 가정·이웃·마을·도시 등 실제 생활권의 관계와 제도 안에서 다시 처리하는 전환이다.</w:t>
       </w:r>
     </w:p>
     <w:p>
@@ -389,7 +389,7 @@
           <w:color w:val="000000"/>
           <w:sz w:val="21"/>
         </w:rPr>
-        <w:t>엘리너 오스트롬(Elinor Ostrom, 1933-2012)은 사람들이 중앙 정부나 사유화 없이도 자치 규칙을 만들어 공유 자원을 지속 가능하게 관리할 수 있음을 실증했다(『공유의 비극을 넘어』, 1990). 그는 이를 다중심 거버넌스(polycentric governance), 곧 여러 층위의 공동체가 각자의 영역에서 문제를 분담하는 구조로 설명했다. 권리는 가정·이웃·마을·도시·국가·세계가 층위에 따라 분담해야 하며, 한 층위가 권리를 독점하면 나머지 층위는 약화되고 개인의 선택지는 줄어든다.</w:t>
+        <w:t>엘리너 오스트롬(Elinor Ostrom, 1933-2012)은 공유 자원이 중앙 정부나 시장만으로 관리되어야 한다는 전제를 비판했다. 그는 목초지·어장·관개 시설처럼 함께 쓰는 자원을 사람들이 자치 규칙으로 관리하는 사례를 분석했다(『공유의 비극을 넘어』, 1990). 다중심 거버넌스(polycentric governance)에서 '중심'은 대도시나 행정 중심지를 뜻하지 않는다. 각자 결정권과 책임을 가진 자치 단위를 뜻한다. 이 연구의 용어로는 가정·이웃·마을·도시·국가·세계가 각각 하나의 중심이 될 수 있다. 따라서 다중심 거버넌스는 권리 위임이 여러 공동체로 분산되고, 각 공동체가 자기 범위의 문제를 담당하는 구조를 설명한다.</w:t>
       </w:r>
     </w:p>
     <w:p>
@@ -406,7 +406,7 @@
           <w:color w:val="000000"/>
           <w:sz w:val="21"/>
         </w:rPr>
-        <w:t>유리 브론펜브레너(Urie Bronfenbrenner, 1917-2005)는 개인의 발달을 가정(미시체계), 이웃과 학교(중간체계), 부모의 직장(외체계), 사회의 가치 규범(거시체계)이 상호작용하는 중첩된 생태체계로 분석했다(『인간 발달의 생태학』, 1979). 그의 핵심 명제는 개인에게 가장 큰 영향을 미치는 것이 가까운 공동체와의 직접적 상호작용, 곧 근접 과정(proximal process)이라는 것이다. 산업화 시대는 근접 과정이 일어나는 가정·이웃·마을을 약화시키고 권리를 국가로 집중함으로써 개인 발달의 토대를 약화시켰다.</w:t>
+        <w:t>유리 브론펜브레너(Urie Bronfenbrenner, 1917-2005)는 개인의 발달을 여러 환경의 상호작용으로 설명했다(『인간 발달의 생태학』, 1979). 가정은 미시체계(microsystem), 이웃과 학교의 관계는 중간체계(mesosystem), 부모의 직장과 제도는 외체계(exosystem), 사회의 가치 규범은 거시체계(macrosystem)에 해당한다. 그는 가까운 환경에서 반복되는 직접 상호작용을 근접 과정(proximal process)이라고 보았다. 이 개념은 개인의 필요가 추상적 제도보다 가까운 공동체에서 먼저 확인되고 조정된다는 이 연구의 주장과 연결된다.</w:t>
       </w:r>
     </w:p>
     <w:p>
@@ -775,7 +775,7 @@
           <w:color w:val="000000"/>
           <w:sz w:val="21"/>
         </w:rPr>
-        <w:t>농업 시대의 노년은 봉양의 대상, 산업화 시대의 노년은 은퇴와 부양의 대상이었고 두 시대 모두 노인을 수혜자로 규정했다. 디지털 시대는 건강을 예측·예방하며 존엄과 판단의 주도권을 유지하고, 경험을 다음 세대에 전수하며 세대를 연결하는 능동적 전수자로서의 노년을 제시한다. 에릭슨은 노년기의 과제를 자아통합 대 절망(ego integrity vs. despair)으로 규정했다. 삶 전체를 통합적으로 수용하지 못하면 절망에 빠진다. 전수 통로와 역할이 주어지고 관계 안에 머물 수 있는 공동체 구조가 통합을 가능하게 한다. 가정은 돌봄과 존엄의 생활 공간을, 이웃은 관계의 지속을, 마을과 도시는 멘토와 자문을 담당하고 국가는 소득의 최소 기반과 고립 방지를 맡는다. 폴라니의 개념으로 보면 노인이 시장과 국가 연금에만 의존하는 상태는 탈배태이며, 재배태는 노인을 관계와 역할의 그물로 되돌리는 것이다.</w:t>
+        <w:t>농업 시대의 노년은 봉양의 대상, 산업화 시대의 노년은 은퇴와 부양의 대상이었고 두 시대 모두 노인을 수혜자로 규정했다. 디지털 시대는 건강을 예측·예방하며 존엄과 판단의 주도권을 유지하고, 경험을 다음 세대에 전수하며 세대를 연결하는 능동적 전수자로서의 노년을 제시한다. 에릭슨은 노년기의 과제를 자아통합 대 절망(ego integrity vs. despair)으로 규정했다. 삶 전체를 통합적으로 수용하지 못하면 절망에 빠진다. 전수 통로와 역할이 주어지고 관계 안에 머물 수 있는 공동체 구조가 통합을 가능하게 한다. 가정은 돌봄과 존엄의 생활 공간을, 이웃은 관계의 지속을, 마을과 도시는 멘토와 자문을 담당하고 국가는 소득의 최소 기반과 고립 방지를 맡는다. 이 경우 재배태는 노인을 시장 소득이나 국가 연금의 수급자로만 보지 않고, 돌봄·관계·전수 역할을 수행하는 생활권 안에 다시 위치시키는 것을 뜻한다.</w:t>
       </w:r>
     </w:p>
     <w:p>
@@ -1192,7 +1192,7 @@
           <w:color w:val="000000"/>
           <w:sz w:val="21"/>
         </w:rPr>
-        <w:t>루소의 자치, 로크의 신탁 회수 가능성, 오스트롬의 다중심 자치, 브론펜브레너의 근접 과정, 폴라니의 재배태는 같은 방향을 가리킨다. 개인은 필요에 맞는 공동체를 구성하고 그 공동체에 권리를 위임하며 상황이 바뀌면 권리를 회수할 수 있어야 한다.</w:t>
+        <w:t>이론적 함의도 여기에 있다. 로크의 신탁은 위임이 조건부라는 점을 제시한다. 오스트롬의 다중심 자치는 권한을 가진 여러 단위가 동시에 존재할 수 있음을 보여준다. 브론펜브레너의 근접 과정은 가까운 공동체가 개인 발달에 직접 영향을 준다는 근거를 제공한다. 폴라니의 재배태는 필요를 시장·국가 경로에만 맡기지 않고 생활권의 관계와 제도 안에서 다시 처리해야 한다는 문제의식을 제공한다. 이 연구는 이 네 논의를 개인의 권리 위임과 회수라는 하나의 제도 원리로 연결한다.</w:t>
       </w:r>
     </w:p>
     <w:p>

</xml_diff>